<commit_message>
Justify Gabor-Granger method, draft Conclusion, switch main text to no-controls specification
- Add two sentences justifying the Gabor-Granger method with citations found
  via Consensus (Jones 1975, Wedel & Leeflang 1998, Lipovetsky et al. 2011),
  adding the missing sources to Zotero via its local connector API.
- Draft the previously-empty Conclusion and Policy Implications section.
- Robustness-check the main-text models with no controls at all; results are
  consistent with the demographics-controlled specification, so swap the
  main text to the no-controls models and move the demographics-only
  specification to a new first robustness-check section in
  supplemental-materials.qmd, alongside the existing demographics +
  cost-concern check.

Co-Authored-By: Claude Sonnet 5 <noreply@anthropic.com>
</commit_message>
<xml_diff>
--- a/_output/cue-WTP.docx
+++ b/_output/cue-WTP.docx
@@ -421,7 +421,7 @@
         <w:pStyle w:val="BodyText"/>
       </w:pPr>
       <w:r>
-        <w:t xml:space="preserve">I first examine how respondents chose to prioritize fossil fuels versus renewables. After receiving the cues, respondents were asked, on a 1 to 7 scale, if fossil fuels should be prioritized (= 1), fossil fuels and renewables should be prioritized equally (= 4), or renewable sources should be prioritized (= 7). The mean on the energy-priority scale was 5.17, indicating that respondents, on average, prioritized renewables. Next, I use OLS to examine the prioritization respondents gave to fossil fuels versus renewables as a function of the cue, their political beliefs, and the interaction between cues and political beliefs, controlling for several demographic variables, including age, male, white, education, and income. Energy affordability was a salient concern during the time data was collected: in the survey respondents were asked, on a 0 to 10 scale, their overall concern about the cost of electricity, and the mean was 7.88, indicating a fair amount of concern. Because this concern could plausibly confound cue and political-identity effects on prioritization and WTP, I re-estimate every model below with concern about energy cost added as an additional control; that specification is reported in the Supplemental Materials. The coefficients, significance, and substantive conclusions are consistent across both specifications.</w:t>
+        <w:t xml:space="preserve">I first examine how respondents chose to prioritize fossil fuels versus renewables. After receiving the cues, respondents were asked, on a 1 to 7 scale, if fossil fuels should be prioritized (= 1), fossil fuels and renewables should be prioritized equally (= 4), or renewable sources should be prioritized (= 7). The mean on the energy-priority scale was 5.17, indicating that respondents, on average, prioritized renewables. Next, I use OLS to examine the prioritization respondents gave to fossil fuels versus renewables as a function of the cue, their political beliefs, and the interaction between cues and political beliefs. Energy affordability was a salient concern during the time data was collected: in the survey respondents were asked, on a 0 to 10 scale, their overall concern about the cost of electricity, and the mean was 7.88, indicating a fair amount of concern. Demographic characteristics could also confound the relationship between cues, political beliefs, and these outcomes, so I re-estimate every model below controlling for age, male, white, education, and income, and separately controlling for those demographics plus concern about energy cost; both specifications are reported in the Supplemental Materials. The coefficients, significance, and substantive conclusions are consistent across all three specifications.</w:t>
       </w:r>
     </w:p>
     <w:bookmarkEnd w:id="13"/>
@@ -540,7 +540,7 @@
                     <w:jc w:val="center"/>
                   </w:pPr>
                   <w:r>
-                    <w:t xml:space="preserve">-0.027</w:t>
+                    <w:t xml:space="preserve">-0.016</w:t>
                   </w:r>
                 </w:p>
               </w:tc>
@@ -562,7 +562,7 @@
                     <w:jc w:val="center"/>
                   </w:pPr>
                   <w:r>
-                    <w:t xml:space="preserve">(0.160)</w:t>
+                    <w:t xml:space="preserve">(0.159)</w:t>
                   </w:r>
                 </w:p>
               </w:tc>
@@ -588,7 +588,7 @@
                     <w:jc w:val="center"/>
                   </w:pPr>
                   <w:r>
-                    <w:t xml:space="preserve">-0.131</w:t>
+                    <w:t xml:space="preserve">-0.137</w:t>
                   </w:r>
                 </w:p>
               </w:tc>
@@ -610,7 +610,7 @@
                     <w:jc w:val="center"/>
                   </w:pPr>
                   <w:r>
-                    <w:t xml:space="preserve">(0.154)</w:t>
+                    <w:t xml:space="preserve">(0.153)</w:t>
                   </w:r>
                 </w:p>
               </w:tc>
@@ -636,7 +636,7 @@
                     <w:jc w:val="center"/>
                   </w:pPr>
                   <w:r>
-                    <w:t xml:space="preserve">0.657***</w:t>
+                    <w:t xml:space="preserve">0.674***</w:t>
                   </w:r>
                 </w:p>
               </w:tc>
@@ -684,7 +684,7 @@
                     <w:jc w:val="center"/>
                   </w:pPr>
                   <w:r>
-                    <w:t xml:space="preserve">-1.224***</w:t>
+                    <w:t xml:space="preserve">-1.236***</w:t>
                   </w:r>
                 </w:p>
               </w:tc>
@@ -706,7 +706,7 @@
                     <w:jc w:val="center"/>
                   </w:pPr>
                   <w:r>
-                    <w:t xml:space="preserve">(0.149)</w:t>
+                    <w:t xml:space="preserve">(0.150)</w:t>
                   </w:r>
                 </w:p>
               </w:tc>
@@ -732,7 +732,7 @@
                     <w:jc w:val="center"/>
                   </w:pPr>
                   <w:r>
-                    <w:t xml:space="preserve">0.173</w:t>
+                    <w:t xml:space="preserve">0.137</w:t>
                   </w:r>
                 </w:p>
               </w:tc>
@@ -780,7 +780,7 @@
                     <w:jc w:val="center"/>
                   </w:pPr>
                   <w:r>
-                    <w:t xml:space="preserve">0.372**</w:t>
+                    <w:t xml:space="preserve">0.341*</w:t>
                   </w:r>
                 </w:p>
               </w:tc>
@@ -802,7 +802,7 @@
                     <w:jc w:val="center"/>
                   </w:pPr>
                   <w:r>
-                    <w:t xml:space="preserve">(0.176)</w:t>
+                    <w:t xml:space="preserve">(0.174)</w:t>
                   </w:r>
                 </w:p>
               </w:tc>
@@ -828,7 +828,7 @@
                     <w:jc w:val="center"/>
                   </w:pPr>
                   <w:r>
-                    <w:t xml:space="preserve">-0.413*</w:t>
+                    <w:t xml:space="preserve">-0.438*</w:t>
                   </w:r>
                 </w:p>
               </w:tc>
@@ -850,7 +850,7 @@
                     <w:jc w:val="center"/>
                   </w:pPr>
                   <w:r>
-                    <w:t xml:space="preserve">(0.234)</w:t>
+                    <w:t xml:space="preserve">(0.235)</w:t>
                   </w:r>
                 </w:p>
               </w:tc>
@@ -876,7 +876,7 @@
                     <w:jc w:val="center"/>
                   </w:pPr>
                   <w:r>
-                    <w:t xml:space="preserve">0.075</w:t>
+                    <w:t xml:space="preserve">0.079</w:t>
                   </w:r>
                 </w:p>
               </w:tc>
@@ -898,7 +898,7 @@
                     <w:jc w:val="center"/>
                   </w:pPr>
                   <w:r>
-                    <w:t xml:space="preserve">(0.218)</w:t>
+                    <w:t xml:space="preserve">(0.221)</w:t>
                   </w:r>
                 </w:p>
               </w:tc>
@@ -912,19 +912,19 @@
                     <w:jc w:val="center"/>
                   </w:pPr>
                   <w:r>
-                    <w:t xml:space="preserve">Age</w:t>
-                  </w:r>
-                </w:p>
-              </w:tc>
-              <w:tc>
-                <w:tcPr/>
-                <w:p>
-                  <w:pPr>
-                    <w:pStyle w:val="Compact"/>
-                    <w:jc w:val="center"/>
-                  </w:pPr>
-                  <w:r>
-                    <w:t xml:space="preserve">-0.010***</w:t>
+                    <w:t xml:space="preserve">(Intercept)</w:t>
+                  </w:r>
+                </w:p>
+              </w:tc>
+              <w:tc>
+                <w:tcPr/>
+                <w:p>
+                  <w:pPr>
+                    <w:pStyle w:val="Compact"/>
+                    <w:jc w:val="center"/>
+                  </w:pPr>
+                  <w:r>
+                    <w:t xml:space="preserve">5.443***</w:t>
                   </w:r>
                 </w:p>
               </w:tc>
@@ -946,247 +946,7 @@
                     <w:jc w:val="center"/>
                   </w:pPr>
                   <w:r>
-                    <w:t xml:space="preserve">(0.002)</w:t>
-                  </w:r>
-                </w:p>
-              </w:tc>
-            </w:tr>
-            <w:tr>
-              <w:tc>
-                <w:tcPr/>
-                <w:p>
-                  <w:pPr>
-                    <w:pStyle w:val="Compact"/>
-                    <w:jc w:val="center"/>
-                  </w:pPr>
-                  <w:r>
-                    <w:t xml:space="preserve">Male</w:t>
-                  </w:r>
-                </w:p>
-              </w:tc>
-              <w:tc>
-                <w:tcPr/>
-                <w:p>
-                  <w:pPr>
-                    <w:pStyle w:val="Compact"/>
-                    <w:jc w:val="center"/>
-                  </w:pPr>
-                  <w:r>
-                    <w:t xml:space="preserve">0.226***</w:t>
-                  </w:r>
-                </w:p>
-              </w:tc>
-            </w:tr>
-            <w:tr>
-              <w:tc>
-                <w:tcPr/>
-                <w:p>
-                  <w:pPr>
-                    <w:pStyle w:val="Compact"/>
-                  </w:pPr>
-                </w:p>
-              </w:tc>
-              <w:tc>
-                <w:tcPr/>
-                <w:p>
-                  <w:pPr>
-                    <w:pStyle w:val="Compact"/>
-                    <w:jc w:val="center"/>
-                  </w:pPr>
-                  <w:r>
-                    <w:t xml:space="preserve">(0.068)</w:t>
-                  </w:r>
-                </w:p>
-              </w:tc>
-            </w:tr>
-            <w:tr>
-              <w:tc>
-                <w:tcPr/>
-                <w:p>
-                  <w:pPr>
-                    <w:pStyle w:val="Compact"/>
-                    <w:jc w:val="center"/>
-                  </w:pPr>
-                  <w:r>
-                    <w:t xml:space="preserve">White</w:t>
-                  </w:r>
-                </w:p>
-              </w:tc>
-              <w:tc>
-                <w:tcPr/>
-                <w:p>
-                  <w:pPr>
-                    <w:pStyle w:val="Compact"/>
-                    <w:jc w:val="center"/>
-                  </w:pPr>
-                  <w:r>
-                    <w:t xml:space="preserve">0.145*</w:t>
-                  </w:r>
-                </w:p>
-              </w:tc>
-            </w:tr>
-            <w:tr>
-              <w:tc>
-                <w:tcPr/>
-                <w:p>
-                  <w:pPr>
-                    <w:pStyle w:val="Compact"/>
-                  </w:pPr>
-                </w:p>
-              </w:tc>
-              <w:tc>
-                <w:tcPr/>
-                <w:p>
-                  <w:pPr>
-                    <w:pStyle w:val="Compact"/>
-                    <w:jc w:val="center"/>
-                  </w:pPr>
-                  <w:r>
-                    <w:t xml:space="preserve">(0.078)</w:t>
-                  </w:r>
-                </w:p>
-              </w:tc>
-            </w:tr>
-            <w:tr>
-              <w:tc>
-                <w:tcPr/>
-                <w:p>
-                  <w:pPr>
-                    <w:pStyle w:val="Compact"/>
-                    <w:jc w:val="center"/>
-                  </w:pPr>
-                  <w:r>
-                    <w:t xml:space="preserve">Education</w:t>
-                  </w:r>
-                </w:p>
-              </w:tc>
-              <w:tc>
-                <w:tcPr/>
-                <w:p>
-                  <w:pPr>
-                    <w:pStyle w:val="Compact"/>
-                    <w:jc w:val="center"/>
-                  </w:pPr>
-                  <w:r>
-                    <w:t xml:space="preserve">0.041**</w:t>
-                  </w:r>
-                </w:p>
-              </w:tc>
-            </w:tr>
-            <w:tr>
-              <w:tc>
-                <w:tcPr/>
-                <w:p>
-                  <w:pPr>
-                    <w:pStyle w:val="Compact"/>
-                  </w:pPr>
-                </w:p>
-              </w:tc>
-              <w:tc>
-                <w:tcPr/>
-                <w:p>
-                  <w:pPr>
-                    <w:pStyle w:val="Compact"/>
-                    <w:jc w:val="center"/>
-                  </w:pPr>
-                  <w:r>
-                    <w:t xml:space="preserve">(0.019)</w:t>
-                  </w:r>
-                </w:p>
-              </w:tc>
-            </w:tr>
-            <w:tr>
-              <w:tc>
-                <w:tcPr/>
-                <w:p>
-                  <w:pPr>
-                    <w:pStyle w:val="Compact"/>
-                    <w:jc w:val="center"/>
-                  </w:pPr>
-                  <w:r>
-                    <w:t xml:space="preserve">Income</w:t>
-                  </w:r>
-                </w:p>
-              </w:tc>
-              <w:tc>
-                <w:tcPr/>
-                <w:p>
-                  <w:pPr>
-                    <w:pStyle w:val="Compact"/>
-                    <w:jc w:val="center"/>
-                  </w:pPr>
-                  <w:r>
-                    <w:t xml:space="preserve">0.018</w:t>
-                  </w:r>
-                </w:p>
-              </w:tc>
-            </w:tr>
-            <w:tr>
-              <w:tc>
-                <w:tcPr/>
-                <w:p>
-                  <w:pPr>
-                    <w:pStyle w:val="Compact"/>
-                  </w:pPr>
-                </w:p>
-              </w:tc>
-              <w:tc>
-                <w:tcPr/>
-                <w:p>
-                  <w:pPr>
-                    <w:pStyle w:val="Compact"/>
-                    <w:jc w:val="center"/>
-                  </w:pPr>
-                  <w:r>
-                    <w:t xml:space="preserve">(0.013)</w:t>
-                  </w:r>
-                </w:p>
-              </w:tc>
-            </w:tr>
-            <w:tr>
-              <w:tc>
-                <w:tcPr/>
-                <w:p>
-                  <w:pPr>
-                    <w:pStyle w:val="Compact"/>
-                    <w:jc w:val="center"/>
-                  </w:pPr>
-                  <w:r>
-                    <w:t xml:space="preserve">(Intercept)</w:t>
-                  </w:r>
-                </w:p>
-              </w:tc>
-              <w:tc>
-                <w:tcPr/>
-                <w:p>
-                  <w:pPr>
-                    <w:pStyle w:val="Compact"/>
-                    <w:jc w:val="center"/>
-                  </w:pPr>
-                  <w:r>
-                    <w:t xml:space="preserve">5.493***</w:t>
-                  </w:r>
-                </w:p>
-              </w:tc>
-            </w:tr>
-            <w:tr>
-              <w:tc>
-                <w:tcPr/>
-                <w:p>
-                  <w:pPr>
-                    <w:pStyle w:val="Compact"/>
-                  </w:pPr>
-                </w:p>
-              </w:tc>
-              <w:tc>
-                <w:tcPr/>
-                <w:p>
-                  <w:pPr>
-                    <w:pStyle w:val="Compact"/>
-                    <w:jc w:val="center"/>
-                  </w:pPr>
-                  <w:r>
-                    <w:t xml:space="preserve">(0.162)</w:t>
+                    <w:t xml:space="preserve">(0.109)</w:t>
                   </w:r>
                 </w:p>
               </w:tc>
@@ -1267,7 +1027,7 @@
               <w:pStyle w:val="ImageCaption"/>
             </w:pPr>
             <w:r>
-              <w:t xml:space="preserve">Figure 1: Predicted energy source-priority scale (1-7) by cue condition and political identity (survey-weighted OLS predictions with 95% CIs; age, male, white, education, and income held at their survey-weighted means)</w:t>
+              <w:t xml:space="preserve">Figure 1: Predicted energy source-priority scale (1-7) by cue condition and political identity (survey-weighted OLS predictions with 95% CIs)</w:t>
             </w:r>
           </w:p>
           <w:p>
@@ -1327,7 +1087,7 @@
         <w:pStyle w:val="BodyText"/>
       </w:pPr>
       <w:r>
-        <w:t xml:space="preserve">As expected, conservative Republicans were more likely to prioritize fossil fuels than renewables, with an estimated coefficient of -1.22 on the 1 to 7 scale. Liberal Democrats prioritized renewables at 0.66. In terms of the interactions, conservative Republicans who received the Trump cue were more likely to prioritize fossil fuels (b = -0.41,</w:t>
+        <w:t xml:space="preserve">As expected, conservative Republicans were more likely to prioritize fossil fuels than renewables, with an estimated coefficient of -1.24 on the 1 to 7 scale. Liberal Democrats prioritized renewables at 0.67. In terms of the interactions, conservative Republicans who received the Trump cue were more likely to prioritize fossil fuels (b = -0.44,</w:t>
       </w:r>
       <w:r>
         <w:t xml:space="preserve"> </w:t>
@@ -1343,7 +1103,7 @@
         <w:t xml:space="preserve"> </w:t>
       </w:r>
       <w:r>
-        <w:t xml:space="preserve">= 0.077), whereas liberal Democrats in the climate condition where more likely to prioritize renewables (b = 0.37). Overall, the predicted value on the 1 to 7 scale for conservative Republicans in the control group was 4.21, indicating a priority split roughly evenly between fossil fuels and renewables, and it was 3.77 for those receiving the Trump cue, indicating a significant shift toward prioritizing fossil fuels. For liberal Democrats the predicted value was 6.09, indicating a priority for renewables, and the value was 6.33 in the climate condition. The interactions of cue x political beliefs was significant; however, the cues themselves had no effect, on average, on energy source priority compared to the control condition.</w:t>
+        <w:t xml:space="preserve">= 0.062), whereas liberal Democrats in the climate condition where more likely to prioritize renewables (b = 0.34). Overall, the predicted value on the 1 to 7 scale for conservative Republicans in the control group was 4.21, indicating a priority split roughly evenly between fossil fuels and renewables, and it was 3.75 for those receiving the Trump cue, indicating a significant shift toward prioritizing fossil fuels. For liberal Democrats the predicted value was 6.12, indicating a priority for renewables, and the value was 6.32 in the climate condition. The interactions of cue x political beliefs were marginally significant; however, the cues themselves had no effect, on average, on energy source priority compared to the control condition.</w:t>
       </w:r>
     </w:p>
     <w:p>
@@ -1358,6 +1118,36 @@
       </w:r>
       <w:r>
         <w:t xml:space="preserve">(e.g., Gabor and Granger 1966)</w:t>
+      </w:r>
+      <w:r>
+        <w:t xml:space="preserve">. The Gabor-Granger method is a well-established survey-based technique for eliciting willingness-to-pay, dating to early applications of iterative-bidding price experiments</w:t>
+      </w:r>
+      <w:r>
+        <w:t xml:space="preserve"> </w:t>
+      </w:r>
+      <w:r>
+        <w:t xml:space="preserve">(Jones 1975)</w:t>
+      </w:r>
+      <w:r>
+        <w:t xml:space="preserve"> </w:t>
+      </w:r>
+      <w:r>
+        <w:t xml:space="preserve">and later formalized in marketing research</w:t>
+      </w:r>
+      <w:r>
+        <w:t xml:space="preserve"> </w:t>
+      </w:r>
+      <w:r>
+        <w:t xml:space="preserve">(Wedel and Leeflang 1998)</w:t>
+      </w:r>
+      <w:r>
+        <w:t xml:space="preserve">. It remains among the standard indirect approaches used to measure willingness-to-pay, alongside methods such as the van Westendorp price sensitivity meter and discrete choice experiments</w:t>
+      </w:r>
+      <w:r>
+        <w:t xml:space="preserve"> </w:t>
+      </w:r>
+      <w:r>
+        <w:t xml:space="preserve">(Breidert, Hahsler, and Reutterer 2006; Lipovetsky, Magnan, and Zanetti-Polzi 2011)</w:t>
       </w:r>
       <w:r>
         <w:t xml:space="preserve">. Specifically, I first give respondents information about potential costs associated with each energy source. In the WTP for fossil fuels question, I noted that costs associated with renewable energy have decreased and, therefore they may need to pay more to use fossil fuels. For renewable sources respondents were told about the need to increase distribution. All respondents were asked their WTP for both sources, and the sources were presented in random order. To elict the maximum/minimum WTP, respondents were shown a random dollar amount between $1 and $46, in five-dollar increments, and asked if they would be WTP that amount extra per-month in their electricity bill. If they indicated yes they were shown a larger, random dollar-amount, and if they indicated no they were shown a smaller dollar-amount. This continues until they reach the $46-maximum or $1-minimum. Respondents who indicated no at $1 were coded with a WTP of 0. The percent of respondents WTP each possible dollar amount for each source is shown in</w:t>
@@ -1974,7 +1764,7 @@
         <w:pStyle w:val="BodyText"/>
       </w:pPr>
       <w:r>
-        <w:t xml:space="preserve">Given the large percantage of respondents at $0 for fossil fuels, I model the WTP for fossil fuels with a two-part hurdle model. First, I use a logit model to see whether a respondent has any positive WTP, then I use OLS to examine differences in WTP amounts. Next, using OLS, I examine the WTP for fossil fuels, among those who are WTP &gt;0, and for renewables. The results of all three models, controlling for demographics, are shown in</w:t>
+        <w:t xml:space="preserve">Given the large percantage of respondents at $0 for fossil fuels, I model the WTP for fossil fuels with a two-part hurdle model. First, I use a logit model to see whether a respondent has any positive WTP, then I use OLS to examine differences in WTP amounts. Next, using OLS, I examine the WTP for fossil fuels, among those who are WTP &gt;0, and for renewables. The results of all three models are shown in</w:t>
       </w:r>
       <w:r>
         <w:t xml:space="preserve"> </w:t>
@@ -2101,31 +1891,31 @@
                     <w:jc w:val="center"/>
                   </w:pPr>
                   <w:r>
-                    <w:t xml:space="preserve">-0.257</w:t>
-                  </w:r>
-                </w:p>
-              </w:tc>
-              <w:tc>
-                <w:tcPr/>
-                <w:p>
-                  <w:pPr>
-                    <w:pStyle w:val="Compact"/>
-                    <w:jc w:val="center"/>
-                  </w:pPr>
-                  <w:r>
-                    <w:t xml:space="preserve">-3.326</w:t>
-                  </w:r>
-                </w:p>
-              </w:tc>
-              <w:tc>
-                <w:tcPr/>
-                <w:p>
-                  <w:pPr>
-                    <w:pStyle w:val="Compact"/>
-                    <w:jc w:val="center"/>
-                  </w:pPr>
-                  <w:r>
-                    <w:t xml:space="preserve">-1.525</w:t>
+                    <w:t xml:space="preserve">-0.263</w:t>
+                  </w:r>
+                </w:p>
+              </w:tc>
+              <w:tc>
+                <w:tcPr/>
+                <w:p>
+                  <w:pPr>
+                    <w:pStyle w:val="Compact"/>
+                    <w:jc w:val="center"/>
+                  </w:pPr>
+                  <w:r>
+                    <w:t xml:space="preserve">-3.607</w:t>
+                  </w:r>
+                </w:p>
+              </w:tc>
+              <w:tc>
+                <w:tcPr/>
+                <w:p>
+                  <w:pPr>
+                    <w:pStyle w:val="Compact"/>
+                    <w:jc w:val="center"/>
+                  </w:pPr>
+                  <w:r>
+                    <w:t xml:space="preserve">-1.495</w:t>
                   </w:r>
                 </w:p>
               </w:tc>
@@ -2147,31 +1937,31 @@
                     <w:jc w:val="center"/>
                   </w:pPr>
                   <w:r>
-                    <w:t xml:space="preserve">(0.210)</w:t>
-                  </w:r>
-                </w:p>
-              </w:tc>
-              <w:tc>
-                <w:tcPr/>
-                <w:p>
-                  <w:pPr>
-                    <w:pStyle w:val="Compact"/>
-                    <w:jc w:val="center"/>
-                  </w:pPr>
-                  <w:r>
-                    <w:t xml:space="preserve">(2.268)</w:t>
-                  </w:r>
-                </w:p>
-              </w:tc>
-              <w:tc>
-                <w:tcPr/>
-                <w:p>
-                  <w:pPr>
-                    <w:pStyle w:val="Compact"/>
-                    <w:jc w:val="center"/>
-                  </w:pPr>
-                  <w:r>
-                    <w:t xml:space="preserve">(1.853)</w:t>
+                    <w:t xml:space="preserve">(0.204)</w:t>
+                  </w:r>
+                </w:p>
+              </w:tc>
+              <w:tc>
+                <w:tcPr/>
+                <w:p>
+                  <w:pPr>
+                    <w:pStyle w:val="Compact"/>
+                    <w:jc w:val="center"/>
+                  </w:pPr>
+                  <w:r>
+                    <w:t xml:space="preserve">(2.265)</w:t>
+                  </w:r>
+                </w:p>
+              </w:tc>
+              <w:tc>
+                <w:tcPr/>
+                <w:p>
+                  <w:pPr>
+                    <w:pStyle w:val="Compact"/>
+                    <w:jc w:val="center"/>
+                  </w:pPr>
+                  <w:r>
+                    <w:t xml:space="preserve">(1.828)</w:t>
                   </w:r>
                 </w:p>
               </w:tc>
@@ -2197,31 +1987,31 @@
                     <w:jc w:val="center"/>
                   </w:pPr>
                   <w:r>
-                    <w:t xml:space="preserve">0.088</w:t>
-                  </w:r>
-                </w:p>
-              </w:tc>
-              <w:tc>
-                <w:tcPr/>
-                <w:p>
-                  <w:pPr>
-                    <w:pStyle w:val="Compact"/>
-                    <w:jc w:val="center"/>
-                  </w:pPr>
-                  <w:r>
-                    <w:t xml:space="preserve">-1.007</w:t>
-                  </w:r>
-                </w:p>
-              </w:tc>
-              <w:tc>
-                <w:tcPr/>
-                <w:p>
-                  <w:pPr>
-                    <w:pStyle w:val="Compact"/>
-                    <w:jc w:val="center"/>
-                  </w:pPr>
-                  <w:r>
-                    <w:t xml:space="preserve">-1.423</w:t>
+                    <w:t xml:space="preserve">0.100</w:t>
+                  </w:r>
+                </w:p>
+              </w:tc>
+              <w:tc>
+                <w:tcPr/>
+                <w:p>
+                  <w:pPr>
+                    <w:pStyle w:val="Compact"/>
+                    <w:jc w:val="center"/>
+                  </w:pPr>
+                  <w:r>
+                    <w:t xml:space="preserve">-1.509</w:t>
+                  </w:r>
+                </w:p>
+              </w:tc>
+              <w:tc>
+                <w:tcPr/>
+                <w:p>
+                  <w:pPr>
+                    <w:pStyle w:val="Compact"/>
+                    <w:jc w:val="center"/>
+                  </w:pPr>
+                  <w:r>
+                    <w:t xml:space="preserve">-1.604</w:t>
                   </w:r>
                 </w:p>
               </w:tc>
@@ -2243,31 +2033,31 @@
                     <w:jc w:val="center"/>
                   </w:pPr>
                   <w:r>
-                    <w:t xml:space="preserve">(0.209)</w:t>
-                  </w:r>
-                </w:p>
-              </w:tc>
-              <w:tc>
-                <w:tcPr/>
-                <w:p>
-                  <w:pPr>
-                    <w:pStyle w:val="Compact"/>
-                    <w:jc w:val="center"/>
-                  </w:pPr>
-                  <w:r>
-                    <w:t xml:space="preserve">(2.231)</w:t>
-                  </w:r>
-                </w:p>
-              </w:tc>
-              <w:tc>
-                <w:tcPr/>
-                <w:p>
-                  <w:pPr>
-                    <w:pStyle w:val="Compact"/>
-                    <w:jc w:val="center"/>
-                  </w:pPr>
-                  <w:r>
-                    <w:t xml:space="preserve">(1.756)</w:t>
+                    <w:t xml:space="preserve">(0.206)</w:t>
+                  </w:r>
+                </w:p>
+              </w:tc>
+              <w:tc>
+                <w:tcPr/>
+                <w:p>
+                  <w:pPr>
+                    <w:pStyle w:val="Compact"/>
+                    <w:jc w:val="center"/>
+                  </w:pPr>
+                  <w:r>
+                    <w:t xml:space="preserve">(2.250)</w:t>
+                  </w:r>
+                </w:p>
+              </w:tc>
+              <w:tc>
+                <w:tcPr/>
+                <w:p>
+                  <w:pPr>
+                    <w:pStyle w:val="Compact"/>
+                    <w:jc w:val="center"/>
+                  </w:pPr>
+                  <w:r>
+                    <w:t xml:space="preserve">(1.741)</w:t>
                   </w:r>
                 </w:p>
               </w:tc>
@@ -2293,31 +2083,31 @@
                     <w:jc w:val="center"/>
                   </w:pPr>
                   <w:r>
-                    <w:t xml:space="preserve">-0.377**</w:t>
-                  </w:r>
-                </w:p>
-              </w:tc>
-              <w:tc>
-                <w:tcPr/>
-                <w:p>
-                  <w:pPr>
-                    <w:pStyle w:val="Compact"/>
-                    <w:jc w:val="center"/>
-                  </w:pPr>
-                  <w:r>
-                    <w:t xml:space="preserve">-0.357</w:t>
-                  </w:r>
-                </w:p>
-              </w:tc>
-              <w:tc>
-                <w:tcPr/>
-                <w:p>
-                  <w:pPr>
-                    <w:pStyle w:val="Compact"/>
-                    <w:jc w:val="center"/>
-                  </w:pPr>
-                  <w:r>
-                    <w:t xml:space="preserve">5.203***</w:t>
+                    <w:t xml:space="preserve">-0.413**</w:t>
+                  </w:r>
+                </w:p>
+              </w:tc>
+              <w:tc>
+                <w:tcPr/>
+                <w:p>
+                  <w:pPr>
+                    <w:pStyle w:val="Compact"/>
+                    <w:jc w:val="center"/>
+                  </w:pPr>
+                  <w:r>
+                    <w:t xml:space="preserve">-0.075</w:t>
+                  </w:r>
+                </w:p>
+              </w:tc>
+              <w:tc>
+                <w:tcPr/>
+                <w:p>
+                  <w:pPr>
+                    <w:pStyle w:val="Compact"/>
+                    <w:jc w:val="center"/>
+                  </w:pPr>
+                  <w:r>
+                    <w:t xml:space="preserve">5.703***</w:t>
                   </w:r>
                 </w:p>
               </w:tc>
@@ -2339,31 +2129,31 @@
                     <w:jc w:val="center"/>
                   </w:pPr>
                   <w:r>
-                    <w:t xml:space="preserve">(0.186)</w:t>
-                  </w:r>
-                </w:p>
-              </w:tc>
-              <w:tc>
-                <w:tcPr/>
-                <w:p>
-                  <w:pPr>
-                    <w:pStyle w:val="Compact"/>
-                    <w:jc w:val="center"/>
-                  </w:pPr>
-                  <w:r>
-                    <w:t xml:space="preserve">(2.116)</w:t>
-                  </w:r>
-                </w:p>
-              </w:tc>
-              <w:tc>
-                <w:tcPr/>
-                <w:p>
-                  <w:pPr>
-                    <w:pStyle w:val="Compact"/>
-                    <w:jc w:val="center"/>
-                  </w:pPr>
-                  <w:r>
-                    <w:t xml:space="preserve">(1.575)</w:t>
+                    <w:t xml:space="preserve">(0.182)</w:t>
+                  </w:r>
+                </w:p>
+              </w:tc>
+              <w:tc>
+                <w:tcPr/>
+                <w:p>
+                  <w:pPr>
+                    <w:pStyle w:val="Compact"/>
+                    <w:jc w:val="center"/>
+                  </w:pPr>
+                  <w:r>
+                    <w:t xml:space="preserve">(2.130)</w:t>
+                  </w:r>
+                </w:p>
+              </w:tc>
+              <w:tc>
+                <w:tcPr/>
+                <w:p>
+                  <w:pPr>
+                    <w:pStyle w:val="Compact"/>
+                    <w:jc w:val="center"/>
+                  </w:pPr>
+                  <w:r>
+                    <w:t xml:space="preserve">(1.569)</w:t>
                   </w:r>
                 </w:p>
               </w:tc>
@@ -2389,31 +2179,31 @@
                     <w:jc w:val="center"/>
                   </w:pPr>
                   <w:r>
-                    <w:t xml:space="preserve">0.743***</w:t>
-                  </w:r>
-                </w:p>
-              </w:tc>
-              <w:tc>
-                <w:tcPr/>
-                <w:p>
-                  <w:pPr>
-                    <w:pStyle w:val="Compact"/>
-                    <w:jc w:val="center"/>
-                  </w:pPr>
-                  <w:r>
-                    <w:t xml:space="preserve">-3.018</w:t>
-                  </w:r>
-                </w:p>
-              </w:tc>
-              <w:tc>
-                <w:tcPr/>
-                <w:p>
-                  <w:pPr>
-                    <w:pStyle w:val="Compact"/>
-                    <w:jc w:val="center"/>
-                  </w:pPr>
-                  <w:r>
-                    <w:t xml:space="preserve">-6.790***</w:t>
+                    <w:t xml:space="preserve">0.704***</w:t>
+                  </w:r>
+                </w:p>
+              </w:tc>
+              <w:tc>
+                <w:tcPr/>
+                <w:p>
+                  <w:pPr>
+                    <w:pStyle w:val="Compact"/>
+                    <w:jc w:val="center"/>
+                  </w:pPr>
+                  <w:r>
+                    <w:t xml:space="preserve">-3.275</w:t>
+                  </w:r>
+                </w:p>
+              </w:tc>
+              <w:tc>
+                <w:tcPr/>
+                <w:p>
+                  <w:pPr>
+                    <w:pStyle w:val="Compact"/>
+                    <w:jc w:val="center"/>
+                  </w:pPr>
+                  <w:r>
+                    <w:t xml:space="preserve">-6.620***</w:t>
                   </w:r>
                 </w:p>
               </w:tc>
@@ -2435,31 +2225,31 @@
                     <w:jc w:val="center"/>
                   </w:pPr>
                   <w:r>
-                    <w:t xml:space="preserve">(0.209)</w:t>
-                  </w:r>
-                </w:p>
-              </w:tc>
-              <w:tc>
-                <w:tcPr/>
-                <w:p>
-                  <w:pPr>
-                    <w:pStyle w:val="Compact"/>
-                    <w:jc w:val="center"/>
-                  </w:pPr>
-                  <w:r>
-                    <w:t xml:space="preserve">(2.091)</w:t>
-                  </w:r>
-                </w:p>
-              </w:tc>
-              <w:tc>
-                <w:tcPr/>
-                <w:p>
-                  <w:pPr>
-                    <w:pStyle w:val="Compact"/>
-                    <w:jc w:val="center"/>
-                  </w:pPr>
-                  <w:r>
-                    <w:t xml:space="preserve">(1.641)</w:t>
+                    <w:t xml:space="preserve">(0.205)</w:t>
+                  </w:r>
+                </w:p>
+              </w:tc>
+              <w:tc>
+                <w:tcPr/>
+                <w:p>
+                  <w:pPr>
+                    <w:pStyle w:val="Compact"/>
+                    <w:jc w:val="center"/>
+                  </w:pPr>
+                  <w:r>
+                    <w:t xml:space="preserve">(2.092)</w:t>
+                  </w:r>
+                </w:p>
+              </w:tc>
+              <w:tc>
+                <w:tcPr/>
+                <w:p>
+                  <w:pPr>
+                    <w:pStyle w:val="Compact"/>
+                    <w:jc w:val="center"/>
+                  </w:pPr>
+                  <w:r>
+                    <w:t xml:space="preserve">(1.626)</w:t>
                   </w:r>
                 </w:p>
               </w:tc>
@@ -2485,31 +2275,31 @@
                     <w:jc w:val="center"/>
                   </w:pPr>
                   <w:r>
-                    <w:t xml:space="preserve">-0.024</w:t>
-                  </w:r>
-                </w:p>
-              </w:tc>
-              <w:tc>
-                <w:tcPr/>
-                <w:p>
-                  <w:pPr>
-                    <w:pStyle w:val="Compact"/>
-                    <w:jc w:val="center"/>
-                  </w:pPr>
-                  <w:r>
-                    <w:t xml:space="preserve">3.119</w:t>
-                  </w:r>
-                </w:p>
-              </w:tc>
-              <w:tc>
-                <w:tcPr/>
-                <w:p>
-                  <w:pPr>
-                    <w:pStyle w:val="Compact"/>
-                    <w:jc w:val="center"/>
-                  </w:pPr>
-                  <w:r>
-                    <w:t xml:space="preserve">2.048</w:t>
+                    <w:t xml:space="preserve">0.007</w:t>
+                  </w:r>
+                </w:p>
+              </w:tc>
+              <w:tc>
+                <w:tcPr/>
+                <w:p>
+                  <w:pPr>
+                    <w:pStyle w:val="Compact"/>
+                    <w:jc w:val="center"/>
+                  </w:pPr>
+                  <w:r>
+                    <w:t xml:space="preserve">3.124</w:t>
+                  </w:r>
+                </w:p>
+              </w:tc>
+              <w:tc>
+                <w:tcPr/>
+                <w:p>
+                  <w:pPr>
+                    <w:pStyle w:val="Compact"/>
+                    <w:jc w:val="center"/>
+                  </w:pPr>
+                  <w:r>
+                    <w:t xml:space="preserve">1.656</w:t>
                   </w:r>
                 </w:p>
               </w:tc>
@@ -2531,31 +2321,31 @@
                     <w:jc w:val="center"/>
                   </w:pPr>
                   <w:r>
-                    <w:t xml:space="preserve">(0.261)</w:t>
-                  </w:r>
-                </w:p>
-              </w:tc>
-              <w:tc>
-                <w:tcPr/>
-                <w:p>
-                  <w:pPr>
-                    <w:pStyle w:val="Compact"/>
-                    <w:jc w:val="center"/>
-                  </w:pPr>
-                  <w:r>
-                    <w:t xml:space="preserve">(2.875)</w:t>
-                  </w:r>
-                </w:p>
-              </w:tc>
-              <w:tc>
-                <w:tcPr/>
-                <w:p>
-                  <w:pPr>
-                    <w:pStyle w:val="Compact"/>
-                    <w:jc w:val="center"/>
-                  </w:pPr>
-                  <w:r>
-                    <w:t xml:space="preserve">(2.242)</w:t>
+                    <w:t xml:space="preserve">(0.257)</w:t>
+                  </w:r>
+                </w:p>
+              </w:tc>
+              <w:tc>
+                <w:tcPr/>
+                <w:p>
+                  <w:pPr>
+                    <w:pStyle w:val="Compact"/>
+                    <w:jc w:val="center"/>
+                  </w:pPr>
+                  <w:r>
+                    <w:t xml:space="preserve">(2.871)</w:t>
+                  </w:r>
+                </w:p>
+              </w:tc>
+              <w:tc>
+                <w:tcPr/>
+                <w:p>
+                  <w:pPr>
+                    <w:pStyle w:val="Compact"/>
+                    <w:jc w:val="center"/>
+                  </w:pPr>
+                  <w:r>
+                    <w:t xml:space="preserve">(2.234)</w:t>
                   </w:r>
                 </w:p>
               </w:tc>
@@ -2581,31 +2371,31 @@
                     <w:jc w:val="center"/>
                   </w:pPr>
                   <w:r>
-                    <w:t xml:space="preserve">-0.302</w:t>
-                  </w:r>
-                </w:p>
-              </w:tc>
-              <w:tc>
-                <w:tcPr/>
-                <w:p>
-                  <w:pPr>
-                    <w:pStyle w:val="Compact"/>
-                    <w:jc w:val="center"/>
-                  </w:pPr>
-                  <w:r>
-                    <w:t xml:space="preserve">1.211</w:t>
-                  </w:r>
-                </w:p>
-              </w:tc>
-              <w:tc>
-                <w:tcPr/>
-                <w:p>
-                  <w:pPr>
-                    <w:pStyle w:val="Compact"/>
-                    <w:jc w:val="center"/>
-                  </w:pPr>
-                  <w:r>
-                    <w:t xml:space="preserve">3.490</w:t>
+                    <w:t xml:space="preserve">-0.270</w:t>
+                  </w:r>
+                </w:p>
+              </w:tc>
+              <w:tc>
+                <w:tcPr/>
+                <w:p>
+                  <w:pPr>
+                    <w:pStyle w:val="Compact"/>
+                    <w:jc w:val="center"/>
+                  </w:pPr>
+                  <w:r>
+                    <w:t xml:space="preserve">1.507</w:t>
+                  </w:r>
+                </w:p>
+              </w:tc>
+              <w:tc>
+                <w:tcPr/>
+                <w:p>
+                  <w:pPr>
+                    <w:pStyle w:val="Compact"/>
+                    <w:jc w:val="center"/>
+                  </w:pPr>
+                  <w:r>
+                    <w:t xml:space="preserve">3.136</w:t>
                   </w:r>
                 </w:p>
               </w:tc>
@@ -2627,31 +2417,31 @@
                     <w:jc w:val="center"/>
                   </w:pPr>
                   <w:r>
-                    <w:t xml:space="preserve">(0.262)</w:t>
-                  </w:r>
-                </w:p>
-              </w:tc>
-              <w:tc>
-                <w:tcPr/>
-                <w:p>
-                  <w:pPr>
-                    <w:pStyle w:val="Compact"/>
-                    <w:jc w:val="center"/>
-                  </w:pPr>
-                  <w:r>
-                    <w:t xml:space="preserve">(2.977)</w:t>
-                  </w:r>
-                </w:p>
-              </w:tc>
-              <w:tc>
-                <w:tcPr/>
-                <w:p>
-                  <w:pPr>
-                    <w:pStyle w:val="Compact"/>
-                    <w:jc w:val="center"/>
-                  </w:pPr>
-                  <w:r>
-                    <w:t xml:space="preserve">(2.176)</w:t>
+                    <w:t xml:space="preserve">(0.259)</w:t>
+                  </w:r>
+                </w:p>
+              </w:tc>
+              <w:tc>
+                <w:tcPr/>
+                <w:p>
+                  <w:pPr>
+                    <w:pStyle w:val="Compact"/>
+                    <w:jc w:val="center"/>
+                  </w:pPr>
+                  <w:r>
+                    <w:t xml:space="preserve">(3.026)</w:t>
+                  </w:r>
+                </w:p>
+              </w:tc>
+              <w:tc>
+                <w:tcPr/>
+                <w:p>
+                  <w:pPr>
+                    <w:pStyle w:val="Compact"/>
+                    <w:jc w:val="center"/>
+                  </w:pPr>
+                  <w:r>
+                    <w:t xml:space="preserve">(2.167)</w:t>
                   </w:r>
                 </w:p>
               </w:tc>
@@ -2677,31 +2467,31 @@
                     <w:jc w:val="center"/>
                   </w:pPr>
                   <w:r>
-                    <w:t xml:space="preserve">0.425</w:t>
-                  </w:r>
-                </w:p>
-              </w:tc>
-              <w:tc>
-                <w:tcPr/>
-                <w:p>
-                  <w:pPr>
-                    <w:pStyle w:val="Compact"/>
-                    <w:jc w:val="center"/>
-                  </w:pPr>
-                  <w:r>
-                    <w:t xml:space="preserve">3.394</w:t>
-                  </w:r>
-                </w:p>
-              </w:tc>
-              <w:tc>
-                <w:tcPr/>
-                <w:p>
-                  <w:pPr>
-                    <w:pStyle w:val="Compact"/>
-                    <w:jc w:val="center"/>
-                  </w:pPr>
-                  <w:r>
-                    <w:t xml:space="preserve">0.384</w:t>
+                    <w:t xml:space="preserve">0.423</w:t>
+                  </w:r>
+                </w:p>
+              </w:tc>
+              <w:tc>
+                <w:tcPr/>
+                <w:p>
+                  <w:pPr>
+                    <w:pStyle w:val="Compact"/>
+                    <w:jc w:val="center"/>
+                  </w:pPr>
+                  <w:r>
+                    <w:t xml:space="preserve">3.919</w:t>
+                  </w:r>
+                </w:p>
+              </w:tc>
+              <w:tc>
+                <w:tcPr/>
+                <w:p>
+                  <w:pPr>
+                    <w:pStyle w:val="Compact"/>
+                    <w:jc w:val="center"/>
+                  </w:pPr>
+                  <w:r>
+                    <w:t xml:space="preserve">0.320</w:t>
                   </w:r>
                 </w:p>
               </w:tc>
@@ -2723,31 +2513,31 @@
                     <w:jc w:val="center"/>
                   </w:pPr>
                   <w:r>
-                    <w:t xml:space="preserve">(0.302)</w:t>
-                  </w:r>
-                </w:p>
-              </w:tc>
-              <w:tc>
-                <w:tcPr/>
-                <w:p>
-                  <w:pPr>
-                    <w:pStyle w:val="Compact"/>
-                    <w:jc w:val="center"/>
-                  </w:pPr>
-                  <w:r>
-                    <w:t xml:space="preserve">(2.937)</w:t>
-                  </w:r>
-                </w:p>
-              </w:tc>
-              <w:tc>
-                <w:tcPr/>
-                <w:p>
-                  <w:pPr>
-                    <w:pStyle w:val="Compact"/>
-                    <w:jc w:val="center"/>
-                  </w:pPr>
-                  <w:r>
-                    <w:t xml:space="preserve">(2.340)</w:t>
+                    <w:t xml:space="preserve">(0.299)</w:t>
+                  </w:r>
+                </w:p>
+              </w:tc>
+              <w:tc>
+                <w:tcPr/>
+                <w:p>
+                  <w:pPr>
+                    <w:pStyle w:val="Compact"/>
+                    <w:jc w:val="center"/>
+                  </w:pPr>
+                  <w:r>
+                    <w:t xml:space="preserve">(2.964)</w:t>
+                  </w:r>
+                </w:p>
+              </w:tc>
+              <w:tc>
+                <w:tcPr/>
+                <w:p>
+                  <w:pPr>
+                    <w:pStyle w:val="Compact"/>
+                    <w:jc w:val="center"/>
+                  </w:pPr>
+                  <w:r>
+                    <w:t xml:space="preserve">(2.337)</w:t>
                   </w:r>
                 </w:p>
               </w:tc>
@@ -2773,31 +2563,31 @@
                     <w:jc w:val="center"/>
                   </w:pPr>
                   <w:r>
-                    <w:t xml:space="preserve">-0.044</w:t>
-                  </w:r>
-                </w:p>
-              </w:tc>
-              <w:tc>
-                <w:tcPr/>
-                <w:p>
-                  <w:pPr>
-                    <w:pStyle w:val="Compact"/>
-                    <w:jc w:val="center"/>
-                  </w:pPr>
-                  <w:r>
-                    <w:t xml:space="preserve">3.088</w:t>
-                  </w:r>
-                </w:p>
-              </w:tc>
-              <w:tc>
-                <w:tcPr/>
-                <w:p>
-                  <w:pPr>
-                    <w:pStyle w:val="Compact"/>
-                    <w:jc w:val="center"/>
-                  </w:pPr>
-                  <w:r>
-                    <w:t xml:space="preserve">2.927</w:t>
+                    <w:t xml:space="preserve">-0.042</w:t>
+                  </w:r>
+                </w:p>
+              </w:tc>
+              <w:tc>
+                <w:tcPr/>
+                <w:p>
+                  <w:pPr>
+                    <w:pStyle w:val="Compact"/>
+                    <w:jc w:val="center"/>
+                  </w:pPr>
+                  <w:r>
+                    <w:t xml:space="preserve">3.665</w:t>
+                  </w:r>
+                </w:p>
+              </w:tc>
+              <w:tc>
+                <w:tcPr/>
+                <w:p>
+                  <w:pPr>
+                    <w:pStyle w:val="Compact"/>
+                    <w:jc w:val="center"/>
+                  </w:pPr>
+                  <w:r>
+                    <w:t xml:space="preserve">2.935</w:t>
                   </w:r>
                 </w:p>
               </w:tc>
@@ -2819,31 +2609,31 @@
                     <w:jc w:val="center"/>
                   </w:pPr>
                   <w:r>
-                    <w:t xml:space="preserve">(0.296)</w:t>
-                  </w:r>
-                </w:p>
-              </w:tc>
-              <w:tc>
-                <w:tcPr/>
-                <w:p>
-                  <w:pPr>
-                    <w:pStyle w:val="Compact"/>
-                    <w:jc w:val="center"/>
-                  </w:pPr>
-                  <w:r>
-                    <w:t xml:space="preserve">(2.886)</w:t>
-                  </w:r>
-                </w:p>
-              </w:tc>
-              <w:tc>
-                <w:tcPr/>
-                <w:p>
-                  <w:pPr>
-                    <w:pStyle w:val="Compact"/>
-                    <w:jc w:val="center"/>
-                  </w:pPr>
-                  <w:r>
-                    <w:t xml:space="preserve">(2.310)</w:t>
+                    <w:t xml:space="preserve">(0.293)</w:t>
+                  </w:r>
+                </w:p>
+              </w:tc>
+              <w:tc>
+                <w:tcPr/>
+                <w:p>
+                  <w:pPr>
+                    <w:pStyle w:val="Compact"/>
+                    <w:jc w:val="center"/>
+                  </w:pPr>
+                  <w:r>
+                    <w:t xml:space="preserve">(2.917)</w:t>
+                  </w:r>
+                </w:p>
+              </w:tc>
+              <w:tc>
+                <w:tcPr/>
+                <w:p>
+                  <w:pPr>
+                    <w:pStyle w:val="Compact"/>
+                    <w:jc w:val="center"/>
+                  </w:pPr>
+                  <w:r>
+                    <w:t xml:space="preserve">(2.311)</w:t>
                   </w:r>
                 </w:p>
               </w:tc>
@@ -2857,43 +2647,43 @@
                     <w:jc w:val="center"/>
                   </w:pPr>
                   <w:r>
-                    <w:t xml:space="preserve">Age</w:t>
-                  </w:r>
-                </w:p>
-              </w:tc>
-              <w:tc>
-                <w:tcPr/>
-                <w:p>
-                  <w:pPr>
-                    <w:pStyle w:val="Compact"/>
-                    <w:jc w:val="center"/>
-                  </w:pPr>
-                  <w:r>
-                    <w:t xml:space="preserve">0.007**</w:t>
-                  </w:r>
-                </w:p>
-              </w:tc>
-              <w:tc>
-                <w:tcPr/>
-                <w:p>
-                  <w:pPr>
-                    <w:pStyle w:val="Compact"/>
-                    <w:jc w:val="center"/>
-                  </w:pPr>
-                  <w:r>
-                    <w:t xml:space="preserve">-0.015</w:t>
-                  </w:r>
-                </w:p>
-              </w:tc>
-              <w:tc>
-                <w:tcPr/>
-                <w:p>
-                  <w:pPr>
-                    <w:pStyle w:val="Compact"/>
-                    <w:jc w:val="center"/>
-                  </w:pPr>
-                  <w:r>
-                    <w:t xml:space="preserve">-0.101***</w:t>
+                    <w:t xml:space="preserve">(Intercept)</w:t>
+                  </w:r>
+                </w:p>
+              </w:tc>
+              <w:tc>
+                <w:tcPr/>
+                <w:p>
+                  <w:pPr>
+                    <w:pStyle w:val="Compact"/>
+                    <w:jc w:val="center"/>
+                  </w:pPr>
+                  <w:r>
+                    <w:t xml:space="preserve">0.048</w:t>
+                  </w:r>
+                </w:p>
+              </w:tc>
+              <w:tc>
+                <w:tcPr/>
+                <w:p>
+                  <w:pPr>
+                    <w:pStyle w:val="Compact"/>
+                    <w:jc w:val="center"/>
+                  </w:pPr>
+                  <w:r>
+                    <w:t xml:space="preserve">17.374***</w:t>
+                  </w:r>
+                </w:p>
+              </w:tc>
+              <w:tc>
+                <w:tcPr/>
+                <w:p>
+                  <w:pPr>
+                    <w:pStyle w:val="Compact"/>
+                    <w:jc w:val="center"/>
+                  </w:pPr>
+                  <w:r>
+                    <w:t xml:space="preserve">18.665***</w:t>
                   </w:r>
                 </w:p>
               </w:tc>
@@ -2915,511 +2705,31 @@
                     <w:jc w:val="center"/>
                   </w:pPr>
                   <w:r>
-                    <w:t xml:space="preserve">(0.003)</w:t>
-                  </w:r>
-                </w:p>
-              </w:tc>
-              <w:tc>
-                <w:tcPr/>
-                <w:p>
-                  <w:pPr>
-                    <w:pStyle w:val="Compact"/>
-                    <w:jc w:val="center"/>
-                  </w:pPr>
-                  <w:r>
-                    <w:t xml:space="preserve">(0.033)</w:t>
-                  </w:r>
-                </w:p>
-              </w:tc>
-              <w:tc>
-                <w:tcPr/>
-                <w:p>
-                  <w:pPr>
-                    <w:pStyle w:val="Compact"/>
-                    <w:jc w:val="center"/>
-                  </w:pPr>
-                  <w:r>
-                    <w:t xml:space="preserve">(0.025)</w:t>
-                  </w:r>
-                </w:p>
-              </w:tc>
-            </w:tr>
-            <w:tr>
-              <w:tc>
-                <w:tcPr/>
-                <w:p>
-                  <w:pPr>
-                    <w:pStyle w:val="Compact"/>
-                    <w:jc w:val="center"/>
-                  </w:pPr>
-                  <w:r>
-                    <w:t xml:space="preserve">Male</w:t>
-                  </w:r>
-                </w:p>
-              </w:tc>
-              <w:tc>
-                <w:tcPr/>
-                <w:p>
-                  <w:pPr>
-                    <w:pStyle w:val="Compact"/>
-                    <w:jc w:val="center"/>
-                  </w:pPr>
-                  <w:r>
-                    <w:t xml:space="preserve">-0.042</w:t>
-                  </w:r>
-                </w:p>
-              </w:tc>
-              <w:tc>
-                <w:tcPr/>
-                <w:p>
-                  <w:pPr>
-                    <w:pStyle w:val="Compact"/>
-                    <w:jc w:val="center"/>
-                  </w:pPr>
-                  <w:r>
-                    <w:t xml:space="preserve">-0.180</w:t>
-                  </w:r>
-                </w:p>
-              </w:tc>
-              <w:tc>
-                <w:tcPr/>
-                <w:p>
-                  <w:pPr>
-                    <w:pStyle w:val="Compact"/>
-                    <w:jc w:val="center"/>
-                  </w:pPr>
-                  <w:r>
-                    <w:t xml:space="preserve">0.601</w:t>
-                  </w:r>
-                </w:p>
-              </w:tc>
-            </w:tr>
-            <w:tr>
-              <w:tc>
-                <w:tcPr/>
-                <w:p>
-                  <w:pPr>
-                    <w:pStyle w:val="Compact"/>
-                  </w:pPr>
-                </w:p>
-              </w:tc>
-              <w:tc>
-                <w:tcPr/>
-                <w:p>
-                  <w:pPr>
-                    <w:pStyle w:val="Compact"/>
-                    <w:jc w:val="center"/>
-                  </w:pPr>
-                  <w:r>
-                    <w:t xml:space="preserve">(0.093)</w:t>
-                  </w:r>
-                </w:p>
-              </w:tc>
-              <w:tc>
-                <w:tcPr/>
-                <w:p>
-                  <w:pPr>
-                    <w:pStyle w:val="Compact"/>
-                    <w:jc w:val="center"/>
-                  </w:pPr>
-                  <w:r>
-                    <w:t xml:space="preserve">(1.026)</w:t>
-                  </w:r>
-                </w:p>
-              </w:tc>
-              <w:tc>
-                <w:tcPr/>
-                <w:p>
-                  <w:pPr>
-                    <w:pStyle w:val="Compact"/>
-                    <w:jc w:val="center"/>
-                  </w:pPr>
-                  <w:r>
-                    <w:t xml:space="preserve">(0.718)</w:t>
-                  </w:r>
-                </w:p>
-              </w:tc>
-            </w:tr>
-            <w:tr>
-              <w:tc>
-                <w:tcPr/>
-                <w:p>
-                  <w:pPr>
-                    <w:pStyle w:val="Compact"/>
-                    <w:jc w:val="center"/>
-                  </w:pPr>
-                  <w:r>
-                    <w:t xml:space="preserve">White</w:t>
-                  </w:r>
-                </w:p>
-              </w:tc>
-              <w:tc>
-                <w:tcPr/>
-                <w:p>
-                  <w:pPr>
-                    <w:pStyle w:val="Compact"/>
-                    <w:jc w:val="center"/>
-                  </w:pPr>
-                  <w:r>
-                    <w:t xml:space="preserve">-0.261**</w:t>
-                  </w:r>
-                </w:p>
-              </w:tc>
-              <w:tc>
-                <w:tcPr/>
-                <w:p>
-                  <w:pPr>
-                    <w:pStyle w:val="Compact"/>
-                    <w:jc w:val="center"/>
-                  </w:pPr>
-                  <w:r>
-                    <w:t xml:space="preserve">0.959</w:t>
-                  </w:r>
-                </w:p>
-              </w:tc>
-              <w:tc>
-                <w:tcPr/>
-                <w:p>
-                  <w:pPr>
-                    <w:pStyle w:val="Compact"/>
-                    <w:jc w:val="center"/>
-                  </w:pPr>
-                  <w:r>
-                    <w:t xml:space="preserve">2.549***</w:t>
-                  </w:r>
-                </w:p>
-              </w:tc>
-            </w:tr>
-            <w:tr>
-              <w:tc>
-                <w:tcPr/>
-                <w:p>
-                  <w:pPr>
-                    <w:pStyle w:val="Compact"/>
-                  </w:pPr>
-                </w:p>
-              </w:tc>
-              <w:tc>
-                <w:tcPr/>
-                <w:p>
-                  <w:pPr>
-                    <w:pStyle w:val="Compact"/>
-                    <w:jc w:val="center"/>
-                  </w:pPr>
-                  <w:r>
-                    <w:t xml:space="preserve">(0.106)</w:t>
-                  </w:r>
-                </w:p>
-              </w:tc>
-              <w:tc>
-                <w:tcPr/>
-                <w:p>
-                  <w:pPr>
-                    <w:pStyle w:val="Compact"/>
-                    <w:jc w:val="center"/>
-                  </w:pPr>
-                  <w:r>
-                    <w:t xml:space="preserve">(1.201)</w:t>
-                  </w:r>
-                </w:p>
-              </w:tc>
-              <w:tc>
-                <w:tcPr/>
-                <w:p>
-                  <w:pPr>
-                    <w:pStyle w:val="Compact"/>
-                    <w:jc w:val="center"/>
-                  </w:pPr>
-                  <w:r>
-                    <w:t xml:space="preserve">(0.854)</w:t>
-                  </w:r>
-                </w:p>
-              </w:tc>
-            </w:tr>
-            <w:tr>
-              <w:tc>
-                <w:tcPr/>
-                <w:p>
-                  <w:pPr>
-                    <w:pStyle w:val="Compact"/>
-                    <w:jc w:val="center"/>
-                  </w:pPr>
-                  <w:r>
-                    <w:t xml:space="preserve">Education</w:t>
-                  </w:r>
-                </w:p>
-              </w:tc>
-              <w:tc>
-                <w:tcPr/>
-                <w:p>
-                  <w:pPr>
-                    <w:pStyle w:val="Compact"/>
-                    <w:jc w:val="center"/>
-                  </w:pPr>
-                  <w:r>
-                    <w:t xml:space="preserve">-0.023</w:t>
-                  </w:r>
-                </w:p>
-              </w:tc>
-              <w:tc>
-                <w:tcPr/>
-                <w:p>
-                  <w:pPr>
-                    <w:pStyle w:val="Compact"/>
-                    <w:jc w:val="center"/>
-                  </w:pPr>
-                  <w:r>
-                    <w:t xml:space="preserve">1.166***</w:t>
-                  </w:r>
-                </w:p>
-              </w:tc>
-              <w:tc>
-                <w:tcPr/>
-                <w:p>
-                  <w:pPr>
-                    <w:pStyle w:val="Compact"/>
-                    <w:jc w:val="center"/>
-                  </w:pPr>
-                  <w:r>
-                    <w:t xml:space="preserve">0.410**</w:t>
-                  </w:r>
-                </w:p>
-              </w:tc>
-            </w:tr>
-            <w:tr>
-              <w:tc>
-                <w:tcPr/>
-                <w:p>
-                  <w:pPr>
-                    <w:pStyle w:val="Compact"/>
-                  </w:pPr>
-                </w:p>
-              </w:tc>
-              <w:tc>
-                <w:tcPr/>
-                <w:p>
-                  <w:pPr>
-                    <w:pStyle w:val="Compact"/>
-                    <w:jc w:val="center"/>
-                  </w:pPr>
-                  <w:r>
-                    <w:t xml:space="preserve">(0.027)</w:t>
-                  </w:r>
-                </w:p>
-              </w:tc>
-              <w:tc>
-                <w:tcPr/>
-                <w:p>
-                  <w:pPr>
-                    <w:pStyle w:val="Compact"/>
-                    <w:jc w:val="center"/>
-                  </w:pPr>
-                  <w:r>
-                    <w:t xml:space="preserve">(0.291)</w:t>
-                  </w:r>
-                </w:p>
-              </w:tc>
-              <w:tc>
-                <w:tcPr/>
-                <w:p>
-                  <w:pPr>
-                    <w:pStyle w:val="Compact"/>
-                    <w:jc w:val="center"/>
-                  </w:pPr>
-                  <w:r>
-                    <w:t xml:space="preserve">(0.207)</w:t>
-                  </w:r>
-                </w:p>
-              </w:tc>
-            </w:tr>
-            <w:tr>
-              <w:tc>
-                <w:tcPr/>
-                <w:p>
-                  <w:pPr>
-                    <w:pStyle w:val="Compact"/>
-                    <w:jc w:val="center"/>
-                  </w:pPr>
-                  <w:r>
-                    <w:t xml:space="preserve">Income</w:t>
-                  </w:r>
-                </w:p>
-              </w:tc>
-              <w:tc>
-                <w:tcPr/>
-                <w:p>
-                  <w:pPr>
-                    <w:pStyle w:val="Compact"/>
-                    <w:jc w:val="center"/>
-                  </w:pPr>
-                  <w:r>
-                    <w:t xml:space="preserve">-0.031*</w:t>
-                  </w:r>
-                </w:p>
-              </w:tc>
-              <w:tc>
-                <w:tcPr/>
-                <w:p>
-                  <w:pPr>
-                    <w:pStyle w:val="Compact"/>
-                    <w:jc w:val="center"/>
-                  </w:pPr>
-                  <w:r>
-                    <w:t xml:space="preserve">0.310</w:t>
-                  </w:r>
-                </w:p>
-              </w:tc>
-              <w:tc>
-                <w:tcPr/>
-                <w:p>
-                  <w:pPr>
-                    <w:pStyle w:val="Compact"/>
-                    <w:jc w:val="center"/>
-                  </w:pPr>
-                  <w:r>
-                    <w:t xml:space="preserve">0.496***</w:t>
-                  </w:r>
-                </w:p>
-              </w:tc>
-            </w:tr>
-            <w:tr>
-              <w:tc>
-                <w:tcPr/>
-                <w:p>
-                  <w:pPr>
-                    <w:pStyle w:val="Compact"/>
-                  </w:pPr>
-                </w:p>
-              </w:tc>
-              <w:tc>
-                <w:tcPr/>
-                <w:p>
-                  <w:pPr>
-                    <w:pStyle w:val="Compact"/>
-                    <w:jc w:val="center"/>
-                  </w:pPr>
-                  <w:r>
-                    <w:t xml:space="preserve">(0.019)</w:t>
-                  </w:r>
-                </w:p>
-              </w:tc>
-              <w:tc>
-                <w:tcPr/>
-                <w:p>
-                  <w:pPr>
-                    <w:pStyle w:val="Compact"/>
-                    <w:jc w:val="center"/>
-                  </w:pPr>
-                  <w:r>
-                    <w:t xml:space="preserve">(0.211)</w:t>
-                  </w:r>
-                </w:p>
-              </w:tc>
-              <w:tc>
-                <w:tcPr/>
-                <w:p>
-                  <w:pPr>
-                    <w:pStyle w:val="Compact"/>
-                    <w:jc w:val="center"/>
-                  </w:pPr>
-                  <w:r>
-                    <w:t xml:space="preserve">(0.144)</w:t>
-                  </w:r>
-                </w:p>
-              </w:tc>
-            </w:tr>
-            <w:tr>
-              <w:tc>
-                <w:tcPr/>
-                <w:p>
-                  <w:pPr>
-                    <w:pStyle w:val="Compact"/>
-                    <w:jc w:val="center"/>
-                  </w:pPr>
-                  <w:r>
-                    <w:t xml:space="preserve">(Intercept)</w:t>
-                  </w:r>
-                </w:p>
-              </w:tc>
-              <w:tc>
-                <w:tcPr/>
-                <w:p>
-                  <w:pPr>
-                    <w:pStyle w:val="Compact"/>
-                    <w:jc w:val="center"/>
-                  </w:pPr>
-                  <w:r>
-                    <w:t xml:space="preserve">0.104</w:t>
-                  </w:r>
-                </w:p>
-              </w:tc>
-              <w:tc>
-                <w:tcPr/>
-                <w:p>
-                  <w:pPr>
-                    <w:pStyle w:val="Compact"/>
-                    <w:jc w:val="center"/>
-                  </w:pPr>
-                  <w:r>
-                    <w:t xml:space="preserve">12.291***</w:t>
-                  </w:r>
-                </w:p>
-              </w:tc>
-              <w:tc>
-                <w:tcPr/>
-                <w:p>
-                  <w:pPr>
-                    <w:pStyle w:val="Compact"/>
-                    <w:jc w:val="center"/>
-                  </w:pPr>
-                  <w:r>
-                    <w:t xml:space="preserve">18.209***</w:t>
-                  </w:r>
-                </w:p>
-              </w:tc>
-            </w:tr>
-            <w:tr>
-              <w:tc>
-                <w:tcPr/>
-                <w:p>
-                  <w:pPr>
-                    <w:pStyle w:val="Compact"/>
-                  </w:pPr>
-                </w:p>
-              </w:tc>
-              <w:tc>
-                <w:tcPr/>
-                <w:p>
-                  <w:pPr>
-                    <w:pStyle w:val="Compact"/>
-                    <w:jc w:val="center"/>
-                  </w:pPr>
-                  <w:r>
-                    <w:t xml:space="preserve">(0.221)</w:t>
-                  </w:r>
-                </w:p>
-              </w:tc>
-              <w:tc>
-                <w:tcPr/>
-                <w:p>
-                  <w:pPr>
-                    <w:pStyle w:val="Compact"/>
-                    <w:jc w:val="center"/>
-                  </w:pPr>
-                  <w:r>
-                    <w:t xml:space="preserve">(2.457)</w:t>
-                  </w:r>
-                </w:p>
-              </w:tc>
-              <w:tc>
-                <w:tcPr/>
-                <w:p>
-                  <w:pPr>
-                    <w:pStyle w:val="Compact"/>
-                    <w:jc w:val="center"/>
-                  </w:pPr>
-                  <w:r>
-                    <w:t xml:space="preserve">(1.803)</w:t>
+                    <w:t xml:space="preserve">(0.145)</w:t>
+                  </w:r>
+                </w:p>
+              </w:tc>
+              <w:tc>
+                <w:tcPr/>
+                <w:p>
+                  <w:pPr>
+                    <w:pStyle w:val="Compact"/>
+                    <w:jc w:val="center"/>
+                  </w:pPr>
+                  <w:r>
+                    <w:t xml:space="preserve">(1.712)</w:t>
+                  </w:r>
+                </w:p>
+              </w:tc>
+              <w:tc>
+                <w:tcPr/>
+                <w:p>
+                  <w:pPr>
+                    <w:pStyle w:val="Compact"/>
+                    <w:jc w:val="center"/>
+                  </w:pPr>
+                  <w:r>
+                    <w:t xml:space="preserve">(1.271)</w:t>
                   </w:r>
                 </w:p>
               </w:tc>
@@ -3505,7 +2815,7 @@
         <w:pStyle w:val="FirstParagraph"/>
       </w:pPr>
       <w:r>
-        <w:t xml:space="preserve">For fossil fuels, conservative Republicans were significantly more likely than the reference group to have any positive WTP (b = 0.74, log-odds scale), predicted at 68.4% in the control condition compared to 41.4% for liberal Democrats (b = -0.38,</w:t>
+        <w:t xml:space="preserve">For fossil fuels, conservative Republicans were significantly more likely than the reference group to have any positive WTP (b = 0.70, log-odds scale), predicted at 68.0% in the control condition compared to 41.0% for liberal Democrats (b = -0.41,</w:t>
       </w:r>
       <w:r>
         <w:t xml:space="preserve"> </w:t>
@@ -3521,7 +2831,7 @@
         <w:t xml:space="preserve"> </w:t>
       </w:r>
       <w:r>
-        <w:t xml:space="preserve">= 0.043). However, the cues were not significant nor were the interactions between the cues and political beliefs.</w:t>
+        <w:t xml:space="preserve">= 0.023). However, the cues were not significant nor were the interactions between the cues and political beliefs.</w:t>
       </w:r>
     </w:p>
     <w:tbl>
@@ -3548,7 +2858,7 @@
               <w:pStyle w:val="ImageCaption"/>
             </w:pPr>
             <w:r>
-              <w:t xml:space="preserve">Figure 2: Predicted willingness-to-pay for fossil fuels, among respondents with any positive WTP, by cue condition and political identity (survey-weighted OLS predictions with 95% CIs; age, male, white, education, and income held at their survey-weighted means)</w:t>
+              <w:t xml:space="preserve">Figure 2: Predicted willingness-to-pay for fossil fuels, among respondents with any positive WTP, by cue condition and political identity (survey-weighted OLS predictions with 95% CIs)</w:t>
             </w:r>
           </w:p>
           <w:p>
@@ -3627,7 +2937,7 @@
               <w:pStyle w:val="ImageCaption"/>
             </w:pPr>
             <w:r>
-              <w:t xml:space="preserve">Figure 3: Predicted willingness-to-pay for renewables by cue condition and political identity (survey-weighted OLS predictions with 95% CIs; age, male, white, education, and income held at their survey-weighted means)</w:t>
+              <w:t xml:space="preserve">Figure 3: Predicted willingness-to-pay for renewables by cue condition and political identity (survey-weighted OLS predictions with 95% CIs)</w:t>
             </w:r>
           </w:p>
           <w:p>
@@ -3687,7 +2997,7 @@
         <w:pStyle w:val="BodyText"/>
       </w:pPr>
       <w:r>
-        <w:t xml:space="preserve">Neither the Trump cue nor its interaction with conservative Republican identity significantly predicted participation or, among those with positive WTP, the dollar amount: predicted participation for conservative Republicans was 68.4% in the control condition versus 71.9% in the Trump cue,</w:t>
+        <w:t xml:space="preserve">Neither the Trump cue nor its interaction with conservative Republican identity significantly predicted participation or, among those with positive WTP, the dollar amount: predicted participation for conservative Republicans was 68.0% in the control condition versus 71.3% in the Trump cue, and the predicted amount conditional on paying something was $14.10 versus $14.41.</w:t>
       </w:r>
     </w:p>
     <w:p>
@@ -3695,15 +3005,7 @@
         <w:pStyle w:val="BodyText"/>
       </w:pPr>
       <w:r>
-        <w:t xml:space="preserve">and the predicted amount conditional on paying something was $14.38 versus $14.45.</w:t>
-      </w:r>
-    </w:p>
-    <w:p>
-      <w:pPr>
-        <w:pStyle w:val="BodyText"/>
-      </w:pPr>
-      <w:r>
-        <w:t xml:space="preserve">Looking to renewables, liberal Democrats were willing to pay $5.20 more, on average, and in the climate condition the amount increased further by $3.49 (</w:t>
+        <w:t xml:space="preserve">Looking to renewables, liberal Democrats were willing to pay $5.70 more, on average, and for those in the climate condition the amount increased further by $3.14 (</w:t>
       </w:r>
       <w:r>
         <w:rPr>
@@ -3716,7 +3018,7 @@
         <w:t xml:space="preserve"> </w:t>
       </w:r>
       <w:r>
-        <w:t xml:space="preserve">= 0.109), for a total predicted willingness to pay of $26.03 for renewables. Conservative Republicans, however, were willing to pay $6.79 less for renewables, for a predicted total of $11.97.</w:t>
+        <w:t xml:space="preserve">= 0.148), for a total predicted willingness to pay of $25.90 for renewables. Conservative Republicans, however, were willing to pay $6.62 less for renewables, for a predicted total of $12.04.</w:t>
       </w:r>
     </w:p>
     <w:p>
@@ -3724,7 +3026,7 @@
         <w:pStyle w:val="BodyText"/>
       </w:pPr>
       <w:r>
-        <w:t xml:space="preserve">The clean energy transition is needed to mitigate climate change, and public support is needed for the energy transition to complete. The results here show that support for fossil fuel and renewable energy sources is polarized, as measured both by prioritizing one source over the other as well as WTP for those sources. Additionally, a Trump cue made conservative Republicans more supportive of fossil fuels and a climate cue made liberal Democrats more supportive of renewables. However, respondents were, on average, more support of renewables in terms of both priority and WTP. Even conservative Republicans in the Trump cue had a WTP higher for renewables, $11.97, than fossil fuels, at $10.39.</w:t>
+        <w:t xml:space="preserve">The clean energy transition is needed to mitigate climate change, and public support is needed for the energy transition to complete. The results here show that support for fossil fuel and renewable energy sources is polarized, as measured both by prioritizing one source over the other as well as WTP for those sources. Additionally, a Trump cue made conservative Republicans more supportive of fossil fuels and a climate cue made liberal Democrats more supportive of renewables. However, respondents were, on average, more support of renewables in terms of both priority and WTP. Even conservative Republicans in the Trump cue had a WTP higher for renewables, $12.04, than fossil fuels, at $10.28.</w:t>
       </w:r>
     </w:p>
     <w:bookmarkEnd w:id="29"/>
@@ -3738,12 +3040,44 @@
       </w:r>
     </w:p>
     <w:p>
+      <w:pPr>
+        <w:pStyle w:val="FirstParagraph"/>
+      </w:pPr>
+      <w:r>
+        <w:t xml:space="preserve">This study examined how exposure to a Trump cue or a climate change cue shapes the US public’s prioritization of, and willingness-to-pay for, fossil fuel versus renewable electricity, and whether these responses are conditional on political identity. The results show that support for energy sources is polarized along partisan lines, both in how respondents prioritized fossil fuels against renewables and in the dollar amounts they were willing to pay, and that a Trump cue pushed conservative Republicans further toward fossil fuels while a climate cue pushed liberal Democrats further toward renewables. However, respondents were, on average, more supportive of renewables than fossil fuels on both measures, and even conservative Republicans exposed to the Trump cue reported a higher WTP for renewables than for fossil fuels. Together, these findings suggest that cues sharpen an existing partisan divide rather than create it, and that the divide sits atop a broad, if uneven, base of support for the energy transition.</w:t>
+      </w:r>
+    </w:p>
+    <w:p>
+      <w:pPr>
+        <w:pStyle w:val="BodyText"/>
+      </w:pPr>
+      <w:r>
+        <w:t xml:space="preserve">The cue effects were also uneven across the two outcomes. Political identity conditioned the effect of the cues on prioritization and on WTP for renewables, but the Trump cue did not significantly change fossil fuel participation or amount among conservative Republicans specifically. This is likely because a single cue, delivered once in a survey, is a weaker treatment than the sustained rhetoric respondents encounter in their daily media diet, and because a cue about a political figure may be too diffuse to move a specific pocketbook judgment like WTP. The climate cue, by contrast, was associated with a directionally larger, though not statistically significant, increase in WTP for renewables among liberal Democrats, consistent with the idea that a cue tied to a scientific rationale for renewables resonates most with those already predisposed toward that position.</w:t>
+      </w:r>
+    </w:p>
+    <w:p>
+      <w:pPr>
+        <w:pStyle w:val="BodyText"/>
+      </w:pPr>
+      <w:r>
+        <w:t xml:space="preserve">These results carry several implications for climate and energy policy. First, respondents across the political spectrum reported some positive WTP for renewables even amid a fairly high level of concern about the cost of electricity, suggesting that affordability concerns alone are unlikely to explain resistance to the energy transition, and that renewable energy investment retains a floor of public support that policymakers can draw on even in a polarized environment. Second, the responsiveness of conservative Republicans and liberal Democrats to identity-congruent cues indicates that elite rhetoric, including rhetoric tied to a single prominent figure, has the capacity to widen the partisan gap in energy preferences further, which is a risk for policymakers seeking durable, bipartisan support for energy legislation. Third, because the cues moved prioritization and WTP mainly among the politically engaged rather than the sample overall, messaging strategies aimed at building broad coalitions for the energy transition likely benefit from emphasizing shared, cross-partisan benefits of renewables, such as reliability or local economic development, rather than frames tied to a specific political figure or to climate change alone.</w:t>
+      </w:r>
+    </w:p>
+    <w:p>
+      <w:pPr>
+        <w:pStyle w:val="BodyText"/>
+      </w:pPr>
+      <w:r>
+        <w:t xml:space="preserve">This study has some limitations. The WTP measure relies on a hypothetical, stated-preference elicitation, and stated WTP does not always translate into WTP once a real premium is introduced. The cues were also each delivered once, in a single survey context, and their effects may not persist or generalize to the repeated, cumulative exposure people experience outside of a survey. Future research should examine whether repeated exposure to partisan cues over time widens the WTP gap identified here, and whether the gap closes when respondents are asked to pay the stated amount rather than simply report it.</w:t>
+      </w:r>
+    </w:p>
+    <w:p>
       <w:r>
         <w:br w:type="page"/>
       </w:r>
     </w:p>
     <w:bookmarkEnd w:id="30"/>
-    <w:bookmarkStart w:id="54" w:name="references"/>
+    <w:bookmarkStart w:id="58" w:name="references"/>
     <w:p>
       <w:pPr>
         <w:pStyle w:val="Heading1"/>
@@ -3752,7 +3086,7 @@
         <w:t xml:space="preserve">References</w:t>
       </w:r>
     </w:p>
-    <w:bookmarkStart w:id="53" w:name="refs"/>
+    <w:bookmarkStart w:id="57" w:name="refs"/>
     <w:bookmarkStart w:id="31" w:name="ref-aldyWillingnessPayPolitical2012"/>
     <w:p>
       <w:pPr>
@@ -4147,7 +3481,72 @@
       </w:r>
     </w:p>
     <w:bookmarkEnd w:id="35"/>
-    <w:bookmarkStart w:id="36" w:name="X8f8eebcd7a9410a4d8f16f6da906bc2a1f7110e"/>
+    <w:bookmarkStart w:id="36" w:name="ref-breidertReviewMethodsMeasuring2006"/>
+    <w:p>
+      <w:pPr>
+        <w:pStyle w:val="Bibliography"/>
+      </w:pPr>
+      <w:r>
+        <w:t xml:space="preserve">Breidert, Christoph, Michael Hahsler, and Thomas Reutterer. 2006.</w:t>
+      </w:r>
+      <w:r>
+        <w:t xml:space="preserve"> </w:t>
+      </w:r>
+      <w:r>
+        <w:t xml:space="preserve">“A</w:t>
+      </w:r>
+      <w:r>
+        <w:t xml:space="preserve"> </w:t>
+      </w:r>
+      <w:r>
+        <w:t xml:space="preserve">Review</w:t>
+      </w:r>
+      <w:r>
+        <w:t xml:space="preserve"> </w:t>
+      </w:r>
+      <w:r>
+        <w:t xml:space="preserve">of</w:t>
+      </w:r>
+      <w:r>
+        <w:t xml:space="preserve"> </w:t>
+      </w:r>
+      <w:r>
+        <w:t xml:space="preserve">Methods</w:t>
+      </w:r>
+      <w:r>
+        <w:t xml:space="preserve"> </w:t>
+      </w:r>
+      <w:r>
+        <w:t xml:space="preserve">for</w:t>
+      </w:r>
+      <w:r>
+        <w:t xml:space="preserve"> </w:t>
+      </w:r>
+      <w:r>
+        <w:t xml:space="preserve">Measuring Willingness-to-Pay</w:t>
+      </w:r>
+      <w:r>
+        <w:t xml:space="preserve">.”</w:t>
+      </w:r>
+      <w:r>
+        <w:t xml:space="preserve"> </w:t>
+      </w:r>
+      <w:r>
+        <w:rPr>
+          <w:i/>
+          <w:iCs/>
+        </w:rPr>
+        <w:t xml:space="preserve">Innovative Marketing</w:t>
+      </w:r>
+      <w:r>
+        <w:t xml:space="preserve"> </w:t>
+      </w:r>
+      <w:r>
+        <w:t xml:space="preserve">2(4): 8–32.</w:t>
+      </w:r>
+    </w:p>
+    <w:bookmarkEnd w:id="36"/>
+    <w:bookmarkStart w:id="37" w:name="X8f8eebcd7a9410a4d8f16f6da906bc2a1f7110e"/>
     <w:p>
       <w:pPr>
         <w:pStyle w:val="Bibliography"/>
@@ -4232,8 +3631,8 @@
         <w:t xml:space="preserve">62: 428–37.</w:t>
       </w:r>
     </w:p>
-    <w:bookmarkEnd w:id="36"/>
-    <w:bookmarkStart w:id="37" w:name="ref-feldmanClimateChangePolarizing2018"/>
+    <w:bookmarkEnd w:id="37"/>
+    <w:bookmarkStart w:id="38" w:name="ref-feldmanClimateChangePolarizing2018"/>
     <w:p>
       <w:pPr>
         <w:pStyle w:val="Bibliography"/>
@@ -4318,8 +3717,8 @@
         <w:t xml:space="preserve">51: 54–66.</w:t>
       </w:r>
     </w:p>
-    <w:bookmarkEnd w:id="37"/>
-    <w:bookmarkStart w:id="38" w:name="ref-gaborPriceIndicatorQuality1966"/>
+    <w:bookmarkEnd w:id="38"/>
+    <w:bookmarkStart w:id="39" w:name="ref-gaborPriceIndicatorQuality1966"/>
     <w:p>
       <w:pPr>
         <w:pStyle w:val="Bibliography"/>
@@ -4392,8 +3791,8 @@
         <w:t xml:space="preserve">33: 43–70.</w:t>
       </w:r>
     </w:p>
-    <w:bookmarkEnd w:id="38"/>
-    <w:bookmarkStart w:id="39" w:name="ref-hamiltonChangeWindUS2018"/>
+    <w:bookmarkEnd w:id="39"/>
+    <w:bookmarkStart w:id="40" w:name="ref-hamiltonChangeWindUS2018"/>
     <w:p>
       <w:pPr>
         <w:pStyle w:val="Bibliography"/>
@@ -4478,8 +3877,8 @@
         <w:t xml:space="preserve">8(1): 11.</w:t>
       </w:r>
     </w:p>
-    <w:bookmarkEnd w:id="39"/>
-    <w:bookmarkStart w:id="40" w:name="ref-hawesClimateSciencePolitics2022"/>
+    <w:bookmarkEnd w:id="40"/>
+    <w:bookmarkStart w:id="41" w:name="ref-hawesClimateSciencePolitics2022"/>
     <w:p>
       <w:pPr>
         <w:pStyle w:val="Bibliography"/>
@@ -4600,13 +3999,78 @@
         <w:t xml:space="preserve">85: 102419.</w:t>
       </w:r>
     </w:p>
-    <w:bookmarkEnd w:id="40"/>
-    <w:bookmarkStart w:id="41" w:name="ref-kennedyAmericansShiftingViews2026"/>
+    <w:bookmarkEnd w:id="41"/>
+    <w:bookmarkStart w:id="42" w:name="ref-jonesSurveyTechniqueMeasure1975"/>
     <w:p>
       <w:pPr>
         <w:pStyle w:val="Bibliography"/>
       </w:pPr>
       <w:r>
+        <w:t xml:space="preserve">Jones, D. Frank. 1975.</w:t>
+      </w:r>
+      <w:r>
+        <w:t xml:space="preserve"> </w:t>
+      </w:r>
+      <w:r>
+        <w:t xml:space="preserve">“A</w:t>
+      </w:r>
+      <w:r>
+        <w:t xml:space="preserve"> </w:t>
+      </w:r>
+      <w:r>
+        <w:t xml:space="preserve">Survey Technique</w:t>
+      </w:r>
+      <w:r>
+        <w:t xml:space="preserve"> </w:t>
+      </w:r>
+      <w:r>
+        <w:t xml:space="preserve">to</w:t>
+      </w:r>
+      <w:r>
+        <w:t xml:space="preserve"> </w:t>
+      </w:r>
+      <w:r>
+        <w:t xml:space="preserve">Measure Demand</w:t>
+      </w:r>
+      <w:r>
+        <w:t xml:space="preserve"> </w:t>
+      </w:r>
+      <w:r>
+        <w:t xml:space="preserve">Under</w:t>
+      </w:r>
+      <w:r>
+        <w:t xml:space="preserve"> </w:t>
+      </w:r>
+      <w:r>
+        <w:t xml:space="preserve">Various Pricing Strategies</w:t>
+      </w:r>
+      <w:r>
+        <w:t xml:space="preserve">.”</w:t>
+      </w:r>
+      <w:r>
+        <w:t xml:space="preserve"> </w:t>
+      </w:r>
+      <w:r>
+        <w:rPr>
+          <w:i/>
+          <w:iCs/>
+        </w:rPr>
+        <w:t xml:space="preserve">Journal of Marketing</w:t>
+      </w:r>
+      <w:r>
+        <w:t xml:space="preserve"> </w:t>
+      </w:r>
+      <w:r>
+        <w:t xml:space="preserve">39(3): 75–77.</w:t>
+      </w:r>
+    </w:p>
+    <w:bookmarkEnd w:id="42"/>
+    <w:bookmarkStart w:id="43" w:name="ref-kennedyAmericansShiftingViews2026"/>
+    <w:p>
+      <w:pPr>
+        <w:pStyle w:val="Bibliography"/>
+      </w:pPr>
+      <w:r>
         <w:t xml:space="preserve">Kennedy, Brian, and Emma Kikuchi. 2026.</w:t>
       </w:r>
       <w:r>
@@ -4655,8 +4119,8 @@
         <w:t xml:space="preserve">https://www.pewresearch.org/science/2026/04/03/americans-shifting-views-on-energy-issues/ (April 21, 2026).</w:t>
       </w:r>
     </w:p>
-    <w:bookmarkEnd w:id="41"/>
-    <w:bookmarkStart w:id="42" w:name="ref-knappWillConsumersReally2020"/>
+    <w:bookmarkEnd w:id="43"/>
+    <w:bookmarkStart w:id="44" w:name="ref-knappWillConsumersReally2020"/>
     <w:p>
       <w:pPr>
         <w:pStyle w:val="Bibliography"/>
@@ -4753,8 +4217,8 @@
         <w:t xml:space="preserve">65: 101457.</w:t>
       </w:r>
     </w:p>
-    <w:bookmarkEnd w:id="42"/>
-    <w:bookmarkStart w:id="43" w:name="X83362c7a395811c107646b0a251a2c1915acb0e"/>
+    <w:bookmarkEnd w:id="44"/>
+    <w:bookmarkStart w:id="45" w:name="X83362c7a395811c107646b0a251a2c1915acb0e"/>
     <w:p>
       <w:pPr>
         <w:pStyle w:val="Bibliography"/>
@@ -4827,8 +4291,8 @@
         <w:t xml:space="preserve">55: 617–25.</w:t>
       </w:r>
     </w:p>
-    <w:bookmarkEnd w:id="43"/>
-    <w:bookmarkStart w:id="44" w:name="ref-kotchenPublicWillingnessPay2017"/>
+    <w:bookmarkEnd w:id="45"/>
+    <w:bookmarkStart w:id="46" w:name="ref-kotchenPublicWillingnessPay2017"/>
     <w:p>
       <w:pPr>
         <w:pStyle w:val="Bibliography"/>
@@ -4928,8 +4392,8 @@
         <w:t xml:space="preserve">12(9).</w:t>
       </w:r>
     </w:p>
-    <w:bookmarkEnd w:id="44"/>
-    <w:bookmarkStart w:id="45" w:name="ref-liPublicSupportReducing2009"/>
+    <w:bookmarkEnd w:id="46"/>
+    <w:bookmarkStart w:id="47" w:name="ref-liPublicSupportReducing2009"/>
     <w:p>
       <w:pPr>
         <w:pStyle w:val="Bibliography"/>
@@ -5026,8 +4490,61 @@
         <w:t xml:space="preserve">68(3): 731–42.</w:t>
       </w:r>
     </w:p>
-    <w:bookmarkEnd w:id="45"/>
-    <w:bookmarkStart w:id="46" w:name="X6d6f152db593044a330e502aa9ce7b5a2623a5a"/>
+    <w:bookmarkEnd w:id="47"/>
+    <w:bookmarkStart w:id="48" w:name="ref-lipovetskyPricingModelsMarketing2011"/>
+    <w:p>
+      <w:pPr>
+        <w:pStyle w:val="Bibliography"/>
+      </w:pPr>
+      <w:r>
+        <w:t xml:space="preserve">Lipovetsky, Stan, Shon Magnan, and Andrea Zanetti-Polzi. 2011.</w:t>
+      </w:r>
+      <w:r>
+        <w:t xml:space="preserve"> </w:t>
+      </w:r>
+      <w:r>
+        <w:t xml:space="preserve">“Pricing</w:t>
+      </w:r>
+      <w:r>
+        <w:t xml:space="preserve"> </w:t>
+      </w:r>
+      <w:r>
+        <w:t xml:space="preserve">Models</w:t>
+      </w:r>
+      <w:r>
+        <w:t xml:space="preserve"> </w:t>
+      </w:r>
+      <w:r>
+        <w:t xml:space="preserve">in</w:t>
+      </w:r>
+      <w:r>
+        <w:t xml:space="preserve"> </w:t>
+      </w:r>
+      <w:r>
+        <w:t xml:space="preserve">Marketing Research</w:t>
+      </w:r>
+      <w:r>
+        <w:t xml:space="preserve">.”</w:t>
+      </w:r>
+      <w:r>
+        <w:t xml:space="preserve"> </w:t>
+      </w:r>
+      <w:r>
+        <w:rPr>
+          <w:i/>
+          <w:iCs/>
+        </w:rPr>
+        <w:t xml:space="preserve">Intelligent Information Management</w:t>
+      </w:r>
+      <w:r>
+        <w:t xml:space="preserve"> </w:t>
+      </w:r>
+      <w:r>
+        <w:t xml:space="preserve">3(5): 167–74.</w:t>
+      </w:r>
+    </w:p>
+    <w:bookmarkEnd w:id="48"/>
+    <w:bookmarkStart w:id="49" w:name="X6d6f152db593044a330e502aa9ce7b5a2623a5a"/>
     <w:p>
       <w:pPr>
         <w:pStyle w:val="Bibliography"/>
@@ -5079,8 +4596,8 @@
         <w:t xml:space="preserve">13(1): 32–39.</w:t>
       </w:r>
     </w:p>
-    <w:bookmarkEnd w:id="46"/>
-    <w:bookmarkStart w:id="47" w:name="ref-merkleyPartyCuesNews2021"/>
+    <w:bookmarkEnd w:id="49"/>
+    <w:bookmarkStart w:id="50" w:name="ref-merkleyPartyCuesNews2021"/>
     <w:p>
       <w:pPr>
         <w:pStyle w:val="Bibliography"/>
@@ -5171,8 +4688,8 @@
         <w:t xml:space="preserve">51(4): 1439–56.</w:t>
       </w:r>
     </w:p>
-    <w:bookmarkEnd w:id="47"/>
-    <w:bookmarkStart w:id="48" w:name="ref-murakamiConsumersWillingnessPay2015"/>
+    <w:bookmarkEnd w:id="50"/>
+    <w:bookmarkStart w:id="51" w:name="ref-murakamiConsumersWillingnessPay2015"/>
     <w:p>
       <w:pPr>
         <w:pStyle w:val="Bibliography"/>
@@ -5281,8 +4798,8 @@
         <w:t xml:space="preserve">50: 178–89.</w:t>
       </w:r>
     </w:p>
-    <w:bookmarkEnd w:id="48"/>
-    <w:bookmarkStart w:id="49" w:name="ref-nkansahWillingnessPayWind2019"/>
+    <w:bookmarkEnd w:id="51"/>
+    <w:bookmarkStart w:id="52" w:name="ref-nkansahWillingnessPayWind2019"/>
     <w:p>
       <w:pPr>
         <w:pStyle w:val="Bibliography"/>
@@ -5358,8 +4875,8 @@
         <w:t xml:space="preserve">48(1): 44–70.</w:t>
       </w:r>
     </w:p>
-    <w:bookmarkEnd w:id="49"/>
-    <w:bookmarkStart w:id="50" w:name="ref-scheuchVotersSupportAre2026"/>
+    <w:bookmarkEnd w:id="52"/>
+    <w:bookmarkStart w:id="53" w:name="ref-scheuchVotersSupportAre2026"/>
     <w:p>
       <w:pPr>
         <w:pStyle w:val="Bibliography"/>
@@ -5432,8 +4949,8 @@
         <w:t xml:space="preserve">: 10780874261475229.</w:t>
       </w:r>
     </w:p>
-    <w:bookmarkEnd w:id="50"/>
-    <w:bookmarkStart w:id="51" w:name="ref-teslerEliteDominationPublic2018"/>
+    <w:bookmarkEnd w:id="53"/>
+    <w:bookmarkStart w:id="54" w:name="ref-teslerEliteDominationPublic2018"/>
     <w:p>
       <w:pPr>
         <w:pStyle w:val="Bibliography"/>
@@ -5494,8 +5011,8 @@
         <w:t xml:space="preserve">35(2): 306–26.</w:t>
       </w:r>
     </w:p>
-    <w:bookmarkEnd w:id="51"/>
-    <w:bookmarkStart w:id="52" w:name="ref-walterExaminingWillingnessPay2023"/>
+    <w:bookmarkEnd w:id="54"/>
+    <w:bookmarkStart w:id="55" w:name="ref-walterExaminingWillingnessPay2023"/>
     <w:p>
       <w:pPr>
         <w:pStyle w:val="Bibliography"/>
@@ -5583,9 +5100,59 @@
         <w:t xml:space="preserve">181: 113661.</w:t>
       </w:r>
     </w:p>
-    <w:bookmarkEnd w:id="52"/>
-    <w:bookmarkEnd w:id="53"/>
-    <w:bookmarkEnd w:id="54"/>
+    <w:bookmarkEnd w:id="55"/>
+    <w:bookmarkStart w:id="56" w:name="ref-wedelModelEffectsPsychological1998"/>
+    <w:p>
+      <w:pPr>
+        <w:pStyle w:val="Bibliography"/>
+      </w:pPr>
+      <w:r>
+        <w:t xml:space="preserve">Wedel, Michel, and Peter S. H. Leeflang. 1998.</w:t>
+      </w:r>
+      <w:r>
+        <w:t xml:space="preserve"> </w:t>
+      </w:r>
+      <w:r>
+        <w:t xml:space="preserve">“A Model for the Effects of Psychological Pricing in</w:t>
+      </w:r>
+      <w:r>
+        <w:t xml:space="preserve"> </w:t>
+      </w:r>
+      <w:r>
+        <w:t xml:space="preserve">Gabor</w:t>
+      </w:r>
+      <w:r>
+        <w:t xml:space="preserve">–</w:t>
+      </w:r>
+      <w:r>
+        <w:t xml:space="preserve">Granger</w:t>
+      </w:r>
+      <w:r>
+        <w:t xml:space="preserve"> </w:t>
+      </w:r>
+      <w:r>
+        <w:t xml:space="preserve">Price Studies.”</w:t>
+      </w:r>
+      <w:r>
+        <w:t xml:space="preserve"> </w:t>
+      </w:r>
+      <w:r>
+        <w:rPr>
+          <w:i/>
+          <w:iCs/>
+        </w:rPr>
+        <w:t xml:space="preserve">Journal of Economic Psychology</w:t>
+      </w:r>
+      <w:r>
+        <w:t xml:space="preserve"> </w:t>
+      </w:r>
+      <w:r>
+        <w:t xml:space="preserve">19(2): 237–60.</w:t>
+      </w:r>
+    </w:p>
+    <w:bookmarkEnd w:id="56"/>
+    <w:bookmarkEnd w:id="57"/>
+    <w:bookmarkEnd w:id="58"/>
     <w:sectPr>
       <w:footnotePr>
         <w:numRestart w:val="eachSect"/>

</xml_diff>

<commit_message>
Fix omitted R2 in regression tables, add cost-concern x cue/identity robustness check
- data-setup.R: gof_omit_pattern was stripping all fit statistics including
  R2, leaving only Num.Obs. Added a glance_custom.svyglm() method that
  reports Adj. R2 for the OLS models and McFadden's pseudo-R2 for the logit
  model as separate labeled rows, and tightened the omit pattern so it
  doesn't also strip those new labels.
- Added a third supplemental-materials robustness check interacting
  concern.cost with the cues and with political identity
  (supplemental-cost-interaction-setup.R): the cost-concern penalty on
  fossil-fuel WTP is significantly weaker for conservative Republicans
  (priority scale) and for both liberal Democrats and conservative
  Republicans (fossil participation), and is offset under the Trump cue
  (fossil amount). No significant interactions for renewables.
- Re-rendered HTML/PDF/DOCX for both documents.

Co-Authored-By: Claude Sonnet 5 <noreply@anthropic.com>
</commit_message>
<xml_diff>
--- a/_output/cue-WTP.docx
+++ b/_output/cue-WTP.docx
@@ -390,14 +390,22 @@
         <w:t xml:space="preserve">likewise found that WTP for a national clean energy standard depended on respondents’ political affiliation as well as on how the standard was structured. Taken together, this literature establishes that the public likely pays a premium for renewable electricity on average, but that the size of that premium, and whether it survives contact with real costs, depends on the source being compared, the framing of the request, and the respondent’s political identity, three factors that remain largely unexamined together within a single experimental design.</w:t>
       </w:r>
     </w:p>
+    <w:p>
+      <w:pPr>
+        <w:pStyle w:val="BodyText"/>
+      </w:pPr>
+      <w:r>
+        <w:t xml:space="preserve">Overall, I expect there to be both general and partisan shifts in preferences based on the cues. In general, those who receive the Trump cue will prioritize fossil and fuels and be willing to pay more, whereas those in the climate condition will prioritize renewable sources and be willing to pay more than those in the other conditions. For political beliefs, I expect conservative Republicans to be responsive to the Trump cue and liberal Democrats to be responsive to the climate cue in their energy preferences.</w:t>
+      </w:r>
+    </w:p>
     <w:bookmarkEnd w:id="12"/>
-    <w:bookmarkStart w:id="13" w:name="methodology-and-data"/>
+    <w:bookmarkStart w:id="13" w:name="data-and-measures"/>
     <w:p>
       <w:pPr>
         <w:pStyle w:val="Heading1"/>
       </w:pPr>
       <w:r>
-        <w:t xml:space="preserve">Methodology and Data</w:t>
+        <w:t xml:space="preserve">Data and Measures</w:t>
       </w:r>
     </w:p>
     <w:p>
@@ -405,7 +413,52 @@
         <w:pStyle w:val="FirstParagraph"/>
       </w:pPr>
       <w:r>
-        <w:t xml:space="preserve">Given the importance of cues and political beliefs in energy preferences, here I use a survey experiment to examine respondents’ prioritization of fossil fuels versus renewables as well as their willingness-to-pay (WTP) for those sources to generate electricity in response to a Trump cue or a climate change cue. Specifically, I surveyed 3113 US residents in April 2026, who were randomly assigned to receive one of three treatments, including a cue about Trump’s critique’s of renewable energy and his support for fossil fuels (n = 1049), a climate change cue that stated scientists recommend moving away from fossil fuels to renewables to address climate change (n = 1013), or a control condition with no cue (n = 1051).</w:t>
+        <w:t xml:space="preserve">To examine the importance of cues and political beliefs in energy preferences I use a survey experiment to examine respondents’ prioritization of fossil fuels versus renewables as well as their willingness-to-pay (WTP) for those sources to generate electricity in response to a Trump cue or a climate change cue. Respondents were recruited using Cloud Research, which provides a quota-based sample of US residents, with quotas for age, race, and gender were based on US Census data. Additionally, to further ensure as representative a sample as possible, I used the</w:t>
+      </w:r>
+      <w:r>
+        <w:t xml:space="preserve"> </w:t>
+      </w:r>
+      <w:r>
+        <w:rPr>
+          <w:rStyle w:val="VerbatimChar"/>
+        </w:rPr>
+        <w:t xml:space="preserve">survey</w:t>
+      </w:r>
+      <w:r>
+        <w:t xml:space="preserve"> </w:t>
+      </w:r>
+      <w:r>
+        <w:t xml:space="preserve">and</w:t>
+      </w:r>
+      <w:r>
+        <w:t xml:space="preserve"> </w:t>
+      </w:r>
+      <w:r>
+        <w:rPr>
+          <w:rStyle w:val="VerbatimChar"/>
+        </w:rPr>
+        <w:t xml:space="preserve">anesrake</w:t>
+      </w:r>
+      <w:r>
+        <w:t xml:space="preserve"> </w:t>
+      </w:r>
+      <w:r>
+        <w:t xml:space="preserve">packages in</w:t>
+      </w:r>
+      <w:r>
+        <w:t xml:space="preserve"> </w:t>
+      </w:r>
+      <w:r>
+        <w:rPr>
+          <w:rStyle w:val="VerbatimChar"/>
+        </w:rPr>
+        <w:t xml:space="preserve">R</w:t>
+      </w:r>
+      <w:r>
+        <w:t xml:space="preserve"> </w:t>
+      </w:r>
+      <w:r>
+        <w:t xml:space="preserve">to perform iterative raking to compute survey weights that weight respondents based on the US Census’s 2023 American Community Survey (ACS) on demographic variables, including age, race, gender, and education. I also used the Pew Research Center’s National Public Opinion Reference Survey (NPORS) from 2025 to weigh the sample based on political party affiliation. I surveyed 3113 US residents in April 2026, who were randomly assigned to receive one of three treatments, including a cue about Trump’s critique’s of renewable energy and his support for fossil fuels (n = 1049), a climate change cue that stated scientists recommend moving away from fossil fuels to renewables to address climate change (n = 1013), or a control condition with no cue (n = 1051).</w:t>
       </w:r>
     </w:p>
     <w:p>
@@ -413,7 +466,140 @@
         <w:pStyle w:val="BodyText"/>
       </w:pPr>
       <w:r>
-        <w:t xml:space="preserve">Overall, I expect there to be both general and partisan shifts in preferences based on the cues. In general, those who receive the Trump cue will prioritize fossil and fuels and be willing to pay more, whereas those in the climate condition will prioritize renewable sources and be willing to pay more than those in the other conditions. For political beliefs, I expect conservative Republicans to be responsive to the Trump cue and liberal Democrats to be responsive to the climate cue in their energy preferences.</w:t>
+        <w:t xml:space="preserve">All respondents were shown the following paragraph:</w:t>
+      </w:r>
+    </w:p>
+    <w:p>
+      <w:pPr>
+        <w:pStyle w:val="BlockText"/>
+      </w:pPr>
+      <w:r>
+        <w:t xml:space="preserve">The use of renewable energy sources for electricity, including wind energy, solar energy, and battery storage, has risen sharply in recent years. Indeed, most of the growth in new electricity generation in the U.S. has come from renewable sources.</w:t>
+      </w:r>
+    </w:p>
+    <w:p>
+      <w:pPr>
+        <w:pStyle w:val="FirstParagraph"/>
+      </w:pPr>
+      <w:r>
+        <w:t xml:space="preserve">Respondents were then shown the following statement. Those in the Trump cue saw President Trump named specifically, while those in the climate cue and the control were shown</w:t>
+      </w:r>
+      <w:r>
+        <w:t xml:space="preserve"> </w:t>
+      </w:r>
+      <w:r>
+        <w:rPr>
+          <w:i/>
+          <w:iCs/>
+        </w:rPr>
+        <w:t xml:space="preserve">some have</w:t>
+      </w:r>
+    </w:p>
+    <w:p>
+      <w:pPr>
+        <w:pStyle w:val="BlockText"/>
+      </w:pPr>
+      <w:r>
+        <w:t xml:space="preserve">However, [</w:t>
+      </w:r>
+      <w:r>
+        <w:rPr>
+          <w:i/>
+          <w:iCs/>
+        </w:rPr>
+        <w:t xml:space="preserve">President Trump has</w:t>
+      </w:r>
+      <w:r>
+        <w:t xml:space="preserve">/</w:t>
+      </w:r>
+      <w:r>
+        <w:rPr>
+          <w:i/>
+          <w:iCs/>
+        </w:rPr>
+        <w:t xml:space="preserve">some have</w:t>
+      </w:r>
+      <w:r>
+        <w:t xml:space="preserve">] argued that renewable sources are not reliable and that we need to increase our reliance on fossil fuels (coal, oil, and natural gas) to ensure energy security.</w:t>
+      </w:r>
+    </w:p>
+    <w:p>
+      <w:pPr>
+        <w:pStyle w:val="FirstParagraph"/>
+      </w:pPr>
+      <w:r>
+        <w:t xml:space="preserve">Those in the climate cue saw the following:</w:t>
+      </w:r>
+    </w:p>
+    <w:p>
+      <w:pPr>
+        <w:pStyle w:val="BlockText"/>
+      </w:pPr>
+      <w:r>
+        <w:t xml:space="preserve">Additionally, scientists have warned that an increase in the use of fossil fuels will make climate change worse; therefore, we should increase our use of renewable sources.</w:t>
+      </w:r>
+    </w:p>
+    <w:p>
+      <w:pPr>
+        <w:pStyle w:val="FirstParagraph"/>
+      </w:pPr>
+      <w:r>
+        <w:t xml:space="preserve">Finally, all respondents were shown:</w:t>
+      </w:r>
+    </w:p>
+    <w:p>
+      <w:pPr>
+        <w:pStyle w:val="BlockText"/>
+      </w:pPr>
+      <w:r>
+        <w:t xml:space="preserve">Please consider how you think we should prioritize the development of fossil fuels and renewable sources to generate electricity.</w:t>
+      </w:r>
+    </w:p>
+    <w:p>
+      <w:pPr>
+        <w:pStyle w:val="FirstParagraph"/>
+      </w:pPr>
+      <w:r>
+        <w:t xml:space="preserve">After receiving the cues, respondents were asked, on a 1 to 7 scale, if fossil fuels should be prioritized (= 1), fossil fuels and renewables should be prioritized equally (= 4), or renewable sources should be prioritized (= 7). Next, I asked respondents their willingness-to-pay (WTP) for fossil fuel and renewable sources using the Gabor-Granger method</w:t>
+      </w:r>
+      <w:r>
+        <w:t xml:space="preserve"> </w:t>
+      </w:r>
+      <w:r>
+        <w:t xml:space="preserve">(e.g., Gabor and Granger 1966)</w:t>
+      </w:r>
+      <w:r>
+        <w:t xml:space="preserve">. With the Gabor-Granger method, respondents are shown a random dollar amount and if they are willing to pay that amount, they are next shown a higher amount, and if they are they are shown a smaller amount. This approach is a well-established survey-based technique for eliciting willingness-to-pay, dating to early applications of iterative-bidding price experiments</w:t>
+      </w:r>
+      <w:r>
+        <w:t xml:space="preserve"> </w:t>
+      </w:r>
+      <w:r>
+        <w:t xml:space="preserve">(Jones 1975)</w:t>
+      </w:r>
+      <w:r>
+        <w:t xml:space="preserve"> </w:t>
+      </w:r>
+      <w:r>
+        <w:t xml:space="preserve">and later formalized in marketing research</w:t>
+      </w:r>
+      <w:r>
+        <w:t xml:space="preserve"> </w:t>
+      </w:r>
+      <w:r>
+        <w:t xml:space="preserve">(Wedel and Leeflang 1998)</w:t>
+      </w:r>
+      <w:r>
+        <w:t xml:space="preserve">. It remains one of the standard indirect approaches used to measure willingness-to-pay</w:t>
+      </w:r>
+      <w:r>
+        <w:t xml:space="preserve"> </w:t>
+      </w:r>
+      <w:r>
+        <w:t xml:space="preserve">(Breidert, Hahsler, and Reutterer 2006; Lipovetsky, Magnan, and Zanetti-Polzi 2011)</w:t>
+      </w:r>
+      <w:r>
+        <w:t xml:space="preserve">.</w:t>
       </w:r>
     </w:p>
     <w:p>
@@ -421,17 +607,25 @@
         <w:pStyle w:val="BodyText"/>
       </w:pPr>
       <w:r>
-        <w:t xml:space="preserve">I first examine how respondents chose to prioritize fossil fuels versus renewables. After receiving the cues, respondents were asked, on a 1 to 7 scale, if fossil fuels should be prioritized (= 1), fossil fuels and renewables should be prioritized equally (= 4), or renewable sources should be prioritized (= 7). The mean on the energy-priority scale was 5.17, indicating that respondents, on average, prioritized renewables. Next, I use OLS to examine the prioritization respondents gave to fossil fuels versus renewables as a function of the cue, their political beliefs, and the interaction between cues and political beliefs. Energy affordability was a salient concern during the time data was collected: in the survey respondents were asked, on a 0 to 10 scale, their overall concern about the cost of electricity, and the mean was 7.88, indicating a fair amount of concern. Demographic characteristics could also confound the relationship between cues, political beliefs, and these outcomes, so I re-estimate every model below controlling for age, male, white, education, and income, and separately controlling for those demographics plus concern about energy cost; both specifications are reported in the Supplemental Materials. The coefficients, significance, and substantive conclusions are consistent across all three specifications.</w:t>
+        <w:t xml:space="preserve">To establish WTP, I first give respondents information about potential costs associated with each energy source. In the WTP for fossil fuels question, I noted that costs associated with renewable energy have decreased and, therefore they may need to pay more to use fossil fuels. For renewable sources respondents were told about the need to increase distribution. All respondents were asked their WTP for both sources, and the sources were presented in random order. To elict the maximum/minimum WTP, respondents were shown a random dollar amount between $1 and $46, in five-dollar increments, and asked if they would be WTP that amount extra per-month in their electricity bill. If they indicated yes they were shown a larger, random dollar-amount, and if they indicated no they were shown a smaller dollar-amount. This continues until they reach the $46-maximum or $1-minimum. Respondents who indicated no at $1 were coded with a WTP of 0.</w:t>
+      </w:r>
+    </w:p>
+    <w:p>
+      <w:pPr>
+        <w:pStyle w:val="BodyText"/>
+      </w:pPr>
+      <w:r>
+        <w:t xml:space="preserve">In the following models, I examine the prioritization of fossil fuels vs. renewables and the WTP for those energy sources as a function of the cues and political beliefs. Political beliefs include conservative Republicans and liberal Democrats, with other political beliefs (moderate independents, conservative Democrats, liberal Republicans) as the excluded referents. The political belief measures were constructed based on responses to a self-reported, 7-point ideology scale (1 = very liberal, 2 = somewhat liberal, 3 = slightly liberal, 4 = middle of the road, 5 = slightly conservative, 6 = somewhat conservative, 7 = very conservative) and political party identification. Conservative Republican is coded 1 for respondents who identify as Republican and place themselves at 5, 6, or 7 on the ideology scale (slightly, somewhat, or very conservative), and liberal Democrat is coded 1 for respondents who identify as Democrat and place themselves at 1, 2, or 3 (slightly, somewhat, or very liberal).</w:t>
       </w:r>
     </w:p>
     <w:bookmarkEnd w:id="13"/>
-    <w:bookmarkStart w:id="29" w:name="results-and-discussion"/>
+    <w:bookmarkStart w:id="29" w:name="results"/>
     <w:p>
       <w:pPr>
         <w:pStyle w:val="Heading1"/>
       </w:pPr>
       <w:r>
-        <w:t xml:space="preserve">Results and Discussion</w:t>
+        <w:t xml:space="preserve">Results</w:t>
       </w:r>
     </w:p>
     <w:p>
@@ -439,7 +633,7 @@
         <w:pStyle w:val="FirstParagraph"/>
       </w:pPr>
       <w:r>
-        <w:t xml:space="preserve">The results are shown in</w:t>
+        <w:t xml:space="preserve">Looking first to how respondents chose to prioritize fossil fuels versus renewables, the mean on the energy-priority scale was 5.17, indicating that respondents, on average, prioritized renewables. I use OLS to examine the prioritization respondents gave to fossil fuels versus renewables as a function of the cue, their political beliefs, and the interaction between cues and political beliefs. The results are shown in</w:t>
       </w:r>
       <w:r>
         <w:t xml:space="preserve"> </w:t>
@@ -973,6 +1167,32 @@
                   </w:pPr>
                   <w:r>
                     <w:t xml:space="preserve">3113</w:t>
+                  </w:r>
+                </w:p>
+              </w:tc>
+            </w:tr>
+            <w:tr>
+              <w:tc>
+                <w:tcPr/>
+                <w:p>
+                  <w:pPr>
+                    <w:pStyle w:val="Compact"/>
+                    <w:jc w:val="center"/>
+                  </w:pPr>
+                  <w:r>
+                    <w:t xml:space="preserve">Adj. R2</w:t>
+                  </w:r>
+                </w:p>
+              </w:tc>
+              <w:tc>
+                <w:tcPr/>
+                <w:p>
+                  <w:pPr>
+                    <w:pStyle w:val="Compact"/>
+                    <w:jc w:val="center"/>
+                  </w:pPr>
+                  <w:r>
+                    <w:t xml:space="preserve">0.313</w:t>
                   </w:r>
                 </w:p>
               </w:tc>
@@ -1111,46 +1331,7 @@
         <w:pStyle w:val="BodyText"/>
       </w:pPr>
       <w:r>
-        <w:t xml:space="preserve">Next, I asked respondents their WTP for fossil fuel and renewable sources using the Gabor-Granger method</w:t>
-      </w:r>
-      <w:r>
-        <w:t xml:space="preserve"> </w:t>
-      </w:r>
-      <w:r>
-        <w:t xml:space="preserve">(e.g., Gabor and Granger 1966)</w:t>
-      </w:r>
-      <w:r>
-        <w:t xml:space="preserve">. The Gabor-Granger method is a well-established survey-based technique for eliciting willingness-to-pay, dating to early applications of iterative-bidding price experiments</w:t>
-      </w:r>
-      <w:r>
-        <w:t xml:space="preserve"> </w:t>
-      </w:r>
-      <w:r>
-        <w:t xml:space="preserve">(Jones 1975)</w:t>
-      </w:r>
-      <w:r>
-        <w:t xml:space="preserve"> </w:t>
-      </w:r>
-      <w:r>
-        <w:t xml:space="preserve">and later formalized in marketing research</w:t>
-      </w:r>
-      <w:r>
-        <w:t xml:space="preserve"> </w:t>
-      </w:r>
-      <w:r>
-        <w:t xml:space="preserve">(Wedel and Leeflang 1998)</w:t>
-      </w:r>
-      <w:r>
-        <w:t xml:space="preserve">. It remains among the standard indirect approaches used to measure willingness-to-pay, alongside methods such as the van Westendorp price sensitivity meter and discrete choice experiments</w:t>
-      </w:r>
-      <w:r>
-        <w:t xml:space="preserve"> </w:t>
-      </w:r>
-      <w:r>
-        <w:t xml:space="preserve">(Breidert, Hahsler, and Reutterer 2006; Lipovetsky, Magnan, and Zanetti-Polzi 2011)</w:t>
-      </w:r>
-      <w:r>
-        <w:t xml:space="preserve">. Specifically, I first give respondents information about potential costs associated with each energy source. In the WTP for fossil fuels question, I noted that costs associated with renewable energy have decreased and, therefore they may need to pay more to use fossil fuels. For renewable sources respondents were told about the need to increase distribution. All respondents were asked their WTP for both sources, and the sources were presented in random order. To elict the maximum/minimum WTP, respondents were shown a random dollar amount between $1 and $46, in five-dollar increments, and asked if they would be WTP that amount extra per-month in their electricity bill. If they indicated yes they were shown a larger, random dollar-amount, and if they indicated no they were shown a smaller dollar-amount. This continues until they reach the $46-maximum or $1-minimum. Respondents who indicated no at $1 were coded with a WTP of 0. The percent of respondents WTP each possible dollar amount for each source is shown in</w:t>
+        <w:t xml:space="preserve">Next, I examine the percent of respondents WTP each possible dollar amount for each source, and that is shown in</w:t>
       </w:r>
       <w:r>
         <w:t xml:space="preserve"> </w:t>
@@ -1764,7 +1945,7 @@
         <w:pStyle w:val="BodyText"/>
       </w:pPr>
       <w:r>
-        <w:t xml:space="preserve">Given the large percantage of respondents at $0 for fossil fuels, I model the WTP for fossil fuels with a two-part hurdle model. First, I use a logit model to see whether a respondent has any positive WTP, then I use OLS to examine differences in WTP amounts. Next, using OLS, I examine the WTP for fossil fuels, among those who are WTP &gt;0, and for renewables. The results of all three models are shown in</w:t>
+        <w:t xml:space="preserve">Given the large percentage of respondents at WTP = $0 for fossil fuels, I model the WTP for fossil fuels with a two-part hurdle model. First, I use a logit model to see whether a respondent has any positive WTP, then I use OLS to examine differences in WTP amounts. Next, using OLS, I examine the WTP for fossil fuels, among those who are WTP &gt;0, and for renewables. The results of all three models are shown in</w:t>
       </w:r>
       <w:r>
         <w:t xml:space="preserve"> </w:t>
@@ -2786,6 +2967,94 @@
             </w:tr>
             <w:tr>
               <w:tc>
+                <w:tcPr/>
+                <w:p>
+                  <w:pPr>
+                    <w:pStyle w:val="Compact"/>
+                    <w:jc w:val="center"/>
+                  </w:pPr>
+                  <w:r>
+                    <w:t xml:space="preserve">Adj. R2</w:t>
+                  </w:r>
+                </w:p>
+              </w:tc>
+              <w:tc>
+                <w:tcPr/>
+                <w:p>
+                  <w:pPr>
+                    <w:pStyle w:val="Compact"/>
+                  </w:pPr>
+                </w:p>
+              </w:tc>
+              <w:tc>
+                <w:tcPr/>
+                <w:p>
+                  <w:pPr>
+                    <w:pStyle w:val="Compact"/>
+                    <w:jc w:val="center"/>
+                  </w:pPr>
+                  <w:r>
+                    <w:t xml:space="preserve">0.002</w:t>
+                  </w:r>
+                </w:p>
+              </w:tc>
+              <w:tc>
+                <w:tcPr/>
+                <w:p>
+                  <w:pPr>
+                    <w:pStyle w:val="Compact"/>
+                    <w:jc w:val="center"/>
+                  </w:pPr>
+                  <w:r>
+                    <w:t xml:space="preserve">0.104</w:t>
+                  </w:r>
+                </w:p>
+              </w:tc>
+            </w:tr>
+            <w:tr>
+              <w:tc>
+                <w:tcPr/>
+                <w:p>
+                  <w:pPr>
+                    <w:pStyle w:val="Compact"/>
+                    <w:jc w:val="center"/>
+                  </w:pPr>
+                  <w:r>
+                    <w:t xml:space="preserve">McFadden’s pseudo R2</w:t>
+                  </w:r>
+                </w:p>
+              </w:tc>
+              <w:tc>
+                <w:tcPr/>
+                <w:p>
+                  <w:pPr>
+                    <w:pStyle w:val="Compact"/>
+                    <w:jc w:val="center"/>
+                  </w:pPr>
+                  <w:r>
+                    <w:t xml:space="preserve">0.061</w:t>
+                  </w:r>
+                </w:p>
+              </w:tc>
+              <w:tc>
+                <w:tcPr/>
+                <w:p>
+                  <w:pPr>
+                    <w:pStyle w:val="Compact"/>
+                  </w:pPr>
+                </w:p>
+              </w:tc>
+              <w:tc>
+                <w:tcPr/>
+                <w:p>
+                  <w:pPr>
+                    <w:pStyle w:val="Compact"/>
+                  </w:pPr>
+                </w:p>
+              </w:tc>
+            </w:tr>
+            <w:tr>
+              <w:tc>
                 <w:tcPr>
                   <w:gridSpan w:val="4"/>
                 </w:tcPr>
@@ -2831,7 +3100,38 @@
         <w:t xml:space="preserve"> </w:t>
       </w:r>
       <w:r>
-        <w:t xml:space="preserve">= 0.023). However, the cues were not significant nor were the interactions between the cues and political beliefs.</w:t>
+        <w:t xml:space="preserve">= 0.023). However, the cues were not significant nor were the interactions between the cues and political beliefs. The WTP amounts are shown in</w:t>
+      </w:r>
+      <w:r>
+        <w:t xml:space="preserve"> </w:t>
+      </w:r>
+      <w:hyperlink w:anchor="fig-wtp-fossil-predicted">
+        <w:r>
+          <w:rPr>
+            <w:rStyle w:val="Hyperlink"/>
+          </w:rPr>
+          <w:t xml:space="preserve">Figure 2</w:t>
+        </w:r>
+      </w:hyperlink>
+      <w:r>
+        <w:t xml:space="preserve"> </w:t>
+      </w:r>
+      <w:r>
+        <w:t xml:space="preserve">and</w:t>
+      </w:r>
+      <w:r>
+        <w:t xml:space="preserve"> </w:t>
+      </w:r>
+      <w:hyperlink w:anchor="fig-wtp-renewable-predicted">
+        <w:r>
+          <w:rPr>
+            <w:rStyle w:val="Hyperlink"/>
+          </w:rPr>
+          <w:t xml:space="preserve">Figure 3</w:t>
+        </w:r>
+      </w:hyperlink>
+      <w:r>
+        <w:t xml:space="preserve">.</w:t>
       </w:r>
     </w:p>
     <w:tbl>
@@ -2997,7 +3297,7 @@
         <w:pStyle w:val="BodyText"/>
       </w:pPr>
       <w:r>
-        <w:t xml:space="preserve">Neither the Trump cue nor its interaction with conservative Republican identity significantly predicted participation or, among those with positive WTP, the dollar amount: predicted participation for conservative Republicans was 68.0% in the control condition versus 71.3% in the Trump cue, and the predicted amount conditional on paying something was $14.10 versus $14.41.</w:t>
+        <w:t xml:space="preserve">Neither the Trump cue nor its interaction with conservative Republican identity significantly predicted participation or, among those with positive WTP, the dollar amount. Overall, the predicted participation for conservative Republicans was 68.0% in the control condition versus 71.3% in the Trump cue, and the predicted amount conditional on paying something was $14.10 versus $14.41.</w:t>
       </w:r>
     </w:p>
     <w:p>
@@ -3026,17 +3326,17 @@
         <w:pStyle w:val="BodyText"/>
       </w:pPr>
       <w:r>
-        <w:t xml:space="preserve">The clean energy transition is needed to mitigate climate change, and public support is needed for the energy transition to complete. The results here show that support for fossil fuel and renewable energy sources is polarized, as measured both by prioritizing one source over the other as well as WTP for those sources. Additionally, a Trump cue made conservative Republicans more supportive of fossil fuels and a climate cue made liberal Democrats more supportive of renewables. However, respondents were, on average, more support of renewables in terms of both priority and WTP. Even conservative Republicans in the Trump cue had a WTP higher for renewables, $12.04, than fossil fuels, at $10.28.</w:t>
+        <w:t xml:space="preserve">Overall, a Trump cue made conservative Republicans more supportive of fossil fuels and a climate cue made liberal Democrats more supportive of renewables. However, respondents were, on average, more support of renewables in terms of both priority and WTP. Even conservative Republicans in the Trump cue had a WTP higher for renewables, $12.04, than fossil fuels, at $10.28.</w:t>
       </w:r>
     </w:p>
     <w:bookmarkEnd w:id="29"/>
-    <w:bookmarkStart w:id="30" w:name="conclusion-and-policy-implications"/>
+    <w:bookmarkStart w:id="30" w:name="discussion-and-conclusion"/>
     <w:p>
       <w:pPr>
         <w:pStyle w:val="Heading1"/>
       </w:pPr>
       <w:r>
-        <w:t xml:space="preserve">Conclusion and Policy Implications</w:t>
+        <w:t xml:space="preserve">Discussion and Conclusion</w:t>
       </w:r>
     </w:p>
     <w:p>
@@ -3044,7 +3344,7 @@
         <w:pStyle w:val="FirstParagraph"/>
       </w:pPr>
       <w:r>
-        <w:t xml:space="preserve">This study examined how exposure to a Trump cue or a climate change cue shapes the US public’s prioritization of, and willingness-to-pay for, fossil fuel versus renewable electricity, and whether these responses are conditional on political identity. The results show that support for energy sources is polarized along partisan lines, both in how respondents prioritized fossil fuels against renewables and in the dollar amounts they were willing to pay, and that a Trump cue pushed conservative Republicans further toward fossil fuels while a climate cue pushed liberal Democrats further toward renewables. However, respondents were, on average, more supportive of renewables than fossil fuels on both measures, and even conservative Republicans exposed to the Trump cue reported a higher WTP for renewables than for fossil fuels. Together, these findings suggest that cues sharpen an existing partisan divide rather than create it, and that the divide sits atop a broad, if uneven, base of support for the energy transition.</w:t>
+        <w:t xml:space="preserve">The clean energy transition is needed to mitigate climate change, and public support is needed for the energy transition. However, President Trump’s rhetoric and actions on energy may serve to polarize the public. This study examined how exposure to a Trump cue or a climate change cue shapes the US public’s prioritization of, and willingness-to-pay for, fossil fuel versus renewable electricity, and whether these responses are conditional on political beliefs. The results show that support for energy sources is polarized along partisan lines, both in how respondents prioritized fossil fuels against renewables and in the dollar amounts they were willing to pay, and that a Trump cue pushed conservative Republicans further toward fossil fuels while a climate cue pushed liberal Democrats further toward renewables. However, respondents were, on average, more supportive of renewables than fossil fuels on both measures, and even conservative Republicans exposed to the Trump cue reported a higher WTP for renewables than for fossil fuels. Together, these findings suggest that cues sharpen an existing partisan divide rather than create it.</w:t>
       </w:r>
     </w:p>
     <w:p>
@@ -3052,7 +3352,7 @@
         <w:pStyle w:val="BodyText"/>
       </w:pPr>
       <w:r>
-        <w:t xml:space="preserve">The cue effects were also uneven across the two outcomes. Political identity conditioned the effect of the cues on prioritization and on WTP for renewables, but the Trump cue did not significantly change fossil fuel participation or amount among conservative Republicans specifically. This is likely because a single cue, delivered once in a survey, is a weaker treatment than the sustained rhetoric respondents encounter in their daily media diet, and because a cue about a political figure may be too diffuse to move a specific pocketbook judgment like WTP. The climate cue, by contrast, was associated with a directionally larger, though not statistically significant, increase in WTP for renewables among liberal Democrats, consistent with the idea that a cue tied to a scientific rationale for renewables resonates most with those already predisposed toward that position.</w:t>
+        <w:t xml:space="preserve">The cue effects were also uneven across the two outcomes. Political beliefs conditioned the effect of the cues on prioritization and on WTP for renewables, but the Trump cue did not significantly change fossil fuel participation or amount among conservative Republicans specifically. This may be because a single cue, delivered once in a survey, is a weaker treatment than the sustained rhetoric respondents may encounter. and because a cue about a political figure may be too diffuse to move a specific pocketbook judgment like WTP. The climate cue, by contrast, was associated with a directionally larger, though not statistically significant, increase in WTP for renewables among liberal Democrats, consistent with the idea that a cue tied to a scientific rationale for renewables resonates most with those already predisposed toward that position.</w:t>
       </w:r>
     </w:p>
     <w:p>

</xml_diff>

<commit_message>
Address mock review: design checks, hypotheses, reframed results
- Add scripts/design-checks-setup.R: cue-only models, balance by
  condition, post-treatment identity check, Holm-adjusted interaction
  p-values, minimum detectable effects, Tobit WTP models, unweighted models
- Expand Table 1 with WTP outcomes and means by condition; relabel
  control as baseline
- Add abstract, keywords, formal hypotheses and research questions,
  costless vs. costly preference framing, prompt-asymmetry and design
  limitations, and statements section
- Reframe interaction results as tentative; remove untested claims
- Document leaner coding and NPORS party targets (verified against raw data)
- Add new robustness sections to supplemental materials; update LOG/README

Co-Authored-By: Claude Opus 5.5 <noreply@anthropic.com>
</commit_message>
<xml_diff>
--- a/_output/cue-WTP.docx
+++ b/_output/cue-WTP.docx
@@ -24,6 +24,22 @@
         <w:footnoteReference w:id="9"/>
       </w:r>
     </w:p>
+    <w:p>
+      <w:pPr>
+        <w:pStyle w:val="AbstractTitle"/>
+      </w:pPr>
+      <w:r>
+        <w:t xml:space="preserve">Abstract</w:t>
+      </w:r>
+    </w:p>
+    <w:p>
+      <w:pPr>
+        <w:pStyle w:val="Abstract"/>
+      </w:pPr>
+      <w:r>
+        <w:t xml:space="preserve">The second Trump administration has promoted fossil fuels and criticized renewable energy, which may serve as a partisan cue that further polarizes the US public on energy. Using a survey experiment with a quota-based sample of US residents (N = 3,113), I examine how a Trump cue and a climate change cue shape how the public prioritizes fossil fuels versus renewables, as well as their willingness-to-pay (WTP) for each source measured with the Gabor-Granger method. Political beliefs strongly predicted both outcomes, as conservative Republicans prioritized fossil fuels and were WTP less for renewables, whereas liberal Democrats prioritized renewables and were WTP more for them. Neither cue had an average effect on priority or WTP. There is some evidence that the Trump cue moved conservative Republicans toward fossil fuels and the climate cue moved liberal Democrats toward renewables on the priority scale, though these interactions were only marginally significant. The cues did not reliably shift WTP for either source. The results suggest that cues are more likely to move costless expressions of energy preferences than the amount the public states it is willing to pay.</w:t>
+      </w:r>
+    </w:p>
     <w:bookmarkStart w:id="10" w:name="introduction"/>
     <w:p>
       <w:pPr>
@@ -82,7 +98,7 @@
         <w:t xml:space="preserve">(Feldman and Hart 2018)</w:t>
       </w:r>
       <w:r>
-        <w:t xml:space="preserve">. Given the emphases of the second Trump administration regarding fossil fuels and renewables, it is possible that polarization among the public on energy sources may increase in response. In this paper, I explore how exposure to a Trump or climate cue, compared to no cue, influences how the US public prioritizes fossil fuels versus renewables as well as their willingness-to-pay (WTP) for those energy sources.</w:t>
+        <w:t xml:space="preserve">. Given the emphases of the second Trump administration regarding fossil fuels and renewables, it is possible that polarization among the public on energy sources may increase in response. In this paper, I explore how exposure to a Trump or climate cue, compared to an unattributed argument for fossil fuels, influences how the US public prioritizes fossil fuels versus renewables as well as their willingness-to-pay (WTP) for those energy sources.</w:t>
       </w:r>
     </w:p>
     <w:p>
@@ -90,7 +106,16 @@
         <w:pStyle w:val="BodyText"/>
       </w:pPr>
       <w:r>
-        <w:t xml:space="preserve">As noted, the public is responsive to cues when forming their views on energy issues; however, less is known about how cues may impact the WTP of the public. In brief, the literature on WTP for energy finds that the public is responsive to price volatility for both fossil fuels and renewables</w:t>
+        <w:t xml:space="preserve">As noted, the public is responsive to cues when forming their views on energy issues; however, less is known about how cues may impact the WTP of the public. The closest work, by</w:t>
+      </w:r>
+      <w:r>
+        <w:t xml:space="preserve"> </w:t>
+      </w:r>
+      <w:r>
+        <w:t xml:space="preserve">Benegal and Green (2024)</w:t>
+      </w:r>
+      <w:r>
+        <w:t xml:space="preserve">, found that partisan cue-taking outweighed sensitivity to cost in support for the Green New Deal, yet the outcome in that study was support for a policy with a stated cost rather than the amount respondents would add to their own electricity bill for a specific energy source. Additionally, few studies compare the effect of a cue on a costless expression of preference, such as how energy sources should be prioritized, with its effect on a costly one, such as WTP, among the same respondents. In brief, the literature on WTP for energy finds that the public is responsive to price volatility for both fossil fuels and renewables</w:t>
       </w:r>
       <w:r>
         <w:t xml:space="preserve"> </w:t>
@@ -152,7 +177,646 @@
         <w:pStyle w:val="BodyText"/>
       </w:pPr>
       <w:r>
-        <w:t xml:space="preserve">In this study, I expand on current research by testing the impacts of a Trump cue versus a climate change cue on the prioritization of and WTP for fossil fuels and renewable sources of energy. Overall, I find that political beliefs shape energy source prioritization as conservative Republicans tend to prioritize and have a higher WTP for fossil fuels and liberal Democrats prioritize and have a higher WTP for renewables. The cues have some interaction effects as conservative Republicans in the Trump cue prioritize fossil fuels somewhat more, and liberal Democrats in the climate cue prioritize renewables more, with interactions significant at</w:t>
+        <w:t xml:space="preserve">In this study, I expand on current research by testing the impacts of a Trump cue versus a climate change cue on the prioritization of and WTP for fossil fuels and renewable sources of energy. Overall, I find that political beliefs shape energy source prioritization as conservative Republicans tend to prioritize and have a higher WTP for fossil fuels and liberal Democrats prioritize and have a higher WTP for renewables. Neither cue had an average effect on either outcome. There is some evidence that conservative Republicans in the Trump cue prioritize fossil fuels more, and liberal Democrats in the climate cue prioritize renewables more, though these interactions are only marginally significant and do not hold after adjusting for multiple comparisons. Finally, the cues did not reliably shift WTP for either energy source, which suggests that cues are more likely to move costless expressions of preference than costly ones.</w:t>
+      </w:r>
+    </w:p>
+    <w:bookmarkEnd w:id="10"/>
+    <w:bookmarkStart w:id="13" w:name="X414242f9dcb5de71fe60fdaf88dd8e9b91b80ad"/>
+    <w:p>
+      <w:pPr>
+        <w:pStyle w:val="Heading1"/>
+      </w:pPr>
+      <w:r>
+        <w:t xml:space="preserve">Cues, Public Opinion, and the Public’s Willingness-to-Pay for Energy</w:t>
+      </w:r>
+    </w:p>
+    <w:p>
+      <w:pPr>
+        <w:pStyle w:val="FirstParagraph"/>
+      </w:pPr>
+      <w:r>
+        <w:t xml:space="preserve">Partisan and elite cues shape public opinion on climate and energy issues, as the public tends to adopt the positions associated with their political party</w:t>
+      </w:r>
+      <w:r>
+        <w:t xml:space="preserve"> </w:t>
+      </w:r>
+      <w:r>
+        <w:t xml:space="preserve">(Ehret, Van Boven, and Sherman 2018; Merkley and Stecula 2021; Tesler 2018)</w:t>
+      </w:r>
+      <w:r>
+        <w:t xml:space="preserve">. Cues provide an information heuristic, or shortcut, that allows the public to form opinions regarding a host of issues. Additionally, cues provide guides for motivated reasoning, as individuals apply reasoning in service to matching their views with those of their preferred party. Such motivated reasoning has been found in energy policy specifically.</w:t>
+      </w:r>
+      <w:r>
+        <w:t xml:space="preserve"> </w:t>
+      </w:r>
+      <w:r>
+        <w:t xml:space="preserve">Bolsen, Druckman, and Cook (2014)</w:t>
+      </w:r>
+      <w:r>
+        <w:t xml:space="preserve"> </w:t>
+      </w:r>
+      <w:r>
+        <w:t xml:space="preserve">found that party endorsements of an energy law led partisans to support the law when their party endorsed it and to oppose it when the other party did, and</w:t>
+      </w:r>
+      <w:r>
+        <w:t xml:space="preserve"> </w:t>
+      </w:r>
+      <w:r>
+        <w:t xml:space="preserve">Druckman, Peterson, and Slothuus (2013)</w:t>
+      </w:r>
+      <w:r>
+        <w:t xml:space="preserve"> </w:t>
+      </w:r>
+      <w:r>
+        <w:t xml:space="preserve">found that party cues on energy policy have a larger influence on opinion when elites are polarized. Given the polarized elite environment surrounding energy, a cue tied to President Trump is likely to be a strong signal to partisans of both parties. Apart from partisan cues, connecting energy policies to the polarized issue of climate change can also shape and polarize public opinion. For example,</w:t>
+      </w:r>
+      <w:r>
+        <w:t xml:space="preserve"> </w:t>
+      </w:r>
+      <w:r>
+        <w:t xml:space="preserve">Feldman and Hart (2018)</w:t>
+      </w:r>
+      <w:r>
+        <w:t xml:space="preserve"> </w:t>
+      </w:r>
+      <w:r>
+        <w:t xml:space="preserve">found that framing a low-carbon energy policy as a climate change solution, rather than as an air pollution or energy security measure, reduced support for that policy among Republicans.</w:t>
+      </w:r>
+    </w:p>
+    <w:p>
+      <w:pPr>
+        <w:pStyle w:val="BodyText"/>
+      </w:pPr>
+      <w:r>
+        <w:t xml:space="preserve">In addition to beliefs and attitudes, partisanship is also likely to influence an individual’s WTP. For example, conservatives were less likely to purchase an energy-efficient light bulb when it was labeled with an environmental message, as opposed to no label</w:t>
+      </w:r>
+      <w:r>
+        <w:t xml:space="preserve"> </w:t>
+      </w:r>
+      <w:r>
+        <w:t xml:space="preserve">(Gromet, Kunreuther, and Larrick 2013)</w:t>
+      </w:r>
+      <w:r>
+        <w:t xml:space="preserve">. A larger number of studies have examined stated WTP and political beliefs.</w:t>
+      </w:r>
+      <w:r>
+        <w:t xml:space="preserve"> </w:t>
+      </w:r>
+      <w:r>
+        <w:t xml:space="preserve">Kotchen, Boyle, and Leiserowitz (2013)</w:t>
+      </w:r>
+      <w:r>
+        <w:t xml:space="preserve"> </w:t>
+      </w:r>
+      <w:r>
+        <w:t xml:space="preserve">found that Republicans reported lower WTP for a national climate policy than Democrats and independents, but that this partisan gap was largely explained by differences in beliefs about whether climate change is occurring. Using a similar national WTP measure,</w:t>
+      </w:r>
+      <w:r>
+        <w:t xml:space="preserve"> </w:t>
+      </w:r>
+      <w:r>
+        <w:t xml:space="preserve">Kotchen, Turk, and Leiserowitz (2017)</w:t>
+      </w:r>
+      <w:r>
+        <w:t xml:space="preserve"> </w:t>
+      </w:r>
+      <w:r>
+        <w:t xml:space="preserve">estimated an average household WTP of $177 per year for a carbon tax, with respondents favoring that the revenue be spent on clean energy investment over other uses. More recently,</w:t>
+      </w:r>
+      <w:r>
+        <w:t xml:space="preserve"> </w:t>
+      </w:r>
+      <w:r>
+        <w:t xml:space="preserve">Benegal and Green (2024)</w:t>
+      </w:r>
+      <w:r>
+        <w:t xml:space="preserve"> </w:t>
+      </w:r>
+      <w:r>
+        <w:t xml:space="preserve">found that partisan cue-taking, where respondents supported policies proposed by their party, outweighed sensitivity to the policy’s stated cost.</w:t>
+      </w:r>
+      <w:r>
+        <w:t xml:space="preserve"> </w:t>
+      </w:r>
+      <w:r>
+        <w:t xml:space="preserve">Scheuch (2026)</w:t>
+      </w:r>
+      <w:r>
+        <w:t xml:space="preserve"> </w:t>
+      </w:r>
+      <w:r>
+        <w:t xml:space="preserve">also found partisanship to be a significant predictor of WTP for local climate policy, alongside age and income. Overall, political beliefs seem to influence not just abstract support for climate and energy policy, but the dollar amounts people state that they are willing to pay.</w:t>
+      </w:r>
+    </w:p>
+    <w:p>
+      <w:pPr>
+        <w:pStyle w:val="BodyText"/>
+      </w:pPr>
+      <w:r>
+        <w:t xml:space="preserve">Yet, the influence of cues may differ between costless and costly expressions of preference. Stating how energy sources should be prioritized costs a respondent nothing, so agreeing with a trusted source or disagreeing with a disliked one is easy. Indeed, research on expressive responding has found that partisan differences in survey responses shrink when respondents are given an incentive to answer accurately, which suggests that some partisan responses are an expression of support for one’s party rather than a sincere belief</w:t>
+      </w:r>
+      <w:r>
+        <w:t xml:space="preserve"> </w:t>
+      </w:r>
+      <w:r>
+        <w:t xml:space="preserve">(Bullock et al. 2015; Prior, Sood, and Khanna 2015)</w:t>
+      </w:r>
+      <w:r>
+        <w:t xml:space="preserve">. Stating a WTP, in contrast, asks respondents to consider a cost to their own household. A cue may therefore move how respondents prioritize energy sources without moving the amount they are willing to pay, as the cost of following the cue becomes concrete. However,</w:t>
+      </w:r>
+      <w:r>
+        <w:t xml:space="preserve"> </w:t>
+      </w:r>
+      <w:r>
+        <w:t xml:space="preserve">Benegal and Green (2024)</w:t>
+      </w:r>
+      <w:r>
+        <w:t xml:space="preserve"> </w:t>
+      </w:r>
+      <w:r>
+        <w:t xml:space="preserve">found that partisan cue-taking can outweigh cost sensitivity, so whether cue effects carry over from priority to WTP is an open question.</w:t>
+      </w:r>
+    </w:p>
+    <w:p>
+      <w:pPr>
+        <w:pStyle w:val="BodyText"/>
+      </w:pPr>
+      <w:r>
+        <w:t xml:space="preserve">Looking to work that specifically examines public WTP for renewables and fossil fuels, several studies have found that the public is WTP more for renewables than other sources of energy. For example,</w:t>
+      </w:r>
+      <w:r>
+        <w:t xml:space="preserve"> </w:t>
+      </w:r>
+      <w:r>
+        <w:t xml:space="preserve">Nkansah and Collins (2019)</w:t>
+      </w:r>
+      <w:r>
+        <w:t xml:space="preserve"> </w:t>
+      </w:r>
+      <w:r>
+        <w:t xml:space="preserve">compared WTP for wind against natural gas generation specifically and found consumers willing to pay more for wind. Along similar lines,</w:t>
+      </w:r>
+      <w:r>
+        <w:t xml:space="preserve"> </w:t>
+      </w:r>
+      <w:r>
+        <w:t xml:space="preserve">Murakami et al. (2015)</w:t>
+      </w:r>
+      <w:r>
+        <w:t xml:space="preserve"> </w:t>
+      </w:r>
+      <w:r>
+        <w:t xml:space="preserve">placed fossil fuels, renewables, and nuclear power on the same WTP scale in the US and Japan, and found that respondents in both countries expressed positive WTP for increased renewable generation but negative WTP for increased nuclear generation, with US respondents expressing a stronger preference for renewables than Japanese respondents. However,</w:t>
+      </w:r>
+      <w:r>
+        <w:t xml:space="preserve"> </w:t>
+      </w:r>
+      <w:r>
+        <w:t xml:space="preserve">Walter, Thacher, and Chermak (2023)</w:t>
+      </w:r>
+      <w:r>
+        <w:t xml:space="preserve"> </w:t>
+      </w:r>
+      <w:r>
+        <w:t xml:space="preserve">found that US respondents’ preferences over fossil versus renewable energy futures depended on their geographic proximity to fossil fuel production and their opinion about anthropogenic climate change. Finally,</w:t>
+      </w:r>
+      <w:r>
+        <w:t xml:space="preserve"> </w:t>
+      </w:r>
+      <w:r>
+        <w:t xml:space="preserve">Li et al. (2009)</w:t>
+      </w:r>
+      <w:r>
+        <w:t xml:space="preserve"> </w:t>
+      </w:r>
+      <w:r>
+        <w:t xml:space="preserve">estimated household WTP for a federal energy research and development fund aimed at reducing reliance on fossil fuels, and found broad support for that funding, suggesting that WTP responds to reducing fossil fuel use on its own without reference to another energy source.</w:t>
+      </w:r>
+      <w:r>
+        <w:t xml:space="preserve"> </w:t>
+      </w:r>
+      <w:r>
+        <w:rPr>
+          <w:rStyle w:val="FootnoteReference"/>
+        </w:rPr>
+        <w:footnoteReference w:id="11"/>
+      </w:r>
+    </w:p>
+    <w:bookmarkStart w:id="12" w:name="theoretical-expectations"/>
+    <w:p>
+      <w:pPr>
+        <w:pStyle w:val="Heading2"/>
+      </w:pPr>
+      <w:r>
+        <w:t xml:space="preserve">Theoretical Expectations</w:t>
+      </w:r>
+    </w:p>
+    <w:p>
+      <w:pPr>
+        <w:pStyle w:val="FirstParagraph"/>
+      </w:pPr>
+      <w:r>
+        <w:t xml:space="preserve">Previous research suggests that partisan cues are an important driver of energy preferences and that partisanship and environmental beliefs shape the WTP for energy sources. In this study, I use a survey experiment to examine the influence of a Trump cue and a climate change cue on preferences and the stated WTP for fossil fuels versus renewables.</w:t>
+      </w:r>
+    </w:p>
+    <w:p>
+      <w:pPr>
+        <w:pStyle w:val="BodyText"/>
+      </w:pPr>
+      <w:r>
+        <w:t xml:space="preserve">The experiment includes three conditions, and each is designed to manipulate something different. All respondents see an argument that renewables are not reliable and that fossil fuels are needed for energy security. In the baseline condition the argument is attributed to</w:t>
+      </w:r>
+      <w:r>
+        <w:t xml:space="preserve"> </w:t>
+      </w:r>
+      <w:r>
+        <w:t xml:space="preserve">“some,”</w:t>
+      </w:r>
+      <w:r>
+        <w:t xml:space="preserve"> </w:t>
+      </w:r>
+      <w:r>
+        <w:t xml:space="preserve">so the baseline is an unattributed argument for fossil fuels rather than the absence of a message. In the Trump condition the same argument is attributed to President Trump, so the comparison with the baseline isolates the effect of a partisan source cue. In the climate condition the unattributed argument is followed by a statement that scientists have warned that fossil fuels will make climate change worse and that renewables should be increased. The climate condition therefore combines a scientific source, a climate change frame, and a counterargument, and its comparison with the baseline captures the effect of that combined message. Because the two cue conditions differ from the baseline in different ways, I compare each cue with the baseline rather than comparing the size of the two cue effects with each other.</w:t>
+      </w:r>
+    </w:p>
+    <w:p>
+      <w:pPr>
+        <w:pStyle w:val="BodyText"/>
+      </w:pPr>
+      <w:r>
+        <w:t xml:space="preserve">Based on the research discussed above, I posit the following hypotheses.</w:t>
+      </w:r>
+    </w:p>
+    <w:p>
+      <w:pPr>
+        <w:pStyle w:val="BlockText"/>
+      </w:pPr>
+      <w:r>
+        <w:t xml:space="preserve">H1a: Conservative Republicans will prioritize fossil fuels and be WTP more for fossil fuels than those with other political beliefs.</w:t>
+      </w:r>
+    </w:p>
+    <w:p>
+      <w:pPr>
+        <w:pStyle w:val="BlockText"/>
+      </w:pPr>
+      <w:r>
+        <w:t xml:space="preserve">H1b: Liberal Democrats will prioritize renewables and be WTP more for renewables than those with other political beliefs.</w:t>
+      </w:r>
+    </w:p>
+    <w:p>
+      <w:pPr>
+        <w:pStyle w:val="BlockText"/>
+      </w:pPr>
+      <w:r>
+        <w:t xml:space="preserve">H2a: Those who receive the Trump cue will prioritize fossil fuels and be WTP more for fossil fuels than those in the baseline condition.</w:t>
+      </w:r>
+    </w:p>
+    <w:p>
+      <w:pPr>
+        <w:pStyle w:val="BlockText"/>
+      </w:pPr>
+      <w:r>
+        <w:t xml:space="preserve">H2b: Those who receive the climate cue will prioritize renewables and be WTP more for renewables than those in the baseline condition.</w:t>
+      </w:r>
+    </w:p>
+    <w:p>
+      <w:pPr>
+        <w:pStyle w:val="BlockText"/>
+      </w:pPr>
+      <w:r>
+        <w:t xml:space="preserve">H3a: The effect of the Trump cue on prioritizing and WTP for fossil fuels will be larger among conservative Republicans than among those with other political beliefs.</w:t>
+      </w:r>
+    </w:p>
+    <w:p>
+      <w:pPr>
+        <w:pStyle w:val="BlockText"/>
+      </w:pPr>
+      <w:r>
+        <w:t xml:space="preserve">H3b: The effect of the climate cue on prioritizing and WTP for renewables will be larger among liberal Democrats than among those with other political beliefs.</w:t>
+      </w:r>
+    </w:p>
+    <w:p>
+      <w:pPr>
+        <w:pStyle w:val="FirstParagraph"/>
+      </w:pPr>
+      <w:r>
+        <w:t xml:space="preserve">In addition, I examine two research questions. First, cues from a disliked source may lead partisans to move away from the position of that source</w:t>
+      </w:r>
+      <w:r>
+        <w:t xml:space="preserve"> </w:t>
+      </w:r>
+      <w:r>
+        <w:t xml:space="preserve">(Feldman and Hart 2018)</w:t>
+      </w:r>
+      <w:r>
+        <w:t xml:space="preserve">, so I ask whether liberal Democrats move toward renewables in response to the Trump cue and whether conservative Republicans move toward fossil fuels in response to the climate cue (RQ1). Second, given the difference between costless and costly expressions of preference, I ask whether the effects of the cues on prioritization carry over to WTP (RQ2).</w:t>
+      </w:r>
+    </w:p>
+    <w:bookmarkEnd w:id="12"/>
+    <w:bookmarkEnd w:id="13"/>
+    <w:bookmarkStart w:id="16" w:name="data-and-measures"/>
+    <w:p>
+      <w:pPr>
+        <w:pStyle w:val="Heading1"/>
+      </w:pPr>
+      <w:r>
+        <w:t xml:space="preserve">Data and Measures</w:t>
+      </w:r>
+    </w:p>
+    <w:p>
+      <w:pPr>
+        <w:pStyle w:val="FirstParagraph"/>
+      </w:pPr>
+      <w:r>
+        <w:t xml:space="preserve">To examine the importance of cues and political beliefs in energy preferences I use a survey experiment to examine respondents’ prioritization of fossil fuels versus renewables as well as their WTP for those sources to generate electricity in response to a Trump cue or a climate change cue. Respondents were recruited using Cloud Research, which provides a quota-based sample of US residents, with quotas for age, race, and gender based on US Census data. Additionally, to further ensure as representative a sample as possible, I used the</w:t>
+      </w:r>
+      <w:r>
+        <w:t xml:space="preserve"> </w:t>
+      </w:r>
+      <w:r>
+        <w:rPr>
+          <w:rStyle w:val="VerbatimChar"/>
+        </w:rPr>
+        <w:t xml:space="preserve">survey</w:t>
+      </w:r>
+      <w:r>
+        <w:t xml:space="preserve"> </w:t>
+      </w:r>
+      <w:r>
+        <w:t xml:space="preserve">and</w:t>
+      </w:r>
+      <w:r>
+        <w:t xml:space="preserve"> </w:t>
+      </w:r>
+      <w:r>
+        <w:rPr>
+          <w:rStyle w:val="VerbatimChar"/>
+        </w:rPr>
+        <w:t xml:space="preserve">anesrake</w:t>
+      </w:r>
+      <w:r>
+        <w:t xml:space="preserve"> </w:t>
+      </w:r>
+      <w:r>
+        <w:t xml:space="preserve">packages in</w:t>
+      </w:r>
+      <w:r>
+        <w:t xml:space="preserve"> </w:t>
+      </w:r>
+      <w:r>
+        <w:rPr>
+          <w:rStyle w:val="VerbatimChar"/>
+        </w:rPr>
+        <w:t xml:space="preserve">R</w:t>
+      </w:r>
+      <w:r>
+        <w:t xml:space="preserve"> </w:t>
+      </w:r>
+      <w:r>
+        <w:t xml:space="preserve">to perform iterative raking to compute survey weights that weight respondents based on the US Census’s 2023 American Community Survey (ACS) on demographic variables, including age, race, gender, and education. I also used the Pew Research Center’s National Public Opinion Reference Survey (NPORS) from 2025 to weight the sample based on political party affiliation. With leaners assigned to a party, the NPORS targets were 45 percent Democratic, 46 percent Republican, and 9 percent identifying with neither party. I surveyed 3113 US residents in April 2026, who were randomly assigned to receive one of three treatments, including a cue about Trump’s critiques of renewable energy and his support for fossil fuels (n = 1049), a climate change cue that stated scientists recommend moving away from fossil fuels to renewables to address climate change (n = 1013), or a baseline condition in which the argument for fossil fuels was attributed to</w:t>
+      </w:r>
+      <w:r>
+        <w:t xml:space="preserve"> </w:t>
+      </w:r>
+      <w:r>
+        <w:t xml:space="preserve">“some”</w:t>
+      </w:r>
+      <w:r>
+        <w:t xml:space="preserve"> </w:t>
+      </w:r>
+      <w:r>
+        <w:t xml:space="preserve">(n = 1051).</w:t>
+      </w:r>
+      <w:r>
+        <w:rPr>
+          <w:rStyle w:val="FootnoteReference"/>
+        </w:rPr>
+        <w:footnoteReference w:id="14"/>
+      </w:r>
+    </w:p>
+    <w:p>
+      <w:pPr>
+        <w:pStyle w:val="BodyText"/>
+      </w:pPr>
+      <w:r>
+        <w:t xml:space="preserve">All respondents were shown the following paragraph:</w:t>
+      </w:r>
+    </w:p>
+    <w:p>
+      <w:pPr>
+        <w:pStyle w:val="BlockText"/>
+      </w:pPr>
+      <w:r>
+        <w:t xml:space="preserve">The use of renewable energy sources for electricity, including wind energy, solar energy, and battery storage, has risen sharply in recent years. Indeed, most of the growth in new electricity generation in the U.S. has come from renewable sources.</w:t>
+      </w:r>
+    </w:p>
+    <w:p>
+      <w:pPr>
+        <w:pStyle w:val="FirstParagraph"/>
+      </w:pPr>
+      <w:r>
+        <w:t xml:space="preserve">Respondents were then shown the following statement. Those in the Trump cue saw President Trump named specifically, while those in the climate cue and the baseline were shown</w:t>
+      </w:r>
+      <w:r>
+        <w:t xml:space="preserve"> </w:t>
+      </w:r>
+      <w:r>
+        <w:rPr>
+          <w:i/>
+          <w:iCs/>
+        </w:rPr>
+        <w:t xml:space="preserve">some have</w:t>
+      </w:r>
+    </w:p>
+    <w:p>
+      <w:pPr>
+        <w:pStyle w:val="BlockText"/>
+      </w:pPr>
+      <w:r>
+        <w:t xml:space="preserve">However, [</w:t>
+      </w:r>
+      <w:r>
+        <w:rPr>
+          <w:i/>
+          <w:iCs/>
+        </w:rPr>
+        <w:t xml:space="preserve">President Trump has</w:t>
+      </w:r>
+      <w:r>
+        <w:t xml:space="preserve">/</w:t>
+      </w:r>
+      <w:r>
+        <w:rPr>
+          <w:i/>
+          <w:iCs/>
+        </w:rPr>
+        <w:t xml:space="preserve">some have</w:t>
+      </w:r>
+      <w:r>
+        <w:t xml:space="preserve">] argued that renewable sources are not reliable and that we need to increase our reliance on fossil fuels (coal, oil, and natural gas) to ensure energy security.</w:t>
+      </w:r>
+    </w:p>
+    <w:p>
+      <w:pPr>
+        <w:pStyle w:val="FirstParagraph"/>
+      </w:pPr>
+      <w:r>
+        <w:t xml:space="preserve">Those in the climate cue saw the following:</w:t>
+      </w:r>
+    </w:p>
+    <w:p>
+      <w:pPr>
+        <w:pStyle w:val="BlockText"/>
+      </w:pPr>
+      <w:r>
+        <w:t xml:space="preserve">Additionally, scientists have warned that an increase in the use of fossil fuels will make climate change worse; therefore, we should increase our use of renewable sources.</w:t>
+      </w:r>
+    </w:p>
+    <w:p>
+      <w:pPr>
+        <w:pStyle w:val="FirstParagraph"/>
+      </w:pPr>
+      <w:r>
+        <w:t xml:space="preserve">Finally, all respondents were shown:</w:t>
+      </w:r>
+    </w:p>
+    <w:p>
+      <w:pPr>
+        <w:pStyle w:val="BlockText"/>
+      </w:pPr>
+      <w:r>
+        <w:t xml:space="preserve">Please consider how you think we should prioritize the development of fossil fuels and renewable sources to generate electricity.</w:t>
+      </w:r>
+    </w:p>
+    <w:p>
+      <w:pPr>
+        <w:pStyle w:val="FirstParagraph"/>
+      </w:pPr>
+      <w:r>
+        <w:t xml:space="preserve">After receiving the cues, respondents were asked, on a 1 to 7 scale, if fossil fuels should be prioritized (= 1), fossil fuels and renewables should be prioritized equally (= 4), or renewable sources should be prioritized (= 7). Next, I asked respondents their willingness-to-pay (WTP) for fossil fuel and renewable sources using the Gabor-Granger method</w:t>
+      </w:r>
+      <w:r>
+        <w:t xml:space="preserve"> </w:t>
+      </w:r>
+      <w:r>
+        <w:t xml:space="preserve">(Gabor and Granger 1966)</w:t>
+      </w:r>
+      <w:r>
+        <w:t xml:space="preserve">. With the Gabor-Granger method, respondents are shown a random dollar amount and if they are willing to pay that amount, they are next shown a higher amount, and if they are not, they are shown a smaller amount. This approach is a well-established survey-based technique for estimating WTP. It dates to early applications of iterative-bidding price experiments</w:t>
+      </w:r>
+      <w:r>
+        <w:t xml:space="preserve"> </w:t>
+      </w:r>
+      <w:r>
+        <w:t xml:space="preserve">(Jones 1975)</w:t>
+      </w:r>
+      <w:r>
+        <w:t xml:space="preserve"> </w:t>
+      </w:r>
+      <w:r>
+        <w:t xml:space="preserve">and was later formalized in marketing research</w:t>
+      </w:r>
+      <w:r>
+        <w:t xml:space="preserve"> </w:t>
+      </w:r>
+      <w:r>
+        <w:t xml:space="preserve">(Wedel and Leeflang 1998)</w:t>
+      </w:r>
+      <w:r>
+        <w:t xml:space="preserve">. It remains one of the standard indirect approaches used to measure WTP</w:t>
+      </w:r>
+      <w:r>
+        <w:t xml:space="preserve"> </w:t>
+      </w:r>
+      <w:r>
+        <w:t xml:space="preserve">(Breidert, Hahsler, and Reutterer 2006; Lipovetsky, Magnan, and Zanetti-Polzi 2011)</w:t>
+      </w:r>
+      <w:r>
+        <w:t xml:space="preserve">.</w:t>
+      </w:r>
+    </w:p>
+    <w:p>
+      <w:pPr>
+        <w:pStyle w:val="BodyText"/>
+      </w:pPr>
+      <w:r>
+        <w:t xml:space="preserve">To establish WTP, I first give respondents information about potential costs associated with each energy source, and the sources were presented in random order. The prompts were written to give respondents a plausible reason that increasing the use of each source would raise their electricity bill. In the WTP for fossil fuels question, I noted that costs associated with renewable energy have decreased and, therefore they may need to pay more to use fossil fuels. For renewable sources respondents were told about the need to increase distribution. Specifically, respondents were shown the following prompts for fossil fuels and renewables, respectively.</w:t>
+      </w:r>
+    </w:p>
+    <w:p>
+      <w:pPr>
+        <w:pStyle w:val="BlockText"/>
+      </w:pPr>
+      <w:r>
+        <w:t xml:space="preserve">The cost of generating electricity from renewable sources has decreased in recent years. In many places, renewable energy sources are often more cost-effective than fossil fuels. Would you support the increased use of fossil fuels if your electricity bill were to increase by the following each month?</w:t>
+      </w:r>
+    </w:p>
+    <w:p>
+      <w:pPr>
+        <w:pStyle w:val="BlockText"/>
+      </w:pPr>
+      <w:r>
+        <w:t xml:space="preserve">Renewable sources have become cheaper in recent years; however, investments are needed to distribute the electricity they produce to homes and businesses. Would you support the increased use of renewable sources if your electricity bill were to increase by the following each month?</w:t>
+      </w:r>
+    </w:p>
+    <w:p>
+      <w:pPr>
+        <w:pStyle w:val="FirstParagraph"/>
+      </w:pPr>
+      <w:r>
+        <w:t xml:space="preserve">The two prompts are not symmetric. The fossil fuel prompt notes that renewables are often more cost-effective than fossil fuels, which likely gives respondents a reason not to pay more for fossil fuels, whereas the renewables prompt does not include a comparable reason not to pay for renewables. As a result, the difference between WTP for fossil fuels and WTP for renewables likely reflects the wording of the prompts as well as respondents’ preferences, and should be interpreted with caution. However, the wording of each prompt was the same in every condition, so the comparison of each cue with the baseline within each energy source is not affected by the asymmetry.</w:t>
+      </w:r>
+    </w:p>
+    <w:p>
+      <w:pPr>
+        <w:pStyle w:val="BodyText"/>
+      </w:pPr>
+      <w:r>
+        <w:t xml:space="preserve">To estimate the maximum/minimum WTP, respondents were first shown a random dollar amount between $1 and $46, in five-dollar increments, and asked if they would be WTP that amount extra per-month in their electricity bill. If they indicated yes they were shown a larger, random dollar-amount, and if they indicated no they were shown a smaller dollar-amount. This continues until they reach the $46-maximum or $1-minimum. Each respondent’s WTP is the highest amount they accepted, and respondents who indicated no at $1 were coded with a WTP of 0. The starting and follow-up amounts were drawn at random, independently of the cue condition, but were not recorded. As such, I cannot control for the starting amount, which may anchor responses, though random assignment of the starting amount means anchoring is unlikely to differ across conditions.</w:t>
+      </w:r>
+    </w:p>
+    <w:p>
+      <w:pPr>
+        <w:pStyle w:val="BodyText"/>
+      </w:pPr>
+      <w:r>
+        <w:t xml:space="preserve">In the following analysis, I examine the prioritization of fossil fuels vs. renewables and the WTP for those energy sources as a function of the cues and political beliefs. Political beliefs include conservative Republicans and liberal Democrats, with other political beliefs (moderates of either party, conservative Democrats, liberal Republicans, and those who identify with neither party) as the excluded referents. The political belief measures were constructed based on responses to a self-reported, 7-point ideology scale (1 = strongly liberal, 2 = liberal, 3 = slightly liberal, 4 = middle of the road, 5 = slightly conservative, 6 = conservative, 7 = strongly conservative) and political party identification. Respondents who identified as independent or with another party were asked whether they lean toward the Democratic or Republican Party, and those who lean toward a party are coded as identifying with that party. Before leaners are assigned, 34 percent of respondents identified as independent or with another party, and after leaners are assigned, only 15 percent identified with neither party. Conservative Republican is coded 1 for respondents who identify as Republican and place themselves at 5, 6, or 7 on the ideology scale (slightly conservative, conservative, or strongly conservative), and liberal Democrat is coded 1 for respondents who identify as Democrat and place themselves at 1, 2, or 3 (strongly liberal, liberal, or slightly liberal). Party identification and ideology were measured after the outcome questions, so the cues could, in principle, have shifted how respondents identified. However, the distribution of political beliefs did not differ across conditions (</w:t>
+      </w:r>
+      <m:oMath>
+        <m:sSup>
+          <m:e>
+            <m:r>
+              <m:t>χ</m:t>
+            </m:r>
+          </m:e>
+          <m:sup>
+            <m:r>
+              <m:t>2</m:t>
+            </m:r>
+          </m:sup>
+        </m:sSup>
+      </m:oMath>
+      <w:r>
+        <w:t xml:space="preserve"> </w:t>
+      </w:r>
+      <w:r>
+        <w:t xml:space="preserve">= 5.20,</w:t>
+      </w:r>
+      <w:r>
+        <w:t xml:space="preserve"> </w:t>
+      </w:r>
+      <w:r>
+        <w:rPr>
+          <w:i/>
+          <w:iCs/>
+        </w:rPr>
+        <w:t xml:space="preserve">df</w:t>
+      </w:r>
+      <w:r>
+        <w:t xml:space="preserve"> </w:t>
+      </w:r>
+      <w:r>
+        <w:t xml:space="preserve">= 4,</w:t>
       </w:r>
       <w:r>
         <w:t xml:space="preserve"> </w:t>
@@ -165,446 +829,10 @@
         <w:t xml:space="preserve">p</w:t>
       </w:r>
       <w:r>
-        <w:t xml:space="preserve">&lt;0.10. Finally, there were no cue or interaction effects on the WTP for either energy source.</w:t>
-      </w:r>
-    </w:p>
-    <w:bookmarkEnd w:id="10"/>
-    <w:bookmarkStart w:id="13" w:name="X414242f9dcb5de71fe60fdaf88dd8e9b91b80ad"/>
-    <w:p>
-      <w:pPr>
-        <w:pStyle w:val="Heading1"/>
-      </w:pPr>
-      <w:r>
-        <w:t xml:space="preserve">Cues, Public Opinion, and the Public’s Willingness-to-Pay for Energy</w:t>
-      </w:r>
-    </w:p>
-    <w:p>
-      <w:pPr>
-        <w:pStyle w:val="FirstParagraph"/>
-      </w:pPr>
-      <w:r>
-        <w:t xml:space="preserve">Partisan and elite cues shape public opinion on climate and energy issues, as the public tends to adopt the positions associated with their political party</w:t>
-      </w:r>
-      <w:r>
-        <w:t xml:space="preserve"> </w:t>
-      </w:r>
-      <w:r>
-        <w:t xml:space="preserve">(Ehret, Van Boven, and Sherman 2018; Merkley and Stecula 2021; Tesler 2018)</w:t>
-      </w:r>
-      <w:r>
-        <w:t xml:space="preserve">. Cues provide an information heuristic, or shortcut, that allows the public to form opinions regarding a host of issues. Additionally, cues provide guides for motivated reasoning, as individuals apply reasoning in service to matching their views with those of their preferred party. Apart from partisan cues, connecting energy policies to the polarized issue of climate change can also shape and polarize public opinion. For example,</w:t>
-      </w:r>
-      <w:r>
-        <w:t xml:space="preserve"> </w:t>
-      </w:r>
-      <w:r>
-        <w:t xml:space="preserve">Feldman and Hart (2018)</w:t>
-      </w:r>
-      <w:r>
-        <w:t xml:space="preserve"> </w:t>
-      </w:r>
-      <w:r>
-        <w:t xml:space="preserve">found that framing a low-carbon energy policy as a climate change solution, rather than as an air pollution or energy security measure, reduced support for that policy among Republicans.</w:t>
-      </w:r>
-    </w:p>
-    <w:p>
-      <w:pPr>
-        <w:pStyle w:val="BodyText"/>
-      </w:pPr>
-      <w:r>
-        <w:t xml:space="preserve">In addition to beliefs and attitudes, partisanship is also likely to influence an individual’s WTP. For example, conservatives were less likely to purchase an energy-efficient light bulb when it was labeled with an environmental message, as opposed to no label</w:t>
-      </w:r>
-      <w:r>
-        <w:t xml:space="preserve"> </w:t>
-      </w:r>
-      <w:r>
-        <w:t xml:space="preserve">(Gromet, Kunreuther, and Larrick 2013)</w:t>
-      </w:r>
-      <w:r>
-        <w:t xml:space="preserve">. A larger number of studies have examined stated WTP and political beliefs.</w:t>
-      </w:r>
-      <w:r>
-        <w:t xml:space="preserve"> </w:t>
-      </w:r>
-      <w:r>
-        <w:t xml:space="preserve">Kotchen, Boyle, and Leiserowitz (2013)</w:t>
-      </w:r>
-      <w:r>
-        <w:t xml:space="preserve"> </w:t>
-      </w:r>
-      <w:r>
-        <w:t xml:space="preserve">found that Republicans reported lower WTP for a national climate policy than Democrats and independents, but that this partisan gap was largely explained by differences in beliefs about whether climate change is occurring. Using a similar national WTP measure,</w:t>
-      </w:r>
-      <w:r>
-        <w:t xml:space="preserve"> </w:t>
-      </w:r>
-      <w:r>
-        <w:t xml:space="preserve">Kotchen, Turk, and Leiserowitz (2017)</w:t>
-      </w:r>
-      <w:r>
-        <w:t xml:space="preserve"> </w:t>
-      </w:r>
-      <w:r>
-        <w:t xml:space="preserve">estimated an average household WTP of $177 per year for a carbon tax, with respondents favoring that the revenue be spent on clean energy investment over other uses. More recently,</w:t>
-      </w:r>
-      <w:r>
-        <w:t xml:space="preserve"> </w:t>
-      </w:r>
-      <w:r>
-        <w:t xml:space="preserve">Benegal and Green (2024)</w:t>
-      </w:r>
-      <w:r>
-        <w:t xml:space="preserve"> </w:t>
-      </w:r>
-      <w:r>
-        <w:t xml:space="preserve">found that partisan cue-taking, where respondents supported policies proposed by their party, outweighed sensitivity to the policy’s stated cost.</w:t>
-      </w:r>
-      <w:r>
-        <w:t xml:space="preserve"> </w:t>
-      </w:r>
-      <w:r>
-        <w:t xml:space="preserve">Scheuch (2026)</w:t>
-      </w:r>
-      <w:r>
-        <w:t xml:space="preserve"> </w:t>
-      </w:r>
-      <w:r>
-        <w:t xml:space="preserve">also found partisanship to be a significant predictor of WTP for local climate policy, alongside age and income. Overall, political beliefs seem to influence not just abstract support for climate and energy policy, but the dollar amounts people state that they are willing to pay.</w:t>
-      </w:r>
-    </w:p>
-    <w:p>
-      <w:pPr>
-        <w:pStyle w:val="BodyText"/>
-      </w:pPr>
-      <w:r>
-        <w:t xml:space="preserve">Looking to work that specifically examines public WTP for renewables and fossil fuels, several studies have found that the public is WTP more for renewables than other sources of energy. For example,</w:t>
-      </w:r>
-      <w:r>
-        <w:t xml:space="preserve"> </w:t>
-      </w:r>
-      <w:r>
-        <w:t xml:space="preserve">Nkansah and Collins (2019)</w:t>
-      </w:r>
-      <w:r>
-        <w:t xml:space="preserve"> </w:t>
-      </w:r>
-      <w:r>
-        <w:t xml:space="preserve">compared WTP for wind against natural gas generation specifically and found consumers willing to pay more for wind. Along similar lines,</w:t>
-      </w:r>
-      <w:r>
-        <w:t xml:space="preserve"> </w:t>
-      </w:r>
-      <w:r>
-        <w:t xml:space="preserve">Murakami et al. (2015)</w:t>
-      </w:r>
-      <w:r>
-        <w:t xml:space="preserve"> </w:t>
-      </w:r>
-      <w:r>
-        <w:t xml:space="preserve">placed fossil fuels, renewables, and nuclear power on the same WTP scale in the US and Japan, and found that respondents in both countries expressed positive WTP for increased renewable generation but negative WTP for increased nuclear generation, with US respondents expressing a stronger preference for renewables than Japanese respondents. However,</w:t>
-      </w:r>
-      <w:r>
-        <w:t xml:space="preserve"> </w:t>
-      </w:r>
-      <w:r>
-        <w:t xml:space="preserve">Walter, Thacher, and Chermak (2023)</w:t>
-      </w:r>
-      <w:r>
-        <w:t xml:space="preserve"> </w:t>
-      </w:r>
-      <w:r>
-        <w:t xml:space="preserve">found that US respondents’ preferences over fossil versus renewable energy futures depended on their geographic proximity to fossil fuel production and their opinion about anthropogenic climate change. Finally,</w:t>
-      </w:r>
-      <w:r>
-        <w:t xml:space="preserve"> </w:t>
-      </w:r>
-      <w:r>
-        <w:t xml:space="preserve">Li et al. (2009)</w:t>
-      </w:r>
-      <w:r>
-        <w:t xml:space="preserve"> </w:t>
-      </w:r>
-      <w:r>
-        <w:t xml:space="preserve">estimated household WTP for a federal energy research and development fund aimed at reducing reliance on fossil fuels, and found broad support for that funding, suggesting that WTP responds to reducing fossil fuel use on its own without reference to another energy source.</w:t>
-      </w:r>
-      <w:r>
-        <w:t xml:space="preserve"> </w:t>
-      </w:r>
-      <w:r>
-        <w:rPr>
-          <w:rStyle w:val="FootnoteReference"/>
-        </w:rPr>
-        <w:footnoteReference w:id="11"/>
-      </w:r>
-    </w:p>
-    <w:bookmarkStart w:id="12" w:name="theoretical-expectations"/>
-    <w:p>
-      <w:pPr>
-        <w:pStyle w:val="Heading2"/>
-      </w:pPr>
-      <w:r>
-        <w:t xml:space="preserve">Theoretical Expectations</w:t>
-      </w:r>
-    </w:p>
-    <w:p>
-      <w:pPr>
-        <w:pStyle w:val="FirstParagraph"/>
-      </w:pPr>
-      <w:r>
-        <w:t xml:space="preserve">Previous research suggests that partisan cues are an important driver of energy preferences and that partisanship and environmental beliefs shape the WTP for energy sources. In this study, I use a survey experiment to examine the influence of a Trump cue and a climate change cue on preferences and the stated WTP for fossil fuels versus renewables.</w:t>
-      </w:r>
-    </w:p>
-    <w:p>
-      <w:pPr>
-        <w:pStyle w:val="BodyText"/>
-      </w:pPr>
-      <w:r>
-        <w:t xml:space="preserve">Overall, I expect that conservative Republicans will prefer and be WTP more for fossil fuels, and liberal Democrats will prefer and be WTP more for renewables. In addition, I expect there to be both general and partisan shifts in preferences and WTP based on the cues. Those who receive the Trump cue will prioritize fossil fuels and be willing to pay more for them, whereas those in the climate condition will prioritize renewable sources and be willing to pay more for them than those in the control condition. Finally, I expect the effects of the cues to depend on political beliefs. Specifically, conservative Republicans who receive the Trump cue will be more supportive of and WTP more for fossil fuels, whereas liberal Democrats who receive the climate cue will prefer and be WTP more for renewables. The comparison groups are those with other political beliefs and those in the control condition.</w:t>
-      </w:r>
-    </w:p>
-    <w:bookmarkEnd w:id="12"/>
-    <w:bookmarkEnd w:id="13"/>
-    <w:bookmarkStart w:id="15" w:name="data-and-measures"/>
-    <w:p>
-      <w:pPr>
-        <w:pStyle w:val="Heading1"/>
-      </w:pPr>
-      <w:r>
-        <w:t xml:space="preserve">Data and Measures</w:t>
-      </w:r>
-    </w:p>
-    <w:p>
-      <w:pPr>
-        <w:pStyle w:val="FirstParagraph"/>
-      </w:pPr>
-      <w:r>
-        <w:t xml:space="preserve">To examine the importance of cues and political beliefs in energy preferences I use a survey experiment to examine respondents’ prioritization of fossil fuels versus renewables as well as their WTP for those sources to generate electricity in response to a Trump cue or a climate change cue. Respondents were recruited using Cloud Research, which provides a quota-based sample of US residents, with quotas for age, race, and gender based on US Census data. Additionally, to further ensure as representative a sample as possible, I used the</w:t>
-      </w:r>
-      <w:r>
-        <w:t xml:space="preserve"> </w:t>
-      </w:r>
-      <w:r>
-        <w:rPr>
-          <w:rStyle w:val="VerbatimChar"/>
-        </w:rPr>
-        <w:t xml:space="preserve">survey</w:t>
-      </w:r>
-      <w:r>
-        <w:t xml:space="preserve"> </w:t>
-      </w:r>
-      <w:r>
-        <w:t xml:space="preserve">and</w:t>
-      </w:r>
-      <w:r>
-        <w:t xml:space="preserve"> </w:t>
-      </w:r>
-      <w:r>
-        <w:rPr>
-          <w:rStyle w:val="VerbatimChar"/>
-        </w:rPr>
-        <w:t xml:space="preserve">anesrake</w:t>
-      </w:r>
-      <w:r>
-        <w:t xml:space="preserve"> </w:t>
-      </w:r>
-      <w:r>
-        <w:t xml:space="preserve">packages in</w:t>
-      </w:r>
-      <w:r>
-        <w:t xml:space="preserve"> </w:t>
-      </w:r>
-      <w:r>
-        <w:rPr>
-          <w:rStyle w:val="VerbatimChar"/>
-        </w:rPr>
-        <w:t xml:space="preserve">R</w:t>
-      </w:r>
-      <w:r>
-        <w:t xml:space="preserve"> </w:t>
-      </w:r>
-      <w:r>
-        <w:t xml:space="preserve">to perform iterative raking to compute survey weights that weight respondents based on the US Census’s 2023 American Community Survey (ACS) on demographic variables, including age, race, gender, and education. I also used the Pew Research Center’s National Public Opinion Reference Survey (NPORS) from 2025 to weight the sample based on political party affiliation. I surveyed 3113 US residents in April 2026, who were randomly assigned to receive one of three treatments, including a cue about Trump’s critiques of renewable energy and his support for fossil fuels (n = 1049), a climate change cue that stated scientists recommend moving away from fossil fuels to renewables to address climate change (n = 1013), or a control condition with no cue (n = 1051).</w:t>
-      </w:r>
-    </w:p>
-    <w:p>
-      <w:pPr>
-        <w:pStyle w:val="BodyText"/>
-      </w:pPr>
-      <w:r>
-        <w:t xml:space="preserve">All respondents were shown the following paragraph:</w:t>
-      </w:r>
-    </w:p>
-    <w:p>
-      <w:pPr>
-        <w:pStyle w:val="BlockText"/>
-      </w:pPr>
-      <w:r>
-        <w:t xml:space="preserve">The use of renewable energy sources for electricity, including wind energy, solar energy, and battery storage, has risen sharply in recent years. Indeed, most of the growth in new electricity generation in the U.S. has come from renewable sources.</w:t>
-      </w:r>
-    </w:p>
-    <w:p>
-      <w:pPr>
-        <w:pStyle w:val="FirstParagraph"/>
-      </w:pPr>
-      <w:r>
-        <w:t xml:space="preserve">Respondents were then shown the following statement. Those in the Trump cue saw President Trump named specifically, while those in the climate cue and the control were shown</w:t>
-      </w:r>
-      <w:r>
-        <w:t xml:space="preserve"> </w:t>
-      </w:r>
-      <w:r>
-        <w:rPr>
-          <w:i/>
-          <w:iCs/>
-        </w:rPr>
-        <w:t xml:space="preserve">some have</w:t>
-      </w:r>
-    </w:p>
-    <w:p>
-      <w:pPr>
-        <w:pStyle w:val="BlockText"/>
-      </w:pPr>
-      <w:r>
-        <w:t xml:space="preserve">However, [</w:t>
-      </w:r>
-      <w:r>
-        <w:rPr>
-          <w:i/>
-          <w:iCs/>
-        </w:rPr>
-        <w:t xml:space="preserve">President Trump has</w:t>
-      </w:r>
-      <w:r>
-        <w:t xml:space="preserve">/</w:t>
-      </w:r>
-      <w:r>
-        <w:rPr>
-          <w:i/>
-          <w:iCs/>
-        </w:rPr>
-        <w:t xml:space="preserve">some have</w:t>
-      </w:r>
-      <w:r>
-        <w:t xml:space="preserve">] argued that renewable sources are not reliable and that we need to increase our reliance on fossil fuels (coal, oil, and natural gas) to ensure energy security.</w:t>
-      </w:r>
-    </w:p>
-    <w:p>
-      <w:pPr>
-        <w:pStyle w:val="FirstParagraph"/>
-      </w:pPr>
-      <w:r>
-        <w:t xml:space="preserve">Those in the climate cue saw the following:</w:t>
-      </w:r>
-    </w:p>
-    <w:p>
-      <w:pPr>
-        <w:pStyle w:val="BlockText"/>
-      </w:pPr>
-      <w:r>
-        <w:t xml:space="preserve">Additionally, scientists have warned that an increase in the use of fossil fuels will make climate change worse; therefore, we should increase our use of renewable sources.</w:t>
-      </w:r>
-    </w:p>
-    <w:p>
-      <w:pPr>
-        <w:pStyle w:val="FirstParagraph"/>
-      </w:pPr>
-      <w:r>
-        <w:t xml:space="preserve">Finally, all respondents were shown:</w:t>
-      </w:r>
-    </w:p>
-    <w:p>
-      <w:pPr>
-        <w:pStyle w:val="BlockText"/>
-      </w:pPr>
-      <w:r>
-        <w:t xml:space="preserve">Please consider how you think we should prioritize the development of fossil fuels and renewable sources to generate electricity.</w:t>
-      </w:r>
-    </w:p>
-    <w:p>
-      <w:pPr>
-        <w:pStyle w:val="FirstParagraph"/>
-      </w:pPr>
-      <w:r>
-        <w:t xml:space="preserve">After receiving the cues, respondents were asked, on a 1 to 7 scale, if fossil fuels should be prioritized (= 1), fossil fuels and renewables should be prioritized equally (= 4), or renewable sources should be prioritized (= 7). Next, I asked respondents their willingness-to-pay (WTP) for fossil fuel and renewable sources using the Gabor-Granger method</w:t>
-      </w:r>
-      <w:r>
-        <w:t xml:space="preserve"> </w:t>
-      </w:r>
-      <w:r>
-        <w:t xml:space="preserve">(Gabor and Granger 1966)</w:t>
-      </w:r>
-      <w:r>
-        <w:t xml:space="preserve">. With the Gabor-Granger method, respondents are shown a random dollar amount and if they are willing to pay that amount, they are next shown a higher amount, and if they are not, they are shown a smaller amount. This approach is a well-established survey-based technique for estimating WTP. It dates to early applications of iterative-bidding price experiments</w:t>
-      </w:r>
-      <w:r>
-        <w:t xml:space="preserve"> </w:t>
-      </w:r>
-      <w:r>
-        <w:t xml:space="preserve">(Jones 1975)</w:t>
-      </w:r>
-      <w:r>
-        <w:t xml:space="preserve"> </w:t>
-      </w:r>
-      <w:r>
-        <w:t xml:space="preserve">and was later formalized in marketing research</w:t>
-      </w:r>
-      <w:r>
-        <w:t xml:space="preserve"> </w:t>
-      </w:r>
-      <w:r>
-        <w:t xml:space="preserve">(Wedel and Leeflang 1998)</w:t>
-      </w:r>
-      <w:r>
-        <w:t xml:space="preserve">. It remains one of the standard indirect approaches used to measure WTP</w:t>
-      </w:r>
-      <w:r>
-        <w:t xml:space="preserve"> </w:t>
-      </w:r>
-      <w:r>
-        <w:t xml:space="preserve">(Breidert, Hahsler, and Reutterer 2006; Lipovetsky, Magnan, and Zanetti-Polzi 2011)</w:t>
-      </w:r>
-      <w:r>
-        <w:t xml:space="preserve">.</w:t>
-      </w:r>
-    </w:p>
-    <w:p>
-      <w:pPr>
-        <w:pStyle w:val="BodyText"/>
-      </w:pPr>
-      <w:r>
-        <w:t xml:space="preserve">To establish WTP, I first give respondents information about potential costs associated with each energy source, and the sources were presented in random order. In the WTP for fossil fuels question, I noted that costs associated with renewable energy have decreased and, therefore they may need to pay more to use fossil fuels. For renewable sources respondents were told about the need to increase distribution. Specifically, respondents were shown:</w:t>
-      </w:r>
-    </w:p>
-    <w:p>
-      <w:pPr>
-        <w:pStyle w:val="BlockText"/>
-      </w:pPr>
-      <w:r>
-        <w:t xml:space="preserve">The cost of generating electricity from renewable sources has decreased in recent years. In many places, renewable energy sources are often more cost-effective than fossil fuels. Would you support the increased use of fossil fuels if your electricity bill were to increase by the following each month?</w:t>
-      </w:r>
-    </w:p>
-    <w:p>
-      <w:pPr>
-        <w:pStyle w:val="BlockText"/>
-      </w:pPr>
-      <w:r>
-        <w:t xml:space="preserve">Renewable sources have become cheaper in recent years; however, investments are needed to distribute the electricity they produce to homes and businesses. Would you support the increased use of renewable sources if your electricity bill were to increase by the following each month?</w:t>
-      </w:r>
-    </w:p>
-    <w:p>
-      <w:pPr>
-        <w:pStyle w:val="FirstParagraph"/>
-      </w:pPr>
-      <w:r>
-        <w:t xml:space="preserve">To estimate the maximum/minimum WTP, respondents were first shown a random dollar amount between $1 and $46, in five-dollar increments, and asked if they would be WTP that amount extra per-month in their electricity bill. If they indicated yes they were shown a larger, random dollar-amount, and if they indicated no they were shown a smaller dollar-amount. This continues until they reach the $46-maximum or $1-minimum. Respondents who indicated no at $1 were coded with a WTP of 0.</w:t>
-      </w:r>
-    </w:p>
-    <w:p>
-      <w:pPr>
-        <w:pStyle w:val="BodyText"/>
-      </w:pPr>
-      <w:r>
-        <w:t xml:space="preserve">In the following analysis, I examine the prioritization of fossil fuels vs. renewables and the WTP for those energy sources as a function of the cues and political beliefs. Political beliefs include conservative Republicans and liberal Democrats, with other political beliefs (moderate independents, conservative Democrats, liberal Republicans) as the excluded referents. The political belief measures were constructed based on responses to a self-reported, 7-point ideology scale (1 = very liberal, 2 = somewhat liberal, 3 = slightly liberal, 4 = middle of the road, 5 = slightly conservative, 6 = somewhat conservative, 7 = very conservative) and political party identification. Conservative Republican is coded 1 for respondents who identify as Republican and place themselves at 5, 6, or 7 on the ideology scale (slightly, somewhat, or very conservative), and liberal Democrat is coded 1 for respondents who identify as Democrat and place themselves at 1, 2, or 3 (slightly, somewhat, or very liberal).</w:t>
+        <w:t xml:space="preserve"> </w:t>
+      </w:r>
+      <w:r>
+        <w:t xml:space="preserve">= 0.268).</w:t>
       </w:r>
     </w:p>
     <w:tbl>
@@ -620,7 +848,7 @@
       <w:tr>
         <w:tc>
           <w:tcPr/>
-          <w:bookmarkStart w:id="14" w:name="tbl-descriptives"/>
+          <w:bookmarkStart w:id="15" w:name="tbl-descriptives"/>
           <w:p>
             <w:pPr>
               <w:jc w:val="left"/>
@@ -631,21 +859,25 @@
               <w:pStyle w:val="ImageCaption"/>
             </w:pPr>
             <w:r>
-              <w:t xml:space="preserve">Table 1: Descriptive statistics for the energy-priority scale and political belief measures (survey-weighted means and standard deviations)</w:t>
+              <w:t xml:space="preserve">Table 1: Descriptive statistics for the energy-priority scale, willingness-to-pay, and political belief measures (survey-weighted means and standard deviations, overall and survey-weighted means by condition)</w:t>
             </w:r>
           </w:p>
           <w:tbl>
             <w:tblPr>
               <w:tblStyle w:val="Table"/>
-              <w:tblW w:type="auto" w:w="0"/>
+              <w:tblW w:type="pct" w:w="5000"/>
+              <w:tblLayout w:type="fixed"/>
               <w:tblLook w:firstRow="1" w:lastRow="0" w:firstColumn="0" w:lastColumn="0" w:noHBand="0" w:noVBand="0" w:val="0020"/>
             </w:tblPr>
             <w:tblGrid>
-              <w:gridCol w:w="1584"/>
-              <w:gridCol w:w="1584"/>
-              <w:gridCol w:w="1584"/>
-              <w:gridCol w:w="1584"/>
-              <w:gridCol w:w="1584"/>
+              <w:gridCol w:w="2807"/>
+              <w:gridCol w:w="601"/>
+              <w:gridCol w:w="601"/>
+              <w:gridCol w:w="401"/>
+              <w:gridCol w:w="401"/>
+              <w:gridCol w:w="902"/>
+              <w:gridCol w:w="1002"/>
+              <w:gridCol w:w="1203"/>
             </w:tblGrid>
             <w:tr>
               <w:trPr>
@@ -716,6 +948,45 @@
                   </w:r>
                 </w:p>
               </w:tc>
+              <w:tc>
+                <w:tcPr/>
+                <w:p>
+                  <w:pPr>
+                    <w:pStyle w:val="Compact"/>
+                    <w:jc w:val="left"/>
+                    <w:jc w:val="left"/>
+                  </w:pPr>
+                  <w:r>
+                    <w:t xml:space="preserve">Baseline</w:t>
+                  </w:r>
+                </w:p>
+              </w:tc>
+              <w:tc>
+                <w:tcPr/>
+                <w:p>
+                  <w:pPr>
+                    <w:pStyle w:val="Compact"/>
+                    <w:jc w:val="left"/>
+                    <w:jc w:val="left"/>
+                  </w:pPr>
+                  <w:r>
+                    <w:t xml:space="preserve">Trump cue</w:t>
+                  </w:r>
+                </w:p>
+              </w:tc>
+              <w:tc>
+                <w:tcPr/>
+                <w:p>
+                  <w:pPr>
+                    <w:pStyle w:val="Compact"/>
+                    <w:jc w:val="left"/>
+                    <w:jc w:val="left"/>
+                  </w:pPr>
+                  <w:r>
+                    <w:t xml:space="preserve">Climate cue</w:t>
+                  </w:r>
+                </w:p>
+              </w:tc>
             </w:tr>
             <w:tr>
               <w:tc>
@@ -783,6 +1054,45 @@
                   </w:r>
                 </w:p>
               </w:tc>
+              <w:tc>
+                <w:tcPr/>
+                <w:p>
+                  <w:pPr>
+                    <w:pStyle w:val="Compact"/>
+                    <w:jc w:val="left"/>
+                    <w:jc w:val="left"/>
+                  </w:pPr>
+                  <w:r>
+                    <w:t xml:space="preserve">5.17</w:t>
+                  </w:r>
+                </w:p>
+              </w:tc>
+              <w:tc>
+                <w:tcPr/>
+                <w:p>
+                  <w:pPr>
+                    <w:pStyle w:val="Compact"/>
+                    <w:jc w:val="left"/>
+                    <w:jc w:val="left"/>
+                  </w:pPr>
+                  <w:r>
+                    <w:t xml:space="preserve">5.15</w:t>
+                  </w:r>
+                </w:p>
+              </w:tc>
+              <w:tc>
+                <w:tcPr/>
+                <w:p>
+                  <w:pPr>
+                    <w:pStyle w:val="Compact"/>
+                    <w:jc w:val="left"/>
+                    <w:jc w:val="left"/>
+                  </w:pPr>
+                  <w:r>
+                    <w:t xml:space="preserve">5.20</w:t>
+                  </w:r>
+                </w:p>
+              </w:tc>
             </w:tr>
             <w:tr>
               <w:tc>
@@ -794,33 +1104,170 @@
                     <w:jc w:val="left"/>
                   </w:pPr>
                   <w:r>
-                    <w:t xml:space="preserve">Liberal Democrat</w:t>
-                  </w:r>
-                </w:p>
-              </w:tc>
-              <w:tc>
-                <w:tcPr/>
-                <w:p>
-                  <w:pPr>
-                    <w:pStyle w:val="Compact"/>
-                    <w:jc w:val="left"/>
-                    <w:jc w:val="left"/>
-                  </w:pPr>
-                  <w:r>
-                    <w:t xml:space="preserve">0.37</w:t>
-                  </w:r>
-                </w:p>
-              </w:tc>
-              <w:tc>
-                <w:tcPr/>
-                <w:p>
-                  <w:pPr>
-                    <w:pStyle w:val="Compact"/>
-                    <w:jc w:val="left"/>
-                    <w:jc w:val="left"/>
-                  </w:pPr>
-                  <w:r>
-                    <w:t xml:space="preserve">0.48</w:t>
+                    <w:t xml:space="preserve">WTP, fossil fuels (</w:t>
+                  </w:r>
+                  <m:oMath>
+                    <m:r>
+                      <m:rPr>
+                        <m:sty m:val="p"/>
+                      </m:rPr>
+                      <m:t>)</m:t>
+                    </m:r>
+                    <m:r>
+                      <m:rPr>
+                        <m:sty m:val="p"/>
+                      </m:rPr>
+                      <m:t>|</m:t>
+                    </m:r>
+                    <m:r>
+                      <m:t>8.33</m:t>
+                    </m:r>
+                    <m:r>
+                      <m:rPr>
+                        <m:sty m:val="p"/>
+                      </m:rPr>
+                      <m:t>|</m:t>
+                    </m:r>
+                    <m:r>
+                      <m:t>13.79</m:t>
+                    </m:r>
+                    <m:r>
+                      <m:rPr>
+                        <m:sty m:val="p"/>
+                      </m:rPr>
+                      <m:t>|</m:t>
+                    </m:r>
+                    <m:r>
+                      <m:t>0</m:t>
+                    </m:r>
+                    <m:r>
+                      <m:rPr>
+                        <m:sty m:val="p"/>
+                      </m:rPr>
+                      <m:t>|</m:t>
+                    </m:r>
+                    <m:r>
+                      <m:t>46</m:t>
+                    </m:r>
+                    <m:r>
+                      <m:rPr>
+                        <m:sty m:val="p"/>
+                      </m:rPr>
+                      <m:t>|</m:t>
+                    </m:r>
+                    <m:r>
+                      <m:t>8.55</m:t>
+                    </m:r>
+                    <m:r>
+                      <m:rPr>
+                        <m:sty m:val="p"/>
+                      </m:rPr>
+                      <m:t>|</m:t>
+                    </m:r>
+                    <m:r>
+                      <m:t>7.54</m:t>
+                    </m:r>
+                    <m:r>
+                      <m:rPr>
+                        <m:sty m:val="p"/>
+                      </m:rPr>
+                      <m:t>|</m:t>
+                    </m:r>
+                    <m:r>
+                      <m:t>8.86</m:t>
+                    </m:r>
+                    <m:r>
+                      <m:rPr>
+                        <m:sty m:val="p"/>
+                      </m:rPr>
+                      <m:t>|</m:t>
+                    </m:r>
+                    <m:r>
+                      <m:rPr>
+                        <m:sty m:val="p"/>
+                      </m:rPr>
+                      <m:t>|</m:t>
+                    </m:r>
+                    <m:r>
+                      <m:t>W</m:t>
+                    </m:r>
+                    <m:r>
+                      <m:t>T</m:t>
+                    </m:r>
+                    <m:r>
+                      <m:t>P</m:t>
+                    </m:r>
+                    <m:r>
+                      <m:rPr>
+                        <m:sty m:val="p"/>
+                      </m:rPr>
+                      <m:t>,</m:t>
+                    </m:r>
+                    <m:r>
+                      <m:t>r</m:t>
+                    </m:r>
+                    <m:r>
+                      <m:t>e</m:t>
+                    </m:r>
+                    <m:r>
+                      <m:t>n</m:t>
+                    </m:r>
+                    <m:r>
+                      <m:t>e</m:t>
+                    </m:r>
+                    <m:r>
+                      <m:t>w</m:t>
+                    </m:r>
+                    <m:r>
+                      <m:t>a</m:t>
+                    </m:r>
+                    <m:r>
+                      <m:t>b</m:t>
+                    </m:r>
+                    <m:r>
+                      <m:t>l</m:t>
+                    </m:r>
+                    <m:r>
+                      <m:t>e</m:t>
+                    </m:r>
+                    <m:r>
+                      <m:t>s</m:t>
+                    </m:r>
+                    <m:r>
+                      <m:rPr>
+                        <m:sty m:val="p"/>
+                      </m:rPr>
+                      <m:t>(</m:t>
+                    </m:r>
+                  </m:oMath>
+                  <w:r>
+                    <w:t xml:space="preserve">)</w:t>
+                  </w:r>
+                </w:p>
+              </w:tc>
+              <w:tc>
+                <w:tcPr/>
+                <w:p>
+                  <w:pPr>
+                    <w:pStyle w:val="Compact"/>
+                    <w:jc w:val="left"/>
+                    <w:jc w:val="left"/>
+                  </w:pPr>
+                  <w:r>
+                    <w:t xml:space="preserve">18.21</w:t>
+                  </w:r>
+                </w:p>
+              </w:tc>
+              <w:tc>
+                <w:tcPr/>
+                <w:p>
+                  <w:pPr>
+                    <w:pStyle w:val="Compact"/>
+                    <w:jc w:val="left"/>
+                    <w:jc w:val="left"/>
+                  </w:pPr>
+                  <w:r>
+                    <w:t xml:space="preserve">17.43</w:t>
                   </w:r>
                 </w:p>
               </w:tc>
@@ -846,7 +1293,46 @@
                     <w:jc w:val="left"/>
                   </w:pPr>
                   <w:r>
-                    <w:t xml:space="preserve">1</w:t>
+                    <w:t xml:space="preserve">46</w:t>
+                  </w:r>
+                </w:p>
+              </w:tc>
+              <w:tc>
+                <w:tcPr/>
+                <w:p>
+                  <w:pPr>
+                    <w:pStyle w:val="Compact"/>
+                    <w:jc w:val="left"/>
+                    <w:jc w:val="left"/>
+                  </w:pPr>
+                  <w:r>
+                    <w:t xml:space="preserve">17.95</w:t>
+                  </w:r>
+                </w:p>
+              </w:tc>
+              <w:tc>
+                <w:tcPr/>
+                <w:p>
+                  <w:pPr>
+                    <w:pStyle w:val="Compact"/>
+                    <w:jc w:val="left"/>
+                    <w:jc w:val="left"/>
+                  </w:pPr>
+                  <w:r>
+                    <w:t xml:space="preserve">17.85</w:t>
+                  </w:r>
+                </w:p>
+              </w:tc>
+              <w:tc>
+                <w:tcPr/>
+                <w:p>
+                  <w:pPr>
+                    <w:pStyle w:val="Compact"/>
+                    <w:jc w:val="left"/>
+                    <w:jc w:val="left"/>
+                  </w:pPr>
+                  <w:r>
+                    <w:t xml:space="preserve">18.80</w:t>
                   </w:r>
                 </w:p>
               </w:tc>
@@ -861,6 +1347,112 @@
                     <w:jc w:val="left"/>
                   </w:pPr>
                   <w:r>
+                    <w:t xml:space="preserve">Liberal Democrat</w:t>
+                  </w:r>
+                </w:p>
+              </w:tc>
+              <w:tc>
+                <w:tcPr/>
+                <w:p>
+                  <w:pPr>
+                    <w:pStyle w:val="Compact"/>
+                    <w:jc w:val="left"/>
+                    <w:jc w:val="left"/>
+                  </w:pPr>
+                  <w:r>
+                    <w:t xml:space="preserve">0.37</w:t>
+                  </w:r>
+                </w:p>
+              </w:tc>
+              <w:tc>
+                <w:tcPr/>
+                <w:p>
+                  <w:pPr>
+                    <w:pStyle w:val="Compact"/>
+                    <w:jc w:val="left"/>
+                    <w:jc w:val="left"/>
+                  </w:pPr>
+                  <w:r>
+                    <w:t xml:space="preserve">0.48</w:t>
+                  </w:r>
+                </w:p>
+              </w:tc>
+              <w:tc>
+                <w:tcPr/>
+                <w:p>
+                  <w:pPr>
+                    <w:pStyle w:val="Compact"/>
+                    <w:jc w:val="left"/>
+                    <w:jc w:val="left"/>
+                  </w:pPr>
+                  <w:r>
+                    <w:t xml:space="preserve">0</w:t>
+                  </w:r>
+                </w:p>
+              </w:tc>
+              <w:tc>
+                <w:tcPr/>
+                <w:p>
+                  <w:pPr>
+                    <w:pStyle w:val="Compact"/>
+                    <w:jc w:val="left"/>
+                    <w:jc w:val="left"/>
+                  </w:pPr>
+                  <w:r>
+                    <w:t xml:space="preserve">1</w:t>
+                  </w:r>
+                </w:p>
+              </w:tc>
+              <w:tc>
+                <w:tcPr/>
+                <w:p>
+                  <w:pPr>
+                    <w:pStyle w:val="Compact"/>
+                    <w:jc w:val="left"/>
+                    <w:jc w:val="left"/>
+                  </w:pPr>
+                  <w:r>
+                    <w:t xml:space="preserve">0.35</w:t>
+                  </w:r>
+                </w:p>
+              </w:tc>
+              <w:tc>
+                <w:tcPr/>
+                <w:p>
+                  <w:pPr>
+                    <w:pStyle w:val="Compact"/>
+                    <w:jc w:val="left"/>
+                    <w:jc w:val="left"/>
+                  </w:pPr>
+                  <w:r>
+                    <w:t xml:space="preserve">0.40</w:t>
+                  </w:r>
+                </w:p>
+              </w:tc>
+              <w:tc>
+                <w:tcPr/>
+                <w:p>
+                  <w:pPr>
+                    <w:pStyle w:val="Compact"/>
+                    <w:jc w:val="left"/>
+                    <w:jc w:val="left"/>
+                  </w:pPr>
+                  <w:r>
+                    <w:t xml:space="preserve">0.37</w:t>
+                  </w:r>
+                </w:p>
+              </w:tc>
+            </w:tr>
+            <w:tr>
+              <w:tc>
+                <w:tcPr/>
+                <w:p>
+                  <w:pPr>
+                    <w:pStyle w:val="Compact"/>
+                    <w:jc w:val="left"/>
+                    <w:jc w:val="left"/>
+                  </w:pPr>
+                  <w:r>
                     <w:t xml:space="preserve">Conservative Republican</w:t>
                   </w:r>
                 </w:p>
@@ -914,12 +1506,51 @@
                   </w:pPr>
                   <w:r>
                     <w:t xml:space="preserve">1</w:t>
+                  </w:r>
+                </w:p>
+              </w:tc>
+              <w:tc>
+                <w:tcPr/>
+                <w:p>
+                  <w:pPr>
+                    <w:pStyle w:val="Compact"/>
+                    <w:jc w:val="left"/>
+                    <w:jc w:val="left"/>
+                  </w:pPr>
+                  <w:r>
+                    <w:t xml:space="preserve">0.41</w:t>
+                  </w:r>
+                </w:p>
+              </w:tc>
+              <w:tc>
+                <w:tcPr/>
+                <w:p>
+                  <w:pPr>
+                    <w:pStyle w:val="Compact"/>
+                    <w:jc w:val="left"/>
+                    <w:jc w:val="left"/>
+                  </w:pPr>
+                  <w:r>
+                    <w:t xml:space="preserve">0.36</w:t>
+                  </w:r>
+                </w:p>
+              </w:tc>
+              <w:tc>
+                <w:tcPr/>
+                <w:p>
+                  <w:pPr>
+                    <w:pStyle w:val="Compact"/>
+                    <w:jc w:val="left"/>
+                    <w:jc w:val="left"/>
+                  </w:pPr>
+                  <w:r>
+                    <w:t xml:space="preserve">0.42</w:t>
                   </w:r>
                 </w:p>
               </w:tc>
             </w:tr>
           </w:tbl>
-          <w:bookmarkEnd w:id="14"/>
+          <w:bookmarkEnd w:id="15"/>
           <w:p/>
         </w:tc>
       </w:tr>
@@ -943,11 +1574,11 @@
         </w:r>
       </w:hyperlink>
       <w:r>
-        <w:t xml:space="preserve">. The mean on the energy-priority scale was 5.17 (SD = 1.74), which is above the midpoint of 4 and indicates that respondents, on average, leaned toward prioritizing renewables over fossil fuels. Regarding political beliefs, 37 percent of the weighted sample were liberal Democrats and 40 percent were conservative Republicans, with the remaining 23 percent holding other political beliefs.</w:t>
-      </w:r>
-    </w:p>
-    <w:bookmarkEnd w:id="15"/>
-    <w:bookmarkStart w:id="31" w:name="results"/>
+        <w:t xml:space="preserve">. The mean on the energy-priority scale was 5.17 (SD = 1.74), which is above the midpoint of 4 and indicates that respondents, on average, leaned toward prioritizing renewables over fossil fuels. Regarding political beliefs, 37 percent of the weighted sample were liberal Democrats and 40 percent were conservative Republicans, with the remaining 23 percent holding other political beliefs. These shares reflect the survey weights, which weight the sample to the party affiliation distribution in the NPORS. Unweighted, 48 percent of respondents were liberal Democrats and 24 percent were conservative Republicans, so the weights roughly double the share of conservative Republicans. To account for this, I also estimate each model without the weights, and those models are shown in the supplemental material.</w:t>
+      </w:r>
+    </w:p>
+    <w:bookmarkEnd w:id="16"/>
+    <w:bookmarkStart w:id="32" w:name="results"/>
     <w:p>
       <w:pPr>
         <w:pStyle w:val="Heading1"/>
@@ -991,7 +1622,7 @@
       <w:tr>
         <w:tc>
           <w:tcPr/>
-          <w:bookmarkStart w:id="16" w:name="tbl-priority-ols"/>
+          <w:bookmarkStart w:id="17" w:name="tbl-priority-ols"/>
           <w:p>
             <w:pPr>
               <w:jc w:val="left"/>
@@ -1002,7 +1633,7 @@
               <w:pStyle w:val="ImageCaption"/>
             </w:pPr>
             <w:r>
-              <w:t xml:space="preserve">Table 2: Effect of cue condition, political beliefs, and their interaction on the energy source-priority scale (survey-weighted OLS; control condition and other/moderate identity as reference)</w:t>
+              <w:t xml:space="preserve">Table 2: Effect of cue condition, political beliefs, and their interaction on the energy source-priority scale (survey-weighted OLS; baseline condition and other/moderate identity as reference)</w:t>
             </w:r>
           </w:p>
           <w:tbl>
@@ -1575,7 +2206,7 @@
               </w:tc>
             </w:tr>
           </w:tbl>
-          <w:bookmarkEnd w:id="16"/>
+          <w:bookmarkEnd w:id="17"/>
           <w:p/>
         </w:tc>
       </w:tr>
@@ -1593,7 +2224,7 @@
       <w:tr>
         <w:tc>
           <w:tcPr/>
-          <w:bookmarkStart w:id="20" w:name="fig-priority-predicted"/>
+          <w:bookmarkStart w:id="21" w:name="fig-priority-predicted"/>
           <w:p>
             <w:pPr>
               <w:jc w:val="center"/>
@@ -1617,18 +2248,18 @@
                 <wp:inline>
                   <wp:extent cx="5334000" cy="4267200"/>
                   <wp:effectExtent b="0" l="0" r="0" t="0"/>
-                  <wp:docPr descr="" title="" id="18" name="Picture"/>
+                  <wp:docPr descr="" title="" id="19" name="Picture"/>
                   <a:graphic>
                     <a:graphicData uri="http://schemas.openxmlformats.org/drawingml/2006/picture">
                       <pic:pic>
                         <pic:nvPicPr>
-                          <pic:cNvPr descr="cue-WTP_files/figure-docx/fig-priority-predicted-1.png" id="19" name="Picture"/>
+                          <pic:cNvPr descr="cue-WTP_files/figure-docx/fig-priority-predicted-1.png" id="20" name="Picture"/>
                           <pic:cNvPicPr>
                             <a:picLocks noChangeArrowheads="1" noChangeAspect="1"/>
                           </pic:cNvPicPr>
                         </pic:nvPicPr>
                         <pic:blipFill>
-                          <a:blip r:embed="rId17"/>
+                          <a:blip r:embed="rId18"/>
                           <a:stretch>
                             <a:fillRect/>
                           </a:stretch>
@@ -1655,7 +2286,7 @@
               </w:drawing>
             </w:r>
           </w:p>
-          <w:bookmarkEnd w:id="20"/>
+          <w:bookmarkEnd w:id="21"/>
         </w:tc>
       </w:tr>
     </w:tbl>
@@ -1664,7 +2295,7 @@
         <w:pStyle w:val="BodyText"/>
       </w:pPr>
       <w:r>
-        <w:t xml:space="preserve">As expected, conservative Republicans were more likely to prioritize fossil fuels than renewables, with an estimated coefficient of -1.24 on the 1 to 7 scale, and liberal Democrats prioritized renewables at 0.67. In terms of the interactions, conservative Republicans who received the Trump cue were more likely to prioritize fossil fuels (b = -0.44,</w:t>
+        <w:t xml:space="preserve">As expected, conservative Republicans were more likely to prioritize fossil fuels than renewables, with an estimated coefficient of -1.24 on the 1 to 7 scale, and liberal Democrats prioritized renewables at 0.67. In terms of the interactions, which test whether the effect of a cue differs by political beliefs, the Trump cue moved conservative Republicans toward fossil fuels more than it moved those with other political beliefs (b = -0.44,</w:t>
       </w:r>
       <w:r>
         <w:t xml:space="preserve"> </w:t>
@@ -1680,7 +2311,7 @@
         <w:t xml:space="preserve"> </w:t>
       </w:r>
       <w:r>
-        <w:t xml:space="preserve">= 0.062), whereas liberal Democrats in the climate condition were more likely to prioritize renewables (b = 0.34). Overall, the predicted value on the 1 to 7 scale for conservative Republicans in the control group was 4.21, indicating a split roughly evenly between fossil fuels and renewables, and it was 3.75 for those receiving the Trump cue, indicating a significant shift toward prioritizing fossil fuels (difference = -0.45,</w:t>
+        <w:t xml:space="preserve">= 0.062), and the climate cue moved liberal Democrats toward renewables more than those with other political beliefs (b = 0.34,</w:t>
       </w:r>
       <w:r>
         <w:t xml:space="preserve"> </w:t>
@@ -1696,7 +2327,7 @@
         <w:t xml:space="preserve"> </w:t>
       </w:r>
       <w:r>
-        <w:t xml:space="preserve">= 0.009). For liberal Democrats the predicted value was 6.12, indicating a priority for renewables, and the value was 6.32 in the climate condition (difference = 0.20,</w:t>
+        <w:t xml:space="preserve">= 0.051). Both interactions are only marginally significant. Additionally, these are 16 cue x political belief interactions across the four models presented here, and neither interaction is significant after a Holm adjustment for multiple comparisons (adjusted</w:t>
       </w:r>
       <w:r>
         <w:t xml:space="preserve"> </w:t>
@@ -1712,7 +2343,7 @@
         <w:t xml:space="preserve"> </w:t>
       </w:r>
       <w:r>
-        <w:t xml:space="preserve">= 0.015). The interactions of cue x political beliefs were significant at</w:t>
+        <w:t xml:space="preserve">= 0.94 and 0.81, respectively). Descriptively, the predicted value on the 1 to 7 scale for conservative Republicans in the baseline condition was 4.21, indicating a split roughly evenly between fossil fuels and renewables, and it was 3.75 for those receiving the Trump cue (difference = -0.45,</w:t>
       </w:r>
       <w:r>
         <w:t xml:space="preserve"> </w:t>
@@ -1725,7 +2356,92 @@
         <w:t xml:space="preserve">p</w:t>
       </w:r>
       <w:r>
-        <w:t xml:space="preserve">&lt;0.10; however, the cues themselves had no effect, on average, on energy source priority compared to the control condition.</w:t>
+        <w:t xml:space="preserve"> </w:t>
+      </w:r>
+      <w:r>
+        <w:t xml:space="preserve">= 0.009). For liberal Democrats the predicted value was 6.12 in the baseline condition, indicating a priority for renewables, and 6.32 in the climate condition (difference = 0.20,</w:t>
+      </w:r>
+      <w:r>
+        <w:t xml:space="preserve"> </w:t>
+      </w:r>
+      <w:r>
+        <w:rPr>
+          <w:i/>
+          <w:iCs/>
+        </w:rPr>
+        <w:t xml:space="preserve">p</w:t>
+      </w:r>
+      <w:r>
+        <w:t xml:space="preserve"> </w:t>
+      </w:r>
+      <w:r>
+        <w:t xml:space="preserve">= 0.015). Without the survey weights, the climate cue x liberal Democrat interaction is significant (</w:t>
+      </w:r>
+      <w:r>
+        <w:rPr>
+          <w:i/>
+          <w:iCs/>
+        </w:rPr>
+        <w:t xml:space="preserve">p</w:t>
+      </w:r>
+      <w:r>
+        <w:t xml:space="preserve"> </w:t>
+      </w:r>
+      <w:r>
+        <w:t xml:space="preserve">= 0.014), whereas the Trump cue x conservative Republican interaction is not (</w:t>
+      </w:r>
+      <w:r>
+        <w:rPr>
+          <w:i/>
+          <w:iCs/>
+        </w:rPr>
+        <w:t xml:space="preserve">p</w:t>
+      </w:r>
+      <w:r>
+        <w:t xml:space="preserve"> </w:t>
+      </w:r>
+      <w:r>
+        <w:t xml:space="preserve">= 0.144). In contrast to the interactions, there is no evidence that liberal Democrats moved toward renewables in response to the Trump cue or that conservative Republicans moved toward fossil fuels in response to the climate cue.</w:t>
+      </w:r>
+    </w:p>
+    <w:p>
+      <w:pPr>
+        <w:pStyle w:val="BodyText"/>
+      </w:pPr>
+      <w:r>
+        <w:t xml:space="preserve">Because the models include interactions, the coefficients for the Trump and climate cues are the effects of the cues among those with other political beliefs only. To estimate the average effect of each cue, I also estimate models with the cues alone, shown in the supplemental material. Neither cue had a significant average effect on energy source priority compared to the baseline (Trump cue b = -0.03,</w:t>
+      </w:r>
+      <w:r>
+        <w:t xml:space="preserve"> </w:t>
+      </w:r>
+      <w:r>
+        <w:rPr>
+          <w:i/>
+          <w:iCs/>
+        </w:rPr>
+        <w:t xml:space="preserve">p</w:t>
+      </w:r>
+      <w:r>
+        <w:t xml:space="preserve"> </w:t>
+      </w:r>
+      <w:r>
+        <w:t xml:space="preserve">= 0.785; climate cue b = 0.03,</w:t>
+      </w:r>
+      <w:r>
+        <w:t xml:space="preserve"> </w:t>
+      </w:r>
+      <w:r>
+        <w:rPr>
+          <w:i/>
+          <w:iCs/>
+        </w:rPr>
+        <w:t xml:space="preserve">p</w:t>
+      </w:r>
+      <w:r>
+        <w:t xml:space="preserve"> </w:t>
+      </w:r>
+      <w:r>
+        <w:t xml:space="preserve">= 0.775).</w:t>
       </w:r>
     </w:p>
     <w:p>
@@ -1763,7 +2479,7 @@
       <w:tr>
         <w:tc>
           <w:tcPr/>
-          <w:bookmarkStart w:id="21" w:name="tbl-wtp-dist"/>
+          <w:bookmarkStart w:id="22" w:name="tbl-wtp-dist"/>
           <w:p>
             <w:pPr>
               <w:jc w:val="left"/>
@@ -1774,7 +2490,7 @@
               <w:pStyle w:val="ImageCaption"/>
             </w:pPr>
             <w:r>
-              <w:t xml:space="preserve">Table 3: Distribution of willingness-to-pay for fossil fuel and renewable electricity (weighted percent of respondents choosing each dollar amount)</w:t>
+              <w:t xml:space="preserve">Table 3: Distribution of willingness-to-pay for fossil fuel and renewable electricity (weighted percent of respondents choosing each dollar amount). Each value is the highest monthly amount the respondent accepted, so the respondent’s WTP is at least that amount and below the next amount they rejected; $0 indicates the respondent rejected $1, and $46 indicates the respondent accepted the highest amount offered.</w:t>
             </w:r>
           </w:p>
           <w:tbl>
@@ -2284,7 +3000,7 @@
               </w:tc>
             </w:tr>
           </w:tbl>
-          <w:bookmarkEnd w:id="21"/>
+          <w:bookmarkEnd w:id="22"/>
           <w:p/>
         </w:tc>
       </w:tr>
@@ -2339,7 +3055,7 @@
         <w:t xml:space="preserve"> </w:t>
       </w:r>
       <w:r>
-        <w:t xml:space="preserve">&lt; .001).</w:t>
+        <w:t xml:space="preserve">&lt; .001). However, because the fossil fuel prompt included a reason not to pay for fossil fuels, the size of this difference is likely overstated and should be interpreted with caution.</w:t>
       </w:r>
     </w:p>
     <w:p>
@@ -2361,7 +3077,7 @@
         </w:r>
       </w:hyperlink>
       <w:r>
-        <w:t xml:space="preserve">.</w:t>
+        <w:t xml:space="preserve">. Because WTP is bounded at $0 and $46, I also estimate a censored-normal (Tobit) model for each source, which treats $0 as censored from below and $46 as censored from above. Those models are shown in the supplemental material.</w:t>
       </w:r>
     </w:p>
     <w:tbl>
@@ -2377,7 +3093,7 @@
       <w:tr>
         <w:tc>
           <w:tcPr/>
-          <w:bookmarkStart w:id="22" w:name="tbl-wtp-models"/>
+          <w:bookmarkStart w:id="23" w:name="tbl-wtp-models"/>
           <w:p>
             <w:pPr>
               <w:jc w:val="left"/>
@@ -2388,7 +3104,7 @@
               <w:pStyle w:val="ImageCaption"/>
             </w:pPr>
             <w:r>
-              <w:t xml:space="preserve">Table 4: Effect of cue condition, political beliefs, and their interaction on willingness-to-pay for fossil fuels (any positive WTP, and amount among those with any positive WTP) and for renewables (survey-weighted logit/OLS; control condition and other/moderate identity as reference)</w:t>
+              <w:t xml:space="preserve">Table 4: Effect of cue condition, political beliefs, and their interaction on willingness-to-pay for fossil fuels (any positive WTP, and amount among those with any positive WTP) and for renewables (survey-weighted logit/OLS; baseline condition and other/moderate identity as reference)</w:t>
             </w:r>
           </w:p>
           <w:tbl>
@@ -3548,7 +4264,7 @@
               </w:tc>
             </w:tr>
           </w:tbl>
-          <w:bookmarkEnd w:id="22"/>
+          <w:bookmarkEnd w:id="23"/>
           <w:p/>
         </w:tc>
       </w:tr>
@@ -3558,7 +4274,7 @@
         <w:pStyle w:val="BodyText"/>
       </w:pPr>
       <w:r>
-        <w:t xml:space="preserve">For fossil fuels, conservative Republicans were significantly more likely than the reference group to have any positive WTP (b = 0.70, log-odds scale), predicted at 68.0% in the control condition compared to 41.0% for liberal Democrats (b = -0.41,</w:t>
+        <w:t xml:space="preserve">For fossil fuels, conservative Republicans were significantly more likely than the reference group to have any positive WTP (b = 0.70, log-odds scale), predicted at 68.0% in the baseline condition compared to 41.0% for liberal Democrats (b = -0.41,</w:t>
       </w:r>
       <w:r>
         <w:t xml:space="preserve"> </w:t>
@@ -3574,7 +4290,7 @@
         <w:t xml:space="preserve"> </w:t>
       </w:r>
       <w:r>
-        <w:t xml:space="preserve">= 0.023). However, the cues were not significant nor were the interactions between the cues and political beliefs. The WTP amounts are shown in</w:t>
+        <w:t xml:space="preserve">= 0.023). However, neither the cues nor the interactions between the cues and political beliefs were significant. The WTP amounts are shown in</w:t>
       </w:r>
       <w:r>
         <w:t xml:space="preserve"> </w:t>
@@ -3621,7 +4337,7 @@
       <w:tr>
         <w:tc>
           <w:tcPr/>
-          <w:bookmarkStart w:id="26" w:name="fig-wtp-fossil-predicted"/>
+          <w:bookmarkStart w:id="27" w:name="fig-wtp-fossil-predicted"/>
           <w:p>
             <w:pPr>
               <w:jc w:val="center"/>
@@ -3645,18 +4361,18 @@
                 <wp:inline>
                   <wp:extent cx="5334000" cy="4267200"/>
                   <wp:effectExtent b="0" l="0" r="0" t="0"/>
-                  <wp:docPr descr="" title="" id="24" name="Picture"/>
+                  <wp:docPr descr="" title="" id="25" name="Picture"/>
                   <a:graphic>
                     <a:graphicData uri="http://schemas.openxmlformats.org/drawingml/2006/picture">
                       <pic:pic>
                         <pic:nvPicPr>
-                          <pic:cNvPr descr="cue-WTP_files/figure-docx/fig-wtp-fossil-predicted-1.png" id="25" name="Picture"/>
+                          <pic:cNvPr descr="cue-WTP_files/figure-docx/fig-wtp-fossil-predicted-1.png" id="26" name="Picture"/>
                           <pic:cNvPicPr>
                             <a:picLocks noChangeArrowheads="1" noChangeAspect="1"/>
                           </pic:cNvPicPr>
                         </pic:nvPicPr>
                         <pic:blipFill>
-                          <a:blip r:embed="rId23"/>
+                          <a:blip r:embed="rId24"/>
                           <a:stretch>
                             <a:fillRect/>
                           </a:stretch>
@@ -3683,7 +4399,7 @@
               </w:drawing>
             </w:r>
           </w:p>
-          <w:bookmarkEnd w:id="26"/>
+          <w:bookmarkEnd w:id="27"/>
         </w:tc>
       </w:tr>
     </w:tbl>
@@ -3700,7 +4416,7 @@
       <w:tr>
         <w:tc>
           <w:tcPr/>
-          <w:bookmarkStart w:id="30" w:name="fig-wtp-renewable-predicted"/>
+          <w:bookmarkStart w:id="31" w:name="fig-wtp-renewable-predicted"/>
           <w:p>
             <w:pPr>
               <w:jc w:val="center"/>
@@ -3724,18 +4440,18 @@
                 <wp:inline>
                   <wp:extent cx="5334000" cy="4267200"/>
                   <wp:effectExtent b="0" l="0" r="0" t="0"/>
-                  <wp:docPr descr="" title="" id="28" name="Picture"/>
+                  <wp:docPr descr="" title="" id="29" name="Picture"/>
                   <a:graphic>
                     <a:graphicData uri="http://schemas.openxmlformats.org/drawingml/2006/picture">
                       <pic:pic>
                         <pic:nvPicPr>
-                          <pic:cNvPr descr="cue-WTP_files/figure-docx/fig-wtp-renewable-predicted-1.png" id="29" name="Picture"/>
+                          <pic:cNvPr descr="cue-WTP_files/figure-docx/fig-wtp-renewable-predicted-1.png" id="30" name="Picture"/>
                           <pic:cNvPicPr>
                             <a:picLocks noChangeArrowheads="1" noChangeAspect="1"/>
                           </pic:cNvPicPr>
                         </pic:nvPicPr>
                         <pic:blipFill>
-                          <a:blip r:embed="rId27"/>
+                          <a:blip r:embed="rId28"/>
                           <a:stretch>
                             <a:fillRect/>
                           </a:stretch>
@@ -3762,7 +4478,7 @@
               </w:drawing>
             </w:r>
           </w:p>
-          <w:bookmarkEnd w:id="30"/>
+          <w:bookmarkEnd w:id="31"/>
         </w:tc>
       </w:tr>
     </w:tbl>
@@ -3771,15 +4487,10 @@
         <w:pStyle w:val="BodyText"/>
       </w:pPr>
       <w:r>
-        <w:t xml:space="preserve">For fossil fuels, neither the Trump cue nor its interaction with conservative Republican identity significantly predicted a WTP &gt; $0 or, among those with positive WTP, the dollar amount. Overall, the predicted WTP &gt; $0 for conservative Republicans was 68.0% in the control condition versus 71.3% in the Trump cue, and the predicted amount conditional on paying something was $14.10 versus $14.41.</w:t>
-      </w:r>
-    </w:p>
-    <w:p>
-      <w:pPr>
-        <w:pStyle w:val="BodyText"/>
-      </w:pPr>
-      <w:r>
-        <w:t xml:space="preserve">Looking to renewables, liberal Democrats were willing to pay $5.70 more, on average, and for those in the climate condition the amount increased further by $3.14 (</w:t>
+        <w:t xml:space="preserve">For fossil fuels, neither the Trump cue nor its interaction with conservative Republican identity significantly predicted a WTP &gt; $0 or, among those with positive WTP, the dollar amount. Overall, the predicted WTP &gt; $0 for conservative Republicans was 68.0% in the baseline condition versus 71.3% in the Trump cue, and the predicted amount conditional on paying something was $14.10 versus $14.41. In the Tobit model of fossil fuel WTP, the Trump cue x conservative Republican interaction is significant (b = 7.78,</w:t>
+      </w:r>
+      <w:r>
+        <w:t xml:space="preserve"> </w:t>
       </w:r>
       <w:r>
         <w:rPr>
@@ -3792,23 +4503,10 @@
         <w:t xml:space="preserve"> </w:t>
       </w:r>
       <w:r>
-        <w:t xml:space="preserve">= 0.148), for a total predicted willingness to pay of $25.90 for renewables. Conservative Republicans, however, were willing to pay $6.62 less for renewables, for a predicted total of $12.04.</w:t>
-      </w:r>
-    </w:p>
-    <w:p>
-      <w:pPr>
-        <w:pStyle w:val="BodyText"/>
-      </w:pPr>
-      <w:r>
-        <w:t xml:space="preserve">Overall, a Trump cue made conservative Republicans more supportive of fossil fuels and a climate cue made liberal Democrats more supportive of renewables. However, respondents were, on average, more supportive of renewables in terms of both priority and WTP. Even conservative Republicans in the Trump cue had a WTP higher for renewables, $10.87, than fossil fuels, at $10.28.</w:t>
-      </w:r>
-    </w:p>
-    <w:p>
-      <w:pPr>
-        <w:pStyle w:val="BodyText"/>
-      </w:pPr>
-      <w:r>
-        <w:t xml:space="preserve">Comparing the results to the expectations, the support is mixed. As expected, political beliefs shaped both preferences and WTP. Conservative Republicans prioritized fossil fuels more than those with other political beliefs, were more likely to have any positive WTP for fossil fuels, and were WTP less for renewables. Liberal Democrats, in contrast, prioritized renewables, were less likely to have any positive WTP for fossil fuels, and were WTP more for renewables. However, among those WTP something for fossil fuels, conservative Republicans were not WTP more than others. The expectation that the cues would shift preferences and WTP in general was not supported, as neither the Trump cue nor the climate cue significantly changed energy priority or WTP for either source compared to the control condition. Finally, the expectation that the effects of the cues would depend on political beliefs received partial support. Conservative Republicans in the Trump cue shifted their priority toward fossil fuels (</w:t>
+        <w:t xml:space="preserve">= 0.038). However, this interaction reflects a lower WTP for fossil fuels in the Trump cue among those with other political beliefs (b = -5.66,</w:t>
+      </w:r>
+      <w:r>
+        <w:t xml:space="preserve"> </w:t>
       </w:r>
       <w:r>
         <w:rPr>
@@ -3821,7 +4519,10 @@
         <w:t xml:space="preserve"> </w:t>
       </w:r>
       <w:r>
-        <w:t xml:space="preserve">= 0.062) and liberal Democrats in the climate cue shifted their priority toward renewables (</w:t>
+        <w:t xml:space="preserve">= 0.047) rather than a higher WTP among conservative Republicans, whose WTP for fossil fuels in the Trump cue did not differ from the baseline (difference = 2.12,</w:t>
+      </w:r>
+      <w:r>
+        <w:t xml:space="preserve"> </w:t>
       </w:r>
       <w:r>
         <w:rPr>
@@ -3834,7 +4535,7 @@
         <w:t xml:space="preserve"> </w:t>
       </w:r>
       <w:r>
-        <w:t xml:space="preserve">= 0.051), though both interactions were only marginally significant, at</w:t>
+        <w:t xml:space="preserve">= 0.381). The interaction is also not significant after adjusting for multiple comparisons (Holm-adjusted</w:t>
       </w:r>
       <w:r>
         <w:t xml:space="preserve"> </w:t>
@@ -3847,11 +4548,145 @@
         <w:t xml:space="preserve">p</w:t>
       </w:r>
       <w:r>
-        <w:t xml:space="preserve">&lt;0.10. Yet, these shifts did not carry over to WTP, as none of the interactions between the cues and political beliefs significantly predicted WTP for fossil fuels or renewables. These results suggest that cues are likely more effective at moving the priority the public gives to energy sources than the amount they are willing to pay.</w:t>
-      </w:r>
-    </w:p>
-    <w:bookmarkEnd w:id="31"/>
-    <w:bookmarkStart w:id="33" w:name="discussion-and-conclusion"/>
+        <w:t xml:space="preserve"> </w:t>
+      </w:r>
+      <w:r>
+        <w:t xml:space="preserve">= 0.65).</w:t>
+      </w:r>
+    </w:p>
+    <w:p>
+      <w:pPr>
+        <w:pStyle w:val="BodyText"/>
+      </w:pPr>
+      <w:r>
+        <w:t xml:space="preserve">Looking to renewables, liberal Democrats were willing to pay $5.70 more, on average, and conservative Republicans were willing to pay $6.62 less, for a predicted total of $12.04 in the baseline condition. The climate cue was associated with a higher WTP for renewables among liberal Democrats (b = 3.14,</w:t>
+      </w:r>
+      <w:r>
+        <w:t xml:space="preserve"> </w:t>
+      </w:r>
+      <w:r>
+        <w:rPr>
+          <w:i/>
+          <w:iCs/>
+        </w:rPr>
+        <w:t xml:space="preserve">p</w:t>
+      </w:r>
+      <w:r>
+        <w:t xml:space="preserve"> </w:t>
+      </w:r>
+      <w:r>
+        <w:t xml:space="preserve">= 0.148), but the estimate was nearly as large among conservative Republicans, and neither interaction was significant.</w:t>
+      </w:r>
+    </w:p>
+    <w:p>
+      <w:pPr>
+        <w:pStyle w:val="BodyText"/>
+      </w:pPr>
+      <w:r>
+        <w:t xml:space="preserve">The absence of significant interactions for WTP should not be read as evidence that the cues have no effect on WTP. With 80 percent power and</w:t>
+      </w:r>
+      <w:r>
+        <w:t xml:space="preserve"> </w:t>
+      </w:r>
+      <m:oMath>
+        <m:r>
+          <m:t>α</m:t>
+        </m:r>
+      </m:oMath>
+      <w:r>
+        <w:t xml:space="preserve"> </w:t>
+      </w:r>
+      <w:r>
+        <w:t xml:space="preserve">= .05, the smallest interaction effects the design could reliably detect are $6.07 to 6.55 for renewables and $8.04 to 8.48 for the amount of fossil fuel WTP, compared with 0.49 to 0.66 points for the priority scale. Smaller effects of the cues on WTP cannot be ruled out. Additionally, neither cue had a significant average effect on WTP for either source in the models with the cues alone (all</w:t>
+      </w:r>
+      <w:r>
+        <w:t xml:space="preserve"> </w:t>
+      </w:r>
+      <w:r>
+        <w:rPr>
+          <w:i/>
+          <w:iCs/>
+        </w:rPr>
+        <w:t xml:space="preserve">p</w:t>
+      </w:r>
+      <w:r>
+        <w:t xml:space="preserve"> </w:t>
+      </w:r>
+      <m:oMath>
+        <m:r>
+          <m:rPr>
+            <m:sty m:val="p"/>
+          </m:rPr>
+          <m:t>≥</m:t>
+        </m:r>
+      </m:oMath>
+      <w:r>
+        <w:t xml:space="preserve"> </w:t>
+      </w:r>
+      <w:r>
+        <w:t xml:space="preserve">0.135).</w:t>
+      </w:r>
+    </w:p>
+    <w:p>
+      <w:pPr>
+        <w:pStyle w:val="BodyText"/>
+      </w:pPr>
+      <w:r>
+        <w:t xml:space="preserve">Overall, respondents leaned toward renewables on the priority scale, and the WTP for renewables was higher than for fossil fuels, though the size of the WTP difference likely reflects the wording of the prompts. The difference in WTP was also not uniform across groups. For example, among conservative Republicans in the Trump cue, the WTP for renewables did not differ significantly from the WTP for fossil fuels (difference = $0.59,</w:t>
+      </w:r>
+      <w:r>
+        <w:t xml:space="preserve"> </w:t>
+      </w:r>
+      <w:r>
+        <w:rPr>
+          <w:i/>
+          <w:iCs/>
+        </w:rPr>
+        <w:t xml:space="preserve">p</w:t>
+      </w:r>
+      <w:r>
+        <w:t xml:space="preserve"> </w:t>
+      </w:r>
+      <w:r>
+        <w:t xml:space="preserve">= 0.669).</w:t>
+      </w:r>
+    </w:p>
+    <w:p>
+      <w:pPr>
+        <w:pStyle w:val="BodyText"/>
+      </w:pPr>
+      <w:r>
+        <w:t xml:space="preserve">Comparing the results to the hypotheses, the support is mixed. As expected, political beliefs shaped both preferences and WTP, largely supporting H1a and H1b. Conservative Republicans prioritized fossil fuels more than those with other political beliefs, were more likely to have any positive WTP for fossil fuels, and were WTP less for renewables. Liberal Democrats, in contrast, prioritized renewables, were less likely to have any positive WTP for fossil fuels, and were WTP more for renewables. However, among those WTP something for fossil fuels, conservative Republicans were not WTP more than others. H2a and H2b were not supported, as neither the Trump cue nor the climate cue had a significant average effect on energy priority or WTP for either source compared to the baseline condition. H3a and H3b received limited support. There is some evidence that the Trump cue moved conservative Republicans toward fossil fuels (</w:t>
+      </w:r>
+      <w:r>
+        <w:rPr>
+          <w:i/>
+          <w:iCs/>
+        </w:rPr>
+        <w:t xml:space="preserve">p</w:t>
+      </w:r>
+      <w:r>
+        <w:t xml:space="preserve"> </w:t>
+      </w:r>
+      <w:r>
+        <w:t xml:space="preserve">= 0.062) and the climate cue moved liberal Democrats toward renewables (</w:t>
+      </w:r>
+      <w:r>
+        <w:rPr>
+          <w:i/>
+          <w:iCs/>
+        </w:rPr>
+        <w:t xml:space="preserve">p</w:t>
+      </w:r>
+      <w:r>
+        <w:t xml:space="preserve"> </w:t>
+      </w:r>
+      <w:r>
+        <w:t xml:space="preserve">= 0.051) on the priority scale, but both interactions were only marginally significant and neither holds after adjusting for multiple comparisons. Regarding RQ1, there was no evidence that either cue led partisans to move away from the position of the source. Regarding RQ2, the shifts in priority did not carry over to WTP, as none of the interactions between the cues and political beliefs reliably predicted WTP for fossil fuels or renewables. These results suggest that cues are likely more effective at moving the priority the public gives to energy sources than the amount they are willing to pay, though the design could not detect small effects on WTP.</w:t>
+      </w:r>
+    </w:p>
+    <w:bookmarkEnd w:id="32"/>
+    <w:bookmarkStart w:id="34" w:name="discussion-and-conclusion"/>
     <w:p>
       <w:pPr>
         <w:pStyle w:val="Heading1"/>
@@ -3865,7 +4700,7 @@
         <w:pStyle w:val="FirstParagraph"/>
       </w:pPr>
       <w:r>
-        <w:t xml:space="preserve">A clean energy transition is needed to mitigate climate change, and public support is needed for the energy transition. However, President Trump’s rhetoric and actions on energy may serve to polarize the public. This study examined how exposure to a Trump cue or a climate change cue shapes the US public’s prioritization of, and willingness-to-pay for, fossil fuel versus renewable electricity, and how these responses are shaped by political beliefs. The results show that support for energy sources is polarized along partisan lines, both in how respondents prioritized fossil fuels against renewables and in the dollar amounts they were willing to pay, and that a Trump cue pushed conservative Republicans further toward fossil fuels while a climate cue pushed liberal Democrats further toward renewables. However, respondents were, on average, more supportive of renewables than fossil fuels on both measures, and even conservative Republicans exposed to the Trump cue reported a higher WTP for renewables than for fossil fuels. Together, these findings suggest that cues may further exacerbate existing partisan divisions.</w:t>
+        <w:t xml:space="preserve">A clean energy transition is needed to mitigate climate change, and public support is needed for the energy transition. However, President Trump’s rhetoric and actions on energy may serve to polarize the public. This study examined how exposure to a Trump cue or a climate change cue shapes the US public’s prioritization of, and willingness-to-pay for, fossil fuel versus renewable electricity, and how these responses are shaped by political beliefs. The results show that support for energy sources is polarized along partisan lines, both in how respondents prioritized fossil fuels against renewables and in the dollar amounts they were willing to pay. There is also some evidence that a Trump cue moved conservative Republicans toward fossil fuels and a climate cue moved liberal Democrats toward renewables, though these effects were marginal and should be considered tentative. Together, these findings suggest that cues may further exacerbate existing partisan divisions in how the public prioritizes energy sources.</w:t>
       </w:r>
     </w:p>
     <w:p>
@@ -3873,19 +4708,19 @@
         <w:pStyle w:val="BodyText"/>
       </w:pPr>
       <w:r>
-        <w:t xml:space="preserve">The cue effects were also uneven across the two outcomes. Political beliefs conditioned the effect of the cues on prioritization, but not on WTP. For example, the Trump cue did not significantly change WTP for fossil fuels among conservative Republicans. This may be because a single cue is a weaker treatment than the sustained rhetoric respondents may encounter. In addition, a cue about a political figure may be too diffuse to move WTP, especially in times of concern about rising energy costs.</w:t>
+        <w:t xml:space="preserve">The cue effects were also uneven across the two outcomes. Political beliefs appear to condition the effect of the cues on prioritization, but not on WTP. For example, the Trump cue did not significantly change WTP for fossil fuels among conservative Republicans. This is likely because stating a priority is costless, whereas stating a WTP asks respondents to consider a cost to their own household. Agreeing with a trusted source, or reacting to a cue, may be easy when nothing is at stake, but the concrete cost of an increase in an electricity bill may limit the influence of cues, especially in times of concern about rising energy costs.</w:t>
       </w:r>
       <w:r>
         <w:rPr>
           <w:rStyle w:val="FootnoteReference"/>
         </w:rPr>
-        <w:footnoteReference w:id="32"/>
-      </w:r>
-      <w:r>
-        <w:t xml:space="preserve"> </w:t>
-      </w:r>
-      <w:r>
-        <w:t xml:space="preserve">The climate cue, by contrast, was associated with a larger, though not statistically significant, increase in WTP for renewables among liberal Democrats, consistent with the idea that a cue tied to a scientific rationale for renewables resonates most with those already predisposed toward that position.</w:t>
+        <w:footnoteReference w:id="33"/>
+      </w:r>
+      <w:r>
+        <w:t xml:space="preserve"> </w:t>
+      </w:r>
+      <w:r>
+        <w:t xml:space="preserve">Additionally, a single cue is likely a weaker treatment than the sustained rhetoric respondents may encounter outside of a survey. However, the design could only detect relatively large interaction effects on WTP, so small effects of the cues on WTP cannot be ruled out.</w:t>
       </w:r>
     </w:p>
     <w:p>
@@ -3893,7 +4728,7 @@
         <w:pStyle w:val="BodyText"/>
       </w:pPr>
       <w:r>
-        <w:t xml:space="preserve">These results carry several implications for climate and energy policy. First, respondents across the political spectrum reported some positive WTP for renewables, and even conservative Republicans exposed to the Trump cue were WTP more for renewables than for fossil fuels. This suggests that renewable energy investment likely has general public support even in a polarized environment. Second, the responsiveness of conservative Republicans and liberal Democrats to identity-congruent cues indicates that elite rhetoric, including rhetoric tied to a single prominent figure, has the capacity to widen the partisan gap in energy preferences further, which is a risk for policymakers seeking durable, bipartisan support for energy policy. Third, because the cues shifted prioritization among conservative Republicans and liberal Democrats rather than the sample overall, and did not shift WTP, messaging strategies aimed at building broad coalitions for the energy transition likely benefit from emphasizing shared, cross-partisan benefits of renewables, such as reliability or local economic development, rather than frames tied to a specific political figure or to climate change.</w:t>
+        <w:t xml:space="preserve">These results carry several implications for climate and energy policy. First, respondents, on average, leaned toward prioritizing renewables over fossil fuels, with a mean of 5.17 on the 1 to 7 scale, and 86 percent of respondents reported some positive WTP for renewables. This suggests that renewable energy investment likely has general public support even in a polarized environment, though the size of the WTP gap between renewables and fossil fuels should be interpreted with caution. Second, if the tentative responsiveness of conservative Republicans and liberal Democrats to identity-congruent cues holds, elite rhetoric, including rhetoric tied to a single prominent figure, may widen the partisan gap in energy preferences further, which is a risk for policymakers seeking durable, bipartisan support for energy policy. Third, because the cues did not shift prioritization in the sample overall and did not reliably shift WTP, messaging strategies aimed at building broad coalitions for the energy transition likely benefit from emphasizing shared, cross-partisan benefits of renewables, such as reliability or local economic development, rather than frames tied to a specific political figure or to climate change.</w:t>
       </w:r>
     </w:p>
     <w:p>
@@ -3901,7 +4736,93 @@
         <w:pStyle w:val="BodyText"/>
       </w:pPr>
       <w:r>
-        <w:t xml:space="preserve">This study has some limitations. The WTP measure relies on a hypothetical, stated-preference elicitation, and stated WTP does not always translate into WTP once a real price change is introduced. The cues were also each delivered once, in a single survey context, and their effects may not persist or generalize to the repeated, cumulative exposure people experience outside of a survey. Future research should examine whether repeated exposure to partisan cues over time widens the WTP gap identified here, and whether the gap closes when respondents are asked to pay the stated amount rather than simply report it.</w:t>
+        <w:t xml:space="preserve">This study has some limitations. First, respondents were recruited from an opt-in, quota-based panel rather than a probability sample, and the survey weights substantially increase the share of conservative Republicans. Second, the WTP prompts were not symmetric, as the fossil fuel prompt included a reason not to pay for fossil fuels, which likely inflates the difference between WTP for renewables and fossil fuels. Third, the conditions were not parallel. The Trump cue changed only the source of the argument for fossil fuels, whereas the climate cue added a scientific source, a climate change frame, and a counterargument, so the effects of the two cues cannot be compared directly. Fourth, party identification and ideology were measured after the outcomes, though their distribution did not differ across conditions. Fifth, the survey did not include attention or manipulation checks, and the starting amounts for the WTP questions were not recorded. Finally, the WTP measure relies on a hypothetical, stated-preference elicitation, and stated WTP does not always translate into WTP once a real price change is introduced. The cues were also each delivered once, in a single survey context, and their effects may not persist or generalize to the repeated, cumulative exposure people experience outside of a survey.</w:t>
+      </w:r>
+    </w:p>
+    <w:p>
+      <w:pPr>
+        <w:pStyle w:val="BodyText"/>
+      </w:pPr>
+      <w:r>
+        <w:t xml:space="preserve">Future research should examine whether repeated exposure to partisan cues over time widens the partisan gap in energy preferences identified here, and whether the cues have larger effects on WTP when respondents are asked to pay the stated amount rather than simply report it. Future research should also use parallel cue conditions and symmetric WTP prompts, and test whether cue effects on costless and costly expressions of preference differ within the same respondents.</w:t>
+      </w:r>
+    </w:p>
+    <w:bookmarkEnd w:id="34"/>
+    <w:bookmarkStart w:id="36" w:name="statements-and-declarations"/>
+    <w:p>
+      <w:pPr>
+        <w:pStyle w:val="Heading1"/>
+      </w:pPr>
+      <w:r>
+        <w:t xml:space="preserve">Statements and Declarations</w:t>
+      </w:r>
+    </w:p>
+    <w:p>
+      <w:pPr>
+        <w:pStyle w:val="FirstParagraph"/>
+      </w:pPr>
+      <w:r>
+        <w:rPr>
+          <w:b/>
+          <w:bCs/>
+        </w:rPr>
+        <w:t xml:space="preserve">Ethics approval.</w:t>
+      </w:r>
+      <w:r>
+        <w:t xml:space="preserve"> </w:t>
+      </w:r>
+      <w:r>
+        <w:t xml:space="preserve">This study was reviewed and approved by the University of Texas at Arlington Institutional Review Board [PROTOCOL NUMBER], and all respondents provided informed consent.</w:t>
+      </w:r>
+    </w:p>
+    <w:p>
+      <w:pPr>
+        <w:pStyle w:val="BodyText"/>
+      </w:pPr>
+      <w:r>
+        <w:rPr>
+          <w:b/>
+          <w:bCs/>
+        </w:rPr>
+        <w:t xml:space="preserve">Pre-registration.</w:t>
+      </w:r>
+      <w:r>
+        <w:t xml:space="preserve"> </w:t>
+      </w:r>
+      <w:r>
+        <w:t xml:space="preserve">The study was not pre-registered.</w:t>
+      </w:r>
+    </w:p>
+    <w:p>
+      <w:pPr>
+        <w:pStyle w:val="BodyText"/>
+      </w:pPr>
+      <w:r>
+        <w:rPr>
+          <w:b/>
+          <w:bCs/>
+        </w:rPr>
+        <w:t xml:space="preserve">Data availability.</w:t>
+      </w:r>
+      <w:r>
+        <w:t xml:space="preserve"> </w:t>
+      </w:r>
+      <w:r>
+        <w:t xml:space="preserve">The code to reproduce the analysis is available at</w:t>
+      </w:r>
+      <w:r>
+        <w:t xml:space="preserve"> </w:t>
+      </w:r>
+      <w:hyperlink r:id="rId35">
+        <w:r>
+          <w:rPr>
+            <w:rStyle w:val="Hyperlink"/>
+          </w:rPr>
+          <w:t xml:space="preserve">https://github.com/mnowlin/cue-WTP</w:t>
+        </w:r>
+      </w:hyperlink>
+      <w:r>
+        <w:t xml:space="preserve">. [DATA AVAILABILITY: location of the survey data, or available upon request.]</w:t>
       </w:r>
     </w:p>
     <w:p>
@@ -3909,8 +4830,8 @@
         <w:br w:type="page"/>
       </w:r>
     </w:p>
-    <w:bookmarkEnd w:id="33"/>
-    <w:bookmarkStart w:id="61" w:name="references"/>
+    <w:bookmarkEnd w:id="36"/>
+    <w:bookmarkStart w:id="68" w:name="references"/>
     <w:p>
       <w:pPr>
         <w:pStyle w:val="Heading1"/>
@@ -3919,8 +4840,8 @@
         <w:t xml:space="preserve">References</w:t>
       </w:r>
     </w:p>
-    <w:bookmarkStart w:id="60" w:name="refs"/>
-    <w:bookmarkStart w:id="34" w:name="ref-aldyWillingnessPayPolitical2012"/>
+    <w:bookmarkStart w:id="67" w:name="refs"/>
+    <w:bookmarkStart w:id="37" w:name="ref-aldyWillingnessPayPolitical2012"/>
     <w:p>
       <w:pPr>
         <w:pStyle w:val="Bibliography"/>
@@ -3984,8 +4905,8 @@
         <w:t xml:space="preserve">2(8): 596–99.</w:t>
       </w:r>
     </w:p>
-    <w:bookmarkEnd w:id="34"/>
-    <w:bookmarkStart w:id="35" w:name="ref-benegalCostSensitivityPartisan2024"/>
+    <w:bookmarkEnd w:id="37"/>
+    <w:bookmarkStart w:id="38" w:name="ref-benegalCostSensitivityPartisan2024"/>
     <w:p>
       <w:pPr>
         <w:pStyle w:val="Bibliography"/>
@@ -4055,8 +4976,8 @@
         <w:t xml:space="preserve">14(4): 763–75.</w:t>
       </w:r>
     </w:p>
-    <w:bookmarkEnd w:id="35"/>
-    <w:bookmarkStart w:id="36" w:name="ref-bergquistEnergyPolicyPublic2020"/>
+    <w:bookmarkEnd w:id="38"/>
+    <w:bookmarkStart w:id="39" w:name="ref-bergquistEnergyPolicyPublic2020"/>
     <w:p>
       <w:pPr>
         <w:pStyle w:val="Bibliography"/>
@@ -4138,8 +5059,73 @@
         <w:t xml:space="preserve">2(3): 032003.</w:t>
       </w:r>
     </w:p>
-    <w:bookmarkEnd w:id="36"/>
-    <w:bookmarkStart w:id="37" w:name="ref-borchersDoesWillingnessPay2007"/>
+    <w:bookmarkEnd w:id="39"/>
+    <w:bookmarkStart w:id="40" w:name="ref-bolsenInfluencePartisanMotivated2014"/>
+    <w:p>
+      <w:pPr>
+        <w:pStyle w:val="Bibliography"/>
+      </w:pPr>
+      <w:r>
+        <w:t xml:space="preserve">Bolsen, Toby, James N. Druckman, and Fay Lomax Cook. 2014.</w:t>
+      </w:r>
+      <w:r>
+        <w:t xml:space="preserve"> </w:t>
+      </w:r>
+      <w:r>
+        <w:t xml:space="preserve">“The</w:t>
+      </w:r>
+      <w:r>
+        <w:t xml:space="preserve"> </w:t>
+      </w:r>
+      <w:r>
+        <w:t xml:space="preserve">Influence</w:t>
+      </w:r>
+      <w:r>
+        <w:t xml:space="preserve"> </w:t>
+      </w:r>
+      <w:r>
+        <w:t xml:space="preserve">of</w:t>
+      </w:r>
+      <w:r>
+        <w:t xml:space="preserve"> </w:t>
+      </w:r>
+      <w:r>
+        <w:t xml:space="preserve">Partisan Motivated Reasoning</w:t>
+      </w:r>
+      <w:r>
+        <w:t xml:space="preserve"> </w:t>
+      </w:r>
+      <w:r>
+        <w:t xml:space="preserve">on</w:t>
+      </w:r>
+      <w:r>
+        <w:t xml:space="preserve"> </w:t>
+      </w:r>
+      <w:r>
+        <w:t xml:space="preserve">Public Opinion</w:t>
+      </w:r>
+      <w:r>
+        <w:t xml:space="preserve">.”</w:t>
+      </w:r>
+      <w:r>
+        <w:t xml:space="preserve"> </w:t>
+      </w:r>
+      <w:r>
+        <w:rPr>
+          <w:i/>
+          <w:iCs/>
+        </w:rPr>
+        <w:t xml:space="preserve">Political Behavior</w:t>
+      </w:r>
+      <w:r>
+        <w:t xml:space="preserve"> </w:t>
+      </w:r>
+      <w:r>
+        <w:t xml:space="preserve">36(2): 235–62.</w:t>
+      </w:r>
+    </w:p>
+    <w:bookmarkEnd w:id="40"/>
+    <w:bookmarkStart w:id="41" w:name="ref-borchersDoesWillingnessPay2007"/>
     <w:p>
       <w:pPr>
         <w:pStyle w:val="Bibliography"/>
@@ -4215,8 +5201,8 @@
         <w:t xml:space="preserve">35(6): 3327–34.</w:t>
       </w:r>
     </w:p>
-    <w:bookmarkEnd w:id="37"/>
-    <w:bookmarkStart w:id="38" w:name="ref-breidertReviewMethodsMeasuring2006"/>
+    <w:bookmarkEnd w:id="41"/>
+    <w:bookmarkStart w:id="42" w:name="ref-breidertReviewMethodsMeasuring2006"/>
     <w:p>
       <w:pPr>
         <w:pStyle w:val="Bibliography"/>
@@ -4280,8 +5266,73 @@
         <w:t xml:space="preserve">2(4): 8–32.</w:t>
       </w:r>
     </w:p>
-    <w:bookmarkEnd w:id="38"/>
-    <w:bookmarkStart w:id="39" w:name="X8f8eebcd7a9410a4d8f16f6da906bc2a1f7110e"/>
+    <w:bookmarkEnd w:id="42"/>
+    <w:bookmarkStart w:id="43" w:name="ref-bullockPartisanBiasFactual2015"/>
+    <w:p>
+      <w:pPr>
+        <w:pStyle w:val="Bibliography"/>
+      </w:pPr>
+      <w:r>
+        <w:t xml:space="preserve">Bullock, John G., Alan S. Gerber, Seth J. Hill, and Gregory A. Huber. 2015.</w:t>
+      </w:r>
+      <w:r>
+        <w:t xml:space="preserve"> </w:t>
+      </w:r>
+      <w:r>
+        <w:t xml:space="preserve">“Partisan</w:t>
+      </w:r>
+      <w:r>
+        <w:t xml:space="preserve"> </w:t>
+      </w:r>
+      <w:r>
+        <w:t xml:space="preserve">Bias</w:t>
+      </w:r>
+      <w:r>
+        <w:t xml:space="preserve"> </w:t>
+      </w:r>
+      <w:r>
+        <w:t xml:space="preserve">in</w:t>
+      </w:r>
+      <w:r>
+        <w:t xml:space="preserve"> </w:t>
+      </w:r>
+      <w:r>
+        <w:t xml:space="preserve">Factual Beliefs</w:t>
+      </w:r>
+      <w:r>
+        <w:t xml:space="preserve"> </w:t>
+      </w:r>
+      <w:r>
+        <w:t xml:space="preserve">about</w:t>
+      </w:r>
+      <w:r>
+        <w:t xml:space="preserve"> </w:t>
+      </w:r>
+      <w:r>
+        <w:t xml:space="preserve">Politics</w:t>
+      </w:r>
+      <w:r>
+        <w:t xml:space="preserve">.”</w:t>
+      </w:r>
+      <w:r>
+        <w:t xml:space="preserve"> </w:t>
+      </w:r>
+      <w:r>
+        <w:rPr>
+          <w:i/>
+          <w:iCs/>
+        </w:rPr>
+        <w:t xml:space="preserve">Quarterly Journal of Political Science</w:t>
+      </w:r>
+      <w:r>
+        <w:t xml:space="preserve"> </w:t>
+      </w:r>
+      <w:r>
+        <w:t xml:space="preserve">10(4): 519–78.</w:t>
+      </w:r>
+    </w:p>
+    <w:bookmarkEnd w:id="43"/>
+    <w:bookmarkStart w:id="44" w:name="X8f8eebcd7a9410a4d8f16f6da906bc2a1f7110e"/>
     <w:p>
       <w:pPr>
         <w:pStyle w:val="Bibliography"/>
@@ -4366,8 +5417,49 @@
         <w:t xml:space="preserve">62: 428–37.</w:t>
       </w:r>
     </w:p>
-    <w:bookmarkEnd w:id="39"/>
-    <w:bookmarkStart w:id="40" w:name="Xd021f1bc7383e3e1df188ec6ac9fbfebe3f9b3a"/>
+    <w:bookmarkEnd w:id="44"/>
+    <w:bookmarkStart w:id="45" w:name="ref-druckmanHowElitePartisan2013"/>
+    <w:p>
+      <w:pPr>
+        <w:pStyle w:val="Bibliography"/>
+      </w:pPr>
+      <w:r>
+        <w:t xml:space="preserve">Druckman, James N., Erik Peterson, and Rune Slothuus. 2013.</w:t>
+      </w:r>
+      <w:r>
+        <w:t xml:space="preserve"> </w:t>
+      </w:r>
+      <w:r>
+        <w:t xml:space="preserve">“How</w:t>
+      </w:r>
+      <w:r>
+        <w:t xml:space="preserve"> </w:t>
+      </w:r>
+      <w:r>
+        <w:t xml:space="preserve">Elite Partisan Polarization Affects Public Opinion Formation</w:t>
+      </w:r>
+      <w:r>
+        <w:t xml:space="preserve">.”</w:t>
+      </w:r>
+      <w:r>
+        <w:t xml:space="preserve"> </w:t>
+      </w:r>
+      <w:r>
+        <w:rPr>
+          <w:i/>
+          <w:iCs/>
+        </w:rPr>
+        <w:t xml:space="preserve">American Political Science Review</w:t>
+      </w:r>
+      <w:r>
+        <w:t xml:space="preserve"> </w:t>
+      </w:r>
+      <w:r>
+        <w:t xml:space="preserve">107(01): 57–79.</w:t>
+      </w:r>
+    </w:p>
+    <w:bookmarkEnd w:id="45"/>
+    <w:bookmarkStart w:id="46" w:name="Xd021f1bc7383e3e1df188ec6ac9fbfebe3f9b3a"/>
     <w:p>
       <w:pPr>
         <w:pStyle w:val="Bibliography"/>
@@ -4428,8 +5520,8 @@
         <w:t xml:space="preserve">9(3): 308–18.</w:t>
       </w:r>
     </w:p>
-    <w:bookmarkEnd w:id="40"/>
-    <w:bookmarkStart w:id="41" w:name="ref-feldmanClimateChangePolarizing2018"/>
+    <w:bookmarkEnd w:id="46"/>
+    <w:bookmarkStart w:id="47" w:name="ref-feldmanClimateChangePolarizing2018"/>
     <w:p>
       <w:pPr>
         <w:pStyle w:val="Bibliography"/>
@@ -4514,8 +5606,8 @@
         <w:t xml:space="preserve">51: 54–66.</w:t>
       </w:r>
     </w:p>
-    <w:bookmarkEnd w:id="41"/>
-    <w:bookmarkStart w:id="42" w:name="ref-gaborPriceIndicatorQuality1966"/>
+    <w:bookmarkEnd w:id="47"/>
+    <w:bookmarkStart w:id="48" w:name="ref-gaborPriceIndicatorQuality1966"/>
     <w:p>
       <w:pPr>
         <w:pStyle w:val="Bibliography"/>
@@ -4588,8 +5680,8 @@
         <w:t xml:space="preserve">33: 43–70.</w:t>
       </w:r>
     </w:p>
-    <w:bookmarkEnd w:id="42"/>
-    <w:bookmarkStart w:id="43" w:name="ref-grometPoliticalIdeologyAffects2013"/>
+    <w:bookmarkEnd w:id="48"/>
+    <w:bookmarkStart w:id="49" w:name="ref-grometPoliticalIdeologyAffects2013"/>
     <w:p>
       <w:pPr>
         <w:pStyle w:val="Bibliography"/>
@@ -4641,8 +5733,8 @@
         <w:t xml:space="preserve">110(23): 9314–19.</w:t>
       </w:r>
     </w:p>
-    <w:bookmarkEnd w:id="43"/>
-    <w:bookmarkStart w:id="44" w:name="ref-hamiltonChangeWindUS2018"/>
+    <w:bookmarkEnd w:id="49"/>
+    <w:bookmarkStart w:id="50" w:name="ref-hamiltonChangeWindUS2018"/>
     <w:p>
       <w:pPr>
         <w:pStyle w:val="Bibliography"/>
@@ -4727,8 +5819,8 @@
         <w:t xml:space="preserve">8(1): 11.</w:t>
       </w:r>
     </w:p>
-    <w:bookmarkEnd w:id="44"/>
-    <w:bookmarkStart w:id="45" w:name="ref-hawesClimateSciencePolitics2022"/>
+    <w:bookmarkEnd w:id="50"/>
+    <w:bookmarkStart w:id="51" w:name="ref-hawesClimateSciencePolitics2022"/>
     <w:p>
       <w:pPr>
         <w:pStyle w:val="Bibliography"/>
@@ -4849,8 +5941,8 @@
         <w:t xml:space="preserve">85: 102419.</w:t>
       </w:r>
     </w:p>
-    <w:bookmarkEnd w:id="45"/>
-    <w:bookmarkStart w:id="46" w:name="ref-jonesSurveyTechniqueMeasure1975"/>
+    <w:bookmarkEnd w:id="51"/>
+    <w:bookmarkStart w:id="52" w:name="ref-jonesSurveyTechniqueMeasure1975"/>
     <w:p>
       <w:pPr>
         <w:pStyle w:val="Bibliography"/>
@@ -4914,8 +6006,8 @@
         <w:t xml:space="preserve">39(3): 75–77.</w:t>
       </w:r>
     </w:p>
-    <w:bookmarkEnd w:id="46"/>
-    <w:bookmarkStart w:id="47" w:name="ref-kennedyAmericansShiftingViews2026"/>
+    <w:bookmarkEnd w:id="52"/>
+    <w:bookmarkStart w:id="53" w:name="ref-kennedyAmericansShiftingViews2026"/>
     <w:p>
       <w:pPr>
         <w:pStyle w:val="Bibliography"/>
@@ -4969,8 +6061,8 @@
         <w:t xml:space="preserve">https://www.pewresearch.org/science/2026/04/03/americans-shifting-views-on-energy-issues/ (April 21, 2026).</w:t>
       </w:r>
     </w:p>
-    <w:bookmarkEnd w:id="47"/>
-    <w:bookmarkStart w:id="48" w:name="ref-knappWillConsumersReally2020"/>
+    <w:bookmarkEnd w:id="53"/>
+    <w:bookmarkStart w:id="54" w:name="ref-knappWillConsumersReally2020"/>
     <w:p>
       <w:pPr>
         <w:pStyle w:val="Bibliography"/>
@@ -5067,8 +6159,8 @@
         <w:t xml:space="preserve">65: 101457.</w:t>
       </w:r>
     </w:p>
-    <w:bookmarkEnd w:id="48"/>
-    <w:bookmarkStart w:id="49" w:name="X83362c7a395811c107646b0a251a2c1915acb0e"/>
+    <w:bookmarkEnd w:id="54"/>
+    <w:bookmarkStart w:id="55" w:name="X83362c7a395811c107646b0a251a2c1915acb0e"/>
     <w:p>
       <w:pPr>
         <w:pStyle w:val="Bibliography"/>
@@ -5141,8 +6233,8 @@
         <w:t xml:space="preserve">55: 617–25.</w:t>
       </w:r>
     </w:p>
-    <w:bookmarkEnd w:id="49"/>
-    <w:bookmarkStart w:id="50" w:name="ref-kotchenPublicWillingnessPay2017"/>
+    <w:bookmarkEnd w:id="55"/>
+    <w:bookmarkStart w:id="56" w:name="ref-kotchenPublicWillingnessPay2017"/>
     <w:p>
       <w:pPr>
         <w:pStyle w:val="Bibliography"/>
@@ -5242,8 +6334,8 @@
         <w:t xml:space="preserve">12(9).</w:t>
       </w:r>
     </w:p>
-    <w:bookmarkEnd w:id="50"/>
-    <w:bookmarkStart w:id="51" w:name="ref-liPublicSupportReducing2009"/>
+    <w:bookmarkEnd w:id="56"/>
+    <w:bookmarkStart w:id="57" w:name="ref-liPublicSupportReducing2009"/>
     <w:p>
       <w:pPr>
         <w:pStyle w:val="Bibliography"/>
@@ -5340,8 +6432,8 @@
         <w:t xml:space="preserve">68(3): 731–42.</w:t>
       </w:r>
     </w:p>
-    <w:bookmarkEnd w:id="51"/>
-    <w:bookmarkStart w:id="52" w:name="ref-lipovetskyPricingModelsMarketing2011"/>
+    <w:bookmarkEnd w:id="57"/>
+    <w:bookmarkStart w:id="58" w:name="ref-lipovetskyPricingModelsMarketing2011"/>
     <w:p>
       <w:pPr>
         <w:pStyle w:val="Bibliography"/>
@@ -5393,8 +6485,8 @@
         <w:t xml:space="preserve">3(5): 167–74.</w:t>
       </w:r>
     </w:p>
-    <w:bookmarkEnd w:id="52"/>
-    <w:bookmarkStart w:id="53" w:name="ref-merkleyPartyCuesNews2021"/>
+    <w:bookmarkEnd w:id="58"/>
+    <w:bookmarkStart w:id="59" w:name="ref-merkleyPartyCuesNews2021"/>
     <w:p>
       <w:pPr>
         <w:pStyle w:val="Bibliography"/>
@@ -5485,8 +6577,8 @@
         <w:t xml:space="preserve">51(4): 1439–56.</w:t>
       </w:r>
     </w:p>
-    <w:bookmarkEnd w:id="53"/>
-    <w:bookmarkStart w:id="54" w:name="ref-murakamiConsumersWillingnessPay2015"/>
+    <w:bookmarkEnd w:id="59"/>
+    <w:bookmarkStart w:id="60" w:name="ref-murakamiConsumersWillingnessPay2015"/>
     <w:p>
       <w:pPr>
         <w:pStyle w:val="Bibliography"/>
@@ -5595,8 +6687,8 @@
         <w:t xml:space="preserve">50: 178–89.</w:t>
       </w:r>
     </w:p>
-    <w:bookmarkEnd w:id="54"/>
-    <w:bookmarkStart w:id="55" w:name="ref-nkansahWillingnessPayWind2019"/>
+    <w:bookmarkEnd w:id="60"/>
+    <w:bookmarkStart w:id="61" w:name="ref-nkansahWillingnessPayWind2019"/>
     <w:p>
       <w:pPr>
         <w:pStyle w:val="Bibliography"/>
@@ -5672,8 +6764,118 @@
         <w:t xml:space="preserve">48(1): 44–70.</w:t>
       </w:r>
     </w:p>
-    <w:bookmarkEnd w:id="55"/>
-    <w:bookmarkStart w:id="56" w:name="ref-scheuchVotersSupportAre2026"/>
+    <w:bookmarkEnd w:id="61"/>
+    <w:bookmarkStart w:id="62" w:name="ref-priorYouCannotBe2015a"/>
+    <w:p>
+      <w:pPr>
+        <w:pStyle w:val="Bibliography"/>
+      </w:pPr>
+      <w:r>
+        <w:t xml:space="preserve">Prior, Markus, Gaurav Sood, and Kabir Khanna. 2015.</w:t>
+      </w:r>
+      <w:r>
+        <w:t xml:space="preserve"> </w:t>
+      </w:r>
+      <w:r>
+        <w:t xml:space="preserve">“You</w:t>
+      </w:r>
+      <w:r>
+        <w:t xml:space="preserve"> </w:t>
+      </w:r>
+      <w:r>
+        <w:t xml:space="preserve">Cannot</w:t>
+      </w:r>
+      <w:r>
+        <w:t xml:space="preserve"> </w:t>
+      </w:r>
+      <w:r>
+        <w:t xml:space="preserve">Be</w:t>
+      </w:r>
+      <w:r>
+        <w:t xml:space="preserve"> </w:t>
+      </w:r>
+      <w:r>
+        <w:t xml:space="preserve">Serious</w:t>
+      </w:r>
+      <w:r>
+        <w:t xml:space="preserve">:</w:t>
+      </w:r>
+      <w:r>
+        <w:t xml:space="preserve"> </w:t>
+      </w:r>
+      <w:r>
+        <w:t xml:space="preserve">The Impact</w:t>
+      </w:r>
+      <w:r>
+        <w:t xml:space="preserve"> </w:t>
+      </w:r>
+      <w:r>
+        <w:t xml:space="preserve">of</w:t>
+      </w:r>
+      <w:r>
+        <w:t xml:space="preserve"> </w:t>
+      </w:r>
+      <w:r>
+        <w:t xml:space="preserve">Accuracy Incentives</w:t>
+      </w:r>
+      <w:r>
+        <w:t xml:space="preserve"> </w:t>
+      </w:r>
+      <w:r>
+        <w:t xml:space="preserve">on</w:t>
+      </w:r>
+      <w:r>
+        <w:t xml:space="preserve"> </w:t>
+      </w:r>
+      <w:r>
+        <w:t xml:space="preserve">Partisan Bias</w:t>
+      </w:r>
+      <w:r>
+        <w:t xml:space="preserve"> </w:t>
+      </w:r>
+      <w:r>
+        <w:t xml:space="preserve">in</w:t>
+      </w:r>
+      <w:r>
+        <w:t xml:space="preserve"> </w:t>
+      </w:r>
+      <w:r>
+        <w:t xml:space="preserve">Reports</w:t>
+      </w:r>
+      <w:r>
+        <w:t xml:space="preserve"> </w:t>
+      </w:r>
+      <w:r>
+        <w:t xml:space="preserve">of</w:t>
+      </w:r>
+      <w:r>
+        <w:t xml:space="preserve"> </w:t>
+      </w:r>
+      <w:r>
+        <w:t xml:space="preserve">Economic Perceptions</w:t>
+      </w:r>
+      <w:r>
+        <w:t xml:space="preserve">.”</w:t>
+      </w:r>
+      <w:r>
+        <w:t xml:space="preserve"> </w:t>
+      </w:r>
+      <w:r>
+        <w:rPr>
+          <w:i/>
+          <w:iCs/>
+        </w:rPr>
+        <w:t xml:space="preserve">Quarterly Journal of Political Science</w:t>
+      </w:r>
+      <w:r>
+        <w:t xml:space="preserve"> </w:t>
+      </w:r>
+      <w:r>
+        <w:t xml:space="preserve">10(4): 489–518.</w:t>
+      </w:r>
+    </w:p>
+    <w:bookmarkEnd w:id="62"/>
+    <w:bookmarkStart w:id="63" w:name="ref-scheuchVotersSupportAre2026"/>
     <w:p>
       <w:pPr>
         <w:pStyle w:val="Bibliography"/>
@@ -5746,8 +6948,8 @@
         <w:t xml:space="preserve">: 10780874261475229.</w:t>
       </w:r>
     </w:p>
-    <w:bookmarkEnd w:id="56"/>
-    <w:bookmarkStart w:id="57" w:name="ref-teslerEliteDominationPublic2018"/>
+    <w:bookmarkEnd w:id="63"/>
+    <w:bookmarkStart w:id="64" w:name="ref-teslerEliteDominationPublic2018"/>
     <w:p>
       <w:pPr>
         <w:pStyle w:val="Bibliography"/>
@@ -5808,8 +7010,8 @@
         <w:t xml:space="preserve">35(2): 306–26.</w:t>
       </w:r>
     </w:p>
-    <w:bookmarkEnd w:id="57"/>
-    <w:bookmarkStart w:id="58" w:name="ref-walterExaminingWillingnessPay2023"/>
+    <w:bookmarkEnd w:id="64"/>
+    <w:bookmarkStart w:id="65" w:name="ref-walterExaminingWillingnessPay2023"/>
     <w:p>
       <w:pPr>
         <w:pStyle w:val="Bibliography"/>
@@ -5897,8 +7099,8 @@
         <w:t xml:space="preserve">181: 113661.</w:t>
       </w:r>
     </w:p>
-    <w:bookmarkEnd w:id="58"/>
-    <w:bookmarkStart w:id="59" w:name="ref-wedelModelEffectsPsychological1998"/>
+    <w:bookmarkEnd w:id="65"/>
+    <w:bookmarkStart w:id="66" w:name="ref-wedelModelEffectsPsychological1998"/>
     <w:p>
       <w:pPr>
         <w:pStyle w:val="Bibliography"/>
@@ -5947,9 +7149,9 @@
         <w:t xml:space="preserve">19(2): 237–60.</w:t>
       </w:r>
     </w:p>
-    <w:bookmarkEnd w:id="59"/>
-    <w:bookmarkEnd w:id="60"/>
-    <w:bookmarkEnd w:id="61"/>
+    <w:bookmarkEnd w:id="66"/>
+    <w:bookmarkEnd w:id="67"/>
+    <w:bookmarkEnd w:id="68"/>
     <w:sectPr>
       <w:footnotePr>
         <w:numRestart w:val="eachSect"/>
@@ -6053,7 +7255,26 @@
       </w:r>
     </w:p>
   </w:footnote>
-  <w:footnote w:id="32">
+  <w:footnote w:id="14">
+    <w:p>
+      <w:pPr>
+        <w:pStyle w:val="FootnoteText"/>
+      </w:pPr>
+      <w:r>
+        <w:rPr>
+          <w:rStyle w:val="FootnoteReference"/>
+        </w:rPr>
+        <w:footnoteRef/>
+      </w:r>
+      <w:r>
+        <w:t xml:space="preserve"> </w:t>
+      </w:r>
+      <w:r>
+        <w:t xml:space="preserve">Randomization produced conditions that were similar on gender, college education, income, and concern about the cost of electricity, but the conditions differed somewhat in age and in the share of white respondents. A balance table is shown in the supplemental material, and the results are similar when controlling for demographics.</w:t>
+      </w:r>
+    </w:p>
+  </w:footnote>
+  <w:footnote w:id="33">
     <w:p>
       <w:pPr>
         <w:pStyle w:val="FootnoteText"/>

</xml_diff>

<commit_message>
Update data availability statement and Druckman et al. citation text
Co-Authored-By: Claude Opus 5.5 <noreply@anthropic.com>
</commit_message>
<xml_diff>
--- a/_output/cue-WTP.docx
+++ b/_output/cue-WTP.docx
@@ -228,7 +228,7 @@
         <w:t xml:space="preserve"> </w:t>
       </w:r>
       <w:r>
-        <w:t xml:space="preserve">found that party cues on energy policy have a larger influence on opinion when elites are polarized. Given the polarized elite environment surrounding energy, a cue tied to President Trump is likely to be a strong signal to partisans of both parties. Apart from partisan cues, connecting energy policies to the polarized issue of climate change can also shape and polarize public opinion. For example,</w:t>
+        <w:t xml:space="preserve">found, in experiments on drilling and immigration, that elite polarization intensifies the influence of party endorsements on opinion. Given the polarized elite environment surrounding energy, a cue tied to President Trump is likely to be a strong signal to partisans of both parties. Apart from partisan cues, connecting energy policies to the polarized issue of climate change can also shape and polarize public opinion. For example,</w:t>
       </w:r>
       <w:r>
         <w:t xml:space="preserve"> </w:t>
@@ -4822,7 +4822,7 @@
         </w:r>
       </w:hyperlink>
       <w:r>
-        <w:t xml:space="preserve">. [DATA AVAILABILITY: location of the survey data, or available upon request.]</w:t>
+        <w:t xml:space="preserve">. The survey data will be made available upon publication.</w:t>
       </w:r>
     </w:p>
     <w:p>

</xml_diff>

<commit_message>
Use party identification instead of ideology x party; add renv
- Replace libDem/conRep with democrat/republican (leaners included) in all
  models, with pure independents as the reference group; rename inline
  objects and labels to match
- Add inline objects for the party-only write-up (within-group shifts,
  Holm p-values, Tobit and renewables terms, unweighted WTP interactions)
- Draft party-only text for the manuscript and supplemental materials
- Initialize renv (R 4.6.0)
- Re-render HTML, PDF, and DOCX; update LOG and README

Co-Authored-By: Claude Opus 5.5 <noreply@anthropic.com>
</commit_message>
<xml_diff>
--- a/_output/cue-WTP.docx
+++ b/_output/cue-WTP.docx
@@ -37,7 +37,7 @@
         <w:pStyle w:val="Abstract"/>
       </w:pPr>
       <w:r>
-        <w:t xml:space="preserve">The second Trump administration has promoted fossil fuels and criticized renewable energy, which may serve as a partisan cue that further polarizes the US public on energy. Using a survey experiment with a quota-based sample of US residents (N = 3,113), I examine how a Trump cue and a climate change cue shape how the public prioritizes fossil fuels versus renewables, as well as their willingness-to-pay (WTP) for each source measured with the Gabor-Granger method. Political beliefs strongly predicted both outcomes, as conservative Republicans prioritized fossil fuels and were WTP less for renewables, whereas liberal Democrats prioritized renewables and were WTP more for them. Neither cue had an average effect on priority or WTP. There is some evidence that the Trump cue moved conservative Republicans toward fossil fuels and the climate cue moved liberal Democrats toward renewables on the priority scale, though these interactions were only marginally significant. The cues did not reliably shift WTP for either source. The results suggest that cues are more likely to move costless expressions of energy preferences than the amount the public states it is willing to pay.</w:t>
+        <w:t xml:space="preserve">The second Trump administration has promoted fossil fuels and criticized renewable energy, which may serve as a partisan cue that further polarizes the US public on energy. Using a survey experiment with a quota-based sample of US residents (N = 3,113), I examine how a Trump cue and a climate change cue shape how the public prioritizes fossil fuels versus renewables, as well as their willingness-to-pay (WTP) for each source measured with the Gabor-Granger method. Partisanship strongly predicted both outcomes, as Republicans prioritized fossil fuels and were WTP less for renewables, whereas Democrats prioritized renewables and were WTP more for them. Neither cue had an average effect on priority or WTP. The Trump cue moved Republicans toward fossil fuels on the priority scale, though this effect does not hold after adjusting for multiple comparisons, and the climate cue did not move Democrats toward renewables. The cues did not reliably shift WTP for either source among partisans. The results suggest that cues are more likely to move costless expressions of energy preferences than the amount the public states it is willing to pay.</w:t>
       </w:r>
     </w:p>
     <w:bookmarkStart w:id="10" w:name="introduction"/>
@@ -177,7 +177,7 @@
         <w:pStyle w:val="BodyText"/>
       </w:pPr>
       <w:r>
-        <w:t xml:space="preserve">In this study, I expand on current research by testing the impacts of a Trump cue versus a climate change cue on the prioritization of and WTP for fossil fuels and renewable sources of energy. Overall, I find that political beliefs shape energy source prioritization as conservative Republicans tend to prioritize and have a higher WTP for fossil fuels and liberal Democrats prioritize and have a higher WTP for renewables. Neither cue had an average effect on either outcome. There is some evidence that conservative Republicans in the Trump cue prioritize fossil fuels more, and liberal Democrats in the climate cue prioritize renewables more, though these interactions are only marginally significant and do not hold after adjusting for multiple comparisons. Finally, the cues did not reliably shift WTP for either energy source, which suggests that cues are more likely to move costless expressions of preference than costly ones.</w:t>
+        <w:t xml:space="preserve">In this study, I expand on current research by testing the impacts of a Trump cue versus a climate change cue on the prioritization of and WTP for fossil fuels and renewable sources of energy. Overall, I find that partisanship shapes energy source prioritization as Republicans tend to prioritize and have a higher WTP for fossil fuels and Democrats prioritize and have a higher WTP for renewables. Neither cue had an average effect on either outcome. There is some evidence that Republicans in the Trump cue prioritize fossil fuels more, though this effect does not hold after adjusting for multiple comparisons, and there is no evidence that the climate cue moved Democrats toward renewables. Finally, the cues did not reliably shift WTP for either energy source among partisans, which suggests that cues are more likely to move costless expressions of preference than costly ones.</w:t>
       </w:r>
     </w:p>
     <w:bookmarkEnd w:id="10"/>
@@ -452,7 +452,7 @@
         <w:pStyle w:val="BlockText"/>
       </w:pPr>
       <w:r>
-        <w:t xml:space="preserve">H1a: Conservative Republicans will prioritize fossil fuels and be WTP more for fossil fuels than those with other political beliefs.</w:t>
+        <w:t xml:space="preserve">H1a: Republicans will prioritize fossil fuels and be WTP more for fossil fuels than those who identify with neither party.</w:t>
       </w:r>
     </w:p>
     <w:p>
@@ -460,7 +460,7 @@
         <w:pStyle w:val="BlockText"/>
       </w:pPr>
       <w:r>
-        <w:t xml:space="preserve">H1b: Liberal Democrats will prioritize renewables and be WTP more for renewables than those with other political beliefs.</w:t>
+        <w:t xml:space="preserve">H1b: Democrats will prioritize renewables and be WTP more for renewables than those who identify with neither party.</w:t>
       </w:r>
     </w:p>
     <w:p>
@@ -484,7 +484,7 @@
         <w:pStyle w:val="BlockText"/>
       </w:pPr>
       <w:r>
-        <w:t xml:space="preserve">H3a: The effect of the Trump cue on prioritizing and WTP for fossil fuels will be larger among conservative Republicans than among those with other political beliefs.</w:t>
+        <w:t xml:space="preserve">H3a: The effect of the Trump cue on prioritizing and WTP for fossil fuels will be larger among Republicans than among those who identify with neither party.</w:t>
       </w:r>
     </w:p>
     <w:p>
@@ -492,7 +492,7 @@
         <w:pStyle w:val="BlockText"/>
       </w:pPr>
       <w:r>
-        <w:t xml:space="preserve">H3b: The effect of the climate cue on prioritizing and WTP for renewables will be larger among liberal Democrats than among those with other political beliefs.</w:t>
+        <w:t xml:space="preserve">H3b: The effect of the climate cue on prioritizing and WTP for renewables will be larger among Democrats than among those who identify with neither party.</w:t>
       </w:r>
     </w:p>
     <w:p>
@@ -509,7 +509,7 @@
         <w:t xml:space="preserve">(Feldman and Hart 2018)</w:t>
       </w:r>
       <w:r>
-        <w:t xml:space="preserve">, so I ask whether liberal Democrats move toward renewables in response to the Trump cue and whether conservative Republicans move toward fossil fuels in response to the climate cue (RQ1). Second, given the difference between costless and costly expressions of preference, I ask whether the effects of the cues on prioritization carry over to WTP (RQ2).</w:t>
+        <w:t xml:space="preserve">, so I ask whether Democrats move toward renewables in response to the Trump cue and whether Republicans move toward fossil fuels in response to the climate cue (RQ1). Second, given the difference between costless and costly expressions of preference, I ask whether the effects of the cues on prioritization carry over to WTP (RQ2).</w:t>
       </w:r>
     </w:p>
     <w:bookmarkEnd w:id="12"/>
@@ -528,7 +528,7 @@
         <w:pStyle w:val="FirstParagraph"/>
       </w:pPr>
       <w:r>
-        <w:t xml:space="preserve">To examine the importance of cues and political beliefs in energy preferences I use a survey experiment to examine respondents’ prioritization of fossil fuels versus renewables as well as their WTP for those sources to generate electricity in response to a Trump cue or a climate change cue. Respondents were recruited using Cloud Research, which provides a quota-based sample of US residents, with quotas for age, race, and gender based on US Census data. Additionally, to further ensure as representative a sample as possible, I used the</w:t>
+        <w:t xml:space="preserve">To examine the importance of cues and partisanship in energy preferences I use a survey experiment to examine respondents’ prioritization of fossil fuels versus renewables as well as their WTP for those sources to generate electricity in response to a Trump cue or a climate change cue. Respondents were recruited using Cloud Research, which provides a quota-based sample of US residents, with quotas for age, race, and gender based on US Census data. Additionally, to further ensure as representative a sample as possible, I used the</w:t>
       </w:r>
       <w:r>
         <w:t xml:space="preserve"> </w:t>
@@ -780,7 +780,7 @@
         <w:pStyle w:val="BodyText"/>
       </w:pPr>
       <w:r>
-        <w:t xml:space="preserve">In the following analysis, I examine the prioritization of fossil fuels vs. renewables and the WTP for those energy sources as a function of the cues and political beliefs. Political beliefs include conservative Republicans and liberal Democrats, with other political beliefs (moderates of either party, conservative Democrats, liberal Republicans, and those who identify with neither party) as the excluded referents. The political belief measures were constructed based on responses to a self-reported, 7-point ideology scale (1 = strongly liberal, 2 = liberal, 3 = slightly liberal, 4 = middle of the road, 5 = slightly conservative, 6 = conservative, 7 = strongly conservative) and political party identification. Respondents who identified as independent or with another party were asked whether they lean toward the Democratic or Republican Party, and those who lean toward a party are coded as identifying with that party. Before leaners are assigned, 34 percent of respondents identified as independent or with another party, and after leaners are assigned, only 15 percent identified with neither party. Conservative Republican is coded 1 for respondents who identify as Republican and place themselves at 5, 6, or 7 on the ideology scale (slightly conservative, conservative, or strongly conservative), and liberal Democrat is coded 1 for respondents who identify as Democrat and place themselves at 1, 2, or 3 (strongly liberal, liberal, or slightly liberal). Party identification and ideology were measured after the outcome questions, so the cues could, in principle, have shifted how respondents identified. However, the distribution of political beliefs did not differ across conditions (</w:t>
+        <w:t xml:space="preserve">In the following analysis, I examine the prioritization of fossil fuels vs. renewables and the WTP for those energy sources as a function of the cues and party identification. Party identification includes Democrats and Republicans, with those who identify with neither party as the excluded referent. Respondents who identified as independent or with another party were asked whether they lean toward the Democratic or Republican Party, and those who lean toward a party are coded as identifying with that party. Before leaners are assigned, 34 percent of respondents identified as independent or with another party, and after leaners are assigned, only 15 percent (n = 466) identified with neither party. Because this reference group is small, the cue effects among those who identify with neither party are estimated with less precision than the effects among partisans. Party identification was measured after the outcome questions, so the cues could, in principle, have shifted how respondents identified. However, the distribution of party identification did not differ across conditions (</w:t>
       </w:r>
       <m:oMath>
         <m:sSup>
@@ -800,7 +800,7 @@
         <w:t xml:space="preserve"> </w:t>
       </w:r>
       <w:r>
-        <w:t xml:space="preserve">= 5.20,</w:t>
+        <w:t xml:space="preserve">= 3.29,</w:t>
       </w:r>
       <w:r>
         <w:t xml:space="preserve"> </w:t>
@@ -832,7 +832,7 @@
         <w:t xml:space="preserve"> </w:t>
       </w:r>
       <w:r>
-        <w:t xml:space="preserve">= 0.268).</w:t>
+        <w:t xml:space="preserve">= 0.511).</w:t>
       </w:r>
     </w:p>
     <w:tbl>
@@ -859,7 +859,7 @@
               <w:pStyle w:val="ImageCaption"/>
             </w:pPr>
             <w:r>
-              <w:t xml:space="preserve">Table 1: Descriptive statistics for the energy-priority scale, willingness-to-pay, and political belief measures (survey-weighted means and standard deviations, overall and survey-weighted means by condition)</w:t>
+              <w:t xml:space="preserve">Table 1: Descriptive statistics for the energy-priority scale, willingness-to-pay, and party identification (survey-weighted means and standard deviations, overall and survey-weighted means by condition)</w:t>
             </w:r>
           </w:p>
           <w:tbl>
@@ -1347,20 +1347,72 @@
                     <w:jc w:val="left"/>
                   </w:pPr>
                   <w:r>
-                    <w:t xml:space="preserve">Liberal Democrat</w:t>
-                  </w:r>
-                </w:p>
-              </w:tc>
-              <w:tc>
-                <w:tcPr/>
-                <w:p>
-                  <w:pPr>
-                    <w:pStyle w:val="Compact"/>
-                    <w:jc w:val="left"/>
-                    <w:jc w:val="left"/>
-                  </w:pPr>
-                  <w:r>
-                    <w:t xml:space="preserve">0.37</w:t>
+                    <w:t xml:space="preserve">Democrat</w:t>
+                  </w:r>
+                </w:p>
+              </w:tc>
+              <w:tc>
+                <w:tcPr/>
+                <w:p>
+                  <w:pPr>
+                    <w:pStyle w:val="Compact"/>
+                    <w:jc w:val="left"/>
+                    <w:jc w:val="left"/>
+                  </w:pPr>
+                  <w:r>
+                    <w:t xml:space="preserve">0.45</w:t>
+                  </w:r>
+                </w:p>
+              </w:tc>
+              <w:tc>
+                <w:tcPr/>
+                <w:p>
+                  <w:pPr>
+                    <w:pStyle w:val="Compact"/>
+                    <w:jc w:val="left"/>
+                    <w:jc w:val="left"/>
+                  </w:pPr>
+                  <w:r>
+                    <w:t xml:space="preserve">0.50</w:t>
+                  </w:r>
+                </w:p>
+              </w:tc>
+              <w:tc>
+                <w:tcPr/>
+                <w:p>
+                  <w:pPr>
+                    <w:pStyle w:val="Compact"/>
+                    <w:jc w:val="left"/>
+                    <w:jc w:val="left"/>
+                  </w:pPr>
+                  <w:r>
+                    <w:t xml:space="preserve">0</w:t>
+                  </w:r>
+                </w:p>
+              </w:tc>
+              <w:tc>
+                <w:tcPr/>
+                <w:p>
+                  <w:pPr>
+                    <w:pStyle w:val="Compact"/>
+                    <w:jc w:val="left"/>
+                    <w:jc w:val="left"/>
+                  </w:pPr>
+                  <w:r>
+                    <w:t xml:space="preserve">1</w:t>
+                  </w:r>
+                </w:p>
+              </w:tc>
+              <w:tc>
+                <w:tcPr/>
+                <w:p>
+                  <w:pPr>
+                    <w:pStyle w:val="Compact"/>
+                    <w:jc w:val="left"/>
+                    <w:jc w:val="left"/>
+                  </w:pPr>
+                  <w:r>
+                    <w:t xml:space="preserve">0.43</w:t>
                   </w:r>
                 </w:p>
               </w:tc>
@@ -1386,59 +1438,7 @@
                     <w:jc w:val="left"/>
                   </w:pPr>
                   <w:r>
-                    <w:t xml:space="preserve">0</w:t>
-                  </w:r>
-                </w:p>
-              </w:tc>
-              <w:tc>
-                <w:tcPr/>
-                <w:p>
-                  <w:pPr>
-                    <w:pStyle w:val="Compact"/>
-                    <w:jc w:val="left"/>
-                    <w:jc w:val="left"/>
-                  </w:pPr>
-                  <w:r>
-                    <w:t xml:space="preserve">1</w:t>
-                  </w:r>
-                </w:p>
-              </w:tc>
-              <w:tc>
-                <w:tcPr/>
-                <w:p>
-                  <w:pPr>
-                    <w:pStyle w:val="Compact"/>
-                    <w:jc w:val="left"/>
-                    <w:jc w:val="left"/>
-                  </w:pPr>
-                  <w:r>
-                    <w:t xml:space="preserve">0.35</w:t>
-                  </w:r>
-                </w:p>
-              </w:tc>
-              <w:tc>
-                <w:tcPr/>
-                <w:p>
-                  <w:pPr>
-                    <w:pStyle w:val="Compact"/>
-                    <w:jc w:val="left"/>
-                    <w:jc w:val="left"/>
-                  </w:pPr>
-                  <w:r>
-                    <w:t xml:space="preserve">0.40</w:t>
-                  </w:r>
-                </w:p>
-              </w:tc>
-              <w:tc>
-                <w:tcPr/>
-                <w:p>
-                  <w:pPr>
-                    <w:pStyle w:val="Compact"/>
-                    <w:jc w:val="left"/>
-                    <w:jc w:val="left"/>
-                  </w:pPr>
-                  <w:r>
-                    <w:t xml:space="preserve">0.37</w:t>
+                    <w:t xml:space="preserve">0.44</w:t>
                   </w:r>
                 </w:p>
               </w:tc>
@@ -1453,33 +1453,33 @@
                     <w:jc w:val="left"/>
                   </w:pPr>
                   <w:r>
-                    <w:t xml:space="preserve">Conservative Republican</w:t>
-                  </w:r>
-                </w:p>
-              </w:tc>
-              <w:tc>
-                <w:tcPr/>
-                <w:p>
-                  <w:pPr>
-                    <w:pStyle w:val="Compact"/>
-                    <w:jc w:val="left"/>
-                    <w:jc w:val="left"/>
-                  </w:pPr>
-                  <w:r>
-                    <w:t xml:space="preserve">0.40</w:t>
-                  </w:r>
-                </w:p>
-              </w:tc>
-              <w:tc>
-                <w:tcPr/>
-                <w:p>
-                  <w:pPr>
-                    <w:pStyle w:val="Compact"/>
-                    <w:jc w:val="left"/>
-                    <w:jc w:val="left"/>
-                  </w:pPr>
-                  <w:r>
-                    <w:t xml:space="preserve">0.49</w:t>
+                    <w:t xml:space="preserve">Republican</w:t>
+                  </w:r>
+                </w:p>
+              </w:tc>
+              <w:tc>
+                <w:tcPr/>
+                <w:p>
+                  <w:pPr>
+                    <w:pStyle w:val="Compact"/>
+                    <w:jc w:val="left"/>
+                    <w:jc w:val="left"/>
+                  </w:pPr>
+                  <w:r>
+                    <w:t xml:space="preserve">0.46</w:t>
+                  </w:r>
+                </w:p>
+              </w:tc>
+              <w:tc>
+                <w:tcPr/>
+                <w:p>
+                  <w:pPr>
+                    <w:pStyle w:val="Compact"/>
+                    <w:jc w:val="left"/>
+                    <w:jc w:val="left"/>
+                  </w:pPr>
+                  <w:r>
+                    <w:t xml:space="preserve">0.50</w:t>
                   </w:r>
                 </w:p>
               </w:tc>
@@ -1518,33 +1518,33 @@
                     <w:jc w:val="left"/>
                   </w:pPr>
                   <w:r>
-                    <w:t xml:space="preserve">0.41</w:t>
-                  </w:r>
-                </w:p>
-              </w:tc>
-              <w:tc>
-                <w:tcPr/>
-                <w:p>
-                  <w:pPr>
-                    <w:pStyle w:val="Compact"/>
-                    <w:jc w:val="left"/>
-                    <w:jc w:val="left"/>
-                  </w:pPr>
-                  <w:r>
-                    <w:t xml:space="preserve">0.36</w:t>
-                  </w:r>
-                </w:p>
-              </w:tc>
-              <w:tc>
-                <w:tcPr/>
-                <w:p>
-                  <w:pPr>
-                    <w:pStyle w:val="Compact"/>
-                    <w:jc w:val="left"/>
-                    <w:jc w:val="left"/>
-                  </w:pPr>
-                  <w:r>
-                    <w:t xml:space="preserve">0.42</w:t>
+                    <w:t xml:space="preserve">0.48</w:t>
+                  </w:r>
+                </w:p>
+              </w:tc>
+              <w:tc>
+                <w:tcPr/>
+                <w:p>
+                  <w:pPr>
+                    <w:pStyle w:val="Compact"/>
+                    <w:jc w:val="left"/>
+                    <w:jc w:val="left"/>
+                  </w:pPr>
+                  <w:r>
+                    <w:t xml:space="preserve">0.43</w:t>
+                  </w:r>
+                </w:p>
+              </w:tc>
+              <w:tc>
+                <w:tcPr/>
+                <w:p>
+                  <w:pPr>
+                    <w:pStyle w:val="Compact"/>
+                    <w:jc w:val="left"/>
+                    <w:jc w:val="left"/>
+                  </w:pPr>
+                  <w:r>
+                    <w:t xml:space="preserve">0.47</w:t>
                   </w:r>
                 </w:p>
               </w:tc>
@@ -1560,7 +1560,7 @@
         <w:pStyle w:val="BodyText"/>
       </w:pPr>
       <w:r>
-        <w:t xml:space="preserve">Descriptive statistics for the energy-priority scale and the political belief measures are shown in</w:t>
+        <w:t xml:space="preserve">Descriptive statistics for the energy-priority scale and party identification are shown in</w:t>
       </w:r>
       <w:r>
         <w:t xml:space="preserve"> </w:t>
@@ -1574,7 +1574,7 @@
         </w:r>
       </w:hyperlink>
       <w:r>
-        <w:t xml:space="preserve">. The mean on the energy-priority scale was 5.17 (SD = 1.74), which is above the midpoint of 4 and indicates that respondents, on average, leaned toward prioritizing renewables over fossil fuels. Regarding political beliefs, 37 percent of the weighted sample were liberal Democrats and 40 percent were conservative Republicans, with the remaining 23 percent holding other political beliefs. These shares reflect the survey weights, which weight the sample to the party affiliation distribution in the NPORS. Unweighted, 48 percent of respondents were liberal Democrats and 24 percent were conservative Republicans, so the weights roughly double the share of conservative Republicans. To account for this, I also estimate each model without the weights, and those models are shown in the supplemental material.</w:t>
+        <w:t xml:space="preserve">. The mean on the energy-priority scale was 5.17 (SD = 1.74), which is above the midpoint of 4 and indicates that respondents, on average, leaned toward prioritizing renewables over fossil fuels. Regarding party identification, 45 percent of the weighted sample were Democrats and 46 percent were Republicans, with the remaining 9 percent identifying with neither party. These shares reflect the survey weights, which weight the sample to the party affiliation distribution in the NPORS. Unweighted, 56 percent of respondents were Democrats and 29 percent were Republicans, so the weights increase the share of Republicans from 29 to 46 percent. To account for this, I also estimate each model without the weights, and those models are shown in the supplemental material.</w:t>
       </w:r>
     </w:p>
     <w:bookmarkEnd w:id="16"/>
@@ -1592,7 +1592,7 @@
         <w:pStyle w:val="FirstParagraph"/>
       </w:pPr>
       <w:r>
-        <w:t xml:space="preserve">First, I use OLS to examine the prioritization respondents gave to fossil fuels versus renewables as a function of the cues, their political beliefs, and the interaction between cues and political beliefs. The results are shown in</w:t>
+        <w:t xml:space="preserve">First, I use OLS to examine the prioritization respondents gave to fossil fuels versus renewables as a function of the cues, their party identification, and the interaction between cues and party identification. The results are shown in</w:t>
       </w:r>
       <w:r>
         <w:t xml:space="preserve"> </w:t>
@@ -1633,18 +1633,18 @@
               <w:pStyle w:val="ImageCaption"/>
             </w:pPr>
             <w:r>
-              <w:t xml:space="preserve">Table 2: Effect of cue condition, political beliefs, and their interaction on the energy source-priority scale (survey-weighted OLS; baseline condition and other/moderate identity as reference)</w:t>
+              <w:t xml:space="preserve">Table 2: Effect of cue condition, party identification, and their interaction on the energy source-priority scale (survey-weighted OLS; baseline condition and those who identify with neither party as reference)</w:t>
             </w:r>
           </w:p>
           <w:tbl>
             <w:tblPr>
               <w:tblStyle w:val="Table"/>
-              <w:tblW w:type="pct" w:w="3958"/>
+              <w:tblW w:type="pct" w:w="3056"/>
               <w:tblLayout w:type="fixed"/>
               <w:tblLook w:firstRow="1" w:lastRow="1" w:firstColumn="0" w:lastColumn="0" w:noHBand="0" w:noVBand="0" w:val="0020"/>
             </w:tblPr>
             <w:tblGrid>
-              <w:gridCol w:w="4400"/>
+              <w:gridCol w:w="2970"/>
               <w:gridCol w:w="1870"/>
             </w:tblGrid>
             <w:tr>
@@ -1696,7 +1696,7 @@
                     <w:jc w:val="left"/>
                   </w:pPr>
                   <w:r>
-                    <w:t xml:space="preserve">-0.016</w:t>
+                    <w:t xml:space="preserve">0.145</w:t>
                   </w:r>
                 </w:p>
               </w:tc>
@@ -1719,7 +1719,7 @@
                     <w:jc w:val="left"/>
                   </w:pPr>
                   <w:r>
-                    <w:t xml:space="preserve">(0.159)</w:t>
+                    <w:t xml:space="preserve">(0.198)</w:t>
                   </w:r>
                 </w:p>
               </w:tc>
@@ -1747,7 +1747,7 @@
                     <w:jc w:val="left"/>
                   </w:pPr>
                   <w:r>
-                    <w:t xml:space="preserve">-0.137</w:t>
+                    <w:t xml:space="preserve">0.098</w:t>
                   </w:r>
                 </w:p>
               </w:tc>
@@ -1770,7 +1770,7 @@
                     <w:jc w:val="left"/>
                   </w:pPr>
                   <w:r>
-                    <w:t xml:space="preserve">(0.153)</w:t>
+                    <w:t xml:space="preserve">(0.189)</w:t>
                   </w:r>
                 </w:p>
               </w:tc>
@@ -1785,20 +1785,20 @@
                     <w:jc w:val="left"/>
                   </w:pPr>
                   <w:r>
-                    <w:t xml:space="preserve">Liberal Democrat</w:t>
-                  </w:r>
-                </w:p>
-              </w:tc>
-              <w:tc>
-                <w:tcPr/>
-                <w:p>
-                  <w:pPr>
-                    <w:pStyle w:val="Compact"/>
-                    <w:jc w:val="left"/>
-                    <w:jc w:val="left"/>
-                  </w:pPr>
-                  <w:r>
-                    <w:t xml:space="preserve">0.674**</w:t>
+                    <w:t xml:space="preserve">Democrat</w:t>
+                  </w:r>
+                </w:p>
+              </w:tc>
+              <w:tc>
+                <w:tcPr/>
+                <w:p>
+                  <w:pPr>
+                    <w:pStyle w:val="Compact"/>
+                    <w:jc w:val="left"/>
+                    <w:jc w:val="left"/>
+                  </w:pPr>
+                  <w:r>
+                    <w:t xml:space="preserve">0.727**</w:t>
                   </w:r>
                 </w:p>
               </w:tc>
@@ -1821,7 +1821,7 @@
                     <w:jc w:val="left"/>
                   </w:pPr>
                   <w:r>
-                    <w:t xml:space="preserve">(0.126)</w:t>
+                    <w:t xml:space="preserve">(0.151)</w:t>
                   </w:r>
                 </w:p>
               </w:tc>
@@ -1836,20 +1836,20 @@
                     <w:jc w:val="left"/>
                   </w:pPr>
                   <w:r>
-                    <w:t xml:space="preserve">Conservative Republican</w:t>
-                  </w:r>
-                </w:p>
-              </w:tc>
-              <w:tc>
-                <w:tcPr/>
-                <w:p>
-                  <w:pPr>
-                    <w:pStyle w:val="Compact"/>
-                    <w:jc w:val="left"/>
-                    <w:jc w:val="left"/>
-                  </w:pPr>
-                  <w:r>
-                    <w:t xml:space="preserve">-1.236**</w:t>
+                    <w:t xml:space="preserve">Republican</w:t>
+                  </w:r>
+                </w:p>
+              </w:tc>
+              <w:tc>
+                <w:tcPr/>
+                <w:p>
+                  <w:pPr>
+                    <w:pStyle w:val="Compact"/>
+                    <w:jc w:val="left"/>
+                    <w:jc w:val="left"/>
+                  </w:pPr>
+                  <w:r>
+                    <w:t xml:space="preserve">-0.991**</w:t>
                   </w:r>
                 </w:p>
               </w:tc>
@@ -1872,7 +1872,7 @@
                     <w:jc w:val="left"/>
                   </w:pPr>
                   <w:r>
-                    <w:t xml:space="preserve">(0.150)</w:t>
+                    <w:t xml:space="preserve">(0.171)</w:t>
                   </w:r>
                 </w:p>
               </w:tc>
@@ -1887,20 +1887,20 @@
                     <w:jc w:val="left"/>
                   </w:pPr>
                   <w:r>
-                    <w:t xml:space="preserve">Trump cue × Liberal Democrat</w:t>
-                  </w:r>
-                </w:p>
-              </w:tc>
-              <w:tc>
-                <w:tcPr/>
-                <w:p>
-                  <w:pPr>
-                    <w:pStyle w:val="Compact"/>
-                    <w:jc w:val="left"/>
-                    <w:jc w:val="left"/>
-                  </w:pPr>
-                  <w:r>
-                    <w:t xml:space="preserve">0.137</w:t>
+                    <w:t xml:space="preserve">Trump cue × Democrat</w:t>
+                  </w:r>
+                </w:p>
+              </w:tc>
+              <w:tc>
+                <w:tcPr/>
+                <w:p>
+                  <w:pPr>
+                    <w:pStyle w:val="Compact"/>
+                    <w:jc w:val="left"/>
+                    <w:jc w:val="left"/>
+                  </w:pPr>
+                  <w:r>
+                    <w:t xml:space="preserve">-0.046</w:t>
                   </w:r>
                 </w:p>
               </w:tc>
@@ -1923,7 +1923,7 @@
                     <w:jc w:val="left"/>
                   </w:pPr>
                   <w:r>
-                    <w:t xml:space="preserve">(0.184)</w:t>
+                    <w:t xml:space="preserve">(0.216)</w:t>
                   </w:r>
                 </w:p>
               </w:tc>
@@ -1938,20 +1938,20 @@
                     <w:jc w:val="left"/>
                   </w:pPr>
                   <w:r>
-                    <w:t xml:space="preserve">Climate cue × Liberal Democrat</w:t>
-                  </w:r>
-                </w:p>
-              </w:tc>
-              <w:tc>
-                <w:tcPr/>
-                <w:p>
-                  <w:pPr>
-                    <w:pStyle w:val="Compact"/>
-                    <w:jc w:val="left"/>
-                    <w:jc w:val="left"/>
-                  </w:pPr>
-                  <w:r>
-                    <w:t xml:space="preserve">0.341†</w:t>
+                    <w:t xml:space="preserve">Climate cue × Democrat</w:t>
+                  </w:r>
+                </w:p>
+              </w:tc>
+              <w:tc>
+                <w:tcPr/>
+                <w:p>
+                  <w:pPr>
+                    <w:pStyle w:val="Compact"/>
+                    <w:jc w:val="left"/>
+                    <w:jc w:val="left"/>
+                  </w:pPr>
+                  <w:r>
+                    <w:t xml:space="preserve">0.014</w:t>
                   </w:r>
                 </w:p>
               </w:tc>
@@ -1974,7 +1974,7 @@
                     <w:jc w:val="left"/>
                   </w:pPr>
                   <w:r>
-                    <w:t xml:space="preserve">(0.174)</w:t>
+                    <w:t xml:space="preserve">(0.206)</w:t>
                   </w:r>
                 </w:p>
               </w:tc>
@@ -1989,20 +1989,20 @@
                     <w:jc w:val="left"/>
                   </w:pPr>
                   <w:r>
-                    <w:t xml:space="preserve">Trump cue × Conservative Republican</w:t>
-                  </w:r>
-                </w:p>
-              </w:tc>
-              <w:tc>
-                <w:tcPr/>
-                <w:p>
-                  <w:pPr>
-                    <w:pStyle w:val="Compact"/>
-                    <w:jc w:val="left"/>
-                    <w:jc w:val="left"/>
-                  </w:pPr>
-                  <w:r>
-                    <w:t xml:space="preserve">-0.438†</w:t>
+                    <w:t xml:space="preserve">Trump cue × Republican</w:t>
+                  </w:r>
+                </w:p>
+              </w:tc>
+              <w:tc>
+                <w:tcPr/>
+                <w:p>
+                  <w:pPr>
+                    <w:pStyle w:val="Compact"/>
+                    <w:jc w:val="left"/>
+                    <w:jc w:val="left"/>
+                  </w:pPr>
+                  <w:r>
+                    <w:t xml:space="preserve">-0.521*</w:t>
                   </w:r>
                 </w:p>
               </w:tc>
@@ -2025,7 +2025,7 @@
                     <w:jc w:val="left"/>
                   </w:pPr>
                   <w:r>
-                    <w:t xml:space="preserve">(0.235)</w:t>
+                    <w:t xml:space="preserve">(0.257)</w:t>
                   </w:r>
                 </w:p>
               </w:tc>
@@ -2040,20 +2040,20 @@
                     <w:jc w:val="left"/>
                   </w:pPr>
                   <w:r>
-                    <w:t xml:space="preserve">Climate cue × Conservative Republican</w:t>
-                  </w:r>
-                </w:p>
-              </w:tc>
-              <w:tc>
-                <w:tcPr/>
-                <w:p>
-                  <w:pPr>
-                    <w:pStyle w:val="Compact"/>
-                    <w:jc w:val="left"/>
-                    <w:jc w:val="left"/>
-                  </w:pPr>
-                  <w:r>
-                    <w:t xml:space="preserve">0.079</w:t>
+                    <w:t xml:space="preserve">Climate cue × Republican</w:t>
+                  </w:r>
+                </w:p>
+              </w:tc>
+              <w:tc>
+                <w:tcPr/>
+                <w:p>
+                  <w:pPr>
+                    <w:pStyle w:val="Compact"/>
+                    <w:jc w:val="left"/>
+                    <w:jc w:val="left"/>
+                  </w:pPr>
+                  <w:r>
+                    <w:t xml:space="preserve">-0.199</w:t>
                   </w:r>
                 </w:p>
               </w:tc>
@@ -2076,7 +2076,7 @@
                     <w:jc w:val="left"/>
                   </w:pPr>
                   <w:r>
-                    <w:t xml:space="preserve">(0.221)</w:t>
+                    <w:t xml:space="preserve">(0.242)</w:t>
                   </w:r>
                 </w:p>
               </w:tc>
@@ -2104,7 +2104,7 @@
                     <w:jc w:val="left"/>
                   </w:pPr>
                   <w:r>
-                    <w:t xml:space="preserve">5.443**</w:t>
+                    <w:t xml:space="preserve">5.333**</w:t>
                   </w:r>
                 </w:p>
               </w:tc>
@@ -2127,7 +2127,7 @@
                     <w:jc w:val="left"/>
                   </w:pPr>
                   <w:r>
-                    <w:t xml:space="preserve">(0.109)</w:t>
+                    <w:t xml:space="preserve">(0.139)</w:t>
                   </w:r>
                 </w:p>
               </w:tc>
@@ -2183,7 +2183,7 @@
                     <w:jc w:val="left"/>
                   </w:pPr>
                   <w:r>
-                    <w:t xml:space="preserve">0.313</w:t>
+                    <w:t xml:space="preserve">0.289</w:t>
                   </w:r>
                 </w:p>
               </w:tc>
@@ -2235,7 +2235,7 @@
               <w:pStyle w:val="ImageCaption"/>
             </w:pPr>
             <w:r>
-              <w:t xml:space="preserve">Figure 1: Predicted energy source-priority scale (1-7) by cue condition and political identity (survey-weighted OLS predictions with 95% CIs)</w:t>
+              <w:t xml:space="preserve">Figure 1: Predicted energy source-priority scale (1-7) by cue condition and party identification (survey-weighted OLS predictions with 95% CIs)</w:t>
             </w:r>
           </w:p>
           <w:p>
@@ -2295,7 +2295,7 @@
         <w:pStyle w:val="BodyText"/>
       </w:pPr>
       <w:r>
-        <w:t xml:space="preserve">As expected, conservative Republicans were more likely to prioritize fossil fuels than renewables, with an estimated coefficient of -1.24 on the 1 to 7 scale, and liberal Democrats prioritized renewables at 0.67. In terms of the interactions, which test whether the effect of a cue differs by political beliefs, the Trump cue moved conservative Republicans toward fossil fuels more than it moved those with other political beliefs (b = -0.44,</w:t>
+        <w:t xml:space="preserve">As expected, Republicans were more likely to prioritize fossil fuels than renewables, with an estimated coefficient of -0.99 on the 1 to 7 scale, and Democrats prioritized renewables at 0.73. In terms of the interactions, which test whether the effect of a cue differs by party identification, the Trump cue moved Republicans toward fossil fuels more than it moved those who identify with neither party (b = -0.52). However, there are 16 cue x party identification interactions across the four models presented here, and this interaction is not significant after a Holm adjustment for multiple comparisons (adjusted</w:t>
       </w:r>
       <w:r>
         <w:t xml:space="preserve"> </w:t>
@@ -2311,7 +2311,7 @@
         <w:t xml:space="preserve"> </w:t>
       </w:r>
       <w:r>
-        <w:t xml:space="preserve">= 0.062), and the climate cue moved liberal Democrats toward renewables more than those with other political beliefs (b = 0.34,</w:t>
+        <w:t xml:space="preserve">= 0.68). Descriptively, the predicted value on the 1 to 7 scale for Republicans in the baseline condition was 4.34, indicating a split roughly evenly between fossil fuels and renewables, and it was 3.96 for those receiving the Trump cue, a significant shift toward fossil fuels (difference = -0.38). In contrast, the climate cue did not move Democrats toward renewables more than those who identify with neither party (b = 0.01). The predicted value for Democrats was 6.06 in the baseline condition, indicating a strong priority for renewables, and 6.17 in the climate condition, which is not a significant difference. Without the survey weights, neither interaction is significant (Trump cue x Republican</w:t>
       </w:r>
       <w:r>
         <w:t xml:space="preserve"> </w:t>
@@ -2327,7 +2327,7 @@
         <w:t xml:space="preserve"> </w:t>
       </w:r>
       <w:r>
-        <w:t xml:space="preserve">= 0.051). Both interactions are only marginally significant. Additionally, these are 16 cue x political belief interactions across the four models presented here, and neither interaction is significant after a Holm adjustment for multiple comparisons (adjusted</w:t>
+        <w:t xml:space="preserve">= 0.135; climate cue x Democrat</w:t>
       </w:r>
       <w:r>
         <w:t xml:space="preserve"> </w:t>
@@ -2343,65 +2343,7 @@
         <w:t xml:space="preserve"> </w:t>
       </w:r>
       <w:r>
-        <w:t xml:space="preserve">= 0.94 and 0.81, respectively). Descriptively, the predicted value on the 1 to 7 scale for conservative Republicans in the baseline condition was 4.21, indicating a split roughly evenly between fossil fuels and renewables, and it was 3.75 for those receiving the Trump cue (difference = -0.45,</w:t>
-      </w:r>
-      <w:r>
-        <w:t xml:space="preserve"> </w:t>
-      </w:r>
-      <w:r>
-        <w:rPr>
-          <w:i/>
-          <w:iCs/>
-        </w:rPr>
-        <w:t xml:space="preserve">p</w:t>
-      </w:r>
-      <w:r>
-        <w:t xml:space="preserve"> </w:t>
-      </w:r>
-      <w:r>
-        <w:t xml:space="preserve">= 0.009). For liberal Democrats the predicted value was 6.12 in the baseline condition, indicating a priority for renewables, and 6.32 in the climate condition (difference = 0.20,</w:t>
-      </w:r>
-      <w:r>
-        <w:t xml:space="preserve"> </w:t>
-      </w:r>
-      <w:r>
-        <w:rPr>
-          <w:i/>
-          <w:iCs/>
-        </w:rPr>
-        <w:t xml:space="preserve">p</w:t>
-      </w:r>
-      <w:r>
-        <w:t xml:space="preserve"> </w:t>
-      </w:r>
-      <w:r>
-        <w:t xml:space="preserve">= 0.015). Without the survey weights, the climate cue x liberal Democrat interaction is significant (</w:t>
-      </w:r>
-      <w:r>
-        <w:rPr>
-          <w:i/>
-          <w:iCs/>
-        </w:rPr>
-        <w:t xml:space="preserve">p</w:t>
-      </w:r>
-      <w:r>
-        <w:t xml:space="preserve"> </w:t>
-      </w:r>
-      <w:r>
-        <w:t xml:space="preserve">= 0.014), whereas the Trump cue x conservative Republican interaction is not (</w:t>
-      </w:r>
-      <w:r>
-        <w:rPr>
-          <w:i/>
-          <w:iCs/>
-        </w:rPr>
-        <w:t xml:space="preserve">p</w:t>
-      </w:r>
-      <w:r>
-        <w:t xml:space="preserve"> </w:t>
-      </w:r>
-      <w:r>
-        <w:t xml:space="preserve">= 0.144). In contrast to the interactions, there is no evidence that liberal Democrats moved toward renewables in response to the Trump cue or that conservative Republicans moved toward fossil fuels in response to the climate cue.</w:t>
+        <w:t xml:space="preserve">= 0.483). Finally, there is no evidence that Democrats moved toward renewables in response to the Trump cue or that Republicans moved toward fossil fuels in response to the climate cue.</w:t>
       </w:r>
     </w:p>
     <w:p>
@@ -2409,7 +2351,7 @@
         <w:pStyle w:val="BodyText"/>
       </w:pPr>
       <w:r>
-        <w:t xml:space="preserve">Because the models include interactions, the coefficients for the Trump and climate cues are the effects of the cues among those with other political beliefs only. To estimate the average effect of each cue, I also estimate models with the cues alone, shown in the supplemental material. Neither cue had a significant average effect on energy source priority compared to the baseline (Trump cue b = -0.03,</w:t>
+        <w:t xml:space="preserve">Because the models include interactions, the coefficients for the Trump and climate cues are the effects of the cues among those who identify with neither party only. To estimate the average effect of each cue, I also estimate models with the cues alone, shown in the supplemental material. Neither cue had a significant average effect on energy source priority compared to the baseline (Trump cue b = -0.03,</w:t>
       </w:r>
       <w:r>
         <w:t xml:space="preserve"> </w:t>
@@ -3104,21 +3046,21 @@
               <w:pStyle w:val="ImageCaption"/>
             </w:pPr>
             <w:r>
-              <w:t xml:space="preserve">Table 4: Effect of cue condition, political beliefs, and their interaction on willingness-to-pay for fossil fuels (any positive WTP, and amount among those with any positive WTP) and for renewables (survey-weighted logit/OLS; baseline condition and other/moderate identity as reference)</w:t>
+              <w:t xml:space="preserve">Table 4: Effect of cue condition, party identification, and their interaction on willingness-to-pay for fossil fuels (any positive WTP, and amount among those with any positive WTP) and for renewables (survey-weighted logit/OLS; baseline condition and those who identify with neither party as reference)</w:t>
             </w:r>
           </w:p>
           <w:tbl>
             <w:tblPr>
               <w:tblStyle w:val="Table"/>
-              <w:tblW w:type="pct" w:w="4930"/>
+              <w:tblW w:type="pct" w:w="4923"/>
               <w:tblLayout w:type="fixed"/>
               <w:tblLook w:firstRow="1" w:lastRow="1" w:firstColumn="0" w:lastColumn="0" w:noHBand="0" w:noVBand="0" w:val="0020"/>
             </w:tblPr>
             <w:tblGrid>
-              <w:gridCol w:w="2215"/>
-              <w:gridCol w:w="1772"/>
-              <w:gridCol w:w="2326"/>
-              <w:gridCol w:w="1495"/>
+              <w:gridCol w:w="1644"/>
+              <w:gridCol w:w="1949"/>
+              <w:gridCol w:w="2558"/>
+              <w:gridCol w:w="1644"/>
             </w:tblGrid>
             <w:tr>
               <w:trPr>
@@ -3195,33 +3137,33 @@
                     <w:jc w:val="left"/>
                   </w:pPr>
                   <w:r>
-                    <w:t xml:space="preserve">-0.263</w:t>
-                  </w:r>
-                </w:p>
-              </w:tc>
-              <w:tc>
-                <w:tcPr/>
-                <w:p>
-                  <w:pPr>
-                    <w:pStyle w:val="Compact"/>
-                    <w:jc w:val="left"/>
-                    <w:jc w:val="left"/>
-                  </w:pPr>
-                  <w:r>
-                    <w:t xml:space="preserve">-3.607</w:t>
-                  </w:r>
-                </w:p>
-              </w:tc>
-              <w:tc>
-                <w:tcPr/>
-                <w:p>
-                  <w:pPr>
-                    <w:pStyle w:val="Compact"/>
-                    <w:jc w:val="left"/>
-                    <w:jc w:val="left"/>
-                  </w:pPr>
-                  <w:r>
-                    <w:t xml:space="preserve">-1.495</w:t>
+                    <w:t xml:space="preserve">-0.560*</w:t>
+                  </w:r>
+                </w:p>
+              </w:tc>
+              <w:tc>
+                <w:tcPr/>
+                <w:p>
+                  <w:pPr>
+                    <w:pStyle w:val="Compact"/>
+                    <w:jc w:val="left"/>
+                    <w:jc w:val="left"/>
+                  </w:pPr>
+                  <w:r>
+                    <w:t xml:space="preserve">-3.589</w:t>
+                  </w:r>
+                </w:p>
+              </w:tc>
+              <w:tc>
+                <w:tcPr/>
+                <w:p>
+                  <w:pPr>
+                    <w:pStyle w:val="Compact"/>
+                    <w:jc w:val="left"/>
+                    <w:jc w:val="left"/>
+                  </w:pPr>
+                  <w:r>
+                    <w:t xml:space="preserve">-2.003</w:t>
                   </w:r>
                 </w:p>
               </w:tc>
@@ -3244,33 +3186,33 @@
                     <w:jc w:val="left"/>
                   </w:pPr>
                   <w:r>
-                    <w:t xml:space="preserve">(0.204)</w:t>
-                  </w:r>
-                </w:p>
-              </w:tc>
-              <w:tc>
-                <w:tcPr/>
-                <w:p>
-                  <w:pPr>
-                    <w:pStyle w:val="Compact"/>
-                    <w:jc w:val="left"/>
-                    <w:jc w:val="left"/>
-                  </w:pPr>
-                  <w:r>
-                    <w:t xml:space="preserve">(2.265)</w:t>
-                  </w:r>
-                </w:p>
-              </w:tc>
-              <w:tc>
-                <w:tcPr/>
-                <w:p>
-                  <w:pPr>
-                    <w:pStyle w:val="Compact"/>
-                    <w:jc w:val="left"/>
-                    <w:jc w:val="left"/>
-                  </w:pPr>
-                  <w:r>
-                    <w:t xml:space="preserve">(1.828)</w:t>
+                    <w:t xml:space="preserve">(0.263)</w:t>
+                  </w:r>
+                </w:p>
+              </w:tc>
+              <w:tc>
+                <w:tcPr/>
+                <w:p>
+                  <w:pPr>
+                    <w:pStyle w:val="Compact"/>
+                    <w:jc w:val="left"/>
+                    <w:jc w:val="left"/>
+                  </w:pPr>
+                  <w:r>
+                    <w:t xml:space="preserve">(2.990)</w:t>
+                  </w:r>
+                </w:p>
+              </w:tc>
+              <w:tc>
+                <w:tcPr/>
+                <w:p>
+                  <w:pPr>
+                    <w:pStyle w:val="Compact"/>
+                    <w:jc w:val="left"/>
+                    <w:jc w:val="left"/>
+                  </w:pPr>
+                  <w:r>
+                    <w:t xml:space="preserve">(2.317)</w:t>
                   </w:r>
                 </w:p>
               </w:tc>
@@ -3298,33 +3240,33 @@
                     <w:jc w:val="left"/>
                   </w:pPr>
                   <w:r>
-                    <w:t xml:space="preserve">0.100</w:t>
-                  </w:r>
-                </w:p>
-              </w:tc>
-              <w:tc>
-                <w:tcPr/>
-                <w:p>
-                  <w:pPr>
-                    <w:pStyle w:val="Compact"/>
-                    <w:jc w:val="left"/>
-                    <w:jc w:val="left"/>
-                  </w:pPr>
-                  <w:r>
-                    <w:t xml:space="preserve">-1.509</w:t>
-                  </w:r>
-                </w:p>
-              </w:tc>
-              <w:tc>
-                <w:tcPr/>
-                <w:p>
-                  <w:pPr>
-                    <w:pStyle w:val="Compact"/>
-                    <w:jc w:val="left"/>
-                    <w:jc w:val="left"/>
-                  </w:pPr>
-                  <w:r>
-                    <w:t xml:space="preserve">-1.604</w:t>
+                    <w:t xml:space="preserve">-0.341</w:t>
+                  </w:r>
+                </w:p>
+              </w:tc>
+              <w:tc>
+                <w:tcPr/>
+                <w:p>
+                  <w:pPr>
+                    <w:pStyle w:val="Compact"/>
+                    <w:jc w:val="left"/>
+                    <w:jc w:val="left"/>
+                  </w:pPr>
+                  <w:r>
+                    <w:t xml:space="preserve">-3.568</w:t>
+                  </w:r>
+                </w:p>
+              </w:tc>
+              <w:tc>
+                <w:tcPr/>
+                <w:p>
+                  <w:pPr>
+                    <w:pStyle w:val="Compact"/>
+                    <w:jc w:val="left"/>
+                    <w:jc w:val="left"/>
+                  </w:pPr>
+                  <w:r>
+                    <w:t xml:space="preserve">-3.578</w:t>
                   </w:r>
                 </w:p>
               </w:tc>
@@ -3347,33 +3289,33 @@
                     <w:jc w:val="left"/>
                   </w:pPr>
                   <w:r>
-                    <w:t xml:space="preserve">(0.206)</w:t>
-                  </w:r>
-                </w:p>
-              </w:tc>
-              <w:tc>
-                <w:tcPr/>
-                <w:p>
-                  <w:pPr>
-                    <w:pStyle w:val="Compact"/>
-                    <w:jc w:val="left"/>
-                    <w:jc w:val="left"/>
-                  </w:pPr>
-                  <w:r>
-                    <w:t xml:space="preserve">(2.250)</w:t>
-                  </w:r>
-                </w:p>
-              </w:tc>
-              <w:tc>
-                <w:tcPr/>
-                <w:p>
-                  <w:pPr>
-                    <w:pStyle w:val="Compact"/>
-                    <w:jc w:val="left"/>
-                    <w:jc w:val="left"/>
-                  </w:pPr>
-                  <w:r>
-                    <w:t xml:space="preserve">(1.741)</w:t>
+                    <w:t xml:space="preserve">(0.261)</w:t>
+                  </w:r>
+                </w:p>
+              </w:tc>
+              <w:tc>
+                <w:tcPr/>
+                <w:p>
+                  <w:pPr>
+                    <w:pStyle w:val="Compact"/>
+                    <w:jc w:val="left"/>
+                    <w:jc w:val="left"/>
+                  </w:pPr>
+                  <w:r>
+                    <w:t xml:space="preserve">(3.045)</w:t>
+                  </w:r>
+                </w:p>
+              </w:tc>
+              <w:tc>
+                <w:tcPr/>
+                <w:p>
+                  <w:pPr>
+                    <w:pStyle w:val="Compact"/>
+                    <w:jc w:val="left"/>
+                    <w:jc w:val="left"/>
+                  </w:pPr>
+                  <w:r>
+                    <w:t xml:space="preserve">(2.245)</w:t>
                   </w:r>
                 </w:p>
               </w:tc>
@@ -3388,46 +3330,46 @@
                     <w:jc w:val="left"/>
                   </w:pPr>
                   <w:r>
-                    <w:t xml:space="preserve">Liberal Democrat</w:t>
-                  </w:r>
-                </w:p>
-              </w:tc>
-              <w:tc>
-                <w:tcPr/>
-                <w:p>
-                  <w:pPr>
-                    <w:pStyle w:val="Compact"/>
-                    <w:jc w:val="left"/>
-                    <w:jc w:val="left"/>
-                  </w:pPr>
-                  <w:r>
-                    <w:t xml:space="preserve">-0.413*</w:t>
-                  </w:r>
-                </w:p>
-              </w:tc>
-              <w:tc>
-                <w:tcPr/>
-                <w:p>
-                  <w:pPr>
-                    <w:pStyle w:val="Compact"/>
-                    <w:jc w:val="left"/>
-                    <w:jc w:val="left"/>
-                  </w:pPr>
-                  <w:r>
-                    <w:t xml:space="preserve">-0.075</w:t>
-                  </w:r>
-                </w:p>
-              </w:tc>
-              <w:tc>
-                <w:tcPr/>
-                <w:p>
-                  <w:pPr>
-                    <w:pStyle w:val="Compact"/>
-                    <w:jc w:val="left"/>
-                    <w:jc w:val="left"/>
-                  </w:pPr>
-                  <w:r>
-                    <w:t xml:space="preserve">5.703**</w:t>
+                    <w:t xml:space="preserve">Democrat</w:t>
+                  </w:r>
+                </w:p>
+              </w:tc>
+              <w:tc>
+                <w:tcPr/>
+                <w:p>
+                  <w:pPr>
+                    <w:pStyle w:val="Compact"/>
+                    <w:jc w:val="left"/>
+                    <w:jc w:val="left"/>
+                  </w:pPr>
+                  <w:r>
+                    <w:t xml:space="preserve">-0.458*</w:t>
+                  </w:r>
+                </w:p>
+              </w:tc>
+              <w:tc>
+                <w:tcPr/>
+                <w:p>
+                  <w:pPr>
+                    <w:pStyle w:val="Compact"/>
+                    <w:jc w:val="left"/>
+                    <w:jc w:val="left"/>
+                  </w:pPr>
+                  <w:r>
+                    <w:t xml:space="preserve">-1.038</w:t>
+                  </w:r>
+                </w:p>
+              </w:tc>
+              <w:tc>
+                <w:tcPr/>
+                <w:p>
+                  <w:pPr>
+                    <w:pStyle w:val="Compact"/>
+                    <w:jc w:val="left"/>
+                    <w:jc w:val="left"/>
+                  </w:pPr>
+                  <w:r>
+                    <w:t xml:space="preserve">3.971*</w:t>
                   </w:r>
                 </w:p>
               </w:tc>
@@ -3450,33 +3392,33 @@
                     <w:jc w:val="left"/>
                   </w:pPr>
                   <w:r>
-                    <w:t xml:space="preserve">(0.182)</w:t>
-                  </w:r>
-                </w:p>
-              </w:tc>
-              <w:tc>
-                <w:tcPr/>
-                <w:p>
-                  <w:pPr>
-                    <w:pStyle w:val="Compact"/>
-                    <w:jc w:val="left"/>
-                    <w:jc w:val="left"/>
-                  </w:pPr>
-                  <w:r>
-                    <w:t xml:space="preserve">(2.130)</w:t>
-                  </w:r>
-                </w:p>
-              </w:tc>
-              <w:tc>
-                <w:tcPr/>
-                <w:p>
-                  <w:pPr>
-                    <w:pStyle w:val="Compact"/>
-                    <w:jc w:val="left"/>
-                    <w:jc w:val="left"/>
-                  </w:pPr>
-                  <w:r>
-                    <w:t xml:space="preserve">(1.569)</w:t>
+                    <w:t xml:space="preserve">(0.204)</w:t>
+                  </w:r>
+                </w:p>
+              </w:tc>
+              <w:tc>
+                <w:tcPr/>
+                <w:p>
+                  <w:pPr>
+                    <w:pStyle w:val="Compact"/>
+                    <w:jc w:val="left"/>
+                    <w:jc w:val="left"/>
+                  </w:pPr>
+                  <w:r>
+                    <w:t xml:space="preserve">(2.454)</w:t>
+                  </w:r>
+                </w:p>
+              </w:tc>
+              <w:tc>
+                <w:tcPr/>
+                <w:p>
+                  <w:pPr>
+                    <w:pStyle w:val="Compact"/>
+                    <w:jc w:val="left"/>
+                    <w:jc w:val="left"/>
+                  </w:pPr>
+                  <w:r>
+                    <w:t xml:space="preserve">(1.813)</w:t>
                   </w:r>
                 </w:p>
               </w:tc>
@@ -3491,46 +3433,46 @@
                     <w:jc w:val="left"/>
                   </w:pPr>
                   <w:r>
-                    <w:t xml:space="preserve">Conservative Republican</w:t>
-                  </w:r>
-                </w:p>
-              </w:tc>
-              <w:tc>
-                <w:tcPr/>
-                <w:p>
-                  <w:pPr>
-                    <w:pStyle w:val="Compact"/>
-                    <w:jc w:val="left"/>
-                    <w:jc w:val="left"/>
-                  </w:pPr>
-                  <w:r>
-                    <w:t xml:space="preserve">0.704**</w:t>
-                  </w:r>
-                </w:p>
-              </w:tc>
-              <w:tc>
-                <w:tcPr/>
-                <w:p>
-                  <w:pPr>
-                    <w:pStyle w:val="Compact"/>
-                    <w:jc w:val="left"/>
-                    <w:jc w:val="left"/>
-                  </w:pPr>
-                  <w:r>
-                    <w:t xml:space="preserve">-3.275</w:t>
-                  </w:r>
-                </w:p>
-              </w:tc>
-              <w:tc>
-                <w:tcPr/>
-                <w:p>
-                  <w:pPr>
-                    <w:pStyle w:val="Compact"/>
-                    <w:jc w:val="left"/>
-                    <w:jc w:val="left"/>
-                  </w:pPr>
-                  <w:r>
-                    <w:t xml:space="preserve">-6.620**</w:t>
+                    <w:t xml:space="preserve">Republican</w:t>
+                  </w:r>
+                </w:p>
+              </w:tc>
+              <w:tc>
+                <w:tcPr/>
+                <w:p>
+                  <w:pPr>
+                    <w:pStyle w:val="Compact"/>
+                    <w:jc w:val="left"/>
+                    <w:jc w:val="left"/>
+                  </w:pPr>
+                  <w:r>
+                    <w:t xml:space="preserve">0.565*</w:t>
+                  </w:r>
+                </w:p>
+              </w:tc>
+              <w:tc>
+                <w:tcPr/>
+                <w:p>
+                  <w:pPr>
+                    <w:pStyle w:val="Compact"/>
+                    <w:jc w:val="left"/>
+                    <w:jc w:val="left"/>
+                  </w:pPr>
+                  <w:r>
+                    <w:t xml:space="preserve">-2.786</w:t>
+                  </w:r>
+                </w:p>
+              </w:tc>
+              <w:tc>
+                <w:tcPr/>
+                <w:p>
+                  <w:pPr>
+                    <w:pStyle w:val="Compact"/>
+                    <w:jc w:val="left"/>
+                    <w:jc w:val="left"/>
+                  </w:pPr>
+                  <w:r>
+                    <w:t xml:space="preserve">-5.959**</w:t>
                   </w:r>
                 </w:p>
               </w:tc>
@@ -3553,33 +3495,33 @@
                     <w:jc w:val="left"/>
                   </w:pPr>
                   <w:r>
-                    <w:t xml:space="preserve">(0.205)</w:t>
-                  </w:r>
-                </w:p>
-              </w:tc>
-              <w:tc>
-                <w:tcPr/>
-                <w:p>
-                  <w:pPr>
-                    <w:pStyle w:val="Compact"/>
-                    <w:jc w:val="left"/>
-                    <w:jc w:val="left"/>
-                  </w:pPr>
-                  <w:r>
-                    <w:t xml:space="preserve">(2.092)</w:t>
-                  </w:r>
-                </w:p>
-              </w:tc>
-              <w:tc>
-                <w:tcPr/>
-                <w:p>
-                  <w:pPr>
-                    <w:pStyle w:val="Compact"/>
-                    <w:jc w:val="left"/>
-                    <w:jc w:val="left"/>
-                  </w:pPr>
-                  <w:r>
-                    <w:t xml:space="preserve">(1.626)</w:t>
+                    <w:t xml:space="preserve">(0.225)</w:t>
+                  </w:r>
+                </w:p>
+              </w:tc>
+              <w:tc>
+                <w:tcPr/>
+                <w:p>
+                  <w:pPr>
+                    <w:pStyle w:val="Compact"/>
+                    <w:jc w:val="left"/>
+                    <w:jc w:val="left"/>
+                  </w:pPr>
+                  <w:r>
+                    <w:t xml:space="preserve">(2.480)</w:t>
+                  </w:r>
+                </w:p>
+              </w:tc>
+              <w:tc>
+                <w:tcPr/>
+                <w:p>
+                  <w:pPr>
+                    <w:pStyle w:val="Compact"/>
+                    <w:jc w:val="left"/>
+                    <w:jc w:val="left"/>
+                  </w:pPr>
+                  <w:r>
+                    <w:t xml:space="preserve">(1.889)</w:t>
                   </w:r>
                 </w:p>
               </w:tc>
@@ -3594,46 +3536,46 @@
                     <w:jc w:val="left"/>
                   </w:pPr>
                   <w:r>
-                    <w:t xml:space="preserve">Trump cue × Liberal Democrat</w:t>
-                  </w:r>
-                </w:p>
-              </w:tc>
-              <w:tc>
-                <w:tcPr/>
-                <w:p>
-                  <w:pPr>
-                    <w:pStyle w:val="Compact"/>
-                    <w:jc w:val="left"/>
-                    <w:jc w:val="left"/>
-                  </w:pPr>
-                  <w:r>
-                    <w:t xml:space="preserve">0.007</w:t>
-                  </w:r>
-                </w:p>
-              </w:tc>
-              <w:tc>
-                <w:tcPr/>
-                <w:p>
-                  <w:pPr>
-                    <w:pStyle w:val="Compact"/>
-                    <w:jc w:val="left"/>
-                    <w:jc w:val="left"/>
-                  </w:pPr>
-                  <w:r>
-                    <w:t xml:space="preserve">3.124</w:t>
-                  </w:r>
-                </w:p>
-              </w:tc>
-              <w:tc>
-                <w:tcPr/>
-                <w:p>
-                  <w:pPr>
-                    <w:pStyle w:val="Compact"/>
-                    <w:jc w:val="left"/>
-                    <w:jc w:val="left"/>
-                  </w:pPr>
-                  <w:r>
-                    <w:t xml:space="preserve">1.656</w:t>
+                    <w:t xml:space="preserve">Trump cue × Democrat</w:t>
+                  </w:r>
+                </w:p>
+              </w:tc>
+              <w:tc>
+                <w:tcPr/>
+                <w:p>
+                  <w:pPr>
+                    <w:pStyle w:val="Compact"/>
+                    <w:jc w:val="left"/>
+                    <w:jc w:val="left"/>
+                  </w:pPr>
+                  <w:r>
+                    <w:t xml:space="preserve">0.346</w:t>
+                  </w:r>
+                </w:p>
+              </w:tc>
+              <w:tc>
+                <w:tcPr/>
+                <w:p>
+                  <w:pPr>
+                    <w:pStyle w:val="Compact"/>
+                    <w:jc w:val="left"/>
+                    <w:jc w:val="left"/>
+                  </w:pPr>
+                  <w:r>
+                    <w:t xml:space="preserve">3.677</w:t>
+                  </w:r>
+                </w:p>
+              </w:tc>
+              <w:tc>
+                <w:tcPr/>
+                <w:p>
+                  <w:pPr>
+                    <w:pStyle w:val="Compact"/>
+                    <w:jc w:val="left"/>
+                    <w:jc w:val="left"/>
+                  </w:pPr>
+                  <w:r>
+                    <w:t xml:space="preserve">2.842</w:t>
                   </w:r>
                 </w:p>
               </w:tc>
@@ -3656,33 +3598,33 @@
                     <w:jc w:val="left"/>
                   </w:pPr>
                   <w:r>
-                    <w:t xml:space="preserve">(0.257)</w:t>
-                  </w:r>
-                </w:p>
-              </w:tc>
-              <w:tc>
-                <w:tcPr/>
-                <w:p>
-                  <w:pPr>
-                    <w:pStyle w:val="Compact"/>
-                    <w:jc w:val="left"/>
-                    <w:jc w:val="left"/>
-                  </w:pPr>
-                  <w:r>
-                    <w:t xml:space="preserve">(2.871)</w:t>
-                  </w:r>
-                </w:p>
-              </w:tc>
-              <w:tc>
-                <w:tcPr/>
-                <w:p>
-                  <w:pPr>
-                    <w:pStyle w:val="Compact"/>
-                    <w:jc w:val="left"/>
-                    <w:jc w:val="left"/>
-                  </w:pPr>
-                  <w:r>
-                    <w:t xml:space="preserve">(2.234)</w:t>
+                    <w:t xml:space="preserve">(0.298)</w:t>
+                  </w:r>
+                </w:p>
+              </w:tc>
+              <w:tc>
+                <w:tcPr/>
+                <w:p>
+                  <w:pPr>
+                    <w:pStyle w:val="Compact"/>
+                    <w:jc w:val="left"/>
+                    <w:jc w:val="left"/>
+                  </w:pPr>
+                  <w:r>
+                    <w:t xml:space="preserve">(3.390)</w:t>
+                  </w:r>
+                </w:p>
+              </w:tc>
+              <w:tc>
+                <w:tcPr/>
+                <w:p>
+                  <w:pPr>
+                    <w:pStyle w:val="Compact"/>
+                    <w:jc w:val="left"/>
+                    <w:jc w:val="left"/>
+                  </w:pPr>
+                  <w:r>
+                    <w:t xml:space="preserve">(2.602)</w:t>
                   </w:r>
                 </w:p>
               </w:tc>
@@ -3697,46 +3639,46 @@
                     <w:jc w:val="left"/>
                   </w:pPr>
                   <w:r>
-                    <w:t xml:space="preserve">Climate cue × Liberal Democrat</w:t>
-                  </w:r>
-                </w:p>
-              </w:tc>
-              <w:tc>
-                <w:tcPr/>
-                <w:p>
-                  <w:pPr>
-                    <w:pStyle w:val="Compact"/>
-                    <w:jc w:val="left"/>
-                    <w:jc w:val="left"/>
-                  </w:pPr>
-                  <w:r>
-                    <w:t xml:space="preserve">-0.270</w:t>
-                  </w:r>
-                </w:p>
-              </w:tc>
-              <w:tc>
-                <w:tcPr/>
-                <w:p>
-                  <w:pPr>
-                    <w:pStyle w:val="Compact"/>
-                    <w:jc w:val="left"/>
-                    <w:jc w:val="left"/>
-                  </w:pPr>
-                  <w:r>
-                    <w:t xml:space="preserve">1.507</w:t>
-                  </w:r>
-                </w:p>
-              </w:tc>
-              <w:tc>
-                <w:tcPr/>
-                <w:p>
-                  <w:pPr>
-                    <w:pStyle w:val="Compact"/>
-                    <w:jc w:val="left"/>
-                    <w:jc w:val="left"/>
-                  </w:pPr>
-                  <w:r>
-                    <w:t xml:space="preserve">3.136</w:t>
+                    <w:t xml:space="preserve">Climate cue × Democrat</w:t>
+                  </w:r>
+                </w:p>
+              </w:tc>
+              <w:tc>
+                <w:tcPr/>
+                <w:p>
+                  <w:pPr>
+                    <w:pStyle w:val="Compact"/>
+                    <w:jc w:val="left"/>
+                    <w:jc w:val="left"/>
+                  </w:pPr>
+                  <w:r>
+                    <w:t xml:space="preserve">0.260</w:t>
+                  </w:r>
+                </w:p>
+              </w:tc>
+              <w:tc>
+                <w:tcPr/>
+                <w:p>
+                  <w:pPr>
+                    <w:pStyle w:val="Compact"/>
+                    <w:jc w:val="left"/>
+                    <w:jc w:val="left"/>
+                  </w:pPr>
+                  <w:r>
+                    <w:t xml:space="preserve">3.710</w:t>
+                  </w:r>
+                </w:p>
+              </w:tc>
+              <w:tc>
+                <w:tcPr/>
+                <w:p>
+                  <w:pPr>
+                    <w:pStyle w:val="Compact"/>
+                    <w:jc w:val="left"/>
+                    <w:jc w:val="left"/>
+                  </w:pPr>
+                  <w:r>
+                    <w:t xml:space="preserve">5.055*</w:t>
                   </w:r>
                 </w:p>
               </w:tc>
@@ -3759,33 +3701,33 @@
                     <w:jc w:val="left"/>
                   </w:pPr>
                   <w:r>
-                    <w:t xml:space="preserve">(0.259)</w:t>
-                  </w:r>
-                </w:p>
-              </w:tc>
-              <w:tc>
-                <w:tcPr/>
-                <w:p>
-                  <w:pPr>
-                    <w:pStyle w:val="Compact"/>
-                    <w:jc w:val="left"/>
-                    <w:jc w:val="left"/>
-                  </w:pPr>
-                  <w:r>
-                    <w:t xml:space="preserve">(3.026)</w:t>
-                  </w:r>
-                </w:p>
-              </w:tc>
-              <w:tc>
-                <w:tcPr/>
-                <w:p>
-                  <w:pPr>
-                    <w:pStyle w:val="Compact"/>
-                    <w:jc w:val="left"/>
-                    <w:jc w:val="left"/>
-                  </w:pPr>
-                  <w:r>
-                    <w:t xml:space="preserve">(2.167)</w:t>
+                    <w:t xml:space="preserve">(0.298)</w:t>
+                  </w:r>
+                </w:p>
+              </w:tc>
+              <w:tc>
+                <w:tcPr/>
+                <w:p>
+                  <w:pPr>
+                    <w:pStyle w:val="Compact"/>
+                    <w:jc w:val="left"/>
+                    <w:jc w:val="left"/>
+                  </w:pPr>
+                  <w:r>
+                    <w:t xml:space="preserve">(3.520)</w:t>
+                  </w:r>
+                </w:p>
+              </w:tc>
+              <w:tc>
+                <w:tcPr/>
+                <w:p>
+                  <w:pPr>
+                    <w:pStyle w:val="Compact"/>
+                    <w:jc w:val="left"/>
+                    <w:jc w:val="left"/>
+                  </w:pPr>
+                  <w:r>
+                    <w:t xml:space="preserve">(2.551)</w:t>
                   </w:r>
                 </w:p>
               </w:tc>
@@ -3800,46 +3742,46 @@
                     <w:jc w:val="left"/>
                   </w:pPr>
                   <w:r>
-                    <w:t xml:space="preserve">Trump cue × Conservative Republican</w:t>
-                  </w:r>
-                </w:p>
-              </w:tc>
-              <w:tc>
-                <w:tcPr/>
-                <w:p>
-                  <w:pPr>
-                    <w:pStyle w:val="Compact"/>
-                    <w:jc w:val="left"/>
-                    <w:jc w:val="left"/>
-                  </w:pPr>
-                  <w:r>
-                    <w:t xml:space="preserve">0.423</w:t>
-                  </w:r>
-                </w:p>
-              </w:tc>
-              <w:tc>
-                <w:tcPr/>
-                <w:p>
-                  <w:pPr>
-                    <w:pStyle w:val="Compact"/>
-                    <w:jc w:val="left"/>
-                    <w:jc w:val="left"/>
-                  </w:pPr>
-                  <w:r>
-                    <w:t xml:space="preserve">3.919</w:t>
-                  </w:r>
-                </w:p>
-              </w:tc>
-              <w:tc>
-                <w:tcPr/>
-                <w:p>
-                  <w:pPr>
-                    <w:pStyle w:val="Compact"/>
-                    <w:jc w:val="left"/>
-                    <w:jc w:val="left"/>
-                  </w:pPr>
-                  <w:r>
-                    <w:t xml:space="preserve">0.320</w:t>
+                    <w:t xml:space="preserve">Trump cue × Republican</w:t>
+                  </w:r>
+                </w:p>
+              </w:tc>
+              <w:tc>
+                <w:tcPr/>
+                <w:p>
+                  <w:pPr>
+                    <w:pStyle w:val="Compact"/>
+                    <w:jc w:val="left"/>
+                    <w:jc w:val="left"/>
+                  </w:pPr>
+                  <w:r>
+                    <w:t xml:space="preserve">0.634†</w:t>
+                  </w:r>
+                </w:p>
+              </w:tc>
+              <w:tc>
+                <w:tcPr/>
+                <w:p>
+                  <w:pPr>
+                    <w:pStyle w:val="Compact"/>
+                    <w:jc w:val="left"/>
+                    <w:jc w:val="left"/>
+                  </w:pPr>
+                  <w:r>
+                    <w:t xml:space="preserve">2.744</w:t>
+                  </w:r>
+                </w:p>
+              </w:tc>
+              <w:tc>
+                <w:tcPr/>
+                <w:p>
+                  <w:pPr>
+                    <w:pStyle w:val="Compact"/>
+                    <w:jc w:val="left"/>
+                    <w:jc w:val="left"/>
+                  </w:pPr>
+                  <w:r>
+                    <w:t xml:space="preserve">0.248</w:t>
                   </w:r>
                 </w:p>
               </w:tc>
@@ -3862,33 +3804,33 @@
                     <w:jc w:val="left"/>
                   </w:pPr>
                   <w:r>
-                    <w:t xml:space="preserve">(0.299)</w:t>
-                  </w:r>
-                </w:p>
-              </w:tc>
-              <w:tc>
-                <w:tcPr/>
-                <w:p>
-                  <w:pPr>
-                    <w:pStyle w:val="Compact"/>
-                    <w:jc w:val="left"/>
-                    <w:jc w:val="left"/>
-                  </w:pPr>
-                  <w:r>
-                    <w:t xml:space="preserve">(2.964)</w:t>
-                  </w:r>
-                </w:p>
-              </w:tc>
-              <w:tc>
-                <w:tcPr/>
-                <w:p>
-                  <w:pPr>
-                    <w:pStyle w:val="Compact"/>
-                    <w:jc w:val="left"/>
-                    <w:jc w:val="left"/>
-                  </w:pPr>
-                  <w:r>
-                    <w:t xml:space="preserve">(2.337)</w:t>
+                    <w:t xml:space="preserve">(0.330)</w:t>
+                  </w:r>
+                </w:p>
+              </w:tc>
+              <w:tc>
+                <w:tcPr/>
+                <w:p>
+                  <w:pPr>
+                    <w:pStyle w:val="Compact"/>
+                    <w:jc w:val="left"/>
+                    <w:jc w:val="left"/>
+                  </w:pPr>
+                  <w:r>
+                    <w:t xml:space="preserve">(3.484)</w:t>
+                  </w:r>
+                </w:p>
+              </w:tc>
+              <w:tc>
+                <w:tcPr/>
+                <w:p>
+                  <w:pPr>
+                    <w:pStyle w:val="Compact"/>
+                    <w:jc w:val="left"/>
+                    <w:jc w:val="left"/>
+                  </w:pPr>
+                  <w:r>
+                    <w:t xml:space="preserve">(2.715)</w:t>
                   </w:r>
                 </w:p>
               </w:tc>
@@ -3903,46 +3845,46 @@
                     <w:jc w:val="left"/>
                   </w:pPr>
                   <w:r>
-                    <w:t xml:space="preserve">Climate cue × Conservative Republican</w:t>
-                  </w:r>
-                </w:p>
-              </w:tc>
-              <w:tc>
-                <w:tcPr/>
-                <w:p>
-                  <w:pPr>
-                    <w:pStyle w:val="Compact"/>
-                    <w:jc w:val="left"/>
-                    <w:jc w:val="left"/>
-                  </w:pPr>
-                  <w:r>
-                    <w:t xml:space="preserve">-0.042</w:t>
-                  </w:r>
-                </w:p>
-              </w:tc>
-              <w:tc>
-                <w:tcPr/>
-                <w:p>
-                  <w:pPr>
-                    <w:pStyle w:val="Compact"/>
-                    <w:jc w:val="left"/>
-                    <w:jc w:val="left"/>
-                  </w:pPr>
-                  <w:r>
-                    <w:t xml:space="preserve">3.665</w:t>
-                  </w:r>
-                </w:p>
-              </w:tc>
-              <w:tc>
-                <w:tcPr/>
-                <w:p>
-                  <w:pPr>
-                    <w:pStyle w:val="Compact"/>
-                    <w:jc w:val="left"/>
-                    <w:jc w:val="left"/>
-                  </w:pPr>
-                  <w:r>
-                    <w:t xml:space="preserve">2.935</w:t>
+                    <w:t xml:space="preserve">Climate cue × Republican</w:t>
+                  </w:r>
+                </w:p>
+              </w:tc>
+              <w:tc>
+                <w:tcPr/>
+                <w:p>
+                  <w:pPr>
+                    <w:pStyle w:val="Compact"/>
+                    <w:jc w:val="left"/>
+                    <w:jc w:val="left"/>
+                  </w:pPr>
+                  <w:r>
+                    <w:t xml:space="preserve">0.469</w:t>
+                  </w:r>
+                </w:p>
+              </w:tc>
+              <w:tc>
+                <w:tcPr/>
+                <w:p>
+                  <w:pPr>
+                    <w:pStyle w:val="Compact"/>
+                    <w:jc w:val="left"/>
+                    <w:jc w:val="left"/>
+                  </w:pPr>
+                  <w:r>
+                    <w:t xml:space="preserve">5.257</w:t>
+                  </w:r>
+                </w:p>
+              </w:tc>
+              <w:tc>
+                <w:tcPr/>
+                <w:p>
+                  <w:pPr>
+                    <w:pStyle w:val="Compact"/>
+                    <w:jc w:val="left"/>
+                    <w:jc w:val="left"/>
+                  </w:pPr>
+                  <w:r>
+                    <w:t xml:space="preserve">4.499†</w:t>
                   </w:r>
                 </w:p>
               </w:tc>
@@ -3965,33 +3907,33 @@
                     <w:jc w:val="left"/>
                   </w:pPr>
                   <w:r>
-                    <w:t xml:space="preserve">(0.293)</w:t>
-                  </w:r>
-                </w:p>
-              </w:tc>
-              <w:tc>
-                <w:tcPr/>
-                <w:p>
-                  <w:pPr>
-                    <w:pStyle w:val="Compact"/>
-                    <w:jc w:val="left"/>
-                    <w:jc w:val="left"/>
-                  </w:pPr>
-                  <w:r>
-                    <w:t xml:space="preserve">(2.917)</w:t>
-                  </w:r>
-                </w:p>
-              </w:tc>
-              <w:tc>
-                <w:tcPr/>
-                <w:p>
-                  <w:pPr>
-                    <w:pStyle w:val="Compact"/>
-                    <w:jc w:val="left"/>
-                    <w:jc w:val="left"/>
-                  </w:pPr>
-                  <w:r>
-                    <w:t xml:space="preserve">(2.311)</w:t>
+                    <w:t xml:space="preserve">(0.326)</w:t>
+                  </w:r>
+                </w:p>
+              </w:tc>
+              <w:tc>
+                <w:tcPr/>
+                <w:p>
+                  <w:pPr>
+                    <w:pStyle w:val="Compact"/>
+                    <w:jc w:val="left"/>
+                    <w:jc w:val="left"/>
+                  </w:pPr>
+                  <w:r>
+                    <w:t xml:space="preserve">(3.512)</w:t>
+                  </w:r>
+                </w:p>
+              </w:tc>
+              <w:tc>
+                <w:tcPr/>
+                <w:p>
+                  <w:pPr>
+                    <w:pStyle w:val="Compact"/>
+                    <w:jc w:val="left"/>
+                    <w:jc w:val="left"/>
+                  </w:pPr>
+                  <w:r>
+                    <w:t xml:space="preserve">(2.672)</w:t>
                   </w:r>
                 </w:p>
               </w:tc>
@@ -4019,33 +3961,33 @@
                     <w:jc w:val="left"/>
                   </w:pPr>
                   <w:r>
-                    <w:t xml:space="preserve">0.048</w:t>
-                  </w:r>
-                </w:p>
-              </w:tc>
-              <w:tc>
-                <w:tcPr/>
-                <w:p>
-                  <w:pPr>
-                    <w:pStyle w:val="Compact"/>
-                    <w:jc w:val="left"/>
-                    <w:jc w:val="left"/>
-                  </w:pPr>
-                  <w:r>
-                    <w:t xml:space="preserve">17.374**</w:t>
-                  </w:r>
-                </w:p>
-              </w:tc>
-              <w:tc>
-                <w:tcPr/>
-                <w:p>
-                  <w:pPr>
-                    <w:pStyle w:val="Compact"/>
-                    <w:jc w:val="left"/>
-                    <w:jc w:val="left"/>
-                  </w:pPr>
-                  <w:r>
-                    <w:t xml:space="preserve">18.665**</w:t>
+                    <w:t xml:space="preserve">0.117</w:t>
+                  </w:r>
+                </w:p>
+              </w:tc>
+              <w:tc>
+                <w:tcPr/>
+                <w:p>
+                  <w:pPr>
+                    <w:pStyle w:val="Compact"/>
+                    <w:jc w:val="left"/>
+                    <w:jc w:val="left"/>
+                  </w:pPr>
+                  <w:r>
+                    <w:t xml:space="preserve">17.652**</w:t>
+                  </w:r>
+                </w:p>
+              </w:tc>
+              <w:tc>
+                <w:tcPr/>
+                <w:p>
+                  <w:pPr>
+                    <w:pStyle w:val="Compact"/>
+                    <w:jc w:val="left"/>
+                    <w:jc w:val="left"/>
+                  </w:pPr>
+                  <w:r>
+                    <w:t xml:space="preserve">19.076**</w:t>
                   </w:r>
                 </w:p>
               </w:tc>
@@ -4068,33 +4010,33 @@
                     <w:jc w:val="left"/>
                   </w:pPr>
                   <w:r>
-                    <w:t xml:space="preserve">(0.145)</w:t>
-                  </w:r>
-                </w:p>
-              </w:tc>
-              <w:tc>
-                <w:tcPr/>
-                <w:p>
-                  <w:pPr>
-                    <w:pStyle w:val="Compact"/>
-                    <w:jc w:val="left"/>
-                    <w:jc w:val="left"/>
-                  </w:pPr>
-                  <w:r>
-                    <w:t xml:space="preserve">(1.712)</w:t>
-                  </w:r>
-                </w:p>
-              </w:tc>
-              <w:tc>
-                <w:tcPr/>
-                <w:p>
-                  <w:pPr>
-                    <w:pStyle w:val="Compact"/>
-                    <w:jc w:val="left"/>
-                    <w:jc w:val="left"/>
-                  </w:pPr>
-                  <w:r>
-                    <w:t xml:space="preserve">(1.271)</w:t>
+                    <w:t xml:space="preserve">(0.179)</w:t>
+                  </w:r>
+                </w:p>
+              </w:tc>
+              <w:tc>
+                <w:tcPr/>
+                <w:p>
+                  <w:pPr>
+                    <w:pStyle w:val="Compact"/>
+                    <w:jc w:val="left"/>
+                    <w:jc w:val="left"/>
+                  </w:pPr>
+                  <w:r>
+                    <w:t xml:space="preserve">(2.181)</w:t>
+                  </w:r>
+                </w:p>
+              </w:tc>
+              <w:tc>
+                <w:tcPr/>
+                <w:p>
+                  <w:pPr>
+                    <w:pStyle w:val="Compact"/>
+                    <w:jc w:val="left"/>
+                    <w:jc w:val="left"/>
+                  </w:pPr>
+                  <w:r>
+                    <w:t xml:space="preserve">(1.601)</w:t>
                   </w:r>
                 </w:p>
               </w:tc>
@@ -4184,20 +4126,20 @@
                     <w:jc w:val="left"/>
                   </w:pPr>
                   <w:r>
-                    <w:t xml:space="preserve">0.002</w:t>
-                  </w:r>
-                </w:p>
-              </w:tc>
-              <w:tc>
-                <w:tcPr/>
-                <w:p>
-                  <w:pPr>
-                    <w:pStyle w:val="Compact"/>
-                    <w:jc w:val="left"/>
-                    <w:jc w:val="left"/>
-                  </w:pPr>
-                  <w:r>
-                    <w:t xml:space="preserve">0.104</w:t>
+                    <w:t xml:space="preserve">0</w:t>
+                  </w:r>
+                </w:p>
+              </w:tc>
+              <w:tc>
+                <w:tcPr/>
+                <w:p>
+                  <w:pPr>
+                    <w:pStyle w:val="Compact"/>
+                    <w:jc w:val="left"/>
+                    <w:jc w:val="left"/>
+                  </w:pPr>
+                  <w:r>
+                    <w:t xml:space="preserve">0.091</w:t>
                   </w:r>
                 </w:p>
               </w:tc>
@@ -4225,7 +4167,7 @@
                     <w:jc w:val="left"/>
                   </w:pPr>
                   <w:r>
-                    <w:t xml:space="preserve">0.061</w:t>
+                    <w:t xml:space="preserve">0.059</w:t>
                   </w:r>
                 </w:p>
               </w:tc>
@@ -4274,7 +4216,7 @@
         <w:pStyle w:val="BodyText"/>
       </w:pPr>
       <w:r>
-        <w:t xml:space="preserve">For fossil fuels, conservative Republicans were significantly more likely than the reference group to have any positive WTP (b = 0.70, log-odds scale), predicted at 68.0% in the baseline condition compared to 41.0% for liberal Democrats (b = -0.41,</w:t>
+        <w:t xml:space="preserve">For fossil fuels, Republicans were significantly more likely than those who identify with neither party to have any positive WTP (b = 0.57, log-odds scale), and Democrats were significantly less likely (b = -0.46). The predicted probability of any positive WTP in the baseline condition was 66.4% for Republicans compared to 41.6% for Democrats. Among those who identify with neither party, the Trump cue lowered the likelihood of any positive WTP for fossil fuels (b = -0.56), and the Trump cue x Republican interaction was marginally significant (b = 0.63,</w:t>
       </w:r>
       <w:r>
         <w:t xml:space="preserve"> </w:t>
@@ -4290,7 +4232,39 @@
         <w:t xml:space="preserve"> </w:t>
       </w:r>
       <w:r>
-        <w:t xml:space="preserve">= 0.023). However, neither the cues nor the interactions between the cues and political beliefs were significant. The WTP amounts are shown in</w:t>
+        <w:t xml:space="preserve">= 0.055). However, this interaction reflects the decline among those who identify with neither party rather than an increase among Republicans, whose likelihood of any positive WTP in the Trump cue did not differ from the baseline (68.1% versus 66.4%; difference = 0.07,</w:t>
+      </w:r>
+      <w:r>
+        <w:t xml:space="preserve"> </w:t>
+      </w:r>
+      <w:r>
+        <w:rPr>
+          <w:i/>
+          <w:iCs/>
+        </w:rPr>
+        <w:t xml:space="preserve">p</w:t>
+      </w:r>
+      <w:r>
+        <w:t xml:space="preserve"> </w:t>
+      </w:r>
+      <w:r>
+        <w:t xml:space="preserve">= 0.711). The interaction is also not significant after adjusting for multiple comparisons (Holm-adjusted</w:t>
+      </w:r>
+      <w:r>
+        <w:t xml:space="preserve"> </w:t>
+      </w:r>
+      <w:r>
+        <w:rPr>
+          <w:i/>
+          <w:iCs/>
+        </w:rPr>
+        <w:t xml:space="preserve">p</w:t>
+      </w:r>
+      <w:r>
+        <w:t xml:space="preserve"> </w:t>
+      </w:r>
+      <w:r>
+        <w:t xml:space="preserve">= 0.77). The WTP amounts are shown in</w:t>
       </w:r>
       <w:r>
         <w:t xml:space="preserve"> </w:t>
@@ -4348,7 +4322,7 @@
               <w:pStyle w:val="ImageCaption"/>
             </w:pPr>
             <w:r>
-              <w:t xml:space="preserve">Figure 2: Predicted willingness-to-pay for fossil fuels, among respondents with any positive WTP, by cue condition and political identity (survey-weighted OLS predictions with 95% CIs)</w:t>
+              <w:t xml:space="preserve">Figure 2: Predicted willingness-to-pay for fossil fuels, among respondents with any positive WTP, by cue condition and party identification (survey-weighted OLS predictions with 95% CIs)</w:t>
             </w:r>
           </w:p>
           <w:p>
@@ -4427,7 +4401,7 @@
               <w:pStyle w:val="ImageCaption"/>
             </w:pPr>
             <w:r>
-              <w:t xml:space="preserve">Figure 3: Predicted willingness-to-pay for renewables by cue condition and political identity (survey-weighted OLS predictions with 95% CIs)</w:t>
+              <w:t xml:space="preserve">Figure 3: Predicted willingness-to-pay for renewables by cue condition and party identification (survey-weighted OLS predictions with 95% CIs)</w:t>
             </w:r>
           </w:p>
           <w:p>
@@ -4487,7 +4461,7 @@
         <w:pStyle w:val="BodyText"/>
       </w:pPr>
       <w:r>
-        <w:t xml:space="preserve">For fossil fuels, neither the Trump cue nor its interaction with conservative Republican identity significantly predicted a WTP &gt; $0 or, among those with positive WTP, the dollar amount. Overall, the predicted WTP &gt; $0 for conservative Republicans was 68.0% in the baseline condition versus 71.3% in the Trump cue, and the predicted amount conditional on paying something was $14.10 versus $14.41. In the Tobit model of fossil fuel WTP, the Trump cue x conservative Republican interaction is significant (b = 7.78,</w:t>
+        <w:t xml:space="preserve">Among those with positive WTP for fossil fuels, neither party identification, the cues, nor their interactions significantly predicted the dollar amount. The predicted amount for Republicans was $14.87 in the baseline condition versus $14.02 in the Trump cue. In the Tobit model of fossil fuel WTP, the Trump cue x Republican interaction (b = 9.64,</w:t>
       </w:r>
       <w:r>
         <w:t xml:space="preserve"> </w:t>
@@ -4503,7 +4477,7 @@
         <w:t xml:space="preserve"> </w:t>
       </w:r>
       <w:r>
-        <w:t xml:space="preserve">= 0.038). However, this interaction reflects a lower WTP for fossil fuels in the Trump cue among those with other political beliefs (b = -5.66,</w:t>
+        <w:t xml:space="preserve">= 0.028) and the climate cue x Republican interaction (b = 9.60,</w:t>
       </w:r>
       <w:r>
         <w:t xml:space="preserve"> </w:t>
@@ -4519,7 +4493,7 @@
         <w:t xml:space="preserve"> </w:t>
       </w:r>
       <w:r>
-        <w:t xml:space="preserve">= 0.047) rather than a higher WTP among conservative Republicans, whose WTP for fossil fuels in the Trump cue did not differ from the baseline (difference = 2.12,</w:t>
+        <w:t xml:space="preserve">= 0.026) are significant. However, these interactions reflect a lower WTP for fossil fuels in the cue conditions among those who identify with neither party (Trump cue b = -9.33,</w:t>
       </w:r>
       <w:r>
         <w:t xml:space="preserve"> </w:t>
@@ -4535,7 +4509,7 @@
         <w:t xml:space="preserve"> </w:t>
       </w:r>
       <w:r>
-        <w:t xml:space="preserve">= 0.381). The interaction is also not significant after adjusting for multiple comparisons (Holm-adjusted</w:t>
+        <w:t xml:space="preserve">= 0.012) rather than a higher WTP among Republicans, whose WTP for fossil fuels did not differ from the baseline in either the Trump cue (difference = 0.31,</w:t>
       </w:r>
       <w:r>
         <w:t xml:space="preserve"> </w:t>
@@ -4551,15 +4525,7 @@
         <w:t xml:space="preserve"> </w:t>
       </w:r>
       <w:r>
-        <w:t xml:space="preserve">= 0.65).</w:t>
-      </w:r>
-    </w:p>
-    <w:p>
-      <w:pPr>
-        <w:pStyle w:val="BodyText"/>
-      </w:pPr>
-      <w:r>
-        <w:t xml:space="preserve">Looking to renewables, liberal Democrats were willing to pay $5.70 more, on average, and conservative Republicans were willing to pay $6.62 less, for a predicted total of $12.04 in the baseline condition. The climate cue was associated with a higher WTP for renewables among liberal Democrats (b = 3.14,</w:t>
+        <w:t xml:space="preserve">= 0.893) or the climate cue (difference = 2.80,</w:t>
       </w:r>
       <w:r>
         <w:t xml:space="preserve"> </w:t>
@@ -4575,7 +4541,23 @@
         <w:t xml:space="preserve"> </w:t>
       </w:r>
       <w:r>
-        <w:t xml:space="preserve">= 0.148), but the estimate was nearly as large among conservative Republicans, and neither interaction was significant.</w:t>
+        <w:t xml:space="preserve">= 0.215). The Trump cue x Republican interaction is also not significant after adjusting for multiple comparisons (Holm-adjusted</w:t>
+      </w:r>
+      <w:r>
+        <w:t xml:space="preserve"> </w:t>
+      </w:r>
+      <w:r>
+        <w:rPr>
+          <w:i/>
+          <w:iCs/>
+        </w:rPr>
+        <w:t xml:space="preserve">p</w:t>
+      </w:r>
+      <w:r>
+        <w:t xml:space="preserve"> </w:t>
+      </w:r>
+      <w:r>
+        <w:t xml:space="preserve">= 0.47).</w:t>
       </w:r>
     </w:p>
     <w:p>
@@ -4583,7 +4565,95 @@
         <w:pStyle w:val="BodyText"/>
       </w:pPr>
       <w:r>
-        <w:t xml:space="preserve">The absence of significant interactions for WTP should not be read as evidence that the cues have no effect on WTP. With 80 percent power and</w:t>
+        <w:t xml:space="preserve">Looking to renewables, Democrats were willing to pay $3.97 more, on average, than those who identify with neither party, and Republicans were willing to pay $5.96 less, for a predicted total of $13.12 among Republicans in the baseline condition. The climate cue x Democrat interaction was significant (b = 5.05,</w:t>
+      </w:r>
+      <w:r>
+        <w:t xml:space="preserve"> </w:t>
+      </w:r>
+      <w:r>
+        <w:rPr>
+          <w:i/>
+          <w:iCs/>
+        </w:rPr>
+        <w:t xml:space="preserve">p</w:t>
+      </w:r>
+      <w:r>
+        <w:t xml:space="preserve"> </w:t>
+      </w:r>
+      <w:r>
+        <w:t xml:space="preserve">= 0.048), and the climate cue x Republican interaction was nearly as large (b = 4.50,</w:t>
+      </w:r>
+      <w:r>
+        <w:t xml:space="preserve"> </w:t>
+      </w:r>
+      <w:r>
+        <w:rPr>
+          <w:i/>
+          <w:iCs/>
+        </w:rPr>
+        <w:t xml:space="preserve">p</w:t>
+      </w:r>
+      <w:r>
+        <w:t xml:space="preserve"> </w:t>
+      </w:r>
+      <w:r>
+        <w:t xml:space="preserve">= 0.092). However, both interactions largely reflect a lower WTP for renewables in the climate cue among those who identify with neither party (b = -3.58,</w:t>
+      </w:r>
+      <w:r>
+        <w:t xml:space="preserve"> </w:t>
+      </w:r>
+      <w:r>
+        <w:rPr>
+          <w:i/>
+          <w:iCs/>
+        </w:rPr>
+        <w:t xml:space="preserve">p</w:t>
+      </w:r>
+      <w:r>
+        <w:t xml:space="preserve"> </w:t>
+      </w:r>
+      <w:r>
+        <w:t xml:space="preserve">= 0.111). Among Democrats, the climate cue did not significantly increase WTP for renewables compared to the baseline (difference = $1.48,</w:t>
+      </w:r>
+      <w:r>
+        <w:t xml:space="preserve"> </w:t>
+      </w:r>
+      <w:r>
+        <w:rPr>
+          <w:i/>
+          <w:iCs/>
+        </w:rPr>
+        <w:t xml:space="preserve">p</w:t>
+      </w:r>
+      <w:r>
+        <w:t xml:space="preserve"> </w:t>
+      </w:r>
+      <w:r>
+        <w:t xml:space="preserve">= 0.223), and the climate cue x Democrat interaction is not significant after adjusting for multiple comparisons (Holm-adjusted</w:t>
+      </w:r>
+      <w:r>
+        <w:t xml:space="preserve"> </w:t>
+      </w:r>
+      <w:r>
+        <w:rPr>
+          <w:i/>
+          <w:iCs/>
+        </w:rPr>
+        <w:t xml:space="preserve">p</w:t>
+      </w:r>
+      <w:r>
+        <w:t xml:space="preserve"> </w:t>
+      </w:r>
+      <w:r>
+        <w:t xml:space="preserve">= 0.71).</w:t>
+      </w:r>
+    </w:p>
+    <w:p>
+      <w:pPr>
+        <w:pStyle w:val="BodyText"/>
+      </w:pPr>
+      <w:r>
+        <w:t xml:space="preserve">The absence of reliable cue effects on WTP among partisans should not be read as evidence that the cues have no effect on WTP. With 80 percent power and</w:t>
       </w:r>
       <w:r>
         <w:t xml:space="preserve"> </w:t>
@@ -4597,7 +4667,7 @@
         <w:t xml:space="preserve"> </w:t>
       </w:r>
       <w:r>
-        <w:t xml:space="preserve">= .05, the smallest interaction effects the design could reliably detect are $6.07 to 6.55 for renewables and $8.04 to 8.48 for the amount of fossil fuel WTP, compared with 0.49 to 0.66 points for the priority scale. Smaller effects of the cues on WTP cannot be ruled out. Additionally, neither cue had a significant average effect on WTP for either source in the models with the cues alone (all</w:t>
+        <w:t xml:space="preserve">= .05, the smallest interaction effects the design could reliably detect are $7.15 to 7.61 for renewables and $9.50 to 9.86 for the amount of fossil fuel WTP, compared with 0.58 to 0.72 points for the priority scale. Smaller effects of the cues on WTP cannot be ruled out. Additionally, neither cue had a significant average effect on WTP for either source in the models with the cues alone (all</w:t>
       </w:r>
       <w:r>
         <w:t xml:space="preserve"> </w:t>
@@ -4632,7 +4702,7 @@
         <w:pStyle w:val="BodyText"/>
       </w:pPr>
       <w:r>
-        <w:t xml:space="preserve">Overall, respondents leaned toward renewables on the priority scale, and the WTP for renewables was higher than for fossil fuels, though the size of the WTP difference likely reflects the wording of the prompts. The difference in WTP was also not uniform across groups. For example, among conservative Republicans in the Trump cue, the WTP for renewables did not differ significantly from the WTP for fossil fuels (difference = $0.59,</w:t>
+        <w:t xml:space="preserve">Overall, respondents leaned toward renewables on the priority scale, and the WTP for renewables was higher than for fossil fuels, though the size of the WTP difference likely reflects the wording of the prompts. The difference in WTP was also not uniform across groups. For example, among Republicans in the Trump cue, the WTP for renewables did not differ significantly from the WTP for fossil fuels (difference = $1.82,</w:t>
       </w:r>
       <w:r>
         <w:t xml:space="preserve"> </w:t>
@@ -4648,7 +4718,7 @@
         <w:t xml:space="preserve"> </w:t>
       </w:r>
       <w:r>
-        <w:t xml:space="preserve">= 0.669).</w:t>
+        <w:t xml:space="preserve">= 0.153).</w:t>
       </w:r>
     </w:p>
     <w:p>
@@ -4656,33 +4726,7 @@
         <w:pStyle w:val="BodyText"/>
       </w:pPr>
       <w:r>
-        <w:t xml:space="preserve">Comparing the results to the hypotheses, the support is mixed. As expected, political beliefs shaped both preferences and WTP, largely supporting H1a and H1b. Conservative Republicans prioritized fossil fuels more than those with other political beliefs, were more likely to have any positive WTP for fossil fuels, and were WTP less for renewables. Liberal Democrats, in contrast, prioritized renewables, were less likely to have any positive WTP for fossil fuels, and were WTP more for renewables. However, among those WTP something for fossil fuels, conservative Republicans were not WTP more than others. H2a and H2b were not supported, as neither the Trump cue nor the climate cue had a significant average effect on energy priority or WTP for either source compared to the baseline condition. H3a and H3b received limited support. There is some evidence that the Trump cue moved conservative Republicans toward fossil fuels (</w:t>
-      </w:r>
-      <w:r>
-        <w:rPr>
-          <w:i/>
-          <w:iCs/>
-        </w:rPr>
-        <w:t xml:space="preserve">p</w:t>
-      </w:r>
-      <w:r>
-        <w:t xml:space="preserve"> </w:t>
-      </w:r>
-      <w:r>
-        <w:t xml:space="preserve">= 0.062) and the climate cue moved liberal Democrats toward renewables (</w:t>
-      </w:r>
-      <w:r>
-        <w:rPr>
-          <w:i/>
-          <w:iCs/>
-        </w:rPr>
-        <w:t xml:space="preserve">p</w:t>
-      </w:r>
-      <w:r>
-        <w:t xml:space="preserve"> </w:t>
-      </w:r>
-      <w:r>
-        <w:t xml:space="preserve">= 0.051) on the priority scale, but both interactions were only marginally significant and neither holds after adjusting for multiple comparisons. Regarding RQ1, there was no evidence that either cue led partisans to move away from the position of the source. Regarding RQ2, the shifts in priority did not carry over to WTP, as none of the interactions between the cues and political beliefs reliably predicted WTP for fossil fuels or renewables. These results suggest that cues are likely more effective at moving the priority the public gives to energy sources than the amount they are willing to pay, though the design could not detect small effects on WTP.</w:t>
+        <w:t xml:space="preserve">Comparing the results to the hypotheses, the support is mixed. As expected, partisanship shaped both preferences and WTP, largely supporting H1a and H1b. Republicans prioritized fossil fuels more than those who identify with neither party, were more likely to have any positive WTP for fossil fuels, and were WTP less for renewables. Democrats, in contrast, prioritized renewables, were less likely to have any positive WTP for fossil fuels, and were WTP more for renewables. However, among those WTP something for fossil fuels, Republicans were not WTP more than others. H2a and H2b were not supported, as neither the Trump cue nor the climate cue had a significant average effect on energy priority or WTP for either source compared to the baseline condition. H3a received limited support. The Trump cue moved Republicans toward fossil fuels on the priority scale, but the interaction does not hold after adjusting for multiple comparisons or without the survey weights. H3b was not supported, as the climate cue did not move Democrats toward renewables on the priority scale, and the climate cue x Democrat interaction for renewables WTP reflects a decline among those who identify with neither party rather than an increase among Democrats. Regarding RQ1, there was no evidence that either cue led partisans to move away from the position of the source. Regarding RQ2, the shift in priority among Republicans did not carry over to WTP, as Republicans in the Trump cue did not differ from those in the baseline in their WTP for fossil fuels. These results suggest that cues are likely more effective at moving the priority the public gives to energy sources than the amount they are willing to pay, though the design could not detect small effects on WTP.</w:t>
       </w:r>
     </w:p>
     <w:bookmarkEnd w:id="32"/>
@@ -4700,7 +4744,7 @@
         <w:pStyle w:val="FirstParagraph"/>
       </w:pPr>
       <w:r>
-        <w:t xml:space="preserve">A clean energy transition is needed to mitigate climate change, and public support is needed for the energy transition. However, President Trump’s rhetoric and actions on energy may serve to polarize the public. This study examined how exposure to a Trump cue or a climate change cue shapes the US public’s prioritization of, and willingness-to-pay for, fossil fuel versus renewable electricity, and how these responses are shaped by political beliefs. The results show that support for energy sources is polarized along partisan lines, both in how respondents prioritized fossil fuels against renewables and in the dollar amounts they were willing to pay. There is also some evidence that a Trump cue moved conservative Republicans toward fossil fuels and a climate cue moved liberal Democrats toward renewables, though these effects were marginal and should be considered tentative. Together, these findings suggest that cues may further exacerbate existing partisan divisions in how the public prioritizes energy sources.</w:t>
+        <w:t xml:space="preserve">A clean energy transition is needed to mitigate climate change, and public support is needed for the energy transition. However, President Trump’s rhetoric and actions on energy may serve to polarize the public. This study examined how exposure to a Trump cue or a climate change cue shapes the US public’s prioritization of, and willingness-to-pay for, fossil fuel versus renewable electricity, and how these responses are shaped by partisanship. The results show that support for energy sources is polarized along partisan lines, both in how respondents prioritized fossil fuels against renewables and in the dollar amounts they were willing to pay. There is also some evidence that a Trump cue moved Republicans toward fossil fuels, though this effect does not hold after adjusting for multiple comparisons and should be considered tentative. In contrast, the climate cue did not move Democrats toward renewables, which is likely because Democrats already strongly prioritized renewables in the baseline condition. Together, these findings suggest that a cue from a polarizing figure such as President Trump may further exacerbate existing partisan divisions in how the public prioritizes energy sources.</w:t>
       </w:r>
     </w:p>
     <w:p>
@@ -4708,7 +4752,7 @@
         <w:pStyle w:val="BodyText"/>
       </w:pPr>
       <w:r>
-        <w:t xml:space="preserve">The cue effects were also uneven across the two outcomes. Political beliefs appear to condition the effect of the cues on prioritization, but not on WTP. For example, the Trump cue did not significantly change WTP for fossil fuels among conservative Republicans. This is likely because stating a priority is costless, whereas stating a WTP asks respondents to consider a cost to their own household. Agreeing with a trusted source, or reacting to a cue, may be easy when nothing is at stake, but the concrete cost of an increase in an electricity bill may limit the influence of cues, especially in times of concern about rising energy costs.</w:t>
+        <w:t xml:space="preserve">The cue effects were also uneven across the two outcomes. Partisanship appears to condition the effect of the Trump cue on prioritization, but not on WTP. For example, the Trump cue did not significantly change WTP for fossil fuels among Republicans. This is likely because stating a priority is costless, whereas stating a WTP asks respondents to consider a cost to their own household. Agreeing with a trusted source, or reacting to a cue, may be easy when nothing is at stake, but the concrete cost of an increase in an electricity bill may limit the influence of cues, especially in times of concern about rising energy costs.</w:t>
       </w:r>
       <w:r>
         <w:rPr>
@@ -4720,7 +4764,7 @@
         <w:t xml:space="preserve"> </w:t>
       </w:r>
       <w:r>
-        <w:t xml:space="preserve">Additionally, a single cue is likely a weaker treatment than the sustained rhetoric respondents may encounter outside of a survey. However, the design could only detect relatively large interaction effects on WTP, so small effects of the cues on WTP cannot be ruled out.</w:t>
+        <w:t xml:space="preserve">Additionally, a single cue is likely a weaker treatment than the sustained rhetoric respondents may encounter outside of a survey. The few cue x party identification interactions for WTP that reached significance reflected a lower WTP among those who identify with neither party rather than a shift among partisans, and this small group is estimated with less precision. However, the design could only detect relatively large interaction effects on WTP, so small effects of the cues on WTP cannot be ruled out.</w:t>
       </w:r>
     </w:p>
     <w:p>
@@ -4728,7 +4772,7 @@
         <w:pStyle w:val="BodyText"/>
       </w:pPr>
       <w:r>
-        <w:t xml:space="preserve">These results carry several implications for climate and energy policy. First, respondents, on average, leaned toward prioritizing renewables over fossil fuels, with a mean of 5.17 on the 1 to 7 scale, and 86 percent of respondents reported some positive WTP for renewables. This suggests that renewable energy investment likely has general public support even in a polarized environment, though the size of the WTP gap between renewables and fossil fuels should be interpreted with caution. Second, if the tentative responsiveness of conservative Republicans and liberal Democrats to identity-congruent cues holds, elite rhetoric, including rhetoric tied to a single prominent figure, may widen the partisan gap in energy preferences further, which is a risk for policymakers seeking durable, bipartisan support for energy policy. Third, because the cues did not shift prioritization in the sample overall and did not reliably shift WTP, messaging strategies aimed at building broad coalitions for the energy transition likely benefit from emphasizing shared, cross-partisan benefits of renewables, such as reliability or local economic development, rather than frames tied to a specific political figure or to climate change.</w:t>
+        <w:t xml:space="preserve">These results carry several implications for climate and energy policy. First, respondents, on average, leaned toward prioritizing renewables over fossil fuels, with a mean of 5.17 on the 1 to 7 scale, and 86 percent of respondents reported some positive WTP for renewables. This suggests that renewable energy investment likely has general public support even in a polarized environment, though the size of the WTP gap between renewables and fossil fuels should be interpreted with caution. Second, if the tentative responsiveness of Republicans to the Trump cue holds, elite rhetoric, including rhetoric tied to a single prominent figure, may widen the partisan gap in energy preferences further, which is a risk for policymakers seeking durable, bipartisan support for energy policy. Third, because the cues did not shift prioritization in the sample overall and did not reliably shift WTP, messaging strategies aimed at building broad coalitions for the energy transition likely benefit from emphasizing shared, cross-partisan benefits of renewables, such as reliability or local economic development, rather than frames tied to a specific political figure or to climate change.</w:t>
       </w:r>
     </w:p>
     <w:p>
@@ -4736,7 +4780,7 @@
         <w:pStyle w:val="BodyText"/>
       </w:pPr>
       <w:r>
-        <w:t xml:space="preserve">This study has some limitations. First, respondents were recruited from an opt-in, quota-based panel rather than a probability sample, and the survey weights substantially increase the share of conservative Republicans. Second, the WTP prompts were not symmetric, as the fossil fuel prompt included a reason not to pay for fossil fuels, which likely inflates the difference between WTP for renewables and fossil fuels. Third, the conditions were not parallel. The Trump cue changed only the source of the argument for fossil fuels, whereas the climate cue added a scientific source, a climate change frame, and a counterargument, so the effects of the two cues cannot be compared directly. Fourth, party identification and ideology were measured after the outcomes, though their distribution did not differ across conditions. Fifth, the survey did not include attention or manipulation checks, and the starting amounts for the WTP questions were not recorded. Finally, the WTP measure relies on a hypothetical, stated-preference elicitation, and stated WTP does not always translate into WTP once a real price change is introduced. The cues were also each delivered once, in a single survey context, and their effects may not persist or generalize to the repeated, cumulative exposure people experience outside of a survey.</w:t>
+        <w:t xml:space="preserve">This study has some limitations. First, respondents were recruited from an opt-in, quota-based panel rather than a probability sample, and the survey weights substantially increase the share of Republicans. Second, the WTP prompts were not symmetric, as the fossil fuel prompt included a reason not to pay for fossil fuels, which likely inflates the difference between WTP for renewables and fossil fuels. Third, the conditions were not parallel. The Trump cue changed only the source of the argument for fossil fuels, whereas the climate cue added a scientific source, a climate change frame, and a counterargument, so the effects of the two cues cannot be compared directly. Fourth, party identification was measured after the outcomes, though its distribution did not differ across conditions. Additionally, after leaners are assigned to a party, the reference group of those who identify with neither party is small. Fifth, the survey did not include attention or manipulation checks, and the starting amounts for the WTP questions were not recorded. Finally, the WTP measure relies on a hypothetical, stated-preference elicitation, and stated WTP does not always translate into WTP once a real price change is introduced. The cues were also each delivered once, in a single survey context, and their effects may not persist or generalize to the repeated, cumulative exposure people experience outside of a survey.</w:t>
       </w:r>
     </w:p>
     <w:p>
@@ -5244,7 +5288,13 @@
         <w:t xml:space="preserve"> </w:t>
       </w:r>
       <w:r>
-        <w:t xml:space="preserve">Measuring Willingness-to-Pay</w:t>
+        <w:t xml:space="preserve">Measuring Willingness</w:t>
+      </w:r>
+      <w:r>
+        <w:t xml:space="preserve">-to-</w:t>
+      </w:r>
+      <w:r>
+        <w:t xml:space="preserve">Pay</w:t>
       </w:r>
       <w:r>
         <w:t xml:space="preserve">.”</w:t>
@@ -6386,7 +6436,13 @@
         <w:t xml:space="preserve"> </w:t>
       </w:r>
       <w:r>
-        <w:t xml:space="preserve">Investigating Household Willingness-to-Pay</w:t>
+        <w:t xml:space="preserve">Investigating Household Willingness</w:t>
+      </w:r>
+      <w:r>
+        <w:t xml:space="preserve">-to-</w:t>
+      </w:r>
+      <w:r>
+        <w:t xml:space="preserve">Pay</w:t>
       </w:r>
       <w:r>
         <w:t xml:space="preserve"> </w:t>

</xml_diff>

<commit_message>
Add footnote testing whether cues weaken cost concern within party
- design-checks-setup.R section 8: within-party cost-concern slopes by cue
  (Republicans/Trump cue for fossil WTP amount; Democrats/climate cue for
  renewables WTP)
- Extend the Discussion's cost footnote with these results
- Re-render outputs; update LOG

Co-Authored-By: Claude Opus 5.5 <noreply@anthropic.com>
</commit_message>
<xml_diff>
--- a/_output/cue-WTP.docx
+++ b/_output/cue-WTP.docx
@@ -7345,7 +7345,100 @@
         <w:t xml:space="preserve"> </w:t>
       </w:r>
       <w:r>
-        <w:t xml:space="preserve">I ran a robustness check that included a measure of the respondent’s concern about the cost of energy. The results are similar to what is reported here, and are shown in the supplemental material.</w:t>
+        <w:t xml:space="preserve">I ran a robustness check that included a measure of the respondent’s concern about the cost of energy. The results are similar to what is reported here, and are shown in the supplemental material. I also examined whether the cues weakened the effect of cost concern within each party, using models estimated separately for Republicans and Democrats with cost concern interacted with the cues and with demographic controls. Among Republicans with a positive WTP for fossil fuels, greater concern about cost was associated with a lower WTP in the baseline condition (b = -1.23 per point on the 0 to 10 scale,</w:t>
+      </w:r>
+      <w:r>
+        <w:t xml:space="preserve"> </w:t>
+      </w:r>
+      <w:r>
+        <w:rPr>
+          <w:i/>
+          <w:iCs/>
+        </w:rPr>
+        <w:t xml:space="preserve">p</w:t>
+      </w:r>
+      <w:r>
+        <w:t xml:space="preserve"> </w:t>
+      </w:r>
+      <w:r>
+        <w:t xml:space="preserve">= 0.010), but not in the Trump cue (b = -0.27,</w:t>
+      </w:r>
+      <w:r>
+        <w:t xml:space="preserve"> </w:t>
+      </w:r>
+      <w:r>
+        <w:rPr>
+          <w:i/>
+          <w:iCs/>
+        </w:rPr>
+        <w:t xml:space="preserve">p</w:t>
+      </w:r>
+      <w:r>
+        <w:t xml:space="preserve"> </w:t>
+      </w:r>
+      <w:r>
+        <w:t xml:space="preserve">= 0.645). Among Democrats, greater concern about cost was associated with a marginally lower WTP for renewables in the baseline condition (b = -0.64,</w:t>
+      </w:r>
+      <w:r>
+        <w:t xml:space="preserve"> </w:t>
+      </w:r>
+      <w:r>
+        <w:rPr>
+          <w:i/>
+          <w:iCs/>
+        </w:rPr>
+        <w:t xml:space="preserve">p</w:t>
+      </w:r>
+      <w:r>
+        <w:t xml:space="preserve"> </w:t>
+      </w:r>
+      <w:r>
+        <w:t xml:space="preserve">= 0.071), but not in the climate cue (b = 0.07,</w:t>
+      </w:r>
+      <w:r>
+        <w:t xml:space="preserve"> </w:t>
+      </w:r>
+      <w:r>
+        <w:rPr>
+          <w:i/>
+          <w:iCs/>
+        </w:rPr>
+        <w:t xml:space="preserve">p</w:t>
+      </w:r>
+      <w:r>
+        <w:t xml:space="preserve"> </w:t>
+      </w:r>
+      <w:r>
+        <w:t xml:space="preserve">= 0.873). However, in neither case did the effect of cost concern differ significantly between the cue and the baseline condition (</w:t>
+      </w:r>
+      <w:r>
+        <w:rPr>
+          <w:i/>
+          <w:iCs/>
+        </w:rPr>
+        <w:t xml:space="preserve">p</w:t>
+      </w:r>
+      <w:r>
+        <w:t xml:space="preserve"> </w:t>
+      </w:r>
+      <w:r>
+        <w:t xml:space="preserve">= 0.193 and</w:t>
+      </w:r>
+      <w:r>
+        <w:t xml:space="preserve"> </w:t>
+      </w:r>
+      <w:r>
+        <w:rPr>
+          <w:i/>
+          <w:iCs/>
+        </w:rPr>
+        <w:t xml:space="preserve">p</w:t>
+      </w:r>
+      <w:r>
+        <w:t xml:space="preserve"> </w:t>
+      </w:r>
+      <w:r>
+        <w:t xml:space="preserve">= 0.205, respectively), so there is limited evidence that the cues override cost concerns among partisans.</w:t>
       </w:r>
     </w:p>
   </w:footnote>

</xml_diff>

<commit_message>
Retitle paper, drop Holm, move Tobit and weight caveats to footnotes, decompose weights
- Fix Table 1: escape $ in WTP row labels so Pandoc doesn't parse them as math
- New title: "Priorities Versus Payment: Partisan Cues and Public Preferences
  for Fossil Fuels and Renewables"
- Trim repeated prompt-asymmetry caveat to two places
- Remove Holm adjustment from text, supplement, and code (MDE table kept)
- Move Tobit and unweighted-model discussion from the main text to footnotes
- Add party-only vs. demographic-only weights comparison (design-checks 5b and
  new supplement section); reword weight text in the manuscript to reflect
  that the weight-sensitive results come from the demographic weights
- Update README and LOG

Co-Authored-By: Claude Opus 5.5 <noreply@anthropic.com>
</commit_message>
<xml_diff>
--- a/_output/cue-WTP.docx
+++ b/_output/cue-WTP.docx
@@ -7,7 +7,7 @@
         <w:pStyle w:val="Title"/>
       </w:pPr>
       <w:r>
-        <w:t xml:space="preserve">Cues, Partisanship, and Willingness-to-Pay for Energy</w:t>
+        <w:t xml:space="preserve">Priorities Versus Payment: Partisan Cues and Public Preferences for Fossil Fuels and Renewables</w:t>
       </w:r>
     </w:p>
     <w:p>
@@ -37,7 +37,7 @@
         <w:pStyle w:val="Abstract"/>
       </w:pPr>
       <w:r>
-        <w:t xml:space="preserve">The second Trump administration has promoted fossil fuels and criticized renewable energy, which may serve as a partisan cue that further polarizes the US public on energy. Using a survey experiment with a quota-based sample of US residents (N = 3,113), I examine how a Trump cue and a climate change cue shape how the public prioritizes fossil fuels versus renewables, as well as their willingness-to-pay (WTP) for each source measured with the Gabor-Granger method. Partisanship strongly predicted both outcomes, as Republicans prioritized fossil fuels and were WTP less for renewables, whereas Democrats prioritized renewables and were WTP more for them. Neither cue had an average effect on priority or WTP. The Trump cue moved Republicans toward fossil fuels on the priority scale, though this effect does not hold after adjusting for multiple comparisons, and the climate cue did not move Democrats toward renewables. The cues did not reliably shift WTP for either source among partisans. The results suggest that cues are more likely to move costless expressions of energy preferences than the amount the public states it is willing to pay.</w:t>
+        <w:t xml:space="preserve">The second Trump administration has promoted fossil fuels and criticized renewable energy, which may serve as a partisan cue that further polarizes the US public on energy. Using a survey experiment with a quota-based sample of US residents (N = 3,113), I examine how a Trump cue and a climate change cue shape how the public prioritizes fossil fuels versus renewables, as well as their willingness-to-pay (WTP) for each source measured with the Gabor-Granger method. Partisanship strongly predicted both outcomes, as Republicans prioritized fossil fuels and were WTP less for renewables, whereas Democrats prioritized renewables and were WTP more for them. Neither cue had an average effect on priority or WTP. The Trump cue moved Republicans toward fossil fuels on the priority scale, and the climate cue did not move Democrats toward renewables. The cues did not reliably shift WTP for either source among partisans. The results suggest that cues are more likely to move costless expressions of energy preferences than the amount the public states it is willing to pay.</w:t>
       </w:r>
     </w:p>
     <w:bookmarkStart w:id="10" w:name="introduction"/>
@@ -115,7 +115,7 @@
         <w:t xml:space="preserve">Benegal and Green (2024)</w:t>
       </w:r>
       <w:r>
-        <w:t xml:space="preserve">, found that partisan cue-taking outweighed sensitivity to cost in support for the Green New Deal, yet the outcome in that study was support for a policy with a stated cost rather than the amount respondents would add to their own electricity bill for a specific energy source. Additionally, few studies compare the effect of a cue on a costless expression of preference, such as how energy sources should be prioritized, with its effect on a costly one, such as WTP, among the same respondents. In brief, the literature on WTP for energy finds that the public is responsive to price volatility for both fossil fuels and renewables</w:t>
+        <w:t xml:space="preserve">, found that partisan cue-taking outweighed sensitivity to cost in support for the Green New Deal, yet the outcome in that study was support for a policy with a stated cost rather than the amount respondents would add to their own electricity bill for a specific energy source. In brief, the literature on WTP for energy finds that the public is responsive to price volatility for both fossil fuels and renewables</w:t>
       </w:r>
       <w:r>
         <w:t xml:space="preserve"> </w:t>
@@ -136,7 +136,7 @@
         <w:t xml:space="preserve"> </w:t>
       </w:r>
       <w:r>
-        <w:t xml:space="preserve">and is WTP for research and development by the federal government aimed at reducing the use of fossil fuels</w:t>
+        <w:t xml:space="preserve">and is willing to pay for research and development by the federal government aimed at reducing the use of fossil fuels</w:t>
       </w:r>
       <w:r>
         <w:t xml:space="preserve"> </w:t>
@@ -177,7 +177,7 @@
         <w:pStyle w:val="BodyText"/>
       </w:pPr>
       <w:r>
-        <w:t xml:space="preserve">In this study, I expand on current research by testing the impacts of a Trump cue versus a climate change cue on the prioritization of and WTP for fossil fuels and renewable sources of energy. Overall, I find that partisanship shapes energy source prioritization as Republicans tend to prioritize and have a higher WTP for fossil fuels and Democrats prioritize and have a higher WTP for renewables. Neither cue had an average effect on either outcome. There is some evidence that Republicans in the Trump cue prioritize fossil fuels more, though this effect does not hold after adjusting for multiple comparisons, and there is no evidence that the climate cue moved Democrats toward renewables. Finally, the cues did not reliably shift WTP for either energy source among partisans, which suggests that cues are more likely to move costless expressions of preference than costly ones.</w:t>
+        <w:t xml:space="preserve">In this study, I expand on current research by testing the impacts of a Trump cue versus a climate change cue on the prioritization of and WTP for fossil fuels and renewable sources of energy. The results are of interest because few studies compare the effect of a cue on a costless expression of preference, such as how energy sources should be prioritized, with its effect on a costly one, such as WTP, among the same respondents. Overall, I find that partisanship shapes energy source prioritization as Republicans tend to prioritize and have a higher WTP for fossil fuels and Democrats prioritize and have a higher WTP for renewables. Neither cue had an average effect on either outcome. There is some evidence that Republicans in the Trump cue prioritize fossil fuels more, and there is no evidence that the climate cue moved Democrats toward renewables. Finally, the cues did not reliably shift WTP for either energy source among partisans, which suggests that cues are more likely to move costless expressions of preference than costly ones.</w:t>
       </w:r>
     </w:p>
     <w:bookmarkEnd w:id="10"/>
@@ -514,7 +514,7 @@
     </w:p>
     <w:bookmarkEnd w:id="12"/>
     <w:bookmarkEnd w:id="13"/>
-    <w:bookmarkStart w:id="16" w:name="data-and-measures"/>
+    <w:bookmarkStart w:id="17" w:name="data-and-measures"/>
     <w:p>
       <w:pPr>
         <w:pStyle w:val="Heading1"/>
@@ -740,7 +740,22 @@
         <w:pStyle w:val="BodyText"/>
       </w:pPr>
       <w:r>
-        <w:t xml:space="preserve">To establish WTP, I first give respondents information about potential costs associated with each energy source, and the sources were presented in random order. The prompts were written to give respondents a plausible reason that increasing the use of each source would raise their electricity bill. In the WTP for fossil fuels question, I noted that costs associated with renewable energy have decreased and, therefore they may need to pay more to use fossil fuels. For renewable sources respondents were told about the need to increase distribution. Specifically, respondents were shown the following prompts for fossil fuels and renewables, respectively.</w:t>
+        <w:t xml:space="preserve">To establish WTP, I first give respondents information about potential costs associated with each energy source, and the sources were presented in random order. The prompts were written to give respondents a plausible reason that increasing the use of each source would raise their electricity bill. In the WTP for fossil fuels question, I noted that costs associated with renewable energy have decreased and, therefore they may need to pay more to use fossil fuels</w:t>
+      </w:r>
+      <w:r>
+        <w:t xml:space="preserve"> </w:t>
+      </w:r>
+      <w:r>
+        <w:t xml:space="preserve">(see U.S. Energy Information Administration 2025)</w:t>
+      </w:r>
+      <w:r>
+        <w:t xml:space="preserve">. For renewable sources respondents were told about the need to increase distribution. Specifically, respondents were shown the following prompts for fossil fuels and renewables, respectively.</w:t>
+      </w:r>
+      <w:r>
+        <w:rPr>
+          <w:rStyle w:val="FootnoteReference"/>
+        </w:rPr>
+        <w:footnoteReference w:id="15"/>
       </w:r>
     </w:p>
     <w:p>
@@ -762,14 +777,6 @@
     <w:p>
       <w:pPr>
         <w:pStyle w:val="FirstParagraph"/>
-      </w:pPr>
-      <w:r>
-        <w:t xml:space="preserve">The two prompts are not symmetric. The fossil fuel prompt notes that renewables are often more cost-effective than fossil fuels, which likely gives respondents a reason not to pay more for fossil fuels, whereas the renewables prompt does not include a comparable reason not to pay for renewables. As a result, the difference between WTP for fossil fuels and WTP for renewables likely reflects the wording of the prompts as well as respondents’ preferences, and should be interpreted with caution. However, the wording of each prompt was the same in every condition, so the comparison of each cue with the baseline within each energy source is not affected by the asymmetry.</w:t>
-      </w:r>
-    </w:p>
-    <w:p>
-      <w:pPr>
-        <w:pStyle w:val="BodyText"/>
       </w:pPr>
       <w:r>
         <w:t xml:space="preserve">To estimate the maximum/minimum WTP, respondents were first shown a random dollar amount between $1 and $46, in five-dollar increments, and asked if they would be WTP that amount extra per-month in their electricity bill. If they indicated yes they were shown a larger, random dollar-amount, and if they indicated no they were shown a smaller dollar-amount. This continues until they reach the $46-maximum or $1-minimum. Each respondent’s WTP is the highest amount they accepted, and respondents who indicated no at $1 were coded with a WTP of 0. The starting and follow-up amounts were drawn at random, independently of the cue condition, but were not recorded. As such, I cannot control for the starting amount, which may anchor responses, though random assignment of the starting amount means anchoring is unlikely to differ across conditions.</w:t>
@@ -848,7 +855,7 @@
       <w:tr>
         <w:tc>
           <w:tcPr/>
-          <w:bookmarkStart w:id="15" w:name="tbl-descriptives"/>
+          <w:bookmarkStart w:id="16" w:name="tbl-descriptives"/>
           <w:p>
             <w:pPr>
               <w:jc w:val="left"/>
@@ -1104,170 +1111,33 @@
                     <w:jc w:val="left"/>
                   </w:pPr>
                   <w:r>
-                    <w:t xml:space="preserve">WTP, fossil fuels (</w:t>
-                  </w:r>
-                  <m:oMath>
-                    <m:r>
-                      <m:rPr>
-                        <m:sty m:val="p"/>
-                      </m:rPr>
-                      <m:t>)</m:t>
-                    </m:r>
-                    <m:r>
-                      <m:rPr>
-                        <m:sty m:val="p"/>
-                      </m:rPr>
-                      <m:t>|</m:t>
-                    </m:r>
-                    <m:r>
-                      <m:t>8.33</m:t>
-                    </m:r>
-                    <m:r>
-                      <m:rPr>
-                        <m:sty m:val="p"/>
-                      </m:rPr>
-                      <m:t>|</m:t>
-                    </m:r>
-                    <m:r>
-                      <m:t>13.79</m:t>
-                    </m:r>
-                    <m:r>
-                      <m:rPr>
-                        <m:sty m:val="p"/>
-                      </m:rPr>
-                      <m:t>|</m:t>
-                    </m:r>
-                    <m:r>
-                      <m:t>0</m:t>
-                    </m:r>
-                    <m:r>
-                      <m:rPr>
-                        <m:sty m:val="p"/>
-                      </m:rPr>
-                      <m:t>|</m:t>
-                    </m:r>
-                    <m:r>
-                      <m:t>46</m:t>
-                    </m:r>
-                    <m:r>
-                      <m:rPr>
-                        <m:sty m:val="p"/>
-                      </m:rPr>
-                      <m:t>|</m:t>
-                    </m:r>
-                    <m:r>
-                      <m:t>8.55</m:t>
-                    </m:r>
-                    <m:r>
-                      <m:rPr>
-                        <m:sty m:val="p"/>
-                      </m:rPr>
-                      <m:t>|</m:t>
-                    </m:r>
-                    <m:r>
-                      <m:t>7.54</m:t>
-                    </m:r>
-                    <m:r>
-                      <m:rPr>
-                        <m:sty m:val="p"/>
-                      </m:rPr>
-                      <m:t>|</m:t>
-                    </m:r>
-                    <m:r>
-                      <m:t>8.86</m:t>
-                    </m:r>
-                    <m:r>
-                      <m:rPr>
-                        <m:sty m:val="p"/>
-                      </m:rPr>
-                      <m:t>|</m:t>
-                    </m:r>
-                    <m:r>
-                      <m:rPr>
-                        <m:sty m:val="p"/>
-                      </m:rPr>
-                      <m:t>|</m:t>
-                    </m:r>
-                    <m:r>
-                      <m:t>W</m:t>
-                    </m:r>
-                    <m:r>
-                      <m:t>T</m:t>
-                    </m:r>
-                    <m:r>
-                      <m:t>P</m:t>
-                    </m:r>
-                    <m:r>
-                      <m:rPr>
-                        <m:sty m:val="p"/>
-                      </m:rPr>
-                      <m:t>,</m:t>
-                    </m:r>
-                    <m:r>
-                      <m:t>r</m:t>
-                    </m:r>
-                    <m:r>
-                      <m:t>e</m:t>
-                    </m:r>
-                    <m:r>
-                      <m:t>n</m:t>
-                    </m:r>
-                    <m:r>
-                      <m:t>e</m:t>
-                    </m:r>
-                    <m:r>
-                      <m:t>w</m:t>
-                    </m:r>
-                    <m:r>
-                      <m:t>a</m:t>
-                    </m:r>
-                    <m:r>
-                      <m:t>b</m:t>
-                    </m:r>
-                    <m:r>
-                      <m:t>l</m:t>
-                    </m:r>
-                    <m:r>
-                      <m:t>e</m:t>
-                    </m:r>
-                    <m:r>
-                      <m:t>s</m:t>
-                    </m:r>
-                    <m:r>
-                      <m:rPr>
-                        <m:sty m:val="p"/>
-                      </m:rPr>
-                      <m:t>(</m:t>
-                    </m:r>
-                  </m:oMath>
-                  <w:r>
-                    <w:t xml:space="preserve">)</w:t>
-                  </w:r>
-                </w:p>
-              </w:tc>
-              <w:tc>
-                <w:tcPr/>
-                <w:p>
-                  <w:pPr>
-                    <w:pStyle w:val="Compact"/>
-                    <w:jc w:val="left"/>
-                    <w:jc w:val="left"/>
-                  </w:pPr>
-                  <w:r>
-                    <w:t xml:space="preserve">18.21</w:t>
-                  </w:r>
-                </w:p>
-              </w:tc>
-              <w:tc>
-                <w:tcPr/>
-                <w:p>
-                  <w:pPr>
-                    <w:pStyle w:val="Compact"/>
-                    <w:jc w:val="left"/>
-                    <w:jc w:val="left"/>
-                  </w:pPr>
-                  <w:r>
-                    <w:t xml:space="preserve">17.43</w:t>
+                    <w:t xml:space="preserve">WTP, fossil fuels ($)</w:t>
+                  </w:r>
+                </w:p>
+              </w:tc>
+              <w:tc>
+                <w:tcPr/>
+                <w:p>
+                  <w:pPr>
+                    <w:pStyle w:val="Compact"/>
+                    <w:jc w:val="left"/>
+                    <w:jc w:val="left"/>
+                  </w:pPr>
+                  <w:r>
+                    <w:t xml:space="preserve">8.33</w:t>
+                  </w:r>
+                </w:p>
+              </w:tc>
+              <w:tc>
+                <w:tcPr/>
+                <w:p>
+                  <w:pPr>
+                    <w:pStyle w:val="Compact"/>
+                    <w:jc w:val="left"/>
+                    <w:jc w:val="left"/>
+                  </w:pPr>
+                  <w:r>
+                    <w:t xml:space="preserve">13.79</w:t>
                   </w:r>
                 </w:p>
               </w:tc>
@@ -1306,33 +1176,33 @@
                     <w:jc w:val="left"/>
                   </w:pPr>
                   <w:r>
-                    <w:t xml:space="preserve">17.95</w:t>
-                  </w:r>
-                </w:p>
-              </w:tc>
-              <w:tc>
-                <w:tcPr/>
-                <w:p>
-                  <w:pPr>
-                    <w:pStyle w:val="Compact"/>
-                    <w:jc w:val="left"/>
-                    <w:jc w:val="left"/>
-                  </w:pPr>
-                  <w:r>
-                    <w:t xml:space="preserve">17.85</w:t>
-                  </w:r>
-                </w:p>
-              </w:tc>
-              <w:tc>
-                <w:tcPr/>
-                <w:p>
-                  <w:pPr>
-                    <w:pStyle w:val="Compact"/>
-                    <w:jc w:val="left"/>
-                    <w:jc w:val="left"/>
-                  </w:pPr>
-                  <w:r>
-                    <w:t xml:space="preserve">18.80</w:t>
+                    <w:t xml:space="preserve">8.55</w:t>
+                  </w:r>
+                </w:p>
+              </w:tc>
+              <w:tc>
+                <w:tcPr/>
+                <w:p>
+                  <w:pPr>
+                    <w:pStyle w:val="Compact"/>
+                    <w:jc w:val="left"/>
+                    <w:jc w:val="left"/>
+                  </w:pPr>
+                  <w:r>
+                    <w:t xml:space="preserve">7.54</w:t>
+                  </w:r>
+                </w:p>
+              </w:tc>
+              <w:tc>
+                <w:tcPr/>
+                <w:p>
+                  <w:pPr>
+                    <w:pStyle w:val="Compact"/>
+                    <w:jc w:val="left"/>
+                    <w:jc w:val="left"/>
+                  </w:pPr>
+                  <w:r>
+                    <w:t xml:space="preserve">8.86</w:t>
                   </w:r>
                 </w:p>
               </w:tc>
@@ -1347,33 +1217,33 @@
                     <w:jc w:val="left"/>
                   </w:pPr>
                   <w:r>
-                    <w:t xml:space="preserve">Democrat</w:t>
-                  </w:r>
-                </w:p>
-              </w:tc>
-              <w:tc>
-                <w:tcPr/>
-                <w:p>
-                  <w:pPr>
-                    <w:pStyle w:val="Compact"/>
-                    <w:jc w:val="left"/>
-                    <w:jc w:val="left"/>
-                  </w:pPr>
-                  <w:r>
-                    <w:t xml:space="preserve">0.45</w:t>
-                  </w:r>
-                </w:p>
-              </w:tc>
-              <w:tc>
-                <w:tcPr/>
-                <w:p>
-                  <w:pPr>
-                    <w:pStyle w:val="Compact"/>
-                    <w:jc w:val="left"/>
-                    <w:jc w:val="left"/>
-                  </w:pPr>
-                  <w:r>
-                    <w:t xml:space="preserve">0.50</w:t>
+                    <w:t xml:space="preserve">WTP, renewables ($)</w:t>
+                  </w:r>
+                </w:p>
+              </w:tc>
+              <w:tc>
+                <w:tcPr/>
+                <w:p>
+                  <w:pPr>
+                    <w:pStyle w:val="Compact"/>
+                    <w:jc w:val="left"/>
+                    <w:jc w:val="left"/>
+                  </w:pPr>
+                  <w:r>
+                    <w:t xml:space="preserve">18.21</w:t>
+                  </w:r>
+                </w:p>
+              </w:tc>
+              <w:tc>
+                <w:tcPr/>
+                <w:p>
+                  <w:pPr>
+                    <w:pStyle w:val="Compact"/>
+                    <w:jc w:val="left"/>
+                    <w:jc w:val="left"/>
+                  </w:pPr>
+                  <w:r>
+                    <w:t xml:space="preserve">17.43</w:t>
                   </w:r>
                 </w:p>
               </w:tc>
@@ -1399,46 +1269,46 @@
                     <w:jc w:val="left"/>
                   </w:pPr>
                   <w:r>
-                    <w:t xml:space="preserve">1</w:t>
-                  </w:r>
-                </w:p>
-              </w:tc>
-              <w:tc>
-                <w:tcPr/>
-                <w:p>
-                  <w:pPr>
-                    <w:pStyle w:val="Compact"/>
-                    <w:jc w:val="left"/>
-                    <w:jc w:val="left"/>
-                  </w:pPr>
-                  <w:r>
-                    <w:t xml:space="preserve">0.43</w:t>
-                  </w:r>
-                </w:p>
-              </w:tc>
-              <w:tc>
-                <w:tcPr/>
-                <w:p>
-                  <w:pPr>
-                    <w:pStyle w:val="Compact"/>
-                    <w:jc w:val="left"/>
-                    <w:jc w:val="left"/>
-                  </w:pPr>
-                  <w:r>
-                    <w:t xml:space="preserve">0.48</w:t>
-                  </w:r>
-                </w:p>
-              </w:tc>
-              <w:tc>
-                <w:tcPr/>
-                <w:p>
-                  <w:pPr>
-                    <w:pStyle w:val="Compact"/>
-                    <w:jc w:val="left"/>
-                    <w:jc w:val="left"/>
-                  </w:pPr>
-                  <w:r>
-                    <w:t xml:space="preserve">0.44</w:t>
+                    <w:t xml:space="preserve">46</w:t>
+                  </w:r>
+                </w:p>
+              </w:tc>
+              <w:tc>
+                <w:tcPr/>
+                <w:p>
+                  <w:pPr>
+                    <w:pStyle w:val="Compact"/>
+                    <w:jc w:val="left"/>
+                    <w:jc w:val="left"/>
+                  </w:pPr>
+                  <w:r>
+                    <w:t xml:space="preserve">17.95</w:t>
+                  </w:r>
+                </w:p>
+              </w:tc>
+              <w:tc>
+                <w:tcPr/>
+                <w:p>
+                  <w:pPr>
+                    <w:pStyle w:val="Compact"/>
+                    <w:jc w:val="left"/>
+                    <w:jc w:val="left"/>
+                  </w:pPr>
+                  <w:r>
+                    <w:t xml:space="preserve">17.85</w:t>
+                  </w:r>
+                </w:p>
+              </w:tc>
+              <w:tc>
+                <w:tcPr/>
+                <w:p>
+                  <w:pPr>
+                    <w:pStyle w:val="Compact"/>
+                    <w:jc w:val="left"/>
+                    <w:jc w:val="left"/>
+                  </w:pPr>
+                  <w:r>
+                    <w:t xml:space="preserve">18.80</w:t>
                   </w:r>
                 </w:p>
               </w:tc>
@@ -1453,6 +1323,112 @@
                     <w:jc w:val="left"/>
                   </w:pPr>
                   <w:r>
+                    <w:t xml:space="preserve">Democrat</w:t>
+                  </w:r>
+                </w:p>
+              </w:tc>
+              <w:tc>
+                <w:tcPr/>
+                <w:p>
+                  <w:pPr>
+                    <w:pStyle w:val="Compact"/>
+                    <w:jc w:val="left"/>
+                    <w:jc w:val="left"/>
+                  </w:pPr>
+                  <w:r>
+                    <w:t xml:space="preserve">0.45</w:t>
+                  </w:r>
+                </w:p>
+              </w:tc>
+              <w:tc>
+                <w:tcPr/>
+                <w:p>
+                  <w:pPr>
+                    <w:pStyle w:val="Compact"/>
+                    <w:jc w:val="left"/>
+                    <w:jc w:val="left"/>
+                  </w:pPr>
+                  <w:r>
+                    <w:t xml:space="preserve">0.50</w:t>
+                  </w:r>
+                </w:p>
+              </w:tc>
+              <w:tc>
+                <w:tcPr/>
+                <w:p>
+                  <w:pPr>
+                    <w:pStyle w:val="Compact"/>
+                    <w:jc w:val="left"/>
+                    <w:jc w:val="left"/>
+                  </w:pPr>
+                  <w:r>
+                    <w:t xml:space="preserve">0</w:t>
+                  </w:r>
+                </w:p>
+              </w:tc>
+              <w:tc>
+                <w:tcPr/>
+                <w:p>
+                  <w:pPr>
+                    <w:pStyle w:val="Compact"/>
+                    <w:jc w:val="left"/>
+                    <w:jc w:val="left"/>
+                  </w:pPr>
+                  <w:r>
+                    <w:t xml:space="preserve">1</w:t>
+                  </w:r>
+                </w:p>
+              </w:tc>
+              <w:tc>
+                <w:tcPr/>
+                <w:p>
+                  <w:pPr>
+                    <w:pStyle w:val="Compact"/>
+                    <w:jc w:val="left"/>
+                    <w:jc w:val="left"/>
+                  </w:pPr>
+                  <w:r>
+                    <w:t xml:space="preserve">0.43</w:t>
+                  </w:r>
+                </w:p>
+              </w:tc>
+              <w:tc>
+                <w:tcPr/>
+                <w:p>
+                  <w:pPr>
+                    <w:pStyle w:val="Compact"/>
+                    <w:jc w:val="left"/>
+                    <w:jc w:val="left"/>
+                  </w:pPr>
+                  <w:r>
+                    <w:t xml:space="preserve">0.48</w:t>
+                  </w:r>
+                </w:p>
+              </w:tc>
+              <w:tc>
+                <w:tcPr/>
+                <w:p>
+                  <w:pPr>
+                    <w:pStyle w:val="Compact"/>
+                    <w:jc w:val="left"/>
+                    <w:jc w:val="left"/>
+                  </w:pPr>
+                  <w:r>
+                    <w:t xml:space="preserve">0.44</w:t>
+                  </w:r>
+                </w:p>
+              </w:tc>
+            </w:tr>
+            <w:tr>
+              <w:tc>
+                <w:tcPr/>
+                <w:p>
+                  <w:pPr>
+                    <w:pStyle w:val="Compact"/>
+                    <w:jc w:val="left"/>
+                    <w:jc w:val="left"/>
+                  </w:pPr>
+                  <w:r>
                     <w:t xml:space="preserve">Republican</w:t>
                   </w:r>
                 </w:p>
@@ -1550,7 +1526,7 @@
               </w:tc>
             </w:tr>
           </w:tbl>
-          <w:bookmarkEnd w:id="15"/>
+          <w:bookmarkEnd w:id="16"/>
           <w:p/>
         </w:tc>
       </w:tr>
@@ -1574,11 +1550,11 @@
         </w:r>
       </w:hyperlink>
       <w:r>
-        <w:t xml:space="preserve">. The mean on the energy-priority scale was 5.17 (SD = 1.74), which is above the midpoint of 4 and indicates that respondents, on average, leaned toward prioritizing renewables over fossil fuels. Regarding party identification, 45 percent of the weighted sample were Democrats and 46 percent were Republicans, with the remaining 9 percent identifying with neither party. These shares reflect the survey weights, which weight the sample to the party affiliation distribution in the NPORS. Unweighted, 56 percent of respondents were Democrats and 29 percent were Republicans, so the weights increase the share of Republicans from 29 to 46 percent. To account for this, I also estimate each model without the weights, and those models are shown in the supplemental material.</w:t>
-      </w:r>
-    </w:p>
-    <w:bookmarkEnd w:id="16"/>
-    <w:bookmarkStart w:id="32" w:name="results"/>
+        <w:t xml:space="preserve">. The mean on the energy-priority scale was 5.17 (SD = 1.74), which is above the midpoint of 4 and indicates that respondents, on average, leaned toward prioritizing renewables over fossil fuels. Regarding party identification, 45 percent of the weighted sample were Democrats and 46 percent were Republicans, with the remaining 9 percent identifying with neither party. These shares reflect the survey weights, which weight the sample to the party affiliation distribution in the NPORS. Unweighted, 56 percent of respondents were Democrats and 29 percent were Republicans, so the weights increase the share of Republicans from 29 to 46 percent. However, because the models interact the cues with party identification, and the party weights give every respondent within a party the same weight, the party weights do not change the estimated interactions, which instead depend on the demographic weights. To account for this, I also estimate each model without the weights, and with only the party weights or only the demographic weights, and those models are shown in the supplemental material.</w:t>
+      </w:r>
+    </w:p>
+    <w:bookmarkEnd w:id="17"/>
+    <w:bookmarkStart w:id="36" w:name="results"/>
     <w:p>
       <w:pPr>
         <w:pStyle w:val="Heading1"/>
@@ -1622,7 +1598,7 @@
       <w:tr>
         <w:tc>
           <w:tcPr/>
-          <w:bookmarkStart w:id="17" w:name="tbl-priority-ols"/>
+          <w:bookmarkStart w:id="18" w:name="tbl-priority-ols"/>
           <w:p>
             <w:pPr>
               <w:jc w:val="left"/>
@@ -2206,7 +2182,7 @@
               </w:tc>
             </w:tr>
           </w:tbl>
-          <w:bookmarkEnd w:id="17"/>
+          <w:bookmarkEnd w:id="18"/>
           <w:p/>
         </w:tc>
       </w:tr>
@@ -2224,7 +2200,7 @@
       <w:tr>
         <w:tc>
           <w:tcPr/>
-          <w:bookmarkStart w:id="21" w:name="fig-priority-predicted"/>
+          <w:bookmarkStart w:id="22" w:name="fig-priority-predicted"/>
           <w:p>
             <w:pPr>
               <w:jc w:val="center"/>
@@ -2248,18 +2224,18 @@
                 <wp:inline>
                   <wp:extent cx="5334000" cy="4267200"/>
                   <wp:effectExtent b="0" l="0" r="0" t="0"/>
-                  <wp:docPr descr="" title="" id="19" name="Picture"/>
+                  <wp:docPr descr="" title="" id="20" name="Picture"/>
                   <a:graphic>
                     <a:graphicData uri="http://schemas.openxmlformats.org/drawingml/2006/picture">
                       <pic:pic>
                         <pic:nvPicPr>
-                          <pic:cNvPr descr="cue-WTP_files/figure-docx/fig-priority-predicted-1.png" id="20" name="Picture"/>
+                          <pic:cNvPr descr="cue-WTP_files/figure-docx/fig-priority-predicted-1.png" id="21" name="Picture"/>
                           <pic:cNvPicPr>
                             <a:picLocks noChangeArrowheads="1" noChangeAspect="1"/>
                           </pic:cNvPicPr>
                         </pic:nvPicPr>
                         <pic:blipFill>
-                          <a:blip r:embed="rId18"/>
+                          <a:blip r:embed="rId19"/>
                           <a:stretch>
                             <a:fillRect/>
                           </a:stretch>
@@ -2286,7 +2262,7 @@
               </w:drawing>
             </w:r>
           </w:p>
-          <w:bookmarkEnd w:id="21"/>
+          <w:bookmarkEnd w:id="22"/>
         </w:tc>
       </w:tr>
     </w:tbl>
@@ -2295,55 +2271,19 @@
         <w:pStyle w:val="BodyText"/>
       </w:pPr>
       <w:r>
-        <w:t xml:space="preserve">As expected, Republicans were more likely to prioritize fossil fuels than renewables, with an estimated coefficient of -0.99 on the 1 to 7 scale, and Democrats prioritized renewables at 0.73. In terms of the interactions, which test whether the effect of a cue differs by party identification, the Trump cue moved Republicans toward fossil fuels more than it moved those who identify with neither party (b = -0.52). However, there are 16 cue x party identification interactions across the four models presented here, and this interaction is not significant after a Holm adjustment for multiple comparisons (adjusted</w:t>
-      </w:r>
-      <w:r>
-        <w:t xml:space="preserve"> </w:t>
-      </w:r>
-      <w:r>
-        <w:rPr>
-          <w:i/>
-          <w:iCs/>
-        </w:rPr>
-        <w:t xml:space="preserve">p</w:t>
-      </w:r>
-      <w:r>
-        <w:t xml:space="preserve"> </w:t>
-      </w:r>
-      <w:r>
-        <w:t xml:space="preserve">= 0.68). Descriptively, the predicted value on the 1 to 7 scale for Republicans in the baseline condition was 4.34, indicating a split roughly evenly between fossil fuels and renewables, and it was 3.96 for those receiving the Trump cue, a significant shift toward fossil fuels (difference = -0.38). In contrast, the climate cue did not move Democrats toward renewables more than those who identify with neither party (b = 0.01). The predicted value for Democrats was 6.06 in the baseline condition, indicating a strong priority for renewables, and 6.17 in the climate condition, which is not a significant difference. Without the survey weights, neither interaction is significant (Trump cue x Republican</w:t>
-      </w:r>
-      <w:r>
-        <w:t xml:space="preserve"> </w:t>
-      </w:r>
-      <w:r>
-        <w:rPr>
-          <w:i/>
-          <w:iCs/>
-        </w:rPr>
-        <w:t xml:space="preserve">p</w:t>
-      </w:r>
-      <w:r>
-        <w:t xml:space="preserve"> </w:t>
-      </w:r>
-      <w:r>
-        <w:t xml:space="preserve">= 0.135; climate cue x Democrat</w:t>
-      </w:r>
-      <w:r>
-        <w:t xml:space="preserve"> </w:t>
-      </w:r>
-      <w:r>
-        <w:rPr>
-          <w:i/>
-          <w:iCs/>
-        </w:rPr>
-        <w:t xml:space="preserve">p</w:t>
-      </w:r>
-      <w:r>
-        <w:t xml:space="preserve"> </w:t>
-      </w:r>
-      <w:r>
-        <w:t xml:space="preserve">= 0.483). Finally, there is no evidence that Democrats moved toward renewables in response to the Trump cue or that Republicans moved toward fossil fuels in response to the climate cue.</w:t>
+        <w:t xml:space="preserve">As expected, Republicans were more likely to prioritize fossil fuels than renewables, with an estimated coefficient of -0.99 on the 1 to 7 scale, and Democrats prioritized renewables at 0.73. In terms of the interactions, which test whether the effect of a cue differs by party identification, the Trump cue moved Republicans toward fossil fuels more than it moved those who identify with neither party (b = -0.52). Descriptively, the predicted value on the 1 to 7 scale for Republicans in the baseline condition was 4.34, indicating a split roughly evenly between fossil fuels and renewables, and it was 3.96 for those receiving the Trump cue, a significant shift toward fossil fuels (difference = -0.38). In contrast, the climate cue did not move Democrats toward renewables more than those who identify with neither party (b = 0.01). The predicted value for Democrats was 6.06 in the baseline condition, indicating a strong priority for renewables, and 6.17 in the climate condition, which is not a significant difference.</w:t>
+      </w:r>
+      <w:r>
+        <w:rPr>
+          <w:rStyle w:val="FootnoteReference"/>
+        </w:rPr>
+        <w:footnoteReference w:id="23"/>
+      </w:r>
+      <w:r>
+        <w:t xml:space="preserve"> </w:t>
+      </w:r>
+      <w:r>
+        <w:t xml:space="preserve">Finally, there is no evidence that Democrats moved toward renewables in response to the Trump cue or that Republicans moved toward fossil fuels in response to the climate cue.</w:t>
       </w:r>
     </w:p>
     <w:p>
@@ -2421,7 +2361,7 @@
       <w:tr>
         <w:tc>
           <w:tcPr/>
-          <w:bookmarkStart w:id="22" w:name="tbl-wtp-dist"/>
+          <w:bookmarkStart w:id="24" w:name="tbl-wtp-dist"/>
           <w:p>
             <w:pPr>
               <w:jc w:val="left"/>
@@ -2942,7 +2882,7 @@
               </w:tc>
             </w:tr>
           </w:tbl>
-          <w:bookmarkEnd w:id="22"/>
+          <w:bookmarkEnd w:id="24"/>
           <w:p/>
         </w:tc>
       </w:tr>
@@ -2997,7 +2937,7 @@
         <w:t xml:space="preserve"> </w:t>
       </w:r>
       <w:r>
-        <w:t xml:space="preserve">&lt; .001). However, because the fossil fuel prompt included a reason not to pay for fossil fuels, the size of this difference is likely overstated and should be interpreted with caution.</w:t>
+        <w:t xml:space="preserve">&lt; .001). However, as noted above, the size of this difference is likely overstated.</w:t>
       </w:r>
     </w:p>
     <w:p>
@@ -3019,7 +2959,13 @@
         </w:r>
       </w:hyperlink>
       <w:r>
-        <w:t xml:space="preserve">. Because WTP is bounded at $0 and $46, I also estimate a censored-normal (Tobit) model for each source, which treats $0 as censored from below and $46 as censored from above. Those models are shown in the supplemental material.</w:t>
+        <w:t xml:space="preserve">.</w:t>
+      </w:r>
+      <w:r>
+        <w:rPr>
+          <w:rStyle w:val="FootnoteReference"/>
+        </w:rPr>
+        <w:footnoteReference w:id="25"/>
       </w:r>
     </w:p>
     <w:tbl>
@@ -3035,7 +2981,7 @@
       <w:tr>
         <w:tc>
           <w:tcPr/>
-          <w:bookmarkStart w:id="23" w:name="tbl-wtp-models"/>
+          <w:bookmarkStart w:id="26" w:name="tbl-wtp-models"/>
           <w:p>
             <w:pPr>
               <w:jc w:val="left"/>
@@ -4206,7 +4152,7 @@
               </w:tc>
             </w:tr>
           </w:tbl>
-          <w:bookmarkEnd w:id="23"/>
+          <w:bookmarkEnd w:id="26"/>
           <w:p/>
         </w:tc>
       </w:tr>
@@ -4248,23 +4194,7 @@
         <w:t xml:space="preserve"> </w:t>
       </w:r>
       <w:r>
-        <w:t xml:space="preserve">= 0.711). The interaction is also not significant after adjusting for multiple comparisons (Holm-adjusted</w:t>
-      </w:r>
-      <w:r>
-        <w:t xml:space="preserve"> </w:t>
-      </w:r>
-      <w:r>
-        <w:rPr>
-          <w:i/>
-          <w:iCs/>
-        </w:rPr>
-        <w:t xml:space="preserve">p</w:t>
-      </w:r>
-      <w:r>
-        <w:t xml:space="preserve"> </w:t>
-      </w:r>
-      <w:r>
-        <w:t xml:space="preserve">= 0.77). The WTP amounts are shown in</w:t>
+        <w:t xml:space="preserve">= 0.711). The WTP amounts are shown in</w:t>
       </w:r>
       <w:r>
         <w:t xml:space="preserve"> </w:t>
@@ -4311,7 +4241,7 @@
       <w:tr>
         <w:tc>
           <w:tcPr/>
-          <w:bookmarkStart w:id="27" w:name="fig-wtp-fossil-predicted"/>
+          <w:bookmarkStart w:id="30" w:name="fig-wtp-fossil-predicted"/>
           <w:p>
             <w:pPr>
               <w:jc w:val="center"/>
@@ -4335,18 +4265,18 @@
                 <wp:inline>
                   <wp:extent cx="5334000" cy="4267200"/>
                   <wp:effectExtent b="0" l="0" r="0" t="0"/>
-                  <wp:docPr descr="" title="" id="25" name="Picture"/>
+                  <wp:docPr descr="" title="" id="28" name="Picture"/>
                   <a:graphic>
                     <a:graphicData uri="http://schemas.openxmlformats.org/drawingml/2006/picture">
                       <pic:pic>
                         <pic:nvPicPr>
-                          <pic:cNvPr descr="cue-WTP_files/figure-docx/fig-wtp-fossil-predicted-1.png" id="26" name="Picture"/>
+                          <pic:cNvPr descr="cue-WTP_files/figure-docx/fig-wtp-fossil-predicted-1.png" id="29" name="Picture"/>
                           <pic:cNvPicPr>
                             <a:picLocks noChangeArrowheads="1" noChangeAspect="1"/>
                           </pic:cNvPicPr>
                         </pic:nvPicPr>
                         <pic:blipFill>
-                          <a:blip r:embed="rId24"/>
+                          <a:blip r:embed="rId27"/>
                           <a:stretch>
                             <a:fillRect/>
                           </a:stretch>
@@ -4373,7 +4303,7 @@
               </w:drawing>
             </w:r>
           </w:p>
-          <w:bookmarkEnd w:id="27"/>
+          <w:bookmarkEnd w:id="30"/>
         </w:tc>
       </w:tr>
     </w:tbl>
@@ -4390,7 +4320,7 @@
       <w:tr>
         <w:tc>
           <w:tcPr/>
-          <w:bookmarkStart w:id="31" w:name="fig-wtp-renewable-predicted"/>
+          <w:bookmarkStart w:id="34" w:name="fig-wtp-renewable-predicted"/>
           <w:p>
             <w:pPr>
               <w:jc w:val="center"/>
@@ -4414,18 +4344,18 @@
                 <wp:inline>
                   <wp:extent cx="5334000" cy="4267200"/>
                   <wp:effectExtent b="0" l="0" r="0" t="0"/>
-                  <wp:docPr descr="" title="" id="29" name="Picture"/>
+                  <wp:docPr descr="" title="" id="32" name="Picture"/>
                   <a:graphic>
                     <a:graphicData uri="http://schemas.openxmlformats.org/drawingml/2006/picture">
                       <pic:pic>
                         <pic:nvPicPr>
-                          <pic:cNvPr descr="cue-WTP_files/figure-docx/fig-wtp-renewable-predicted-1.png" id="30" name="Picture"/>
+                          <pic:cNvPr descr="cue-WTP_files/figure-docx/fig-wtp-renewable-predicted-1.png" id="33" name="Picture"/>
                           <pic:cNvPicPr>
                             <a:picLocks noChangeArrowheads="1" noChangeAspect="1"/>
                           </pic:cNvPicPr>
                         </pic:nvPicPr>
                         <pic:blipFill>
-                          <a:blip r:embed="rId28"/>
+                          <a:blip r:embed="rId31"/>
                           <a:stretch>
                             <a:fillRect/>
                           </a:stretch>
@@ -4452,7 +4382,7 @@
               </w:drawing>
             </w:r>
           </w:p>
-          <w:bookmarkEnd w:id="31"/>
+          <w:bookmarkEnd w:id="34"/>
         </w:tc>
       </w:tr>
     </w:tbl>
@@ -4461,7 +4391,21 @@
         <w:pStyle w:val="BodyText"/>
       </w:pPr>
       <w:r>
-        <w:t xml:space="preserve">Among those with positive WTP for fossil fuels, neither party identification, the cues, nor their interactions significantly predicted the dollar amount. The predicted amount for Republicans was $14.87 in the baseline condition versus $14.02 in the Trump cue. In the Tobit model of fossil fuel WTP, the Trump cue x Republican interaction (b = 9.64,</w:t>
+        <w:t xml:space="preserve">Among those with positive WTP for fossil fuels, neither party identification, the cues, nor their interactions significantly predicted the dollar amount. The predicted amount for Republicans was $14.87 in the baseline condition versus $14.02 in the Trump cue.</w:t>
+      </w:r>
+      <w:r>
+        <w:rPr>
+          <w:rStyle w:val="FootnoteReference"/>
+        </w:rPr>
+        <w:footnoteReference w:id="35"/>
+      </w:r>
+    </w:p>
+    <w:p>
+      <w:pPr>
+        <w:pStyle w:val="BodyText"/>
+      </w:pPr>
+      <w:r>
+        <w:t xml:space="preserve">Looking to renewables, Democrats were willing to pay $3.97 more, on average, than those who identify with neither party, and Republicans were willing to pay $5.96 less, for a predicted total of $13.12 among Republicans in the baseline condition. The climate cue x Democrat interaction was significant (b = 5.05,</w:t>
       </w:r>
       <w:r>
         <w:t xml:space="preserve"> </w:t>
@@ -4477,7 +4421,7 @@
         <w:t xml:space="preserve"> </w:t>
       </w:r>
       <w:r>
-        <w:t xml:space="preserve">= 0.028) and the climate cue x Republican interaction (b = 9.60,</w:t>
+        <w:t xml:space="preserve">= 0.048), and the climate cue x Republican interaction was nearly as large (b = 4.50,</w:t>
       </w:r>
       <w:r>
         <w:t xml:space="preserve"> </w:t>
@@ -4493,7 +4437,7 @@
         <w:t xml:space="preserve"> </w:t>
       </w:r>
       <w:r>
-        <w:t xml:space="preserve">= 0.026) are significant. However, these interactions reflect a lower WTP for fossil fuels in the cue conditions among those who identify with neither party (Trump cue b = -9.33,</w:t>
+        <w:t xml:space="preserve">= 0.092). However, both interactions largely reflect a lower WTP for renewables in the climate cue among those who identify with neither party (b = -3.58,</w:t>
       </w:r>
       <w:r>
         <w:t xml:space="preserve"> </w:t>
@@ -4509,7 +4453,7 @@
         <w:t xml:space="preserve"> </w:t>
       </w:r>
       <w:r>
-        <w:t xml:space="preserve">= 0.012) rather than a higher WTP among Republicans, whose WTP for fossil fuels did not differ from the baseline in either the Trump cue (difference = 0.31,</w:t>
+        <w:t xml:space="preserve">= 0.111). Among Democrats, the climate cue did not significantly increase WTP for renewables compared to the baseline (difference = $1.48,</w:t>
       </w:r>
       <w:r>
         <w:t xml:space="preserve"> </w:t>
@@ -4525,127 +4469,7 @@
         <w:t xml:space="preserve"> </w:t>
       </w:r>
       <w:r>
-        <w:t xml:space="preserve">= 0.893) or the climate cue (difference = 2.80,</w:t>
-      </w:r>
-      <w:r>
-        <w:t xml:space="preserve"> </w:t>
-      </w:r>
-      <w:r>
-        <w:rPr>
-          <w:i/>
-          <w:iCs/>
-        </w:rPr>
-        <w:t xml:space="preserve">p</w:t>
-      </w:r>
-      <w:r>
-        <w:t xml:space="preserve"> </w:t>
-      </w:r>
-      <w:r>
-        <w:t xml:space="preserve">= 0.215). The Trump cue x Republican interaction is also not significant after adjusting for multiple comparisons (Holm-adjusted</w:t>
-      </w:r>
-      <w:r>
-        <w:t xml:space="preserve"> </w:t>
-      </w:r>
-      <w:r>
-        <w:rPr>
-          <w:i/>
-          <w:iCs/>
-        </w:rPr>
-        <w:t xml:space="preserve">p</w:t>
-      </w:r>
-      <w:r>
-        <w:t xml:space="preserve"> </w:t>
-      </w:r>
-      <w:r>
-        <w:t xml:space="preserve">= 0.47).</w:t>
-      </w:r>
-    </w:p>
-    <w:p>
-      <w:pPr>
-        <w:pStyle w:val="BodyText"/>
-      </w:pPr>
-      <w:r>
-        <w:t xml:space="preserve">Looking to renewables, Democrats were willing to pay $3.97 more, on average, than those who identify with neither party, and Republicans were willing to pay $5.96 less, for a predicted total of $13.12 among Republicans in the baseline condition. The climate cue x Democrat interaction was significant (b = 5.05,</w:t>
-      </w:r>
-      <w:r>
-        <w:t xml:space="preserve"> </w:t>
-      </w:r>
-      <w:r>
-        <w:rPr>
-          <w:i/>
-          <w:iCs/>
-        </w:rPr>
-        <w:t xml:space="preserve">p</w:t>
-      </w:r>
-      <w:r>
-        <w:t xml:space="preserve"> </w:t>
-      </w:r>
-      <w:r>
-        <w:t xml:space="preserve">= 0.048), and the climate cue x Republican interaction was nearly as large (b = 4.50,</w:t>
-      </w:r>
-      <w:r>
-        <w:t xml:space="preserve"> </w:t>
-      </w:r>
-      <w:r>
-        <w:rPr>
-          <w:i/>
-          <w:iCs/>
-        </w:rPr>
-        <w:t xml:space="preserve">p</w:t>
-      </w:r>
-      <w:r>
-        <w:t xml:space="preserve"> </w:t>
-      </w:r>
-      <w:r>
-        <w:t xml:space="preserve">= 0.092). However, both interactions largely reflect a lower WTP for renewables in the climate cue among those who identify with neither party (b = -3.58,</w:t>
-      </w:r>
-      <w:r>
-        <w:t xml:space="preserve"> </w:t>
-      </w:r>
-      <w:r>
-        <w:rPr>
-          <w:i/>
-          <w:iCs/>
-        </w:rPr>
-        <w:t xml:space="preserve">p</w:t>
-      </w:r>
-      <w:r>
-        <w:t xml:space="preserve"> </w:t>
-      </w:r>
-      <w:r>
-        <w:t xml:space="preserve">= 0.111). Among Democrats, the climate cue did not significantly increase WTP for renewables compared to the baseline (difference = $1.48,</w:t>
-      </w:r>
-      <w:r>
-        <w:t xml:space="preserve"> </w:t>
-      </w:r>
-      <w:r>
-        <w:rPr>
-          <w:i/>
-          <w:iCs/>
-        </w:rPr>
-        <w:t xml:space="preserve">p</w:t>
-      </w:r>
-      <w:r>
-        <w:t xml:space="preserve"> </w:t>
-      </w:r>
-      <w:r>
-        <w:t xml:space="preserve">= 0.223), and the climate cue x Democrat interaction is not significant after adjusting for multiple comparisons (Holm-adjusted</w:t>
-      </w:r>
-      <w:r>
-        <w:t xml:space="preserve"> </w:t>
-      </w:r>
-      <w:r>
-        <w:rPr>
-          <w:i/>
-          <w:iCs/>
-        </w:rPr>
-        <w:t xml:space="preserve">p</w:t>
-      </w:r>
-      <w:r>
-        <w:t xml:space="preserve"> </w:t>
-      </w:r>
-      <w:r>
-        <w:t xml:space="preserve">= 0.71).</w:t>
+        <w:t xml:space="preserve">= 0.223).</w:t>
       </w:r>
     </w:p>
     <w:p>
@@ -4702,7 +4526,7 @@
         <w:pStyle w:val="BodyText"/>
       </w:pPr>
       <w:r>
-        <w:t xml:space="preserve">Overall, respondents leaned toward renewables on the priority scale, and the WTP for renewables was higher than for fossil fuels, though the size of the WTP difference likely reflects the wording of the prompts. The difference in WTP was also not uniform across groups. For example, among Republicans in the Trump cue, the WTP for renewables did not differ significantly from the WTP for fossil fuels (difference = $1.82,</w:t>
+        <w:t xml:space="preserve">Overall, respondents leaned toward renewables on the priority scale, and the WTP for renewables was higher than for fossil fuels. The difference in WTP was also not uniform across groups. For example, among Republicans in the Trump cue, the WTP for renewables did not differ significantly from the WTP for fossil fuels (difference = $1.82,</w:t>
       </w:r>
       <w:r>
         <w:t xml:space="preserve"> </w:t>
@@ -4726,11 +4550,11 @@
         <w:pStyle w:val="BodyText"/>
       </w:pPr>
       <w:r>
-        <w:t xml:space="preserve">Comparing the results to the hypotheses, the support is mixed. As expected, partisanship shaped both preferences and WTP, largely supporting H1a and H1b. Republicans prioritized fossil fuels more than those who identify with neither party, were more likely to have any positive WTP for fossil fuels, and were WTP less for renewables. Democrats, in contrast, prioritized renewables, were less likely to have any positive WTP for fossil fuels, and were WTP more for renewables. However, among those WTP something for fossil fuels, Republicans were not WTP more than others. H2a and H2b were not supported, as neither the Trump cue nor the climate cue had a significant average effect on energy priority or WTP for either source compared to the baseline condition. H3a received limited support. The Trump cue moved Republicans toward fossil fuels on the priority scale, but the interaction does not hold after adjusting for multiple comparisons or without the survey weights. H3b was not supported, as the climate cue did not move Democrats toward renewables on the priority scale, and the climate cue x Democrat interaction for renewables WTP reflects a decline among those who identify with neither party rather than an increase among Democrats. Regarding RQ1, there was no evidence that either cue led partisans to move away from the position of the source. Regarding RQ2, the shift in priority among Republicans did not carry over to WTP, as Republicans in the Trump cue did not differ from those in the baseline in their WTP for fossil fuels. These results suggest that cues are likely more effective at moving the priority the public gives to energy sources than the amount they are willing to pay, though the design could not detect small effects on WTP.</w:t>
-      </w:r>
-    </w:p>
-    <w:bookmarkEnd w:id="32"/>
-    <w:bookmarkStart w:id="34" w:name="discussion-and-conclusion"/>
+        <w:t xml:space="preserve">Comparing the results to the hypotheses, the support is mixed. As expected, partisanship shaped both preferences and WTP, largely supporting H1a and H1b. Republicans prioritized fossil fuels more than those who identify with neither party, were more likely to have any positive WTP for fossil fuels, and were WTP less for renewables. Democrats, in contrast, prioritized renewables, were less likely to have any positive WTP for fossil fuels, and were WTP more for renewables. However, among those WTP something for fossil fuels, Republicans were not WTP more than others. H2a and H2b were not supported, as neither the Trump cue nor the climate cue had a significant average effect on energy priority or WTP for either source compared to the baseline condition. H3a received limited support. The Trump cue moved Republicans toward fossil fuels on the priority scale. H3b was not supported, as the climate cue did not move Democrats toward renewables on the priority scale, and the climate cue x Democrat interaction for renewables WTP reflects a decline among those who identify with neither party rather than an increase among Democrats. Regarding RQ1, there was no evidence that either cue led partisans to move away from the position of the source. Regarding RQ2, the shift in priority among Republicans did not carry over to WTP, as Republicans in the Trump cue did not differ from those in the baseline in their WTP for fossil fuels. These results suggest that cues are likely more effective at moving the priority the public gives to energy sources than the amount they are willing to pay, though the design could not detect small effects on WTP.</w:t>
+      </w:r>
+    </w:p>
+    <w:bookmarkEnd w:id="36"/>
+    <w:bookmarkStart w:id="38" w:name="discussion-and-conclusion"/>
     <w:p>
       <w:pPr>
         <w:pStyle w:val="Heading1"/>
@@ -4744,7 +4568,7 @@
         <w:pStyle w:val="FirstParagraph"/>
       </w:pPr>
       <w:r>
-        <w:t xml:space="preserve">A clean energy transition is needed to mitigate climate change, and public support is needed for the energy transition. However, President Trump’s rhetoric and actions on energy may serve to polarize the public. This study examined how exposure to a Trump cue or a climate change cue shapes the US public’s prioritization of, and willingness-to-pay for, fossil fuel versus renewable electricity, and how these responses are shaped by partisanship. The results show that support for energy sources is polarized along partisan lines, both in how respondents prioritized fossil fuels against renewables and in the dollar amounts they were willing to pay. There is also some evidence that a Trump cue moved Republicans toward fossil fuels, though this effect does not hold after adjusting for multiple comparisons and should be considered tentative. In contrast, the climate cue did not move Democrats toward renewables, which is likely because Democrats already strongly prioritized renewables in the baseline condition. Together, these findings suggest that a cue from a polarizing figure such as President Trump may further exacerbate existing partisan divisions in how the public prioritizes energy sources.</w:t>
+        <w:t xml:space="preserve">A clean energy transition is needed to mitigate climate change, and public support is needed for the energy transition. However, President Trump’s rhetoric and actions on energy may serve to polarize the public. This study examined how exposure to a Trump cue or a climate change cue shapes the US public’s prioritization of, and willingness-to-pay for, fossil fuel versus renewable electricity, and how these responses are shaped by partisanship. The results show that support for energy sources is polarized along partisan lines, both in how respondents prioritized fossil fuels against renewables and in the dollar amounts they were willing to pay. There is also some evidence that a Trump cue moved Republicans toward fossil fuels, though this effect should be considered tentative. In contrast, the climate cue did not move Democrats toward renewables, which is likely because Democrats already strongly prioritized renewables in the baseline condition. Together, these findings suggest that a cue from a polarizing figure such as President Trump may further exacerbate existing partisan divisions in how the public prioritizes energy sources.</w:t>
       </w:r>
     </w:p>
     <w:p>
@@ -4758,7 +4582,7 @@
         <w:rPr>
           <w:rStyle w:val="FootnoteReference"/>
         </w:rPr>
-        <w:footnoteReference w:id="33"/>
+        <w:footnoteReference w:id="37"/>
       </w:r>
       <w:r>
         <w:t xml:space="preserve"> </w:t>
@@ -4772,7 +4596,7 @@
         <w:pStyle w:val="BodyText"/>
       </w:pPr>
       <w:r>
-        <w:t xml:space="preserve">These results carry several implications for climate and energy policy. First, respondents, on average, leaned toward prioritizing renewables over fossil fuels, with a mean of 5.17 on the 1 to 7 scale, and 86 percent of respondents reported some positive WTP for renewables. This suggests that renewable energy investment likely has general public support even in a polarized environment, though the size of the WTP gap between renewables and fossil fuels should be interpreted with caution. Second, if the tentative responsiveness of Republicans to the Trump cue holds, elite rhetoric, including rhetoric tied to a single prominent figure, may widen the partisan gap in energy preferences further, which is a risk for policymakers seeking durable, bipartisan support for energy policy. Third, because the cues did not shift prioritization in the sample overall and did not reliably shift WTP, messaging strategies aimed at building broad coalitions for the energy transition likely benefit from emphasizing shared, cross-partisan benefits of renewables, such as reliability or local economic development, rather than frames tied to a specific political figure or to climate change.</w:t>
+        <w:t xml:space="preserve">These results carry several implications for climate and energy policy. First, respondents, on average, leaned toward prioritizing renewables over fossil fuels, with a mean of 5.17 on the 1 to 7 scale, and 86 percent of respondents reported some positive WTP for renewables. This suggests that renewable energy investment likely has general public support even in a polarized environment. Second, if the tentative responsiveness of Republicans to the Trump cue holds, elite rhetoric, including rhetoric tied to a single prominent figure, may widen the partisan gap in energy preferences further, which is a risk for policymakers seeking durable, bipartisan support for energy policy. Third, because the cues did not shift prioritization in the sample overall and did not reliably shift WTP, messaging strategies aimed at building broad coalitions for the energy transition likely benefit from emphasizing shared, cross-partisan benefits of renewables, such as reliability or local economic development, rather than frames tied to a specific political figure or to climate change.</w:t>
       </w:r>
     </w:p>
     <w:p>
@@ -4780,7 +4604,7 @@
         <w:pStyle w:val="BodyText"/>
       </w:pPr>
       <w:r>
-        <w:t xml:space="preserve">This study has some limitations. First, respondents were recruited from an opt-in, quota-based panel rather than a probability sample, and the survey weights substantially increase the share of Republicans. Second, the WTP prompts were not symmetric, as the fossil fuel prompt included a reason not to pay for fossil fuels, which likely inflates the difference between WTP for renewables and fossil fuels. Third, the conditions were not parallel. The Trump cue changed only the source of the argument for fossil fuels, whereas the climate cue added a scientific source, a climate change frame, and a counterargument, so the effects of the two cues cannot be compared directly. Fourth, party identification was measured after the outcomes, though its distribution did not differ across conditions. Additionally, after leaners are assigned to a party, the reference group of those who identify with neither party is small. Fifth, the survey did not include attention or manipulation checks, and the starting amounts for the WTP questions were not recorded. Finally, the WTP measure relies on a hypothetical, stated-preference elicitation, and stated WTP does not always translate into WTP once a real price change is introduced. The cues were also each delivered once, in a single survey context, and their effects may not persist or generalize to the repeated, cumulative exposure people experience outside of a survey.</w:t>
+        <w:t xml:space="preserve">This study has some limitations. First, respondents were recruited from an opt-in, quota-based panel rather than a probability sample, and the Trump cue x Republican interaction for the priority scale depends on the demographic weights, as it is not significant without them. Second, the WTP prompts were not symmetric, as the fossil fuel prompt included a reason not to pay for fossil fuels, which likely inflates the difference between WTP for renewables and fossil fuels. Third, the conditions were not parallel. The Trump cue changed only the source of the argument for fossil fuels, whereas the climate cue added a scientific source, a climate change frame, and a counterargument, so the effects of the two cues cannot be compared directly. Fourth, party identification was measured after the outcomes, though its distribution did not differ across conditions. Additionally, after leaners are assigned to a party, the reference group of those who identify with neither party is small. Fifth, the survey did not include attention or manipulation checks, and the starting amounts for the WTP questions were not recorded. Finally, the WTP measure relies on a hypothetical, stated-preference elicitation, and stated WTP does not always translate into WTP once a real price change is introduced. The cues were also each delivered once, in a single survey context, and their effects may not persist or generalize to the repeated, cumulative exposure people experience outside of a survey.</w:t>
       </w:r>
     </w:p>
     <w:p>
@@ -4791,8 +4615,8 @@
         <w:t xml:space="preserve">Future research should examine whether repeated exposure to partisan cues over time widens the partisan gap in energy preferences identified here, and whether the cues have larger effects on WTP when respondents are asked to pay the stated amount rather than simply report it. Future research should also use parallel cue conditions and symmetric WTP prompts, and test whether cue effects on costless and costly expressions of preference differ within the same respondents.</w:t>
       </w:r>
     </w:p>
-    <w:bookmarkEnd w:id="34"/>
-    <w:bookmarkStart w:id="36" w:name="statements-and-declarations"/>
+    <w:bookmarkEnd w:id="38"/>
+    <w:bookmarkStart w:id="40" w:name="statements-and-declarations"/>
     <w:p>
       <w:pPr>
         <w:pStyle w:val="Heading1"/>
@@ -4857,7 +4681,7 @@
       <w:r>
         <w:t xml:space="preserve"> </w:t>
       </w:r>
-      <w:hyperlink r:id="rId35">
+      <w:hyperlink r:id="rId39">
         <w:r>
           <w:rPr>
             <w:rStyle w:val="Hyperlink"/>
@@ -4874,8 +4698,8 @@
         <w:br w:type="page"/>
       </w:r>
     </w:p>
-    <w:bookmarkEnd w:id="36"/>
-    <w:bookmarkStart w:id="68" w:name="references"/>
+    <w:bookmarkEnd w:id="40"/>
+    <w:bookmarkStart w:id="73" w:name="references"/>
     <w:p>
       <w:pPr>
         <w:pStyle w:val="Heading1"/>
@@ -4884,8 +4708,8 @@
         <w:t xml:space="preserve">References</w:t>
       </w:r>
     </w:p>
-    <w:bookmarkStart w:id="67" w:name="refs"/>
-    <w:bookmarkStart w:id="37" w:name="ref-aldyWillingnessPayPolitical2012"/>
+    <w:bookmarkStart w:id="72" w:name="refs"/>
+    <w:bookmarkStart w:id="41" w:name="ref-aldyWillingnessPayPolitical2012"/>
     <w:p>
       <w:pPr>
         <w:pStyle w:val="Bibliography"/>
@@ -4949,8 +4773,8 @@
         <w:t xml:space="preserve">2(8): 596–99.</w:t>
       </w:r>
     </w:p>
-    <w:bookmarkEnd w:id="37"/>
-    <w:bookmarkStart w:id="38" w:name="ref-benegalCostSensitivityPartisan2024"/>
+    <w:bookmarkEnd w:id="41"/>
+    <w:bookmarkStart w:id="42" w:name="ref-benegalCostSensitivityPartisan2024"/>
     <w:p>
       <w:pPr>
         <w:pStyle w:val="Bibliography"/>
@@ -5020,8 +4844,8 @@
         <w:t xml:space="preserve">14(4): 763–75.</w:t>
       </w:r>
     </w:p>
-    <w:bookmarkEnd w:id="38"/>
-    <w:bookmarkStart w:id="39" w:name="ref-bergquistEnergyPolicyPublic2020"/>
+    <w:bookmarkEnd w:id="42"/>
+    <w:bookmarkStart w:id="43" w:name="ref-bergquistEnergyPolicyPublic2020"/>
     <w:p>
       <w:pPr>
         <w:pStyle w:val="Bibliography"/>
@@ -5103,8 +4927,8 @@
         <w:t xml:space="preserve">2(3): 032003.</w:t>
       </w:r>
     </w:p>
-    <w:bookmarkEnd w:id="39"/>
-    <w:bookmarkStart w:id="40" w:name="ref-bolsenInfluencePartisanMotivated2014"/>
+    <w:bookmarkEnd w:id="43"/>
+    <w:bookmarkStart w:id="44" w:name="ref-bolsenInfluencePartisanMotivated2014"/>
     <w:p>
       <w:pPr>
         <w:pStyle w:val="Bibliography"/>
@@ -5168,8 +4992,8 @@
         <w:t xml:space="preserve">36(2): 235–62.</w:t>
       </w:r>
     </w:p>
-    <w:bookmarkEnd w:id="40"/>
-    <w:bookmarkStart w:id="41" w:name="ref-borchersDoesWillingnessPay2007"/>
+    <w:bookmarkEnd w:id="44"/>
+    <w:bookmarkStart w:id="45" w:name="ref-borchersDoesWillingnessPay2007"/>
     <w:p>
       <w:pPr>
         <w:pStyle w:val="Bibliography"/>
@@ -5245,8 +5069,8 @@
         <w:t xml:space="preserve">35(6): 3327–34.</w:t>
       </w:r>
     </w:p>
-    <w:bookmarkEnd w:id="41"/>
-    <w:bookmarkStart w:id="42" w:name="ref-breidertReviewMethodsMeasuring2006"/>
+    <w:bookmarkEnd w:id="45"/>
+    <w:bookmarkStart w:id="46" w:name="ref-breidertReviewMethodsMeasuring2006"/>
     <w:p>
       <w:pPr>
         <w:pStyle w:val="Bibliography"/>
@@ -5316,8 +5140,8 @@
         <w:t xml:space="preserve">2(4): 8–32.</w:t>
       </w:r>
     </w:p>
-    <w:bookmarkEnd w:id="42"/>
-    <w:bookmarkStart w:id="43" w:name="ref-bullockPartisanBiasFactual2015"/>
+    <w:bookmarkEnd w:id="46"/>
+    <w:bookmarkStart w:id="47" w:name="ref-bullockPartisanBiasFactual2015"/>
     <w:p>
       <w:pPr>
         <w:pStyle w:val="Bibliography"/>
@@ -5381,8 +5205,8 @@
         <w:t xml:space="preserve">10(4): 519–78.</w:t>
       </w:r>
     </w:p>
-    <w:bookmarkEnd w:id="43"/>
-    <w:bookmarkStart w:id="44" w:name="X8f8eebcd7a9410a4d8f16f6da906bc2a1f7110e"/>
+    <w:bookmarkEnd w:id="47"/>
+    <w:bookmarkStart w:id="48" w:name="X8f8eebcd7a9410a4d8f16f6da906bc2a1f7110e"/>
     <w:p>
       <w:pPr>
         <w:pStyle w:val="Bibliography"/>
@@ -5467,8 +5291,8 @@
         <w:t xml:space="preserve">62: 428–37.</w:t>
       </w:r>
     </w:p>
-    <w:bookmarkEnd w:id="44"/>
-    <w:bookmarkStart w:id="45" w:name="ref-druckmanHowElitePartisan2013"/>
+    <w:bookmarkEnd w:id="48"/>
+    <w:bookmarkStart w:id="49" w:name="ref-druckmanHowElitePartisan2013"/>
     <w:p>
       <w:pPr>
         <w:pStyle w:val="Bibliography"/>
@@ -5508,8 +5332,8 @@
         <w:t xml:space="preserve">107(01): 57–79.</w:t>
       </w:r>
     </w:p>
-    <w:bookmarkEnd w:id="45"/>
-    <w:bookmarkStart w:id="46" w:name="Xd021f1bc7383e3e1df188ec6ac9fbfebe3f9b3a"/>
+    <w:bookmarkEnd w:id="49"/>
+    <w:bookmarkStart w:id="50" w:name="Xd021f1bc7383e3e1df188ec6ac9fbfebe3f9b3a"/>
     <w:p>
       <w:pPr>
         <w:pStyle w:val="Bibliography"/>
@@ -5570,8 +5394,8 @@
         <w:t xml:space="preserve">9(3): 308–18.</w:t>
       </w:r>
     </w:p>
-    <w:bookmarkEnd w:id="46"/>
-    <w:bookmarkStart w:id="47" w:name="ref-feldmanClimateChangePolarizing2018"/>
+    <w:bookmarkEnd w:id="50"/>
+    <w:bookmarkStart w:id="51" w:name="ref-feldmanClimateChangePolarizing2018"/>
     <w:p>
       <w:pPr>
         <w:pStyle w:val="Bibliography"/>
@@ -5656,8 +5480,8 @@
         <w:t xml:space="preserve">51: 54–66.</w:t>
       </w:r>
     </w:p>
-    <w:bookmarkEnd w:id="47"/>
-    <w:bookmarkStart w:id="48" w:name="ref-gaborPriceIndicatorQuality1966"/>
+    <w:bookmarkEnd w:id="51"/>
+    <w:bookmarkStart w:id="52" w:name="ref-gaborPriceIndicatorQuality1966"/>
     <w:p>
       <w:pPr>
         <w:pStyle w:val="Bibliography"/>
@@ -5730,8 +5554,8 @@
         <w:t xml:space="preserve">33: 43–70.</w:t>
       </w:r>
     </w:p>
-    <w:bookmarkEnd w:id="48"/>
-    <w:bookmarkStart w:id="49" w:name="ref-grometPoliticalIdeologyAffects2013"/>
+    <w:bookmarkEnd w:id="52"/>
+    <w:bookmarkStart w:id="53" w:name="ref-grometPoliticalIdeologyAffects2013"/>
     <w:p>
       <w:pPr>
         <w:pStyle w:val="Bibliography"/>
@@ -5783,8 +5607,8 @@
         <w:t xml:space="preserve">110(23): 9314–19.</w:t>
       </w:r>
     </w:p>
-    <w:bookmarkEnd w:id="49"/>
-    <w:bookmarkStart w:id="50" w:name="ref-hamiltonChangeWindUS2018"/>
+    <w:bookmarkEnd w:id="53"/>
+    <w:bookmarkStart w:id="54" w:name="ref-hamiltonChangeWindUS2018"/>
     <w:p>
       <w:pPr>
         <w:pStyle w:val="Bibliography"/>
@@ -5869,8 +5693,8 @@
         <w:t xml:space="preserve">8(1): 11.</w:t>
       </w:r>
     </w:p>
-    <w:bookmarkEnd w:id="50"/>
-    <w:bookmarkStart w:id="51" w:name="ref-hawesClimateSciencePolitics2022"/>
+    <w:bookmarkEnd w:id="54"/>
+    <w:bookmarkStart w:id="55" w:name="ref-hawesClimateSciencePolitics2022"/>
     <w:p>
       <w:pPr>
         <w:pStyle w:val="Bibliography"/>
@@ -5991,8 +5815,8 @@
         <w:t xml:space="preserve">85: 102419.</w:t>
       </w:r>
     </w:p>
-    <w:bookmarkEnd w:id="51"/>
-    <w:bookmarkStart w:id="52" w:name="ref-jonesSurveyTechniqueMeasure1975"/>
+    <w:bookmarkEnd w:id="55"/>
+    <w:bookmarkStart w:id="56" w:name="ref-jonesSurveyTechniqueMeasure1975"/>
     <w:p>
       <w:pPr>
         <w:pStyle w:val="Bibliography"/>
@@ -6056,8 +5880,8 @@
         <w:t xml:space="preserve">39(3): 75–77.</w:t>
       </w:r>
     </w:p>
-    <w:bookmarkEnd w:id="52"/>
-    <w:bookmarkStart w:id="53" w:name="ref-kennedyAmericansShiftingViews2026"/>
+    <w:bookmarkEnd w:id="56"/>
+    <w:bookmarkStart w:id="57" w:name="ref-kennedyAmericansShiftingViews2026"/>
     <w:p>
       <w:pPr>
         <w:pStyle w:val="Bibliography"/>
@@ -6111,8 +5935,8 @@
         <w:t xml:space="preserve">https://www.pewresearch.org/science/2026/04/03/americans-shifting-views-on-energy-issues/ (April 21, 2026).</w:t>
       </w:r>
     </w:p>
-    <w:bookmarkEnd w:id="53"/>
-    <w:bookmarkStart w:id="54" w:name="ref-knappWillConsumersReally2020"/>
+    <w:bookmarkEnd w:id="57"/>
+    <w:bookmarkStart w:id="58" w:name="ref-knappWillConsumersReally2020"/>
     <w:p>
       <w:pPr>
         <w:pStyle w:val="Bibliography"/>
@@ -6209,8 +6033,8 @@
         <w:t xml:space="preserve">65: 101457.</w:t>
       </w:r>
     </w:p>
-    <w:bookmarkEnd w:id="54"/>
-    <w:bookmarkStart w:id="55" w:name="X83362c7a395811c107646b0a251a2c1915acb0e"/>
+    <w:bookmarkEnd w:id="58"/>
+    <w:bookmarkStart w:id="59" w:name="X83362c7a395811c107646b0a251a2c1915acb0e"/>
     <w:p>
       <w:pPr>
         <w:pStyle w:val="Bibliography"/>
@@ -6283,8 +6107,8 @@
         <w:t xml:space="preserve">55: 617–25.</w:t>
       </w:r>
     </w:p>
-    <w:bookmarkEnd w:id="55"/>
-    <w:bookmarkStart w:id="56" w:name="ref-kotchenPublicWillingnessPay2017"/>
+    <w:bookmarkEnd w:id="59"/>
+    <w:bookmarkStart w:id="60" w:name="ref-kotchenPublicWillingnessPay2017"/>
     <w:p>
       <w:pPr>
         <w:pStyle w:val="Bibliography"/>
@@ -6384,8 +6208,8 @@
         <w:t xml:space="preserve">12(9).</w:t>
       </w:r>
     </w:p>
-    <w:bookmarkEnd w:id="56"/>
-    <w:bookmarkStart w:id="57" w:name="ref-liPublicSupportReducing2009"/>
+    <w:bookmarkEnd w:id="60"/>
+    <w:bookmarkStart w:id="61" w:name="ref-liPublicSupportReducing2009"/>
     <w:p>
       <w:pPr>
         <w:pStyle w:val="Bibliography"/>
@@ -6488,8 +6312,8 @@
         <w:t xml:space="preserve">68(3): 731–42.</w:t>
       </w:r>
     </w:p>
-    <w:bookmarkEnd w:id="57"/>
-    <w:bookmarkStart w:id="58" w:name="ref-lipovetskyPricingModelsMarketing2011"/>
+    <w:bookmarkEnd w:id="61"/>
+    <w:bookmarkStart w:id="62" w:name="ref-lipovetskyPricingModelsMarketing2011"/>
     <w:p>
       <w:pPr>
         <w:pStyle w:val="Bibliography"/>
@@ -6541,8 +6365,8 @@
         <w:t xml:space="preserve">3(5): 167–74.</w:t>
       </w:r>
     </w:p>
-    <w:bookmarkEnd w:id="58"/>
-    <w:bookmarkStart w:id="59" w:name="ref-merkleyPartyCuesNews2021"/>
+    <w:bookmarkEnd w:id="62"/>
+    <w:bookmarkStart w:id="63" w:name="ref-merkleyPartyCuesNews2021"/>
     <w:p>
       <w:pPr>
         <w:pStyle w:val="Bibliography"/>
@@ -6633,8 +6457,8 @@
         <w:t xml:space="preserve">51(4): 1439–56.</w:t>
       </w:r>
     </w:p>
-    <w:bookmarkEnd w:id="59"/>
-    <w:bookmarkStart w:id="60" w:name="ref-murakamiConsumersWillingnessPay2015"/>
+    <w:bookmarkEnd w:id="63"/>
+    <w:bookmarkStart w:id="64" w:name="ref-murakamiConsumersWillingnessPay2015"/>
     <w:p>
       <w:pPr>
         <w:pStyle w:val="Bibliography"/>
@@ -6743,8 +6567,8 @@
         <w:t xml:space="preserve">50: 178–89.</w:t>
       </w:r>
     </w:p>
-    <w:bookmarkEnd w:id="60"/>
-    <w:bookmarkStart w:id="61" w:name="ref-nkansahWillingnessPayWind2019"/>
+    <w:bookmarkEnd w:id="64"/>
+    <w:bookmarkStart w:id="65" w:name="ref-nkansahWillingnessPayWind2019"/>
     <w:p>
       <w:pPr>
         <w:pStyle w:val="Bibliography"/>
@@ -6820,8 +6644,8 @@
         <w:t xml:space="preserve">48(1): 44–70.</w:t>
       </w:r>
     </w:p>
-    <w:bookmarkEnd w:id="61"/>
-    <w:bookmarkStart w:id="62" w:name="ref-priorYouCannotBe2015a"/>
+    <w:bookmarkEnd w:id="65"/>
+    <w:bookmarkStart w:id="66" w:name="ref-priorYouCannotBe2015a"/>
     <w:p>
       <w:pPr>
         <w:pStyle w:val="Bibliography"/>
@@ -6930,8 +6754,8 @@
         <w:t xml:space="preserve">10(4): 489–518.</w:t>
       </w:r>
     </w:p>
-    <w:bookmarkEnd w:id="62"/>
-    <w:bookmarkStart w:id="63" w:name="ref-scheuchVotersSupportAre2026"/>
+    <w:bookmarkEnd w:id="66"/>
+    <w:bookmarkStart w:id="67" w:name="ref-scheuchVotersSupportAre2026"/>
     <w:p>
       <w:pPr>
         <w:pStyle w:val="Bibliography"/>
@@ -7004,8 +6828,8 @@
         <w:t xml:space="preserve">: 10780874261475229.</w:t>
       </w:r>
     </w:p>
-    <w:bookmarkEnd w:id="63"/>
-    <w:bookmarkStart w:id="64" w:name="ref-teslerEliteDominationPublic2018"/>
+    <w:bookmarkEnd w:id="67"/>
+    <w:bookmarkStart w:id="68" w:name="ref-teslerEliteDominationPublic2018"/>
     <w:p>
       <w:pPr>
         <w:pStyle w:val="Bibliography"/>
@@ -7066,77 +6890,14 @@
         <w:t xml:space="preserve">35(2): 306–26.</w:t>
       </w:r>
     </w:p>
-    <w:bookmarkEnd w:id="64"/>
-    <w:bookmarkStart w:id="65" w:name="ref-walterExaminingWillingnessPay2023"/>
+    <w:bookmarkEnd w:id="68"/>
+    <w:bookmarkStart w:id="69" w:name="ref-LevelizedCostsNew2025"/>
     <w:p>
       <w:pPr>
         <w:pStyle w:val="Bibliography"/>
       </w:pPr>
       <w:r>
-        <w:t xml:space="preserve">Walter, Kara A., Jennifer Thacher, and Janie M. Chermak. 2023.</w:t>
-      </w:r>
-      <w:r>
-        <w:t xml:space="preserve"> </w:t>
-      </w:r>
-      <w:r>
-        <w:t xml:space="preserve">“Examining</w:t>
-      </w:r>
-      <w:r>
-        <w:t xml:space="preserve"> </w:t>
-      </w:r>
-      <w:r>
-        <w:t xml:space="preserve">Willingness</w:t>
-      </w:r>
-      <w:r>
-        <w:t xml:space="preserve"> </w:t>
-      </w:r>
-      <w:r>
-        <w:t xml:space="preserve">to</w:t>
-      </w:r>
-      <w:r>
-        <w:t xml:space="preserve"> </w:t>
-      </w:r>
-      <w:r>
-        <w:t xml:space="preserve">Pay</w:t>
-      </w:r>
-      <w:r>
-        <w:t xml:space="preserve"> </w:t>
-      </w:r>
-      <w:r>
-        <w:t xml:space="preserve">for</w:t>
-      </w:r>
-      <w:r>
-        <w:t xml:space="preserve"> </w:t>
-      </w:r>
-      <w:r>
-        <w:t xml:space="preserve">Energy Futures</w:t>
-      </w:r>
-      <w:r>
-        <w:t xml:space="preserve"> </w:t>
-      </w:r>
-      <w:r>
-        <w:t xml:space="preserve">in a</w:t>
-      </w:r>
-      <w:r>
-        <w:t xml:space="preserve"> </w:t>
-      </w:r>
-      <w:r>
-        <w:t xml:space="preserve">Fossil</w:t>
-      </w:r>
-      <w:r>
-        <w:t xml:space="preserve"> </w:t>
-      </w:r>
-      <w:r>
-        <w:t xml:space="preserve">and</w:t>
-      </w:r>
-      <w:r>
-        <w:t xml:space="preserve"> </w:t>
-      </w:r>
-      <w:r>
-        <w:t xml:space="preserve">Renewable Energy-Rich Locale</w:t>
-      </w:r>
-      <w:r>
-        <w:t xml:space="preserve">.”</w:t>
+        <w:t xml:space="preserve">U.S. Energy Information Administration. 2025.</w:t>
       </w:r>
       <w:r>
         <w:t xml:space="preserve"> </w:t>
@@ -7146,56 +6907,226 @@
           <w:i/>
           <w:iCs/>
         </w:rPr>
-        <w:t xml:space="preserve">Energy Policy</w:t>
-      </w:r>
-      <w:r>
-        <w:t xml:space="preserve"> </w:t>
-      </w:r>
-      <w:r>
-        <w:t xml:space="preserve">181: 113661.</w:t>
-      </w:r>
-    </w:p>
-    <w:bookmarkEnd w:id="65"/>
-    <w:bookmarkStart w:id="66" w:name="ref-wedelModelEffectsPsychological1998"/>
-    <w:p>
-      <w:pPr>
-        <w:pStyle w:val="Bibliography"/>
-      </w:pPr>
-      <w:r>
-        <w:t xml:space="preserve">Wedel, Michel, and Peter S. H. Leeflang. 1998.</w:t>
-      </w:r>
-      <w:r>
-        <w:t xml:space="preserve"> </w:t>
-      </w:r>
-      <w:r>
-        <w:t xml:space="preserve">“A Model for the Effects of Psychological Pricing in</w:t>
-      </w:r>
-      <w:r>
-        <w:t xml:space="preserve"> </w:t>
-      </w:r>
-      <w:r>
-        <w:t xml:space="preserve">Gabor</w:t>
-      </w:r>
-      <w:r>
-        <w:t xml:space="preserve">–</w:t>
-      </w:r>
-      <w:r>
-        <w:t xml:space="preserve">Granger</w:t>
-      </w:r>
-      <w:r>
-        <w:t xml:space="preserve"> </w:t>
-      </w:r>
-      <w:r>
-        <w:t xml:space="preserve">Price Studies.”</w:t>
-      </w:r>
-      <w:r>
-        <w:t xml:space="preserve"> </w:t>
+        <w:t xml:space="preserve">Levelized</w:t>
       </w:r>
       <w:r>
         <w:rPr>
           <w:i/>
           <w:iCs/>
         </w:rPr>
+        <w:t xml:space="preserve"> </w:t>
+      </w:r>
+      <w:r>
+        <w:rPr>
+          <w:i/>
+          <w:iCs/>
+        </w:rPr>
+        <w:t xml:space="preserve">Costs</w:t>
+      </w:r>
+      <w:r>
+        <w:rPr>
+          <w:i/>
+          <w:iCs/>
+        </w:rPr>
+        <w:t xml:space="preserve"> </w:t>
+      </w:r>
+      <w:r>
+        <w:rPr>
+          <w:i/>
+          <w:iCs/>
+        </w:rPr>
+        <w:t xml:space="preserve">of</w:t>
+      </w:r>
+      <w:r>
+        <w:rPr>
+          <w:i/>
+          <w:iCs/>
+        </w:rPr>
+        <w:t xml:space="preserve"> </w:t>
+      </w:r>
+      <w:r>
+        <w:rPr>
+          <w:i/>
+          <w:iCs/>
+        </w:rPr>
+        <w:t xml:space="preserve">New Generation Resources</w:t>
+      </w:r>
+      <w:r>
+        <w:rPr>
+          <w:i/>
+          <w:iCs/>
+        </w:rPr>
+        <w:t xml:space="preserve"> </w:t>
+      </w:r>
+      <w:r>
+        <w:rPr>
+          <w:i/>
+          <w:iCs/>
+        </w:rPr>
+        <w:t xml:space="preserve">in the</w:t>
+      </w:r>
+      <w:r>
+        <w:rPr>
+          <w:i/>
+          <w:iCs/>
+        </w:rPr>
+        <w:t xml:space="preserve"> </w:t>
+      </w:r>
+      <w:r>
+        <w:rPr>
+          <w:i/>
+          <w:iCs/>
+        </w:rPr>
+        <w:t xml:space="preserve">Annual Energy Outlook</w:t>
+      </w:r>
+      <w:r>
+        <w:rPr>
+          <w:i/>
+          <w:iCs/>
+        </w:rPr>
+        <w:t xml:space="preserve"> </w:t>
+      </w:r>
+      <w:r>
+        <w:rPr>
+          <w:i/>
+          <w:iCs/>
+        </w:rPr>
+        <w:t xml:space="preserve">2025</w:t>
+      </w:r>
+      <w:r>
+        <w:t xml:space="preserve">. Washington, D.C. https://www.eia.gov/outlooks/aeo/electricity_generation/pdf/AEO2025_LCOE_report.pdf.</w:t>
+      </w:r>
+    </w:p>
+    <w:bookmarkEnd w:id="69"/>
+    <w:bookmarkStart w:id="70" w:name="ref-walterExaminingWillingnessPay2023"/>
+    <w:p>
+      <w:pPr>
+        <w:pStyle w:val="Bibliography"/>
+      </w:pPr>
+      <w:r>
+        <w:t xml:space="preserve">Walter, Kara A., Jennifer Thacher, and Janie M. Chermak. 2023.</w:t>
+      </w:r>
+      <w:r>
+        <w:t xml:space="preserve"> </w:t>
+      </w:r>
+      <w:r>
+        <w:t xml:space="preserve">“Examining</w:t>
+      </w:r>
+      <w:r>
+        <w:t xml:space="preserve"> </w:t>
+      </w:r>
+      <w:r>
+        <w:t xml:space="preserve">Willingness</w:t>
+      </w:r>
+      <w:r>
+        <w:t xml:space="preserve"> </w:t>
+      </w:r>
+      <w:r>
+        <w:t xml:space="preserve">to</w:t>
+      </w:r>
+      <w:r>
+        <w:t xml:space="preserve"> </w:t>
+      </w:r>
+      <w:r>
+        <w:t xml:space="preserve">Pay</w:t>
+      </w:r>
+      <w:r>
+        <w:t xml:space="preserve"> </w:t>
+      </w:r>
+      <w:r>
+        <w:t xml:space="preserve">for</w:t>
+      </w:r>
+      <w:r>
+        <w:t xml:space="preserve"> </w:t>
+      </w:r>
+      <w:r>
+        <w:t xml:space="preserve">Energy Futures</w:t>
+      </w:r>
+      <w:r>
+        <w:t xml:space="preserve"> </w:t>
+      </w:r>
+      <w:r>
+        <w:t xml:space="preserve">in a</w:t>
+      </w:r>
+      <w:r>
+        <w:t xml:space="preserve"> </w:t>
+      </w:r>
+      <w:r>
+        <w:t xml:space="preserve">Fossil</w:t>
+      </w:r>
+      <w:r>
+        <w:t xml:space="preserve"> </w:t>
+      </w:r>
+      <w:r>
+        <w:t xml:space="preserve">and</w:t>
+      </w:r>
+      <w:r>
+        <w:t xml:space="preserve"> </w:t>
+      </w:r>
+      <w:r>
+        <w:t xml:space="preserve">Renewable Energy-Rich Locale</w:t>
+      </w:r>
+      <w:r>
+        <w:t xml:space="preserve">.”</w:t>
+      </w:r>
+      <w:r>
+        <w:t xml:space="preserve"> </w:t>
+      </w:r>
+      <w:r>
+        <w:rPr>
+          <w:i/>
+          <w:iCs/>
+        </w:rPr>
+        <w:t xml:space="preserve">Energy Policy</w:t>
+      </w:r>
+      <w:r>
+        <w:t xml:space="preserve"> </w:t>
+      </w:r>
+      <w:r>
+        <w:t xml:space="preserve">181: 113661.</w:t>
+      </w:r>
+    </w:p>
+    <w:bookmarkEnd w:id="70"/>
+    <w:bookmarkStart w:id="71" w:name="ref-wedelModelEffectsPsychological1998"/>
+    <w:p>
+      <w:pPr>
+        <w:pStyle w:val="Bibliography"/>
+      </w:pPr>
+      <w:r>
+        <w:t xml:space="preserve">Wedel, Michel, and Peter S. H. Leeflang. 1998.</w:t>
+      </w:r>
+      <w:r>
+        <w:t xml:space="preserve"> </w:t>
+      </w:r>
+      <w:r>
+        <w:t xml:space="preserve">“A Model for the Effects of Psychological Pricing in</w:t>
+      </w:r>
+      <w:r>
+        <w:t xml:space="preserve"> </w:t>
+      </w:r>
+      <w:r>
+        <w:t xml:space="preserve">Gabor</w:t>
+      </w:r>
+      <w:r>
+        <w:t xml:space="preserve">–</w:t>
+      </w:r>
+      <w:r>
+        <w:t xml:space="preserve">Granger</w:t>
+      </w:r>
+      <w:r>
+        <w:t xml:space="preserve"> </w:t>
+      </w:r>
+      <w:r>
+        <w:t xml:space="preserve">Price Studies.”</w:t>
+      </w:r>
+      <w:r>
+        <w:t xml:space="preserve"> </w:t>
+      </w:r>
+      <w:r>
+        <w:rPr>
+          <w:i/>
+          <w:iCs/>
+        </w:rPr>
         <w:t xml:space="preserve">Journal of Economic Psychology</w:t>
       </w:r>
       <w:r>
@@ -7205,9 +7136,9 @@
         <w:t xml:space="preserve">19(2): 237–60.</w:t>
       </w:r>
     </w:p>
-    <w:bookmarkEnd w:id="66"/>
-    <w:bookmarkEnd w:id="67"/>
-    <w:bookmarkEnd w:id="68"/>
+    <w:bookmarkEnd w:id="71"/>
+    <w:bookmarkEnd w:id="72"/>
+    <w:bookmarkEnd w:id="73"/>
     <w:sectPr>
       <w:footnotePr>
         <w:numRestart w:val="eachSect"/>
@@ -7330,7 +7261,227 @@
       </w:r>
     </w:p>
   </w:footnote>
-  <w:footnote w:id="33">
+  <w:footnote w:id="15">
+    <w:p>
+      <w:pPr>
+        <w:pStyle w:val="FootnoteText"/>
+      </w:pPr>
+      <w:r>
+        <w:rPr>
+          <w:rStyle w:val="FootnoteReference"/>
+        </w:rPr>
+        <w:footnoteRef/>
+      </w:r>
+      <w:r>
+        <w:t xml:space="preserve"> </w:t>
+      </w:r>
+      <w:r>
+        <w:t xml:space="preserve">The two prompts are not symmetric. The fossil fuel prompt notes that renewables are often more cost-effective than fossil fuels, which likely gives respondents a reason not to pay more for fossil fuels, whereas the renewables prompt does not include a comparable reason not to pay for renewables. As a result, the difference between WTP for fossil fuels and WTP for renewables may reflect the wording of the prompts as well as respondents’ preferences, and should be interpreted with caution. However, the wording of each prompt was the same in every condition, so the comparison of each cue with the baseline within each energy source is not affected by the asymmetry.</w:t>
+      </w:r>
+    </w:p>
+  </w:footnote>
+  <w:footnote w:id="23">
+    <w:p>
+      <w:pPr>
+        <w:pStyle w:val="FootnoteText"/>
+      </w:pPr>
+      <w:r>
+        <w:rPr>
+          <w:rStyle w:val="FootnoteReference"/>
+        </w:rPr>
+        <w:footnoteRef/>
+      </w:r>
+      <w:r>
+        <w:t xml:space="preserve"> </w:t>
+      </w:r>
+      <w:r>
+        <w:t xml:space="preserve">Without the survey weights, neither interaction is significant (Trump cue x Republican</w:t>
+      </w:r>
+      <w:r>
+        <w:t xml:space="preserve"> </w:t>
+      </w:r>
+      <w:r>
+        <w:rPr>
+          <w:i/>
+          <w:iCs/>
+        </w:rPr>
+        <w:t xml:space="preserve">p</w:t>
+      </w:r>
+      <w:r>
+        <w:t xml:space="preserve"> </w:t>
+      </w:r>
+      <w:r>
+        <w:t xml:space="preserve">= 0.135; climate cue x Democrat</w:t>
+      </w:r>
+      <w:r>
+        <w:t xml:space="preserve"> </w:t>
+      </w:r>
+      <w:r>
+        <w:rPr>
+          <w:i/>
+          <w:iCs/>
+        </w:rPr>
+        <w:t xml:space="preserve">p</w:t>
+      </w:r>
+      <w:r>
+        <w:t xml:space="preserve"> </w:t>
+      </w:r>
+      <w:r>
+        <w:t xml:space="preserve">= 0.483). This difference reflects the demographic weights rather than the party weights. With only the demographic weights, the Trump cue x Republican interaction is similar to the estimate reported here (b = -0.51,</w:t>
+      </w:r>
+      <w:r>
+        <w:t xml:space="preserve"> </w:t>
+      </w:r>
+      <w:r>
+        <w:rPr>
+          <w:i/>
+          <w:iCs/>
+        </w:rPr>
+        <w:t xml:space="preserve">p</w:t>
+      </w:r>
+      <w:r>
+        <w:t xml:space="preserve"> </w:t>
+      </w:r>
+      <w:r>
+        <w:t xml:space="preserve">= 0.046), whereas with only the party weights it is the same as without the weights (b = -0.32,</w:t>
+      </w:r>
+      <w:r>
+        <w:t xml:space="preserve"> </w:t>
+      </w:r>
+      <w:r>
+        <w:rPr>
+          <w:i/>
+          <w:iCs/>
+        </w:rPr>
+        <w:t xml:space="preserve">p</w:t>
+      </w:r>
+      <w:r>
+        <w:t xml:space="preserve"> </w:t>
+      </w:r>
+      <w:r>
+        <w:t xml:space="preserve">= 0.135).</w:t>
+      </w:r>
+    </w:p>
+  </w:footnote>
+  <w:footnote w:id="25">
+    <w:p>
+      <w:pPr>
+        <w:pStyle w:val="FootnoteText"/>
+      </w:pPr>
+      <w:r>
+        <w:rPr>
+          <w:rStyle w:val="FootnoteReference"/>
+        </w:rPr>
+        <w:footnoteRef/>
+      </w:r>
+      <w:r>
+        <w:t xml:space="preserve"> </w:t>
+      </w:r>
+      <w:r>
+        <w:t xml:space="preserve">Because WTP is bounded at $0 and $46, I also estimate a censored-normal (Tobit) model for each source, which treats $0 as censored from below and $46 as censored from above. Those models are shown in the supplemental material.</w:t>
+      </w:r>
+    </w:p>
+  </w:footnote>
+  <w:footnote w:id="35">
+    <w:p>
+      <w:pPr>
+        <w:pStyle w:val="FootnoteText"/>
+      </w:pPr>
+      <w:r>
+        <w:rPr>
+          <w:rStyle w:val="FootnoteReference"/>
+        </w:rPr>
+        <w:footnoteRef/>
+      </w:r>
+      <w:r>
+        <w:t xml:space="preserve"> </w:t>
+      </w:r>
+      <w:r>
+        <w:t xml:space="preserve">In the Tobit model of fossil fuel WTP, the Trump cue x Republican interaction (b = 9.64,</w:t>
+      </w:r>
+      <w:r>
+        <w:t xml:space="preserve"> </w:t>
+      </w:r>
+      <w:r>
+        <w:rPr>
+          <w:i/>
+          <w:iCs/>
+        </w:rPr>
+        <w:t xml:space="preserve">p</w:t>
+      </w:r>
+      <w:r>
+        <w:t xml:space="preserve"> </w:t>
+      </w:r>
+      <w:r>
+        <w:t xml:space="preserve">= 0.028) and the climate cue x Republican interaction (b = 9.60,</w:t>
+      </w:r>
+      <w:r>
+        <w:t xml:space="preserve"> </w:t>
+      </w:r>
+      <w:r>
+        <w:rPr>
+          <w:i/>
+          <w:iCs/>
+        </w:rPr>
+        <w:t xml:space="preserve">p</w:t>
+      </w:r>
+      <w:r>
+        <w:t xml:space="preserve"> </w:t>
+      </w:r>
+      <w:r>
+        <w:t xml:space="preserve">= 0.026) are significant. However, these interactions reflect a lower WTP for fossil fuels in the cue conditions among those who identify with neither party (Trump cue b = -9.33,</w:t>
+      </w:r>
+      <w:r>
+        <w:t xml:space="preserve"> </w:t>
+      </w:r>
+      <w:r>
+        <w:rPr>
+          <w:i/>
+          <w:iCs/>
+        </w:rPr>
+        <w:t xml:space="preserve">p</w:t>
+      </w:r>
+      <w:r>
+        <w:t xml:space="preserve"> </w:t>
+      </w:r>
+      <w:r>
+        <w:t xml:space="preserve">= 0.012) rather than a higher WTP among Republicans, whose WTP for fossil fuels did not differ from the baseline in either the Trump cue (difference = 0.31,</w:t>
+      </w:r>
+      <w:r>
+        <w:t xml:space="preserve"> </w:t>
+      </w:r>
+      <w:r>
+        <w:rPr>
+          <w:i/>
+          <w:iCs/>
+        </w:rPr>
+        <w:t xml:space="preserve">p</w:t>
+      </w:r>
+      <w:r>
+        <w:t xml:space="preserve"> </w:t>
+      </w:r>
+      <w:r>
+        <w:t xml:space="preserve">= 0.893) or the climate cue (difference = 2.80,</w:t>
+      </w:r>
+      <w:r>
+        <w:t xml:space="preserve"> </w:t>
+      </w:r>
+      <w:r>
+        <w:rPr>
+          <w:i/>
+          <w:iCs/>
+        </w:rPr>
+        <w:t xml:space="preserve">p</w:t>
+      </w:r>
+      <w:r>
+        <w:t xml:space="preserve"> </w:t>
+      </w:r>
+      <w:r>
+        <w:t xml:space="preserve">= 0.215).</w:t>
+      </w:r>
+    </w:p>
+  </w:footnote>
+  <w:footnote w:id="37">
     <w:p>
       <w:pPr>
         <w:pStyle w:val="FootnoteText"/>

</xml_diff>

<commit_message>
Finish Tobit footnote and copyedit manuscript
Complete the Tobit comparison footnote, fix typos, grammar, and
terminology throughout, standardize captions, and re-render outputs.

Co-Authored-By: Claude Opus 5.5 <noreply@anthropic.com>
</commit_message>
<xml_diff>
--- a/_output/cue-WTP.docx
+++ b/_output/cue-WTP.docx
@@ -37,7 +37,7 @@
         <w:pStyle w:val="Abstract"/>
       </w:pPr>
       <w:r>
-        <w:t xml:space="preserve">The second Trump administration has promoted fossil fuels and criticized renewable energy, which may serve as a partisan cue that further polarizes the US public on energy. Using a survey experiment with a quota-based sample of US residents (N = 3,113), I examine how a Trump cue and a climate change cue shape how the public prioritizes fossil fuels versus renewables, as well as their willingness-to-pay (WTP) for each source measured with the Gabor-Granger method. Partisanship strongly predicted both outcomes, as Republicans prioritized fossil fuels and were WTP less for renewables, whereas Democrats prioritized renewables and were WTP more for them. Neither cue had an average effect on priority or WTP. The Trump cue moved Republicans toward fossil fuels on the priority scale, and the climate cue did not move Democrats toward renewables. The cues did not reliably shift WTP for either source among partisans. The results suggest that cues are more likely to move costless expressions of energy preferences than the amount the public states it is willing to pay.</w:t>
+        <w:t xml:space="preserve">The second Trump administration has promoted fossil fuels and criticized renewable energy, which may serve as a partisan cue that further polarizes the US public on energy. Using a survey experiment with a quota-based sample of US residents (N = 3,113), I examine how a Trump cue and a climate change cue shape how the public prioritizes fossil fuels versus renewables, as well as their willingness-to-pay (WTP) for each source measured with the Gabor-Granger method. Partisanship strongly predicted both outcomes, as Republicans prioritized fossil fuels and were willing to pay less for renewables, whereas Democrats prioritized renewables and were willing to pay more for them. Neither cue had an average effect on priority or WTP. The Trump cue moved Republicans toward fossil fuels on the priority scale, and the climate cue did not move Democrats toward renewables. The cues did not reliably shift WTP for either source among partisans. The results suggest that cues are more likely to move costless expressions of energy preferences than the amount the public states it is willing to pay.</w:t>
       </w:r>
     </w:p>
     <w:bookmarkStart w:id="10" w:name="introduction"/>
@@ -54,7 +54,7 @@
         <w:pStyle w:val="FirstParagraph"/>
       </w:pPr>
       <w:r>
-        <w:t xml:space="preserve">Shifting from fossil fuel sources of energy to renewables is needed to mitigate climate change. Yet, such a shift requires the commitment and support of the public. In general, the US public seems to support using more renewable sources, yet there are partisan differences in the degree of that support with Republicans tending to be more supportive of fossil fuels and Democrats tending to be more supportive of renewables</w:t>
+        <w:t xml:space="preserve">Shifting from fossil fuel sources of energy to renewables is needed to mitigate climate change. Such a shift requires the commitment and support of the public. In general, the US public seems to support using fewer fossil fuels and more renewable sources; however, there are partisan differences in the degree of that support with Republicans tending to be more supportive of fossil fuels and Democrats tending to be more supportive of renewables</w:t>
       </w:r>
       <w:r>
         <w:t xml:space="preserve"> </w:t>
@@ -63,7 +63,7 @@
         <w:t xml:space="preserve">(Bergquist, Konisky, and Kotcher 2020; Hamilton et al. 2018; Hawes and Nowlin 2022)</w:t>
       </w:r>
       <w:r>
-        <w:t xml:space="preserve">. Additionally, in the last several years, Republicans have become more supportive of fossil fuels and less supportive of renewables</w:t>
+        <w:t xml:space="preserve">. Additionally, in the last several years, Republicans’ support for fossil fuels has increased, whereas their support of renewables has decreased</w:t>
       </w:r>
       <w:r>
         <w:t xml:space="preserve"> </w:t>
@@ -72,7 +72,7 @@
         <w:t xml:space="preserve">(Kennedy and Kikuchi 2026)</w:t>
       </w:r>
       <w:r>
-        <w:t xml:space="preserve">. Finally, the rhetoric and actions of President Trump since beginning his second term have focused on expanding fossil fuels and reducing renewables. Such actions by such a divisive political actor can serve as a partisan cue for the public.</w:t>
+        <w:t xml:space="preserve">. The shift among Republicans may be, in part, a result of the rhetoric and actions of President Trump, which have focused on expanding fossil fuels and reducing renewables. Actions by such a divisive political actor can serve as a partisan cue for the public.</w:t>
       </w:r>
     </w:p>
     <w:p>
@@ -98,7 +98,7 @@
         <w:t xml:space="preserve">(Feldman and Hart 2018)</w:t>
       </w:r>
       <w:r>
-        <w:t xml:space="preserve">. Given the emphases of the second Trump administration regarding fossil fuels and renewables, it is possible that polarization among the public on energy sources may increase in response. In this paper, I explore how exposure to a Trump or climate cue, compared to an unattributed argument for fossil fuels, influences how the US public prioritizes fossil fuels versus renewables as well as their willingness-to-pay (WTP) for those energy sources.</w:t>
+        <w:t xml:space="preserve">. Given the emphases of the second Trump administration regarding fossil fuels and renewables, it is possible that polarization among the public on energy sources may increase in response. In this paper, I explore how exposure to a Trump or climate cue influences how the US public prioritizes fossil fuels versus renewables as well as their willingness-to-pay (WTP) for those energy sources.</w:t>
       </w:r>
     </w:p>
     <w:p>
@@ -124,7 +124,7 @@
         <w:t xml:space="preserve">(Cardella, Ewing, and Williams 2017)</w:t>
       </w:r>
       <w:r>
-        <w:t xml:space="preserve">, but in general are willing to pay more for renewable sources</w:t>
+        <w:t xml:space="preserve">, but in general is willing to pay more for renewable sources</w:t>
       </w:r>
       <w:r>
         <w:t xml:space="preserve"> </w:t>
@@ -248,7 +248,7 @@
         <w:pStyle w:val="BodyText"/>
       </w:pPr>
       <w:r>
-        <w:t xml:space="preserve">In addition to beliefs and attitudes, partisanship is also likely to influence an individual’s WTP. For example, conservatives were less likely to purchase an energy-efficient light bulb when it was labeled with an environmental message, as opposed to no label</w:t>
+        <w:t xml:space="preserve">In addition to beliefs and attitudes, partisanship is also likely to influence an individual’s consumption choices and WTP. For example, conservatives were less likely to purchase an energy-efficient light bulb when it was labeled with an environmental message, as opposed to no label</w:t>
       </w:r>
       <w:r>
         <w:t xml:space="preserve"> </w:t>
@@ -281,7 +281,7 @@
         <w:t xml:space="preserve"> </w:t>
       </w:r>
       <w:r>
-        <w:t xml:space="preserve">estimated an average household WTP of $177 per year for a carbon tax, with respondents favoring that the revenue be spent on clean energy investment over other uses. More recently,</w:t>
+        <w:t xml:space="preserve">estimated an average household WTP of $177 per year for a carbon tax, with respondents preferring that the revenue be spent on clean energy investment over other uses. More recently,</w:t>
       </w:r>
       <w:r>
         <w:t xml:space="preserve"> </w:t>
@@ -313,7 +313,7 @@
         <w:pStyle w:val="BodyText"/>
       </w:pPr>
       <w:r>
-        <w:t xml:space="preserve">Yet, the influence of cues may differ between costless and costly expressions of preference. Stating how energy sources should be prioritized costs a respondent nothing, so agreeing with a trusted source or disagreeing with a disliked one is easy. Indeed, research on expressive responding has found that partisan differences in survey responses shrink when respondents are given an incentive to answer accurately, which suggests that some partisan responses are an expression of support for one’s party rather than a sincere belief</w:t>
+        <w:t xml:space="preserve">The influence of cues may differ between costless and costly expressions of preference. Stating how energy sources should be prioritized is costless, so agreeing with a trusted source or disagreeing with a disliked one is easy. Indeed, research on expressive responding has found that partisan differences in survey responses shrink when respondents are given an incentive to answer accurately, which suggests that some partisan responses may be an expression of support for one’s party rather than a sincere belief</w:t>
       </w:r>
       <w:r>
         <w:t xml:space="preserve"> </w:t>
@@ -342,7 +342,7 @@
         <w:pStyle w:val="BodyText"/>
       </w:pPr>
       <w:r>
-        <w:t xml:space="preserve">Looking to work that specifically examines public WTP for renewables and fossil fuels, several studies have found that the public is WTP more for renewables than other sources of energy. For example,</w:t>
+        <w:t xml:space="preserve">Looking to work that specifically examines public WTP for renewables and fossil fuels, several studies have found that the public is willing to pay more for renewables than other sources of energy. For example,</w:t>
       </w:r>
       <w:r>
         <w:t xml:space="preserve"> </w:t>
@@ -393,9 +393,6 @@
         <w:t xml:space="preserve">estimated household WTP for a federal energy research and development fund aimed at reducing reliance on fossil fuels, and found broad support for that funding, suggesting that WTP responds to reducing fossil fuel use on its own without reference to another energy source.</w:t>
       </w:r>
       <w:r>
-        <w:t xml:space="preserve"> </w:t>
-      </w:r>
-      <w:r>
         <w:rPr>
           <w:rStyle w:val="FootnoteReference"/>
         </w:rPr>
@@ -424,7 +421,7 @@
         <w:pStyle w:val="BodyText"/>
       </w:pPr>
       <w:r>
-        <w:t xml:space="preserve">The experiment includes three conditions, and each is designed to manipulate something different. All respondents see an argument that renewables are not reliable and that fossil fuels are needed for energy security. In the baseline condition the argument is attributed to</w:t>
+        <w:t xml:space="preserve">The experiment includes three conditions: a Trump cue, a climate change cue, and a baseline. All respondents see an argument that renewables are not reliable and that fossil fuels are needed for energy security. In the baseline condition, the argument is attributed to</w:t>
       </w:r>
       <w:r>
         <w:t xml:space="preserve"> </w:t>
@@ -436,7 +433,7 @@
         <w:t xml:space="preserve"> </w:t>
       </w:r>
       <w:r>
-        <w:t xml:space="preserve">so the baseline is an unattributed argument for fossil fuels rather than the absence of a message. In the Trump condition the same argument is attributed to President Trump, so the comparison with the baseline isolates the effect of a partisan source cue. In the climate condition the unattributed argument is followed by a statement that scientists have warned that fossil fuels will make climate change worse and that renewables should be increased. The climate condition therefore combines a scientific source, a climate change frame, and a counterargument, and its comparison with the baseline captures the effect of that combined message. Because the two cue conditions differ from the baseline in different ways, I compare each cue with the baseline rather than comparing the size of the two cue effects with each other.</w:t>
+        <w:t xml:space="preserve">so the baseline is an unattributed argument for fossil fuels rather than the absence of a message. In the Trump condition, the same argument is attributed to President Trump, so the comparison with the baseline isolates the effect of a partisan source cue. In the climate condition, the unattributed argument is followed by a statement that scientists have warned that fossil fuels will make climate change worse and that renewables should be increased. The climate condition therefore combines a scientific source, a climate change frame, and a counterargument, and its comparison with the baseline captures the effect of that combined message. Because the two cue conditions differ from the baseline in different ways, I compare each cue with the baseline rather than comparing the size of the two cue effects with each other.</w:t>
       </w:r>
     </w:p>
     <w:p>
@@ -444,7 +441,7 @@
         <w:pStyle w:val="BodyText"/>
       </w:pPr>
       <w:r>
-        <w:t xml:space="preserve">Based on the research discussed above, I posit the following hypotheses.</w:t>
+        <w:t xml:space="preserve">Based on previous research, I posit the following hypotheses.</w:t>
       </w:r>
     </w:p>
     <w:p>
@@ -452,7 +449,7 @@
         <w:pStyle w:val="BlockText"/>
       </w:pPr>
       <w:r>
-        <w:t xml:space="preserve">H1a: Republicans will prioritize fossil fuels and be WTP more for fossil fuels than those who identify with neither party.</w:t>
+        <w:t xml:space="preserve">H1a: Republicans will prioritize fossil fuels and be willing to pay more for fossil fuels than those who identify with neither party.</w:t>
       </w:r>
     </w:p>
     <w:p>
@@ -460,7 +457,7 @@
         <w:pStyle w:val="BlockText"/>
       </w:pPr>
       <w:r>
-        <w:t xml:space="preserve">H1b: Democrats will prioritize renewables and be WTP more for renewables than those who identify with neither party.</w:t>
+        <w:t xml:space="preserve">H1b: Democrats will prioritize renewables and be willing to pay more for renewables than those who identify with neither party.</w:t>
       </w:r>
     </w:p>
     <w:p>
@@ -468,7 +465,7 @@
         <w:pStyle w:val="BlockText"/>
       </w:pPr>
       <w:r>
-        <w:t xml:space="preserve">H2a: Those who receive the Trump cue will prioritize fossil fuels and be WTP more for fossil fuels than those in the baseline condition.</w:t>
+        <w:t xml:space="preserve">H2a: Those who receive the Trump cue will prioritize fossil fuels and be willing to pay more for fossil fuels than those in the baseline condition.</w:t>
       </w:r>
     </w:p>
     <w:p>
@@ -476,7 +473,7 @@
         <w:pStyle w:val="BlockText"/>
       </w:pPr>
       <w:r>
-        <w:t xml:space="preserve">H2b: Those who receive the climate cue will prioritize renewables and be WTP more for renewables than those in the baseline condition.</w:t>
+        <w:t xml:space="preserve">H2b: Those who receive the climate cue will prioritize renewables and be willing to pay more for renewables than those in the baseline condition.</w:t>
       </w:r>
     </w:p>
     <w:p>
@@ -500,7 +497,7 @@
         <w:pStyle w:val="FirstParagraph"/>
       </w:pPr>
       <w:r>
-        <w:t xml:space="preserve">In addition, I examine two research questions. First, cues from a disliked source may lead partisans to move away from the position of that source</w:t>
+        <w:t xml:space="preserve">In addition, I examine two exploratory questions. First, cues from a disliked source may lead partisans to move away from the position of that source</w:t>
       </w:r>
       <w:r>
         <w:t xml:space="preserve"> </w:t>
@@ -509,12 +506,12 @@
         <w:t xml:space="preserve">(Feldman and Hart 2018)</w:t>
       </w:r>
       <w:r>
-        <w:t xml:space="preserve">, so I ask whether Democrats move toward renewables in response to the Trump cue and whether Republicans move toward fossil fuels in response to the climate cue (RQ1). Second, given the difference between costless and costly expressions of preference, I ask whether the effects of the cues on prioritization carry over to WTP (RQ2).</w:t>
+        <w:t xml:space="preserve">, so I explore whether Democrats move toward renewables in response to the Trump cue and whether Republicans move toward fossil fuels in response to the climate cue. Second, given the difference between costless and costly expressions of preference, I examine whether the effects of the cues on prioritization carry over to WTP.</w:t>
       </w:r>
     </w:p>
     <w:bookmarkEnd w:id="12"/>
     <w:bookmarkEnd w:id="13"/>
-    <w:bookmarkStart w:id="17" w:name="data-and-measures"/>
+    <w:bookmarkStart w:id="18" w:name="data-and-measures"/>
     <w:p>
       <w:pPr>
         <w:pStyle w:val="Heading1"/>
@@ -528,7 +525,7 @@
         <w:pStyle w:val="FirstParagraph"/>
       </w:pPr>
       <w:r>
-        <w:t xml:space="preserve">To examine the importance of cues and partisanship in energy preferences I use a survey experiment to examine respondents’ prioritization of fossil fuels versus renewables as well as their WTP for those sources to generate electricity in response to a Trump cue or a climate change cue. Respondents were recruited using Cloud Research, which provides a quota-based sample of US residents, with quotas for age, race, and gender based on US Census data. Additionally, to further ensure as representative a sample as possible, I used the</w:t>
+        <w:t xml:space="preserve">To examine the importance of cues and partisanship in energy preferences, I use a survey experiment to measure respondents’ prioritization of fossil fuels versus renewables as well as their WTP for those sources to generate electricity in response to a Trump cue or a climate change cue. Respondents were recruited using CloudResearch, which provides a quota-based sample of US residents, with quotas for age, race, and gender based on US Census data. Additionally, to further ensure as representative a sample as possible, I used the</w:t>
       </w:r>
       <w:r>
         <w:t xml:space="preserve"> </w:t>
@@ -573,7 +570,7 @@
         <w:t xml:space="preserve"> </w:t>
       </w:r>
       <w:r>
-        <w:t xml:space="preserve">to perform iterative raking to compute survey weights that weight respondents based on the US Census’s 2023 American Community Survey (ACS) on demographic variables, including age, race, gender, and education. I also used the Pew Research Center’s National Public Opinion Reference Survey (NPORS) from 2025 to weight the sample based on political party affiliation. With leaners assigned to a party, the NPORS targets were 45 percent Democratic, 46 percent Republican, and 9 percent identifying with neither party. I surveyed 3113 US residents in April 2026, who were randomly assigned to receive one of three treatments, including a cue about Trump’s critiques of renewable energy and his support for fossil fuels (n = 1049), a climate change cue that stated scientists recommend moving away from fossil fuels to renewables to address climate change (n = 1013), or a baseline condition in which the argument for fossil fuels was attributed to</w:t>
+        <w:t xml:space="preserve">to perform iterative raking to compute survey weights that weight respondents based on the US Census’s 2023 American Community Survey (ACS) on demographic variables, including age, race, gender, and education. I also used the Pew Research Center’s National Public Opinion Reference Survey (NPORS) from 2025 to weight the sample based on political party affiliation. With leaners assigned to a party, the NPORS targets were 45 percent Democratic, 46 percent Republican, and 9 percent identifying with neither party. I surveyed 3113 US residents in April 2026, who were randomly assigned to one of three conditions: a cue about Trump’s critiques of renewable energy and his support for fossil fuels (n = 1049), a climate change cue that stated scientists recommend moving away from fossil fuels to renewables to address climate change (n = 1013), or a baseline condition in which the argument for fossil fuels was attributed to</w:t>
       </w:r>
       <w:r>
         <w:t xml:space="preserve"> </w:t>
@@ -627,6 +624,9 @@
         </w:rPr>
         <w:t xml:space="preserve">some have</w:t>
       </w:r>
+      <w:r>
+        <w:t xml:space="preserve">.</w:t>
+      </w:r>
     </w:p>
     <w:p>
       <w:pPr>
@@ -702,7 +702,7 @@
         <w:t xml:space="preserve">(Gabor and Granger 1966)</w:t>
       </w:r>
       <w:r>
-        <w:t xml:space="preserve">. With the Gabor-Granger method, respondents are shown a random dollar amount and if they are willing to pay that amount, they are next shown a higher amount, and if they are not, they are shown a smaller amount. This approach is a well-established survey-based technique for estimating WTP. It dates to early applications of iterative-bidding price experiments</w:t>
+        <w:t xml:space="preserve">. With the Gabor-Granger method, respondents are shown a random dollar amount, and if they are willing to pay that amount, they are next shown a higher amount, and if they are not, they are shown a smaller amount. This approach is a well-established survey-based technique for estimating WTP. It dates to early applications of iterative-bidding price experiments</w:t>
       </w:r>
       <w:r>
         <w:t xml:space="preserve"> </w:t>
@@ -740,7 +740,7 @@
         <w:pStyle w:val="BodyText"/>
       </w:pPr>
       <w:r>
-        <w:t xml:space="preserve">To establish WTP, I first give respondents information about potential costs associated with each energy source, and the sources were presented in random order. The prompts were written to give respondents a plausible reason that increasing the use of each source would raise their electricity bill. In the WTP for fossil fuels question, I noted that costs associated with renewable energy have decreased and, therefore they may need to pay more to use fossil fuels</w:t>
+        <w:t xml:space="preserve">To establish WTP, I first give respondents information about potential costs associated with each energy source, and the sources were presented in random order. The prompts were written to give respondents a plausible reason that increasing the use of each source would raise their electricity bill. In the WTP for fossil fuels question, I noted that costs associated with renewable energy have decreased and, therefore, respondents may need to pay more to use fossil fuels</w:t>
       </w:r>
       <w:r>
         <w:t xml:space="preserve"> </w:t>
@@ -749,7 +749,7 @@
         <w:t xml:space="preserve">(see U.S. Energy Information Administration 2025)</w:t>
       </w:r>
       <w:r>
-        <w:t xml:space="preserve">. For renewable sources respondents were told about the need to increase distribution. Specifically, respondents were shown the following prompts for fossil fuels and renewables, respectively.</w:t>
+        <w:t xml:space="preserve">. For renewable sources, respondents were told about the need to increase distribution. Specifically, respondents were shown the following prompts for fossil fuels and renewables, respectively.</w:t>
       </w:r>
       <w:r>
         <w:rPr>
@@ -779,7 +779,7 @@
         <w:pStyle w:val="FirstParagraph"/>
       </w:pPr>
       <w:r>
-        <w:t xml:space="preserve">To estimate the maximum/minimum WTP, respondents were first shown a random dollar amount between $1 and $46, in five-dollar increments, and asked if they would be WTP that amount extra per-month in their electricity bill. If they indicated yes they were shown a larger, random dollar-amount, and if they indicated no they were shown a smaller dollar-amount. This continues until they reach the $46-maximum or $1-minimum. Each respondent’s WTP is the highest amount they accepted, and respondents who indicated no at $1 were coded with a WTP of 0. The starting and follow-up amounts were drawn at random, independently of the cue condition, but were not recorded. As such, I cannot control for the starting amount, which may anchor responses, though random assignment of the starting amount means anchoring is unlikely to differ across conditions.</w:t>
+        <w:t xml:space="preserve">To estimate the maximum/minimum WTP, respondents were first shown a random dollar amount between $1 and $46, in five-dollar increments, and asked if they would be WTP that amount extra per month on their electricity bill. If they indicated yes, they were shown a larger random dollar amount, and if they indicated no, they were shown a smaller dollar amount. This continued until they reached the $46 maximum or $1 minimum. Each respondent’s WTP is the highest amount they accepted, and respondents who indicated no at $1 were coded with a WTP of $0. The starting and follow-up amounts were drawn at random, independently of the cue condition, but were not recorded. Therefore, I cannot control for the starting amount, which may anchor responses, though random assignment of the starting amount means anchoring is unlikely to differ across conditions.</w:t>
       </w:r>
     </w:p>
     <w:p>
@@ -787,7 +787,7 @@
         <w:pStyle w:val="BodyText"/>
       </w:pPr>
       <w:r>
-        <w:t xml:space="preserve">In the following analysis, I examine the prioritization of fossil fuels vs. renewables and the WTP for those energy sources as a function of the cues and party identification. Party identification includes Democrats and Republicans, with those who identify with neither party as the excluded referent. Respondents who identified as independent or with another party were asked whether they lean toward the Democratic or Republican Party, and those who lean toward a party are coded as identifying with that party. Before leaners are assigned, 34 percent of respondents identified as independent or with another party, and after leaners are assigned, only 15 percent (n = 466) identified with neither party. Because this reference group is small, the cue effects among those who identify with neither party are estimated with less precision than the effects among partisans. Party identification was measured after the outcome questions, so the cues could, in principle, have shifted how respondents identified. However, the distribution of party identification did not differ across conditions (</w:t>
+        <w:t xml:space="preserve">In the following analysis, I examine the prioritization of fossil fuels versus renewables and the WTP for those energy sources as a function of the cues and party identification. Party identification includes Democrats and Republicans, with those who identify with neither party as the excluded referent. Respondents who identified as independent or with another party were asked whether they lean toward the Democratic or Republican Party, and those who lean toward a party are coded as identifying with that party. Before leaners are assigned, 34 percent of respondents identified as independent or with another party, and after leaners are assigned, only 15 percent (n = 466) identified with neither party. Because this reference group is small, the cue effects among those who identify with neither party are estimated with less precision than the effects among partisans. Party identification was measured after the outcome questions, so the cues could, in principle, have shifted how respondents identified. However, the distribution of party identification did not differ across conditions (</w:t>
       </w:r>
       <m:oMath>
         <m:sSup>
@@ -866,7 +866,7 @@
               <w:pStyle w:val="ImageCaption"/>
             </w:pPr>
             <w:r>
-              <w:t xml:space="preserve">Table 1: Descriptive statistics for the energy-priority scale, willingness-to-pay, and party identification (survey-weighted means and standard deviations, overall and survey-weighted means by condition)</w:t>
+              <w:t xml:space="preserve">Table 1: Descriptive statistics for the energy-priority scale, willingness-to-pay, and party identification (survey-weighted means and standard deviations, overall and by condition)</w:t>
             </w:r>
           </w:p>
           <w:tbl>
@@ -1550,11 +1550,17 @@
         </w:r>
       </w:hyperlink>
       <w:r>
-        <w:t xml:space="preserve">. The mean on the energy-priority scale was 5.17 (SD = 1.74), which is above the midpoint of 4 and indicates that respondents, on average, leaned toward prioritizing renewables over fossil fuels. Regarding party identification, 45 percent of the weighted sample were Democrats and 46 percent were Republicans, with the remaining 9 percent identifying with neither party. These shares reflect the survey weights, which weight the sample to the party affiliation distribution in the NPORS. Unweighted, 56 percent of respondents were Democrats and 29 percent were Republicans, so the weights increase the share of Republicans from 29 to 46 percent. However, because the models interact the cues with party identification, and the party weights give every respondent within a party the same weight, the party weights do not change the estimated interactions, which instead depend on the demographic weights. To account for this, I also estimate each model without the weights, and with only the party weights or only the demographic weights, and those models are shown in the supplemental material.</w:t>
-      </w:r>
-    </w:p>
-    <w:bookmarkEnd w:id="17"/>
-    <w:bookmarkStart w:id="36" w:name="results"/>
+        <w:t xml:space="preserve">. The mean on the energy-priority scale was 5.17 (SD = 1.74), which is above the midpoint of 4 and indicates that respondents, on average, leaned toward prioritizing renewables over fossil fuels. Regarding party identification, 45 percent of the weighted sample were Democrats and 46 percent were Republicans, with the remaining 9 percent identifying with neither party. These shares reflect the survey weights, which weight the sample to the party affiliation distribution in the NPORS. Unweighted, 56 percent of respondents were Democrats and 29 percent were Republicans, so the weights increase the share of Republicans from 29 to 46 percent.</w:t>
+      </w:r>
+      <w:r>
+        <w:rPr>
+          <w:rStyle w:val="FootnoteReference"/>
+        </w:rPr>
+        <w:footnoteReference w:id="17"/>
+      </w:r>
+    </w:p>
+    <w:bookmarkEnd w:id="18"/>
+    <w:bookmarkStart w:id="37" w:name="results"/>
     <w:p>
       <w:pPr>
         <w:pStyle w:val="Heading1"/>
@@ -1568,7 +1574,7 @@
         <w:pStyle w:val="FirstParagraph"/>
       </w:pPr>
       <w:r>
-        <w:t xml:space="preserve">First, I use OLS to examine the prioritization respondents gave to fossil fuels versus renewables as a function of the cues, their party identification, and the interaction between cues and party identification. The results are shown in</w:t>
+        <w:t xml:space="preserve">First, I use OLS regression to examine the prioritization respondents gave to fossil fuels versus renewables as a function of the cues, their party identification, and the interaction between cues and party identification. The results are shown in</w:t>
       </w:r>
       <w:r>
         <w:t xml:space="preserve"> </w:t>
@@ -1579,6 +1585,23 @@
             <w:rStyle w:val="Hyperlink"/>
           </w:rPr>
           <w:t xml:space="preserve">Table 2</w:t>
+        </w:r>
+      </w:hyperlink>
+      <w:r>
+        <w:t xml:space="preserve"> </w:t>
+      </w:r>
+      <w:r>
+        <w:t xml:space="preserve">and</w:t>
+      </w:r>
+      <w:r>
+        <w:t xml:space="preserve"> </w:t>
+      </w:r>
+      <w:hyperlink w:anchor="fig-priority-predicted">
+        <w:r>
+          <w:rPr>
+            <w:rStyle w:val="Hyperlink"/>
+          </w:rPr>
+          <w:t xml:space="preserve">Figure 1</w:t>
         </w:r>
       </w:hyperlink>
       <w:r>
@@ -1598,7 +1621,7 @@
       <w:tr>
         <w:tc>
           <w:tcPr/>
-          <w:bookmarkStart w:id="18" w:name="tbl-priority-ols"/>
+          <w:bookmarkStart w:id="19" w:name="tbl-priority-ols"/>
           <w:p>
             <w:pPr>
               <w:jc w:val="left"/>
@@ -1609,7 +1632,7 @@
               <w:pStyle w:val="ImageCaption"/>
             </w:pPr>
             <w:r>
-              <w:t xml:space="preserve">Table 2: Effect of cue condition, party identification, and their interaction on the energy source-priority scale (survey-weighted OLS; baseline condition and those who identify with neither party as reference)</w:t>
+              <w:t xml:space="preserve">Table 2: Effect of cue condition, party identification, and their interaction on the energy-priority scale (survey-weighted OLS; baseline condition and those who identify with neither party as reference)</w:t>
             </w:r>
           </w:p>
           <w:tbl>
@@ -2182,7 +2205,7 @@
               </w:tc>
             </w:tr>
           </w:tbl>
-          <w:bookmarkEnd w:id="18"/>
+          <w:bookmarkEnd w:id="19"/>
           <w:p/>
         </w:tc>
       </w:tr>
@@ -2200,7 +2223,7 @@
       <w:tr>
         <w:tc>
           <w:tcPr/>
-          <w:bookmarkStart w:id="22" w:name="fig-priority-predicted"/>
+          <w:bookmarkStart w:id="23" w:name="fig-priority-predicted"/>
           <w:p>
             <w:pPr>
               <w:jc w:val="center"/>
@@ -2211,7 +2234,7 @@
               <w:pStyle w:val="ImageCaption"/>
             </w:pPr>
             <w:r>
-              <w:t xml:space="preserve">Figure 1: Predicted energy source-priority scale (1-7) by cue condition and party identification (survey-weighted OLS predictions with 95% CIs)</w:t>
+              <w:t xml:space="preserve">Figure 1: Predicted energy-priority scale (1–7) by cue condition and party identification (survey-weighted OLS predictions with 95% CIs)</w:t>
             </w:r>
           </w:p>
           <w:p>
@@ -2224,18 +2247,18 @@
                 <wp:inline>
                   <wp:extent cx="5334000" cy="4267200"/>
                   <wp:effectExtent b="0" l="0" r="0" t="0"/>
-                  <wp:docPr descr="" title="" id="20" name="Picture"/>
+                  <wp:docPr descr="" title="" id="21" name="Picture"/>
                   <a:graphic>
                     <a:graphicData uri="http://schemas.openxmlformats.org/drawingml/2006/picture">
                       <pic:pic>
                         <pic:nvPicPr>
-                          <pic:cNvPr descr="cue-WTP_files/figure-docx/fig-priority-predicted-1.png" id="21" name="Picture"/>
+                          <pic:cNvPr descr="cue-WTP_files/figure-docx/fig-priority-predicted-1.png" id="22" name="Picture"/>
                           <pic:cNvPicPr>
                             <a:picLocks noChangeArrowheads="1" noChangeAspect="1"/>
                           </pic:cNvPicPr>
                         </pic:nvPicPr>
                         <pic:blipFill>
-                          <a:blip r:embed="rId19"/>
+                          <a:blip r:embed="rId20"/>
                           <a:stretch>
                             <a:fillRect/>
                           </a:stretch>
@@ -2262,7 +2285,7 @@
               </w:drawing>
             </w:r>
           </w:p>
-          <w:bookmarkEnd w:id="22"/>
+          <w:bookmarkEnd w:id="23"/>
         </w:tc>
       </w:tr>
     </w:tbl>
@@ -2271,59 +2294,13 @@
         <w:pStyle w:val="BodyText"/>
       </w:pPr>
       <w:r>
-        <w:t xml:space="preserve">As expected, Republicans were more likely to prioritize fossil fuels than renewables, with an estimated coefficient of -0.99 on the 1 to 7 scale, and Democrats prioritized renewables at 0.73. In terms of the interactions, which test whether the effect of a cue differs by party identification, the Trump cue moved Republicans toward fossil fuels more than it moved those who identify with neither party (b = -0.52). Descriptively, the predicted value on the 1 to 7 scale for Republicans in the baseline condition was 4.34, indicating a split roughly evenly between fossil fuels and renewables, and it was 3.96 for those receiving the Trump cue, a significant shift toward fossil fuels (difference = -0.38). In contrast, the climate cue did not move Democrats toward renewables more than those who identify with neither party (b = 0.01). The predicted value for Democrats was 6.06 in the baseline condition, indicating a strong priority for renewables, and 6.17 in the climate condition, which is not a significant difference.</w:t>
+        <w:t xml:space="preserve">As expected, Republicans prioritized fossil fuels more than those who identify with neither party, with an estimated coefficient of -0.99 on the 1 to 7 scale, and Democrats prioritized renewables at 0.73. In terms of the interactions, which test whether the effect of a cue differs by party identification, the Trump cue moved Republicans toward fossil fuels more than it moved those who identify with neither party (b = -0.52). Descriptively, the predicted value on the 1 to 7 scale for Republicans in the baseline condition was 4.34, indicating a roughly even split between fossil fuels and renewables, and it was 3.96 for those receiving the Trump cue, a significant shift toward fossil fuels (difference = -0.38). In contrast, the climate cue did not move Democrats toward renewables more than those who identify with neither party (b = 0.01). The predicted value for Democrats was 6.06 in the baseline condition, indicating a strong priority for renewables, and 6.17 in the climate condition, which is not a significant difference. Finally, there is no evidence that Democrats moved toward renewables in response to the Trump cue or that Republicans moved toward fossil fuels in response to the climate cue.</w:t>
       </w:r>
       <w:r>
         <w:rPr>
           <w:rStyle w:val="FootnoteReference"/>
         </w:rPr>
-        <w:footnoteReference w:id="23"/>
-      </w:r>
-      <w:r>
-        <w:t xml:space="preserve"> </w:t>
-      </w:r>
-      <w:r>
-        <w:t xml:space="preserve">Finally, there is no evidence that Democrats moved toward renewables in response to the Trump cue or that Republicans moved toward fossil fuels in response to the climate cue.</w:t>
-      </w:r>
-    </w:p>
-    <w:p>
-      <w:pPr>
-        <w:pStyle w:val="BodyText"/>
-      </w:pPr>
-      <w:r>
-        <w:t xml:space="preserve">Because the models include interactions, the coefficients for the Trump and climate cues are the effects of the cues among those who identify with neither party only. To estimate the average effect of each cue, I also estimate models with the cues alone, shown in the supplemental material. Neither cue had a significant average effect on energy source priority compared to the baseline (Trump cue b = -0.03,</w:t>
-      </w:r>
-      <w:r>
-        <w:t xml:space="preserve"> </w:t>
-      </w:r>
-      <w:r>
-        <w:rPr>
-          <w:i/>
-          <w:iCs/>
-        </w:rPr>
-        <w:t xml:space="preserve">p</w:t>
-      </w:r>
-      <w:r>
-        <w:t xml:space="preserve"> </w:t>
-      </w:r>
-      <w:r>
-        <w:t xml:space="preserve">= 0.785; climate cue b = 0.03,</w:t>
-      </w:r>
-      <w:r>
-        <w:t xml:space="preserve"> </w:t>
-      </w:r>
-      <w:r>
-        <w:rPr>
-          <w:i/>
-          <w:iCs/>
-        </w:rPr>
-        <w:t xml:space="preserve">p</w:t>
-      </w:r>
-      <w:r>
-        <w:t xml:space="preserve"> </w:t>
-      </w:r>
-      <w:r>
-        <w:t xml:space="preserve">= 0.775).</w:t>
+        <w:footnoteReference w:id="24"/>
       </w:r>
     </w:p>
     <w:p>
@@ -2361,7 +2338,7 @@
       <w:tr>
         <w:tc>
           <w:tcPr/>
-          <w:bookmarkStart w:id="24" w:name="tbl-wtp-dist"/>
+          <w:bookmarkStart w:id="25" w:name="tbl-wtp-dist"/>
           <w:p>
             <w:pPr>
               <w:jc w:val="left"/>
@@ -2882,7 +2859,7 @@
               </w:tc>
             </w:tr>
           </w:tbl>
-          <w:bookmarkEnd w:id="24"/>
+          <w:bookmarkEnd w:id="25"/>
           <w:p/>
         </w:tc>
       </w:tr>
@@ -2892,7 +2869,7 @@
         <w:pStyle w:val="BodyText"/>
       </w:pPr>
       <w:r>
-        <w:t xml:space="preserve">As shown, nearly half of respondents, 47 percent, were not willing to pay any additional amount for fossil fuels, whereas 18.3 percent were willing to pay the max, $46 for renewables. Overall, the median WTP for fossil fuels was $1 with a mean of $8.33. For renewables the median WTP was $11 and the mean was $18.21. Comparing the differences in median and means, the median difference in WTP for renewables versus fossil fuels was $10. For the mean, the difference was $9.88, which is significant based on a survey-weighted paired t-test (</w:t>
+        <w:t xml:space="preserve">As shown, nearly half of respondents, 47 percent, were not willing to pay any additional amount for fossil fuels, whereas 18.3 percent were willing to pay the maximum, $46, for renewables. Overall, the median WTP for fossil fuels was $1 with a mean of $8.33. For renewables the median WTP was $11 and the mean was $18.21. The median WTP for renewables was $10 higher than for fossil fuels, and the mean WTP was $9.88 higher, a difference that is significant based on a survey-weighted paired t-test (</w:t>
       </w:r>
       <w:r>
         <w:rPr>
@@ -2937,7 +2914,7 @@
         <w:t xml:space="preserve"> </w:t>
       </w:r>
       <w:r>
-        <w:t xml:space="preserve">&lt; .001). However, as noted above, the size of this difference is likely overstated.</w:t>
+        <w:t xml:space="preserve">&lt; .001).</w:t>
       </w:r>
     </w:p>
     <w:p>
@@ -2945,7 +2922,7 @@
         <w:pStyle w:val="BodyText"/>
       </w:pPr>
       <w:r>
-        <w:t xml:space="preserve">Given the large percentage of respondents with a WTP = $0 for fossil fuels, I model the WTP for fossil fuels in two parts. First, I use a logit model to see whether a respondent has any positive WTP. Next, using OLS, I examine the WTP for fossil fuels, among those who are WTP &gt;0, and for renewables. The results of all three models are shown in</w:t>
+        <w:t xml:space="preserve">Given the large percentage of respondents with a WTP = $0 for fossil fuels, I model the WTP for fossil fuels in two parts. First, I use a logit model to see whether a respondent has any positive WTP for fossil fuels. Next, using OLS, I examine the WTP for fossil fuels, among those with a WTP &gt; $0, and for renewables. The results of all three models are shown in</w:t>
       </w:r>
       <w:r>
         <w:t xml:space="preserve"> </w:t>
@@ -2965,7 +2942,7 @@
         <w:rPr>
           <w:rStyle w:val="FootnoteReference"/>
         </w:rPr>
-        <w:footnoteReference w:id="25"/>
+        <w:footnoteReference w:id="26"/>
       </w:r>
     </w:p>
     <w:tbl>
@@ -2981,7 +2958,7 @@
       <w:tr>
         <w:tc>
           <w:tcPr/>
-          <w:bookmarkStart w:id="26" w:name="tbl-wtp-models"/>
+          <w:bookmarkStart w:id="27" w:name="tbl-wtp-models"/>
           <w:p>
             <w:pPr>
               <w:jc w:val="left"/>
@@ -4152,7 +4129,7 @@
               </w:tc>
             </w:tr>
           </w:tbl>
-          <w:bookmarkEnd w:id="26"/>
+          <w:bookmarkEnd w:id="27"/>
           <w:p/>
         </w:tc>
       </w:tr>
@@ -4241,7 +4218,7 @@
       <w:tr>
         <w:tc>
           <w:tcPr/>
-          <w:bookmarkStart w:id="30" w:name="fig-wtp-fossil-predicted"/>
+          <w:bookmarkStart w:id="31" w:name="fig-wtp-fossil-predicted"/>
           <w:p>
             <w:pPr>
               <w:jc w:val="center"/>
@@ -4265,18 +4242,18 @@
                 <wp:inline>
                   <wp:extent cx="5334000" cy="4267200"/>
                   <wp:effectExtent b="0" l="0" r="0" t="0"/>
-                  <wp:docPr descr="" title="" id="28" name="Picture"/>
+                  <wp:docPr descr="" title="" id="29" name="Picture"/>
                   <a:graphic>
                     <a:graphicData uri="http://schemas.openxmlformats.org/drawingml/2006/picture">
                       <pic:pic>
                         <pic:nvPicPr>
-                          <pic:cNvPr descr="cue-WTP_files/figure-docx/fig-wtp-fossil-predicted-1.png" id="29" name="Picture"/>
+                          <pic:cNvPr descr="cue-WTP_files/figure-docx/fig-wtp-fossil-predicted-1.png" id="30" name="Picture"/>
                           <pic:cNvPicPr>
                             <a:picLocks noChangeArrowheads="1" noChangeAspect="1"/>
                           </pic:cNvPicPr>
                         </pic:nvPicPr>
                         <pic:blipFill>
-                          <a:blip r:embed="rId27"/>
+                          <a:blip r:embed="rId28"/>
                           <a:stretch>
                             <a:fillRect/>
                           </a:stretch>
@@ -4303,7 +4280,7 @@
               </w:drawing>
             </w:r>
           </w:p>
-          <w:bookmarkEnd w:id="30"/>
+          <w:bookmarkEnd w:id="31"/>
         </w:tc>
       </w:tr>
     </w:tbl>
@@ -4320,7 +4297,7 @@
       <w:tr>
         <w:tc>
           <w:tcPr/>
-          <w:bookmarkStart w:id="34" w:name="fig-wtp-renewable-predicted"/>
+          <w:bookmarkStart w:id="35" w:name="fig-wtp-renewable-predicted"/>
           <w:p>
             <w:pPr>
               <w:jc w:val="center"/>
@@ -4344,18 +4321,18 @@
                 <wp:inline>
                   <wp:extent cx="5334000" cy="4267200"/>
                   <wp:effectExtent b="0" l="0" r="0" t="0"/>
-                  <wp:docPr descr="" title="" id="32" name="Picture"/>
+                  <wp:docPr descr="" title="" id="33" name="Picture"/>
                   <a:graphic>
                     <a:graphicData uri="http://schemas.openxmlformats.org/drawingml/2006/picture">
                       <pic:pic>
                         <pic:nvPicPr>
-                          <pic:cNvPr descr="cue-WTP_files/figure-docx/fig-wtp-renewable-predicted-1.png" id="33" name="Picture"/>
+                          <pic:cNvPr descr="cue-WTP_files/figure-docx/fig-wtp-renewable-predicted-1.png" id="34" name="Picture"/>
                           <pic:cNvPicPr>
                             <a:picLocks noChangeArrowheads="1" noChangeAspect="1"/>
                           </pic:cNvPicPr>
                         </pic:nvPicPr>
                         <pic:blipFill>
-                          <a:blip r:embed="rId31"/>
+                          <a:blip r:embed="rId32"/>
                           <a:stretch>
                             <a:fillRect/>
                           </a:stretch>
@@ -4382,7 +4359,7 @@
               </w:drawing>
             </w:r>
           </w:p>
-          <w:bookmarkEnd w:id="34"/>
+          <w:bookmarkEnd w:id="35"/>
         </w:tc>
       </w:tr>
     </w:tbl>
@@ -4397,7 +4374,7 @@
         <w:rPr>
           <w:rStyle w:val="FootnoteReference"/>
         </w:rPr>
-        <w:footnoteReference w:id="35"/>
+        <w:footnoteReference w:id="36"/>
       </w:r>
     </w:p>
     <w:p>
@@ -4477,7 +4454,47 @@
         <w:pStyle w:val="BodyText"/>
       </w:pPr>
       <w:r>
-        <w:t xml:space="preserve">The absence of reliable cue effects on WTP among partisans should not be read as evidence that the cues have no effect on WTP. With 80 percent power and</w:t>
+        <w:t xml:space="preserve">Comparing the results to the hypotheses, the support is mixed. As expected, partisanship shaped both preferences and WTP, largely supporting H1a and H1b. Republicans prioritized fossil fuels more than those who identify with neither party, were more likely to have any positive WTP for fossil fuels, and were willing to pay less for renewables. Democrats, in contrast, prioritized renewables, were less likely to have any positive WTP for fossil fuels, and were willing to pay more for renewables. However, among those with any WTP for fossil fuels, Republicans were not willing to pay more than others. H2a and H2b were not supported, as neither the Trump cue nor the climate cue had a significant average effect on energy priority or WTP for either source compared to the baseline condition. H3a received limited support. The Trump cue moved Republicans toward fossil fuels on the priority scale. H3b was not supported, as the climate cue did not move Democrats toward renewables on the priority scale, and the climate cue x Democrat interaction for renewables WTP reflects a decline among those who identify with neither party rather than an increase among Democrats. Additionally, there was no evidence of a backlash effect, as neither cue led partisans to move away from the position of the source. Finally, the shift in priority among Republicans did not carry over to WTP, as Republicans in the Trump cue did not differ from those in the baseline in their WTP for fossil fuels. These results suggest that cues are likely more effective at moving the priority the public gives to energy sources than the amount they are willing to pay, though the design could not detect small effects on WTP.</w:t>
+      </w:r>
+    </w:p>
+    <w:bookmarkEnd w:id="37"/>
+    <w:bookmarkStart w:id="39" w:name="discussion-and-conclusion"/>
+    <w:p>
+      <w:pPr>
+        <w:pStyle w:val="Heading1"/>
+      </w:pPr>
+      <w:r>
+        <w:t xml:space="preserve">Discussion and Conclusion</w:t>
+      </w:r>
+    </w:p>
+    <w:p>
+      <w:pPr>
+        <w:pStyle w:val="FirstParagraph"/>
+      </w:pPr>
+      <w:r>
+        <w:t xml:space="preserve">A clean energy transition is needed to mitigate climate change, and public support is needed for the energy transition. However, President Trump’s rhetoric and actions on energy may serve to polarize the public. This study examined how exposure to a Trump cue or a climate change cue shapes the US public’s prioritization of, and willingness-to-pay for, fossil fuel versus renewable sources of electricity, and how these responses are shaped by partisanship. The results show that support for energy sources is polarized along partisan lines, both in how respondents prioritized fossil fuels against renewables and in the dollar amounts they were willing to pay. There is also some evidence that a Trump cue moved Republicans toward fossil fuels. In contrast, the climate cue did not move Democrats toward renewables, which is likely because Democrats already strongly prioritized renewables in the baseline condition. Together, these findings suggest that a cue from a polarizing figure such as President Trump may exacerbate existing partisan divisions in how the public prioritizes energy sources.</w:t>
+      </w:r>
+    </w:p>
+    <w:p>
+      <w:pPr>
+        <w:pStyle w:val="BodyText"/>
+      </w:pPr>
+      <w:r>
+        <w:t xml:space="preserve">The cue effects were also uneven across the two outcomes. Partisanship appears to condition the effect of the Trump cue on prioritization, but not on WTP. The Trump cue did not significantly change WTP for fossil fuels among Republicans. This is likely because stating a priority is costless, whereas stating a WTP asks respondents to consider a cost to their own household. Agreeing with a trusted source, or reacting to a cue, may be easy when nothing is at stake, but the concrete cost of an increase in an electricity bill may limit the influence of cues, especially in times of concern about rising energy costs.</w:t>
+      </w:r>
+      <w:r>
+        <w:rPr>
+          <w:rStyle w:val="FootnoteReference"/>
+        </w:rPr>
+        <w:footnoteReference w:id="38"/>
+      </w:r>
+    </w:p>
+    <w:p>
+      <w:pPr>
+        <w:pStyle w:val="BodyText"/>
+      </w:pPr>
+      <w:r>
+        <w:t xml:space="preserve">A single cue is likely a weaker treatment than the sustained rhetoric respondents may encounter outside of a survey. The few cue x party identification interactions for WTP that reached significance reflected a lower WTP among those who identify with neither party rather than a shift among partisans, and this small group is estimated with less precision. However, the design could only detect relatively large interaction effects on WTP, so small effects of the cues on WTP cannot be ruled out. With 80 percent power and</w:t>
       </w:r>
       <w:r>
         <w:t xml:space="preserve"> </w:t>
@@ -4491,7 +4508,7 @@
         <w:t xml:space="preserve"> </w:t>
       </w:r>
       <w:r>
-        <w:t xml:space="preserve">= .05, the smallest interaction effects the design could reliably detect are $7.15 to 7.61 for renewables and $9.50 to 9.86 for the amount of fossil fuel WTP, compared with 0.58 to 0.72 points for the priority scale. Smaller effects of the cues on WTP cannot be ruled out. Additionally, neither cue had a significant average effect on WTP for either source in the models with the cues alone (all</w:t>
+        <w:t xml:space="preserve">= .05, the smallest interaction effects the design could reliably detect are $7.15 to 7.61 for renewables and $9.50 to 9.86 for the amount of fossil fuel WTP, compared with 0.58 to 0.72 points for the priority scale. Additionally, neither cue had a significant average effect on WTP for either source in the models with the cues alone (all</w:t>
       </w:r>
       <w:r>
         <w:t xml:space="preserve"> </w:t>
@@ -4526,23 +4543,7 @@
         <w:pStyle w:val="BodyText"/>
       </w:pPr>
       <w:r>
-        <w:t xml:space="preserve">Overall, respondents leaned toward renewables on the priority scale, and the WTP for renewables was higher than for fossil fuels. The difference in WTP was also not uniform across groups. For example, among Republicans in the Trump cue, the WTP for renewables did not differ significantly from the WTP for fossil fuels (difference = $1.82,</w:t>
-      </w:r>
-      <w:r>
-        <w:t xml:space="preserve"> </w:t>
-      </w:r>
-      <w:r>
-        <w:rPr>
-          <w:i/>
-          <w:iCs/>
-        </w:rPr>
-        <w:t xml:space="preserve">p</w:t>
-      </w:r>
-      <w:r>
-        <w:t xml:space="preserve"> </w:t>
-      </w:r>
-      <w:r>
-        <w:t xml:space="preserve">= 0.153).</w:t>
+        <w:t xml:space="preserve">These results carry several implications for climate and energy policy. First, respondents, on average, leaned toward prioritizing renewables over fossil fuels, with a mean of 5.17 on the 1 to 7 scale, and 86 percent of respondents reported some positive WTP for renewables. This suggests that renewable energy investment likely has general public support even in a polarized environment. Second, given the responsiveness of Republicans to the Trump cue, elite rhetoric, including rhetoric tied to a single prominent figure, may widen the partisan gap in energy preferences further, which is a risk for those seeking durable, bipartisan agreement on energy policy. Third, because the cues did not shift prioritization in the sample overall and did not reliably shift WTP, messaging strategies aimed at building broad coalitions for the energy transition likely benefit from emphasizing shared, cross-partisan benefits of renewables, such as reliability or local economic development, rather than frames tied to a specific political figure or to climate change.</w:t>
       </w:r>
     </w:p>
     <w:p>
@@ -4550,25 +4551,7 @@
         <w:pStyle w:val="BodyText"/>
       </w:pPr>
       <w:r>
-        <w:t xml:space="preserve">Comparing the results to the hypotheses, the support is mixed. As expected, partisanship shaped both preferences and WTP, largely supporting H1a and H1b. Republicans prioritized fossil fuels more than those who identify with neither party, were more likely to have any positive WTP for fossil fuels, and were WTP less for renewables. Democrats, in contrast, prioritized renewables, were less likely to have any positive WTP for fossil fuels, and were WTP more for renewables. However, among those WTP something for fossil fuels, Republicans were not WTP more than others. H2a and H2b were not supported, as neither the Trump cue nor the climate cue had a significant average effect on energy priority or WTP for either source compared to the baseline condition. H3a received limited support. The Trump cue moved Republicans toward fossil fuels on the priority scale. H3b was not supported, as the climate cue did not move Democrats toward renewables on the priority scale, and the climate cue x Democrat interaction for renewables WTP reflects a decline among those who identify with neither party rather than an increase among Democrats. Regarding RQ1, there was no evidence that either cue led partisans to move away from the position of the source. Regarding RQ2, the shift in priority among Republicans did not carry over to WTP, as Republicans in the Trump cue did not differ from those in the baseline in their WTP for fossil fuels. These results suggest that cues are likely more effective at moving the priority the public gives to energy sources than the amount they are willing to pay, though the design could not detect small effects on WTP.</w:t>
-      </w:r>
-    </w:p>
-    <w:bookmarkEnd w:id="36"/>
-    <w:bookmarkStart w:id="38" w:name="discussion-and-conclusion"/>
-    <w:p>
-      <w:pPr>
-        <w:pStyle w:val="Heading1"/>
-      </w:pPr>
-      <w:r>
-        <w:t xml:space="preserve">Discussion and Conclusion</w:t>
-      </w:r>
-    </w:p>
-    <w:p>
-      <w:pPr>
-        <w:pStyle w:val="FirstParagraph"/>
-      </w:pPr>
-      <w:r>
-        <w:t xml:space="preserve">A clean energy transition is needed to mitigate climate change, and public support is needed for the energy transition. However, President Trump’s rhetoric and actions on energy may serve to polarize the public. This study examined how exposure to a Trump cue or a climate change cue shapes the US public’s prioritization of, and willingness-to-pay for, fossil fuel versus renewable electricity, and how these responses are shaped by partisanship. The results show that support for energy sources is polarized along partisan lines, both in how respondents prioritized fossil fuels against renewables and in the dollar amounts they were willing to pay. There is also some evidence that a Trump cue moved Republicans toward fossil fuels, though this effect should be considered tentative. In contrast, the climate cue did not move Democrats toward renewables, which is likely because Democrats already strongly prioritized renewables in the baseline condition. Together, these findings suggest that a cue from a polarizing figure such as President Trump may further exacerbate existing partisan divisions in how the public prioritizes energy sources.</w:t>
+        <w:t xml:space="preserve">This study has some limitations. First, respondents were recruited from an opt-in, quota-based panel rather than a probability sample. Second, the WTP prompts were not symmetric, as the fossil fuel prompt included a reason not to pay for fossil fuels, which likely inflates the difference between WTP for renewables and fossil fuels. Third, the conditions were not parallel. The Trump cue changed only the source of the argument for fossil fuels, whereas the climate cue added a scientific source, a climate change frame, and a counterargument, so the effects of the two cues cannot be compared directly. Fourth, party identification was measured after the outcomes, though its distribution did not differ across conditions. Additionally, after leaners are assigned to a party, the reference group of those who identify with neither party is small. Fifth, the survey did not include attention or manipulation checks, and the starting amounts for the WTP questions were not recorded. Finally, the WTP measure relies on a hypothetical, stated-preference elicitation, and stated WTP does not always translate into WTP once a real price change is introduced. The cues were also each delivered once, in a single survey context, and their effects may not persist or generalize to the repeated, cumulative exposure people experience outside of a survey.</w:t>
       </w:r>
     </w:p>
     <w:p>
@@ -4576,47 +4559,11 @@
         <w:pStyle w:val="BodyText"/>
       </w:pPr>
       <w:r>
-        <w:t xml:space="preserve">The cue effects were also uneven across the two outcomes. Partisanship appears to condition the effect of the Trump cue on prioritization, but not on WTP. For example, the Trump cue did not significantly change WTP for fossil fuels among Republicans. This is likely because stating a priority is costless, whereas stating a WTP asks respondents to consider a cost to their own household. Agreeing with a trusted source, or reacting to a cue, may be easy when nothing is at stake, but the concrete cost of an increase in an electricity bill may limit the influence of cues, especially in times of concern about rising energy costs.</w:t>
-      </w:r>
-      <w:r>
-        <w:rPr>
-          <w:rStyle w:val="FootnoteReference"/>
-        </w:rPr>
-        <w:footnoteReference w:id="37"/>
-      </w:r>
-      <w:r>
-        <w:t xml:space="preserve"> </w:t>
-      </w:r>
-      <w:r>
-        <w:t xml:space="preserve">Additionally, a single cue is likely a weaker treatment than the sustained rhetoric respondents may encounter outside of a survey. The few cue x party identification interactions for WTP that reached significance reflected a lower WTP among those who identify with neither party rather than a shift among partisans, and this small group is estimated with less precision. However, the design could only detect relatively large interaction effects on WTP, so small effects of the cues on WTP cannot be ruled out.</w:t>
-      </w:r>
-    </w:p>
-    <w:p>
-      <w:pPr>
-        <w:pStyle w:val="BodyText"/>
-      </w:pPr>
-      <w:r>
-        <w:t xml:space="preserve">These results carry several implications for climate and energy policy. First, respondents, on average, leaned toward prioritizing renewables over fossil fuels, with a mean of 5.17 on the 1 to 7 scale, and 86 percent of respondents reported some positive WTP for renewables. This suggests that renewable energy investment likely has general public support even in a polarized environment. Second, if the tentative responsiveness of Republicans to the Trump cue holds, elite rhetoric, including rhetoric tied to a single prominent figure, may widen the partisan gap in energy preferences further, which is a risk for policymakers seeking durable, bipartisan support for energy policy. Third, because the cues did not shift prioritization in the sample overall and did not reliably shift WTP, messaging strategies aimed at building broad coalitions for the energy transition likely benefit from emphasizing shared, cross-partisan benefits of renewables, such as reliability or local economic development, rather than frames tied to a specific political figure or to climate change.</w:t>
-      </w:r>
-    </w:p>
-    <w:p>
-      <w:pPr>
-        <w:pStyle w:val="BodyText"/>
-      </w:pPr>
-      <w:r>
-        <w:t xml:space="preserve">This study has some limitations. First, respondents were recruited from an opt-in, quota-based panel rather than a probability sample, and the Trump cue x Republican interaction for the priority scale depends on the demographic weights, as it is not significant without them. Second, the WTP prompts were not symmetric, as the fossil fuel prompt included a reason not to pay for fossil fuels, which likely inflates the difference between WTP for renewables and fossil fuels. Third, the conditions were not parallel. The Trump cue changed only the source of the argument for fossil fuels, whereas the climate cue added a scientific source, a climate change frame, and a counterargument, so the effects of the two cues cannot be compared directly. Fourth, party identification was measured after the outcomes, though its distribution did not differ across conditions. Additionally, after leaners are assigned to a party, the reference group of those who identify with neither party is small. Fifth, the survey did not include attention or manipulation checks, and the starting amounts for the WTP questions were not recorded. Finally, the WTP measure relies on a hypothetical, stated-preference elicitation, and stated WTP does not always translate into WTP once a real price change is introduced. The cues were also each delivered once, in a single survey context, and their effects may not persist or generalize to the repeated, cumulative exposure people experience outside of a survey.</w:t>
-      </w:r>
-    </w:p>
-    <w:p>
-      <w:pPr>
-        <w:pStyle w:val="BodyText"/>
-      </w:pPr>
-      <w:r>
         <w:t xml:space="preserve">Future research should examine whether repeated exposure to partisan cues over time widens the partisan gap in energy preferences identified here, and whether the cues have larger effects on WTP when respondents are asked to pay the stated amount rather than simply report it. Future research should also use parallel cue conditions and symmetric WTP prompts, and test whether cue effects on costless and costly expressions of preference differ within the same respondents.</w:t>
       </w:r>
     </w:p>
-    <w:bookmarkEnd w:id="38"/>
-    <w:bookmarkStart w:id="40" w:name="statements-and-declarations"/>
+    <w:bookmarkEnd w:id="39"/>
+    <w:bookmarkStart w:id="41" w:name="statements-and-declarations"/>
     <w:p>
       <w:pPr>
         <w:pStyle w:val="Heading1"/>
@@ -4681,7 +4628,7 @@
       <w:r>
         <w:t xml:space="preserve"> </w:t>
       </w:r>
-      <w:hyperlink r:id="rId39">
+      <w:hyperlink r:id="rId40">
         <w:r>
           <w:rPr>
             <w:rStyle w:val="Hyperlink"/>
@@ -4698,8 +4645,8 @@
         <w:br w:type="page"/>
       </w:r>
     </w:p>
-    <w:bookmarkEnd w:id="40"/>
-    <w:bookmarkStart w:id="73" w:name="references"/>
+    <w:bookmarkEnd w:id="41"/>
+    <w:bookmarkStart w:id="74" w:name="references"/>
     <w:p>
       <w:pPr>
         <w:pStyle w:val="Heading1"/>
@@ -4708,8 +4655,8 @@
         <w:t xml:space="preserve">References</w:t>
       </w:r>
     </w:p>
-    <w:bookmarkStart w:id="72" w:name="refs"/>
-    <w:bookmarkStart w:id="41" w:name="ref-aldyWillingnessPayPolitical2012"/>
+    <w:bookmarkStart w:id="73" w:name="refs"/>
+    <w:bookmarkStart w:id="42" w:name="ref-aldyWillingnessPayPolitical2012"/>
     <w:p>
       <w:pPr>
         <w:pStyle w:val="Bibliography"/>
@@ -4773,8 +4720,8 @@
         <w:t xml:space="preserve">2(8): 596–99.</w:t>
       </w:r>
     </w:p>
-    <w:bookmarkEnd w:id="41"/>
-    <w:bookmarkStart w:id="42" w:name="ref-benegalCostSensitivityPartisan2024"/>
+    <w:bookmarkEnd w:id="42"/>
+    <w:bookmarkStart w:id="43" w:name="ref-benegalCostSensitivityPartisan2024"/>
     <w:p>
       <w:pPr>
         <w:pStyle w:val="Bibliography"/>
@@ -4844,8 +4791,8 @@
         <w:t xml:space="preserve">14(4): 763–75.</w:t>
       </w:r>
     </w:p>
-    <w:bookmarkEnd w:id="42"/>
-    <w:bookmarkStart w:id="43" w:name="ref-bergquistEnergyPolicyPublic2020"/>
+    <w:bookmarkEnd w:id="43"/>
+    <w:bookmarkStart w:id="44" w:name="ref-bergquistEnergyPolicyPublic2020"/>
     <w:p>
       <w:pPr>
         <w:pStyle w:val="Bibliography"/>
@@ -4927,8 +4874,8 @@
         <w:t xml:space="preserve">2(3): 032003.</w:t>
       </w:r>
     </w:p>
-    <w:bookmarkEnd w:id="43"/>
-    <w:bookmarkStart w:id="44" w:name="ref-bolsenInfluencePartisanMotivated2014"/>
+    <w:bookmarkEnd w:id="44"/>
+    <w:bookmarkStart w:id="45" w:name="ref-bolsenInfluencePartisanMotivated2014"/>
     <w:p>
       <w:pPr>
         <w:pStyle w:val="Bibliography"/>
@@ -4992,8 +4939,8 @@
         <w:t xml:space="preserve">36(2): 235–62.</w:t>
       </w:r>
     </w:p>
-    <w:bookmarkEnd w:id="44"/>
-    <w:bookmarkStart w:id="45" w:name="ref-borchersDoesWillingnessPay2007"/>
+    <w:bookmarkEnd w:id="45"/>
+    <w:bookmarkStart w:id="46" w:name="ref-borchersDoesWillingnessPay2007"/>
     <w:p>
       <w:pPr>
         <w:pStyle w:val="Bibliography"/>
@@ -5069,8 +5016,8 @@
         <w:t xml:space="preserve">35(6): 3327–34.</w:t>
       </w:r>
     </w:p>
-    <w:bookmarkEnd w:id="45"/>
-    <w:bookmarkStart w:id="46" w:name="ref-breidertReviewMethodsMeasuring2006"/>
+    <w:bookmarkEnd w:id="46"/>
+    <w:bookmarkStart w:id="47" w:name="ref-breidertReviewMethodsMeasuring2006"/>
     <w:p>
       <w:pPr>
         <w:pStyle w:val="Bibliography"/>
@@ -5140,8 +5087,8 @@
         <w:t xml:space="preserve">2(4): 8–32.</w:t>
       </w:r>
     </w:p>
-    <w:bookmarkEnd w:id="46"/>
-    <w:bookmarkStart w:id="47" w:name="ref-bullockPartisanBiasFactual2015"/>
+    <w:bookmarkEnd w:id="47"/>
+    <w:bookmarkStart w:id="48" w:name="ref-bullockPartisanBiasFactual2015"/>
     <w:p>
       <w:pPr>
         <w:pStyle w:val="Bibliography"/>
@@ -5205,8 +5152,8 @@
         <w:t xml:space="preserve">10(4): 519–78.</w:t>
       </w:r>
     </w:p>
-    <w:bookmarkEnd w:id="47"/>
-    <w:bookmarkStart w:id="48" w:name="X8f8eebcd7a9410a4d8f16f6da906bc2a1f7110e"/>
+    <w:bookmarkEnd w:id="48"/>
+    <w:bookmarkStart w:id="49" w:name="X8f8eebcd7a9410a4d8f16f6da906bc2a1f7110e"/>
     <w:p>
       <w:pPr>
         <w:pStyle w:val="Bibliography"/>
@@ -5291,8 +5238,8 @@
         <w:t xml:space="preserve">62: 428–37.</w:t>
       </w:r>
     </w:p>
-    <w:bookmarkEnd w:id="48"/>
-    <w:bookmarkStart w:id="49" w:name="ref-druckmanHowElitePartisan2013"/>
+    <w:bookmarkEnd w:id="49"/>
+    <w:bookmarkStart w:id="50" w:name="ref-druckmanHowElitePartisan2013"/>
     <w:p>
       <w:pPr>
         <w:pStyle w:val="Bibliography"/>
@@ -5332,8 +5279,8 @@
         <w:t xml:space="preserve">107(01): 57–79.</w:t>
       </w:r>
     </w:p>
-    <w:bookmarkEnd w:id="49"/>
-    <w:bookmarkStart w:id="50" w:name="Xd021f1bc7383e3e1df188ec6ac9fbfebe3f9b3a"/>
+    <w:bookmarkEnd w:id="50"/>
+    <w:bookmarkStart w:id="51" w:name="Xd021f1bc7383e3e1df188ec6ac9fbfebe3f9b3a"/>
     <w:p>
       <w:pPr>
         <w:pStyle w:val="Bibliography"/>
@@ -5394,8 +5341,8 @@
         <w:t xml:space="preserve">9(3): 308–18.</w:t>
       </w:r>
     </w:p>
-    <w:bookmarkEnd w:id="50"/>
-    <w:bookmarkStart w:id="51" w:name="ref-feldmanClimateChangePolarizing2018"/>
+    <w:bookmarkEnd w:id="51"/>
+    <w:bookmarkStart w:id="52" w:name="ref-feldmanClimateChangePolarizing2018"/>
     <w:p>
       <w:pPr>
         <w:pStyle w:val="Bibliography"/>
@@ -5480,8 +5427,8 @@
         <w:t xml:space="preserve">51: 54–66.</w:t>
       </w:r>
     </w:p>
-    <w:bookmarkEnd w:id="51"/>
-    <w:bookmarkStart w:id="52" w:name="ref-gaborPriceIndicatorQuality1966"/>
+    <w:bookmarkEnd w:id="52"/>
+    <w:bookmarkStart w:id="53" w:name="ref-gaborPriceIndicatorQuality1966"/>
     <w:p>
       <w:pPr>
         <w:pStyle w:val="Bibliography"/>
@@ -5554,8 +5501,8 @@
         <w:t xml:space="preserve">33: 43–70.</w:t>
       </w:r>
     </w:p>
-    <w:bookmarkEnd w:id="52"/>
-    <w:bookmarkStart w:id="53" w:name="ref-grometPoliticalIdeologyAffects2013"/>
+    <w:bookmarkEnd w:id="53"/>
+    <w:bookmarkStart w:id="54" w:name="ref-grometPoliticalIdeologyAffects2013"/>
     <w:p>
       <w:pPr>
         <w:pStyle w:val="Bibliography"/>
@@ -5607,8 +5554,8 @@
         <w:t xml:space="preserve">110(23): 9314–19.</w:t>
       </w:r>
     </w:p>
-    <w:bookmarkEnd w:id="53"/>
-    <w:bookmarkStart w:id="54" w:name="ref-hamiltonChangeWindUS2018"/>
+    <w:bookmarkEnd w:id="54"/>
+    <w:bookmarkStart w:id="55" w:name="ref-hamiltonChangeWindUS2018"/>
     <w:p>
       <w:pPr>
         <w:pStyle w:val="Bibliography"/>
@@ -5693,8 +5640,8 @@
         <w:t xml:space="preserve">8(1): 11.</w:t>
       </w:r>
     </w:p>
-    <w:bookmarkEnd w:id="54"/>
-    <w:bookmarkStart w:id="55" w:name="ref-hawesClimateSciencePolitics2022"/>
+    <w:bookmarkEnd w:id="55"/>
+    <w:bookmarkStart w:id="56" w:name="ref-hawesClimateSciencePolitics2022"/>
     <w:p>
       <w:pPr>
         <w:pStyle w:val="Bibliography"/>
@@ -5815,8 +5762,8 @@
         <w:t xml:space="preserve">85: 102419.</w:t>
       </w:r>
     </w:p>
-    <w:bookmarkEnd w:id="55"/>
-    <w:bookmarkStart w:id="56" w:name="ref-jonesSurveyTechniqueMeasure1975"/>
+    <w:bookmarkEnd w:id="56"/>
+    <w:bookmarkStart w:id="57" w:name="ref-jonesSurveyTechniqueMeasure1975"/>
     <w:p>
       <w:pPr>
         <w:pStyle w:val="Bibliography"/>
@@ -5880,8 +5827,8 @@
         <w:t xml:space="preserve">39(3): 75–77.</w:t>
       </w:r>
     </w:p>
-    <w:bookmarkEnd w:id="56"/>
-    <w:bookmarkStart w:id="57" w:name="ref-kennedyAmericansShiftingViews2026"/>
+    <w:bookmarkEnd w:id="57"/>
+    <w:bookmarkStart w:id="58" w:name="ref-kennedyAmericansShiftingViews2026"/>
     <w:p>
       <w:pPr>
         <w:pStyle w:val="Bibliography"/>
@@ -5935,8 +5882,8 @@
         <w:t xml:space="preserve">https://www.pewresearch.org/science/2026/04/03/americans-shifting-views-on-energy-issues/ (April 21, 2026).</w:t>
       </w:r>
     </w:p>
-    <w:bookmarkEnd w:id="57"/>
-    <w:bookmarkStart w:id="58" w:name="ref-knappWillConsumersReally2020"/>
+    <w:bookmarkEnd w:id="58"/>
+    <w:bookmarkStart w:id="59" w:name="ref-knappWillConsumersReally2020"/>
     <w:p>
       <w:pPr>
         <w:pStyle w:val="Bibliography"/>
@@ -6033,8 +5980,8 @@
         <w:t xml:space="preserve">65: 101457.</w:t>
       </w:r>
     </w:p>
-    <w:bookmarkEnd w:id="58"/>
-    <w:bookmarkStart w:id="59" w:name="X83362c7a395811c107646b0a251a2c1915acb0e"/>
+    <w:bookmarkEnd w:id="59"/>
+    <w:bookmarkStart w:id="60" w:name="X83362c7a395811c107646b0a251a2c1915acb0e"/>
     <w:p>
       <w:pPr>
         <w:pStyle w:val="Bibliography"/>
@@ -6107,8 +6054,8 @@
         <w:t xml:space="preserve">55: 617–25.</w:t>
       </w:r>
     </w:p>
-    <w:bookmarkEnd w:id="59"/>
-    <w:bookmarkStart w:id="60" w:name="ref-kotchenPublicWillingnessPay2017"/>
+    <w:bookmarkEnd w:id="60"/>
+    <w:bookmarkStart w:id="61" w:name="ref-kotchenPublicWillingnessPay2017"/>
     <w:p>
       <w:pPr>
         <w:pStyle w:val="Bibliography"/>
@@ -6208,8 +6155,8 @@
         <w:t xml:space="preserve">12(9).</w:t>
       </w:r>
     </w:p>
-    <w:bookmarkEnd w:id="60"/>
-    <w:bookmarkStart w:id="61" w:name="ref-liPublicSupportReducing2009"/>
+    <w:bookmarkEnd w:id="61"/>
+    <w:bookmarkStart w:id="62" w:name="ref-liPublicSupportReducing2009"/>
     <w:p>
       <w:pPr>
         <w:pStyle w:val="Bibliography"/>
@@ -6312,8 +6259,8 @@
         <w:t xml:space="preserve">68(3): 731–42.</w:t>
       </w:r>
     </w:p>
-    <w:bookmarkEnd w:id="61"/>
-    <w:bookmarkStart w:id="62" w:name="ref-lipovetskyPricingModelsMarketing2011"/>
+    <w:bookmarkEnd w:id="62"/>
+    <w:bookmarkStart w:id="63" w:name="ref-lipovetskyPricingModelsMarketing2011"/>
     <w:p>
       <w:pPr>
         <w:pStyle w:val="Bibliography"/>
@@ -6365,8 +6312,8 @@
         <w:t xml:space="preserve">3(5): 167–74.</w:t>
       </w:r>
     </w:p>
-    <w:bookmarkEnd w:id="62"/>
-    <w:bookmarkStart w:id="63" w:name="ref-merkleyPartyCuesNews2021"/>
+    <w:bookmarkEnd w:id="63"/>
+    <w:bookmarkStart w:id="64" w:name="ref-merkleyPartyCuesNews2021"/>
     <w:p>
       <w:pPr>
         <w:pStyle w:val="Bibliography"/>
@@ -6457,8 +6404,8 @@
         <w:t xml:space="preserve">51(4): 1439–56.</w:t>
       </w:r>
     </w:p>
-    <w:bookmarkEnd w:id="63"/>
-    <w:bookmarkStart w:id="64" w:name="ref-murakamiConsumersWillingnessPay2015"/>
+    <w:bookmarkEnd w:id="64"/>
+    <w:bookmarkStart w:id="65" w:name="ref-murakamiConsumersWillingnessPay2015"/>
     <w:p>
       <w:pPr>
         <w:pStyle w:val="Bibliography"/>
@@ -6567,8 +6514,8 @@
         <w:t xml:space="preserve">50: 178–89.</w:t>
       </w:r>
     </w:p>
-    <w:bookmarkEnd w:id="64"/>
-    <w:bookmarkStart w:id="65" w:name="ref-nkansahWillingnessPayWind2019"/>
+    <w:bookmarkEnd w:id="65"/>
+    <w:bookmarkStart w:id="66" w:name="ref-nkansahWillingnessPayWind2019"/>
     <w:p>
       <w:pPr>
         <w:pStyle w:val="Bibliography"/>
@@ -6644,8 +6591,8 @@
         <w:t xml:space="preserve">48(1): 44–70.</w:t>
       </w:r>
     </w:p>
-    <w:bookmarkEnd w:id="65"/>
-    <w:bookmarkStart w:id="66" w:name="ref-priorYouCannotBe2015a"/>
+    <w:bookmarkEnd w:id="66"/>
+    <w:bookmarkStart w:id="67" w:name="ref-priorYouCannotBe2015a"/>
     <w:p>
       <w:pPr>
         <w:pStyle w:val="Bibliography"/>
@@ -6754,8 +6701,8 @@
         <w:t xml:space="preserve">10(4): 489–518.</w:t>
       </w:r>
     </w:p>
-    <w:bookmarkEnd w:id="66"/>
-    <w:bookmarkStart w:id="67" w:name="ref-scheuchVotersSupportAre2026"/>
+    <w:bookmarkEnd w:id="67"/>
+    <w:bookmarkStart w:id="68" w:name="ref-scheuchVotersSupportAre2026"/>
     <w:p>
       <w:pPr>
         <w:pStyle w:val="Bibliography"/>
@@ -6828,8 +6775,8 @@
         <w:t xml:space="preserve">: 10780874261475229.</w:t>
       </w:r>
     </w:p>
-    <w:bookmarkEnd w:id="67"/>
-    <w:bookmarkStart w:id="68" w:name="ref-teslerEliteDominationPublic2018"/>
+    <w:bookmarkEnd w:id="68"/>
+    <w:bookmarkStart w:id="69" w:name="ref-teslerEliteDominationPublic2018"/>
     <w:p>
       <w:pPr>
         <w:pStyle w:val="Bibliography"/>
@@ -6890,8 +6837,8 @@
         <w:t xml:space="preserve">35(2): 306–26.</w:t>
       </w:r>
     </w:p>
-    <w:bookmarkEnd w:id="68"/>
-    <w:bookmarkStart w:id="69" w:name="ref-LevelizedCostsNew2025"/>
+    <w:bookmarkEnd w:id="69"/>
+    <w:bookmarkStart w:id="70" w:name="ref-LevelizedCostsNew2025"/>
     <w:p>
       <w:pPr>
         <w:pStyle w:val="Bibliography"/>
@@ -6997,8 +6944,8 @@
         <w:t xml:space="preserve">. Washington, D.C. https://www.eia.gov/outlooks/aeo/electricity_generation/pdf/AEO2025_LCOE_report.pdf.</w:t>
       </w:r>
     </w:p>
-    <w:bookmarkEnd w:id="69"/>
-    <w:bookmarkStart w:id="70" w:name="ref-walterExaminingWillingnessPay2023"/>
+    <w:bookmarkEnd w:id="70"/>
+    <w:bookmarkStart w:id="71" w:name="ref-walterExaminingWillingnessPay2023"/>
     <w:p>
       <w:pPr>
         <w:pStyle w:val="Bibliography"/>
@@ -7086,8 +7033,8 @@
         <w:t xml:space="preserve">181: 113661.</w:t>
       </w:r>
     </w:p>
-    <w:bookmarkEnd w:id="70"/>
-    <w:bookmarkStart w:id="71" w:name="ref-wedelModelEffectsPsychological1998"/>
+    <w:bookmarkEnd w:id="71"/>
+    <w:bookmarkStart w:id="72" w:name="ref-wedelModelEffectsPsychological1998"/>
     <w:p>
       <w:pPr>
         <w:pStyle w:val="Bibliography"/>
@@ -7136,9 +7083,9 @@
         <w:t xml:space="preserve">19(2): 237–60.</w:t>
       </w:r>
     </w:p>
-    <w:bookmarkEnd w:id="71"/>
     <w:bookmarkEnd w:id="72"/>
     <w:bookmarkEnd w:id="73"/>
+    <w:bookmarkEnd w:id="74"/>
     <w:sectPr>
       <w:footnotePr>
         <w:numRestart w:val="eachSect"/>
@@ -7257,7 +7204,7 @@
         <w:t xml:space="preserve"> </w:t>
       </w:r>
       <w:r>
-        <w:t xml:space="preserve">Randomization produced conditions that were similar on gender, college education, income, and concern about the cost of electricity, but the conditions differed somewhat in age and in the share of white respondents. A balance table is shown in the supplemental material, and the results are similar when controlling for demographics.</w:t>
+        <w:t xml:space="preserve">Randomization produced conditions that were similar on gender, college education, and income, but the conditions differed somewhat in age and in the share of white respondents. A balance table is shown in the supplemental material, and the results are similar when controlling for demographics.</w:t>
       </w:r>
     </w:p>
   </w:footnote>
@@ -7276,11 +7223,11 @@
         <w:t xml:space="preserve"> </w:t>
       </w:r>
       <w:r>
-        <w:t xml:space="preserve">The two prompts are not symmetric. The fossil fuel prompt notes that renewables are often more cost-effective than fossil fuels, which likely gives respondents a reason not to pay more for fossil fuels, whereas the renewables prompt does not include a comparable reason not to pay for renewables. As a result, the difference between WTP for fossil fuels and WTP for renewables may reflect the wording of the prompts as well as respondents’ preferences, and should be interpreted with caution. However, the wording of each prompt was the same in every condition, so the comparison of each cue with the baseline within each energy source is not affected by the asymmetry.</w:t>
+        <w:t xml:space="preserve">The two prompts are not symmetric. The fossil fuel prompt notes that renewables are often more cost-effective than fossil fuels, which likely gives respondents a reason not to pay more for fossil fuels, whereas the renewables prompt does not include a comparable reason not to pay for renewables. As a result, the difference between WTP for fossil fuels and WTP for renewables may reflect the wording of the prompts as well as respondents’ preferences. However, the wording of each prompt was the same in every condition, so the comparison of each cue with the baseline within each energy source is not affected by the asymmetry.</w:t>
       </w:r>
     </w:p>
   </w:footnote>
-  <w:footnote w:id="23">
+  <w:footnote w:id="17">
     <w:p>
       <w:pPr>
         <w:pStyle w:val="FootnoteText"/>
@@ -7295,7 +7242,26 @@
         <w:t xml:space="preserve"> </w:t>
       </w:r>
       <w:r>
-        <w:t xml:space="preserve">Without the survey weights, neither interaction is significant (Trump cue x Republican</w:t>
+        <w:t xml:space="preserve">However, because the models interact the cues with party identification, and the party weights give every respondent within a party the same weight, the party weights do not change the estimated interactions, which instead depend on the demographic weights. To account for this, I also estimate each model without the weights, and with only the party weights or only the demographic weights, and those models are shown in the supplemental material.</w:t>
+      </w:r>
+    </w:p>
+  </w:footnote>
+  <w:footnote w:id="24">
+    <w:p>
+      <w:pPr>
+        <w:pStyle w:val="FootnoteText"/>
+      </w:pPr>
+      <w:r>
+        <w:rPr>
+          <w:rStyle w:val="FootnoteReference"/>
+        </w:rPr>
+        <w:footnoteRef/>
+      </w:r>
+      <w:r>
+        <w:t xml:space="preserve"> </w:t>
+      </w:r>
+      <w:r>
+        <w:t xml:space="preserve">Because the models include interactions, the coefficients for the Trump and climate cues are the effects of the cues among those who identify with neither party. To estimate the average effect of each cue, I also estimate models with the cues alone, shown in the supplemental material. Neither cue had a significant average effect on energy source priority compared to the baseline (Trump cue b = -0.03,</w:t>
       </w:r>
       <w:r>
         <w:t xml:space="preserve"> </w:t>
@@ -7311,7 +7277,7 @@
         <w:t xml:space="preserve"> </w:t>
       </w:r>
       <w:r>
-        <w:t xml:space="preserve">= 0.135; climate cue x Democrat</w:t>
+        <w:t xml:space="preserve">= 0.785; climate cue b = 0.03,</w:t>
       </w:r>
       <w:r>
         <w:t xml:space="preserve"> </w:t>
@@ -7327,7 +7293,45 @@
         <w:t xml:space="preserve"> </w:t>
       </w:r>
       <w:r>
-        <w:t xml:space="preserve">= 0.483). This difference reflects the demographic weights rather than the party weights. With only the demographic weights, the Trump cue x Republican interaction is similar to the estimate reported here (b = -0.51,</w:t>
+        <w:t xml:space="preserve">= 0.775).</w:t>
+      </w:r>
+    </w:p>
+  </w:footnote>
+  <w:footnote w:id="26">
+    <w:p>
+      <w:pPr>
+        <w:pStyle w:val="FootnoteText"/>
+      </w:pPr>
+      <w:r>
+        <w:rPr>
+          <w:rStyle w:val="FootnoteReference"/>
+        </w:rPr>
+        <w:footnoteRef/>
+      </w:r>
+      <w:r>
+        <w:t xml:space="preserve"> </w:t>
+      </w:r>
+      <w:r>
+        <w:t xml:space="preserve">Because WTP is bounded at $0 and $46, I also estimate a censored-normal (Tobit) model for each source, which treats $0 as censored from below and $46 as censored from above. Those models are shown in the supplemental material. The results of the Tobit models are consistent with those reported here. For renewables, party identification predicts WTP and no cue x party identification interaction is significant at the .05 level. For fossil fuels, the Trump and climate cue x Republican interactions are significant, but they reflect a lower WTP among those who identify with neither party rather than a higher WTP among Republicans.</w:t>
+      </w:r>
+    </w:p>
+  </w:footnote>
+  <w:footnote w:id="36">
+    <w:p>
+      <w:pPr>
+        <w:pStyle w:val="FootnoteText"/>
+      </w:pPr>
+      <w:r>
+        <w:rPr>
+          <w:rStyle w:val="FootnoteReference"/>
+        </w:rPr>
+        <w:footnoteRef/>
+      </w:r>
+      <w:r>
+        <w:t xml:space="preserve"> </w:t>
+      </w:r>
+      <w:r>
+        <w:t xml:space="preserve">In the Tobit model of fossil fuel WTP, the Trump cue x Republican interaction (b = 9.64,</w:t>
       </w:r>
       <w:r>
         <w:t xml:space="preserve"> </w:t>
@@ -7343,7 +7347,7 @@
         <w:t xml:space="preserve"> </w:t>
       </w:r>
       <w:r>
-        <w:t xml:space="preserve">= 0.046), whereas with only the party weights it is the same as without the weights (b = -0.32,</w:t>
+        <w:t xml:space="preserve">= 0.028) and the climate cue x Republican interaction (b = 9.60,</w:t>
       </w:r>
       <w:r>
         <w:t xml:space="preserve"> </w:t>
@@ -7359,45 +7363,7 @@
         <w:t xml:space="preserve"> </w:t>
       </w:r>
       <w:r>
-        <w:t xml:space="preserve">= 0.135).</w:t>
-      </w:r>
-    </w:p>
-  </w:footnote>
-  <w:footnote w:id="25">
-    <w:p>
-      <w:pPr>
-        <w:pStyle w:val="FootnoteText"/>
-      </w:pPr>
-      <w:r>
-        <w:rPr>
-          <w:rStyle w:val="FootnoteReference"/>
-        </w:rPr>
-        <w:footnoteRef/>
-      </w:r>
-      <w:r>
-        <w:t xml:space="preserve"> </w:t>
-      </w:r>
-      <w:r>
-        <w:t xml:space="preserve">Because WTP is bounded at $0 and $46, I also estimate a censored-normal (Tobit) model for each source, which treats $0 as censored from below and $46 as censored from above. Those models are shown in the supplemental material.</w:t>
-      </w:r>
-    </w:p>
-  </w:footnote>
-  <w:footnote w:id="35">
-    <w:p>
-      <w:pPr>
-        <w:pStyle w:val="FootnoteText"/>
-      </w:pPr>
-      <w:r>
-        <w:rPr>
-          <w:rStyle w:val="FootnoteReference"/>
-        </w:rPr>
-        <w:footnoteRef/>
-      </w:r>
-      <w:r>
-        <w:t xml:space="preserve"> </w:t>
-      </w:r>
-      <w:r>
-        <w:t xml:space="preserve">In the Tobit model of fossil fuel WTP, the Trump cue x Republican interaction (b = 9.64,</w:t>
+        <w:t xml:space="preserve">= 0.026) are significant. However, these interactions reflect a lower WTP for fossil fuels in the cue conditions among those who identify with neither party (Trump cue b = -9.33,</w:t>
       </w:r>
       <w:r>
         <w:t xml:space="preserve"> </w:t>
@@ -7413,7 +7379,7 @@
         <w:t xml:space="preserve"> </w:t>
       </w:r>
       <w:r>
-        <w:t xml:space="preserve">= 0.028) and the climate cue x Republican interaction (b = 9.60,</w:t>
+        <w:t xml:space="preserve">= 0.012) rather than a higher WTP among Republicans, whose WTP for fossil fuels did not differ from the baseline in either the Trump cue (difference = 0.31,</w:t>
       </w:r>
       <w:r>
         <w:t xml:space="preserve"> </w:t>
@@ -7429,7 +7395,7 @@
         <w:t xml:space="preserve"> </w:t>
       </w:r>
       <w:r>
-        <w:t xml:space="preserve">= 0.026) are significant. However, these interactions reflect a lower WTP for fossil fuels in the cue conditions among those who identify with neither party (Trump cue b = -9.33,</w:t>
+        <w:t xml:space="preserve">= 0.893) or the climate cue (difference = 2.80,</w:t>
       </w:r>
       <w:r>
         <w:t xml:space="preserve"> </w:t>
@@ -7445,43 +7411,11 @@
         <w:t xml:space="preserve"> </w:t>
       </w:r>
       <w:r>
-        <w:t xml:space="preserve">= 0.012) rather than a higher WTP among Republicans, whose WTP for fossil fuels did not differ from the baseline in either the Trump cue (difference = 0.31,</w:t>
-      </w:r>
-      <w:r>
-        <w:t xml:space="preserve"> </w:t>
-      </w:r>
-      <w:r>
-        <w:rPr>
-          <w:i/>
-          <w:iCs/>
-        </w:rPr>
-        <w:t xml:space="preserve">p</w:t>
-      </w:r>
-      <w:r>
-        <w:t xml:space="preserve"> </w:t>
-      </w:r>
-      <w:r>
-        <w:t xml:space="preserve">= 0.893) or the climate cue (difference = 2.80,</w:t>
-      </w:r>
-      <w:r>
-        <w:t xml:space="preserve"> </w:t>
-      </w:r>
-      <w:r>
-        <w:rPr>
-          <w:i/>
-          <w:iCs/>
-        </w:rPr>
-        <w:t xml:space="preserve">p</w:t>
-      </w:r>
-      <w:r>
-        <w:t xml:space="preserve"> </w:t>
-      </w:r>
-      <w:r>
         <w:t xml:space="preserve">= 0.215).</w:t>
       </w:r>
     </w:p>
   </w:footnote>
-  <w:footnote w:id="37">
+  <w:footnote w:id="38">
     <w:p>
       <w:pPr>
         <w:pStyle w:val="FootnoteText"/>
@@ -7496,7 +7430,7 @@
         <w:t xml:space="preserve"> </w:t>
       </w:r>
       <w:r>
-        <w:t xml:space="preserve">I ran a robustness check that included a measure of the respondent’s concern about the cost of energy. The results are similar to what is reported here, and are shown in the supplemental material. I also examined whether the cues weakened the effect of cost concern within each party, using models estimated separately for Republicans and Democrats with cost concern interacted with the cues and with demographic controls. Among Republicans with a positive WTP for fossil fuels, greater concern about cost was associated with a lower WTP in the baseline condition (b = -1.23 per point on the 0 to 10 scale,</w:t>
+        <w:t xml:space="preserve">I ran a robustness check that included a measure of the respondent’s concern about the cost of energy. The results are similar to what is reported here and are shown in the supplemental material. I also examined whether the cues weakened the effect of cost concern within each party, using models estimated separately for Republicans and Democrats with cost concern interacted with the cues and with demographic controls. Among Republicans with a positive WTP for fossil fuels, greater concern about cost was associated with a lower WTP in the baseline condition (b = -1.23 per point on the 0 to 10 scale,</w:t>
       </w:r>
       <w:r>
         <w:t xml:space="preserve"> </w:t>

</xml_diff>

<commit_message>
Prepare manuscript for Energy Policy submission
Accuracy and consistency pass on the manuscript, relative claims about
partisan priorities, power caveat, hedged interpretations, p-value and
number formatting, and declarations. Add make-dataset.R to rebuild the
weighted analysis data and render-anonymous.R for blinded submission files.

Co-Authored-By: Claude Opus 5.5 <noreply@anthropic.com>
</commit_message>
<xml_diff>
--- a/_output/cue-WTP.docx
+++ b/_output/cue-WTP.docx
@@ -37,7 +37,7 @@
         <w:pStyle w:val="Abstract"/>
       </w:pPr>
       <w:r>
-        <w:t xml:space="preserve">The second Trump administration has promoted fossil fuels and criticized renewable energy, which may serve as a partisan cue that further polarizes the US public on energy. Using a survey experiment with a quota-based sample of US residents (N = 3,113), I examine how a Trump cue and a climate change cue shape how the public prioritizes fossil fuels versus renewables, as well as their willingness-to-pay (WTP) for each source measured with the Gabor-Granger method. Partisanship strongly predicted both outcomes, as Republicans prioritized fossil fuels and were willing to pay less for renewables, whereas Democrats prioritized renewables and were willing to pay more for them. Neither cue had an average effect on priority or WTP. The Trump cue moved Republicans toward fossil fuels on the priority scale, and the climate cue did not move Democrats toward renewables. The cues did not reliably shift WTP for either source among partisans. The results suggest that cues are more likely to move costless expressions of energy preferences than the amount the public states it is willing to pay.</w:t>
+        <w:t xml:space="preserve">The second Trump administration has promoted fossil fuels and criticized renewable energy, which may serve as a partisan cue that further polarizes the US public on energy. Using a survey experiment with a quota-based sample of US residents (N = 3,113), I examine how a Trump cue and a climate change cue shape how the public prioritizes fossil fuels versus renewables, as well as their willingness-to-pay (WTP) for each source measured with the Gabor-Granger method. Partisanship strongly predicted both outcomes, as Republicans gave greater priority to fossil fuels and were willing to pay less for renewables than those who identify with neither party, whereas Democrats gave greater priority to renewables and were willing to pay more for them. Neither cue had an overall, average effect on priority or WTP. The Trump cue moved Republicans toward fossil fuels on the priority scale, yet the climate cue did not move Democrats toward renewables. The cues did not reliably shift WTP for either source among partisans. The results suggest that cues are more likely to move costless expressions of energy preferences than the amount the public states it is willing to pay.</w:t>
       </w:r>
     </w:p>
     <w:bookmarkStart w:id="10" w:name="introduction"/>
@@ -54,7 +54,7 @@
         <w:pStyle w:val="FirstParagraph"/>
       </w:pPr>
       <w:r>
-        <w:t xml:space="preserve">Shifting from fossil fuel sources of energy to renewables is needed to mitigate climate change. Such a shift requires the commitment and support of the public. In general, the US public seems to support using fewer fossil fuels and more renewable sources; however, there are partisan differences in the degree of that support with Republicans tending to be more supportive of fossil fuels and Democrats tending to be more supportive of renewables</w:t>
+        <w:t xml:space="preserve">Shifting from fossil fuel sources of energy to renewables is needed to mitigate climate change. Such a shift requires the commitment and support of the public. In general, the US public seems to support using fewer fossil fuels and more renewable sources; however, there are partisan differences in the degree of that support, with Republicans tending to be more supportive of fossil fuels and Democrats tending to be more supportive of renewables</w:t>
       </w:r>
       <w:r>
         <w:t xml:space="preserve"> </w:t>
@@ -63,7 +63,7 @@
         <w:t xml:space="preserve">(Bergquist, Konisky, and Kotcher 2020; Hamilton et al. 2018; Hawes and Nowlin 2022)</w:t>
       </w:r>
       <w:r>
-        <w:t xml:space="preserve">. Additionally, in the last several years, Republicans’ support for fossil fuels has increased, whereas their support of renewables has decreased</w:t>
+        <w:t xml:space="preserve">. Additionally, in the last several years, Republicans’ support for fossil fuels has increased, whereas their support for renewables has decreased</w:t>
       </w:r>
       <w:r>
         <w:t xml:space="preserve"> </w:t>
@@ -177,7 +177,7 @@
         <w:pStyle w:val="BodyText"/>
       </w:pPr>
       <w:r>
-        <w:t xml:space="preserve">In this study, I expand on current research by testing the impacts of a Trump cue versus a climate change cue on the prioritization of and WTP for fossil fuels and renewable sources of energy. The results are of interest because few studies compare the effect of a cue on a costless expression of preference, such as how energy sources should be prioritized, with its effect on a costly one, such as WTP, among the same respondents. Overall, I find that partisanship shapes energy source prioritization as Republicans tend to prioritize and have a higher WTP for fossil fuels and Democrats prioritize and have a higher WTP for renewables. Neither cue had an average effect on either outcome. There is some evidence that Republicans in the Trump cue prioritize fossil fuels more, and there is no evidence that the climate cue moved Democrats toward renewables. Finally, the cues did not reliably shift WTP for either energy source among partisans, which suggests that cues are more likely to move costless expressions of preference than costly ones.</w:t>
+        <w:t xml:space="preserve">In this study, I expand on current research by testing the impacts of a Trump cue versus a climate change cue on the prioritization of and WTP for fossil fuels and renewable sources of energy. The results are of interest because few studies compare the effect of a cue on a costless expression of preference, such as how energy sources should be prioritized, with its effect on a costly one, such as WTP, among the same respondents. Overall, I find that partisanship shapes energy preferences, as Republicans give greater priority to fossil fuels and are more likely to be willing to pay anything for them, whereas Democrats give greater priority to renewables and have a higher WTP for them. Neither cue had an average effect on either outcome. There is some evidence that Republicans in the Trump cue condition prioritized fossil fuels more, and there is no evidence that the climate cue moved Democrats toward renewables. Finally, the cues did not reliably shift WTP for either energy source among partisans, which suggests that cues are more likely to move costless expressions of preference than costly ones.</w:t>
       </w:r>
     </w:p>
     <w:bookmarkEnd w:id="10"/>
@@ -204,7 +204,7 @@
         <w:t xml:space="preserve">(Ehret, Van Boven, and Sherman 2018; Merkley and Stecula 2021; Tesler 2018)</w:t>
       </w:r>
       <w:r>
-        <w:t xml:space="preserve">. Cues provide an information heuristic, or shortcut, that allows the public to form opinions regarding a host of issues. Additionally, cues provide guides for motivated reasoning, as individuals apply reasoning in service to matching their views with those of their preferred party. Such motivated reasoning has been found in energy policy specifically.</w:t>
+        <w:t xml:space="preserve">. Cues provide an information heuristic, or shortcut, that allows the public to form opinions regarding a host of issues. Additionally, cues provide guides for motivated reasoning, as individuals apply reasoning in service of matching their views with those of their preferred party. Such motivated reasoning has been found in energy policy specifically.</w:t>
       </w:r>
       <w:r>
         <w:t xml:space="preserve"> </w:t>
@@ -390,7 +390,7 @@
         <w:t xml:space="preserve"> </w:t>
       </w:r>
       <w:r>
-        <w:t xml:space="preserve">estimated household WTP for a federal energy research and development fund aimed at reducing reliance on fossil fuels, and found broad support for that funding, suggesting that WTP responds to reducing fossil fuel use on its own without reference to another energy source.</w:t>
+        <w:t xml:space="preserve">estimated household WTP for a federal energy research and development fund aimed at reducing reliance on fossil fuels, and found broad support for that funding, suggesting that the public is willing to pay to reduce fossil fuel use even when no alternative energy source is specified.</w:t>
       </w:r>
       <w:r>
         <w:rPr>
@@ -570,7 +570,7 @@
         <w:t xml:space="preserve"> </w:t>
       </w:r>
       <w:r>
-        <w:t xml:space="preserve">to perform iterative raking to compute survey weights that weight respondents based on the US Census’s 2023 American Community Survey (ACS) on demographic variables, including age, race, gender, and education. I also used the Pew Research Center’s National Public Opinion Reference Survey (NPORS) from 2025 to weight the sample based on political party affiliation. With leaners assigned to a party, the NPORS targets were 45 percent Democratic, 46 percent Republican, and 9 percent identifying with neither party. I surveyed 3113 US residents in April 2026, who were randomly assigned to one of three conditions: a cue about Trump’s critiques of renewable energy and his support for fossil fuels (n = 1049), a climate change cue that stated scientists recommend moving away from fossil fuels to renewables to address climate change (n = 1013), or a baseline condition in which the argument for fossil fuels was attributed to</w:t>
+        <w:t xml:space="preserve">to perform iterative raking to compute survey weights that weight respondents based on the US Census’s 2023 American Community Survey (ACS) on demographic variables, including age, race, gender, and education. I also used the Pew Research Center’s National Public Opinion Reference Survey (NPORS) from 2025 to weight the sample based on political party affiliation. With leaners assigned to a party, the NPORS targets were 45 percent Democratic, 46 percent Republican, and 9 percent identifying with neither party. I surveyed 3,113 US residents in April 2026, who were randomly assigned to one of three conditions: a cue about Trump’s critiques of renewable energy and his support for fossil fuels (n = 1,049), a climate change cue that stated scientists recommend moving away from fossil fuels to renewables to address climate change (n = 1,013), or a baseline condition in which the argument for fossil fuels was attributed to</w:t>
       </w:r>
       <w:r>
         <w:t xml:space="preserve"> </w:t>
@@ -582,7 +582,7 @@
         <w:t xml:space="preserve"> </w:t>
       </w:r>
       <w:r>
-        <w:t xml:space="preserve">(n = 1051).</w:t>
+        <w:t xml:space="preserve">(n = 1,051).</w:t>
       </w:r>
       <w:r>
         <w:rPr>
@@ -612,7 +612,7 @@
         <w:pStyle w:val="FirstParagraph"/>
       </w:pPr>
       <w:r>
-        <w:t xml:space="preserve">Respondents were then shown the following statement. Those in the Trump cue saw President Trump named specifically, while those in the climate cue and the baseline were shown</w:t>
+        <w:t xml:space="preserve">Respondents were then shown the following statement. Those in the Trump cue condition saw President Trump named specifically, while those in the climate cue and baseline conditions were shown</w:t>
       </w:r>
       <w:r>
         <w:t xml:space="preserve"> </w:t>
@@ -661,7 +661,7 @@
         <w:pStyle w:val="FirstParagraph"/>
       </w:pPr>
       <w:r>
-        <w:t xml:space="preserve">Those in the climate cue saw the following:</w:t>
+        <w:t xml:space="preserve">Those in the climate cue condition saw the following:</w:t>
       </w:r>
     </w:p>
     <w:p>
@@ -693,7 +693,7 @@
         <w:pStyle w:val="FirstParagraph"/>
       </w:pPr>
       <w:r>
-        <w:t xml:space="preserve">After receiving the cues, respondents were asked, on a 1 to 7 scale, if fossil fuels should be prioritized (= 1), fossil fuels and renewables should be prioritized equally (= 4), or renewable sources should be prioritized (= 7). Next, I asked respondents their willingness-to-pay (WTP) for fossil fuel and renewable sources using the Gabor-Granger method</w:t>
+        <w:t xml:space="preserve">After receiving the cues, respondents were asked, on a 1 to 7 scale, if fossil fuels should be prioritized (= 1), fossil fuels and renewables should be prioritized equally (= 4), or renewable sources should be prioritized (= 7). Next, I asked respondents their WTP for fossil fuel and renewable sources using the Gabor-Granger method</w:t>
       </w:r>
       <w:r>
         <w:t xml:space="preserve"> </w:t>
@@ -740,7 +740,7 @@
         <w:pStyle w:val="BodyText"/>
       </w:pPr>
       <w:r>
-        <w:t xml:space="preserve">To establish WTP, I first give respondents information about potential costs associated with each energy source, and the sources were presented in random order. The prompts were written to give respondents a plausible reason that increasing the use of each source would raise their electricity bill. In the WTP for fossil fuels question, I noted that costs associated with renewable energy have decreased and, therefore, respondents may need to pay more to use fossil fuels</w:t>
+        <w:t xml:space="preserve">To establish WTP, I first gave respondents information about potential costs associated with each energy source, and the sources were presented in random order. The prompts were written to give respondents a plausible reason that increasing the use of each source would raise their electricity bill. In the WTP for fossil fuels question, I noted that costs associated with renewable energy have decreased and, therefore, respondents may need to pay more to use fossil fuels</w:t>
       </w:r>
       <w:r>
         <w:t xml:space="preserve"> </w:t>
@@ -779,7 +779,7 @@
         <w:pStyle w:val="FirstParagraph"/>
       </w:pPr>
       <w:r>
-        <w:t xml:space="preserve">To estimate the maximum/minimum WTP, respondents were first shown a random dollar amount between $1 and $46, in five-dollar increments, and asked if they would be WTP that amount extra per month on their electricity bill. If they indicated yes, they were shown a larger random dollar amount, and if they indicated no, they were shown a smaller dollar amount. This continued until they reached the $46 maximum or $1 minimum. Each respondent’s WTP is the highest amount they accepted, and respondents who indicated no at $1 were coded with a WTP of $0. The starting and follow-up amounts were drawn at random, independently of the cue condition, but were not recorded. Therefore, I cannot control for the starting amount, which may anchor responses, though random assignment of the starting amount means anchoring is unlikely to differ across conditions.</w:t>
+        <w:t xml:space="preserve">To estimate WTP, respondents were first shown a random dollar amount between $1 and $46, in five-dollar increments, and asked if they would be willing to pay that amount extra per month on their electricity bill. If they indicated yes, they were shown a larger random dollar amount, and if they indicated no, they were shown a smaller dollar amount. This continued until they rejected an amount after accepting a lower one, accepted an amount after rejecting a higher one, or reached the $46 maximum or $1 minimum. Each respondent’s WTP is the highest amount they accepted, and respondents who indicated no at $1 were coded with a WTP of $0. The starting and follow-up amounts were drawn at random, independently of the cue condition, but were not recorded. Therefore, I cannot control for the starting amount, which may anchor responses, though random assignment of the starting amount means anchoring is unlikely to differ across conditions.</w:t>
       </w:r>
     </w:p>
     <w:p>
@@ -787,7 +787,7 @@
         <w:pStyle w:val="BodyText"/>
       </w:pPr>
       <w:r>
-        <w:t xml:space="preserve">In the following analysis, I examine the prioritization of fossil fuels versus renewables and the WTP for those energy sources as a function of the cues and party identification. Party identification includes Democrats and Republicans, with those who identify with neither party as the excluded referent. Respondents who identified as independent or with another party were asked whether they lean toward the Democratic or Republican Party, and those who lean toward a party are coded as identifying with that party. Before leaners are assigned, 34 percent of respondents identified as independent or with another party, and after leaners are assigned, only 15 percent (n = 466) identified with neither party. Because this reference group is small, the cue effects among those who identify with neither party are estimated with less precision than the effects among partisans. Party identification was measured after the outcome questions, so the cues could, in principle, have shifted how respondents identified. However, the distribution of party identification did not differ across conditions (</w:t>
+        <w:t xml:space="preserve">In the following analysis, I examine the prioritization of fossil fuels versus renewables and the WTP for those energy sources as a function of the cues and party identification. Party identification includes Democrats and Republicans, with those who identify with neither party as the excluded referent. Respondents who identified as independent or with another party were asked whether they lean toward the Democratic or Republican Party, and those who lean toward a party are coded as identifying with that party. Before leaners are assigned, 34 percent of respondents identified as independent or with another party, and after leaners are assigned, only 15 percent (unweighted; n = 466) identified with neither party. Because this reference group is small, the cue effects among those who identify with neither party are estimated with less precision than the effects among partisans. Party identification was measured after the outcome questions, so the cues could, in principle, have shifted how respondents identified. However, the distribution of party identification did not differ across conditions (</w:t>
       </w:r>
       <m:oMath>
         <m:sSup>
@@ -839,7 +839,7 @@
         <w:t xml:space="preserve"> </w:t>
       </w:r>
       <w:r>
-        <w:t xml:space="preserve">= 0.511).</w:t>
+        <w:t xml:space="preserve">= .511).</w:t>
       </w:r>
     </w:p>
     <w:tbl>
@@ -1536,7 +1536,7 @@
         <w:pStyle w:val="BodyText"/>
       </w:pPr>
       <w:r>
-        <w:t xml:space="preserve">Descriptive statistics for the energy-priority scale and party identification are shown in</w:t>
+        <w:t xml:space="preserve">Descriptive statistics for the energy-priority scale, WTP, and party identification are shown in</w:t>
       </w:r>
       <w:r>
         <w:t xml:space="preserve"> </w:t>
@@ -2294,7 +2294,23 @@
         <w:pStyle w:val="BodyText"/>
       </w:pPr>
       <w:r>
-        <w:t xml:space="preserve">As expected, Republicans prioritized fossil fuels more than those who identify with neither party, with an estimated coefficient of -0.99 on the 1 to 7 scale, and Democrats prioritized renewables at 0.73. In terms of the interactions, which test whether the effect of a cue differs by party identification, the Trump cue moved Republicans toward fossil fuels more than it moved those who identify with neither party (b = -0.52). Descriptively, the predicted value on the 1 to 7 scale for Republicans in the baseline condition was 4.34, indicating a roughly even split between fossil fuels and renewables, and it was 3.96 for those receiving the Trump cue, a significant shift toward fossil fuels (difference = -0.38). In contrast, the climate cue did not move Democrats toward renewables more than those who identify with neither party (b = 0.01). The predicted value for Democrats was 6.06 in the baseline condition, indicating a strong priority for renewables, and 6.17 in the climate condition, which is not a significant difference. Finally, there is no evidence that Democrats moved toward renewables in response to the Trump cue or that Republicans moved toward fossil fuels in response to the climate cue.</w:t>
+        <w:t xml:space="preserve">As expected, Republicans prioritized fossil fuels more than those who identify with neither party, with an estimated coefficient of -0.99 on the 1 to 7 scale, and Democrats prioritized renewables at 0.73. In terms of the interactions, which test whether the effect of a cue differs by party identification, the Trump cue moved Republicans toward fossil fuels more than it moved those who identify with neither party (b = -0.52). The predicted value on the 1 to 7 scale for Republicans in the baseline condition was 4.34, indicating a roughly even split between fossil fuels and renewables, and it was 3.96 for those receiving the Trump cue, a significant shift toward fossil fuels (difference = -0.38,</w:t>
+      </w:r>
+      <w:r>
+        <w:t xml:space="preserve"> </w:t>
+      </w:r>
+      <w:r>
+        <w:rPr>
+          <w:i/>
+          <w:iCs/>
+        </w:rPr>
+        <w:t xml:space="preserve">p</w:t>
+      </w:r>
+      <w:r>
+        <w:t xml:space="preserve"> </w:t>
+      </w:r>
+      <w:r>
+        <w:t xml:space="preserve">= .022). In contrast, the climate cue did not move Democrats toward renewables more than those who identify with neither party (b = 0.01). The predicted value for Democrats was 6.06 in the baseline condition, indicating a strong priority for renewables, and 6.17 in the climate condition, which is not a significant difference. Finally, there is no evidence that Democrats moved toward renewables in response to the Trump cue or that Republicans moved toward fossil fuels in response to the climate cue.</w:t>
       </w:r>
       <w:r>
         <w:rPr>
@@ -2869,7 +2885,7 @@
         <w:pStyle w:val="BodyText"/>
       </w:pPr>
       <w:r>
-        <w:t xml:space="preserve">As shown, nearly half of respondents, 47 percent, were not willing to pay any additional amount for fossil fuels, whereas 18.3 percent were willing to pay the maximum, $46, for renewables. Overall, the median WTP for fossil fuels was $1 with a mean of $8.33. For renewables the median WTP was $11 and the mean was $18.21. The median WTP for renewables was $10 higher than for fossil fuels, and the mean WTP was $9.88 higher, a difference that is significant based on a survey-weighted paired t-test (</w:t>
+        <w:t xml:space="preserve">As shown, nearly half of respondents, 47.0 percent, were not willing to pay any additional amount for fossil fuels, whereas 18.3 percent were willing to pay the maximum, $46, for renewables. Overall, the median WTP for fossil fuels was $1 with a mean of $8.33. For renewables the median WTP was $11 and the mean was $18.21. The median WTP for renewables was $10 higher than for fossil fuels, and the mean WTP was $9.88 higher, a difference that is significant based on a survey-weighted paired t-test (</w:t>
       </w:r>
       <w:r>
         <w:rPr>
@@ -4139,7 +4155,7 @@
         <w:pStyle w:val="BodyText"/>
       </w:pPr>
       <w:r>
-        <w:t xml:space="preserve">For fossil fuels, Republicans were significantly more likely than those who identify with neither party to have any positive WTP (b = 0.57, log-odds scale), and Democrats were significantly less likely (b = -0.46). The predicted probability of any positive WTP in the baseline condition was 66.4% for Republicans compared to 41.6% for Democrats. Among those who identify with neither party, the Trump cue lowered the likelihood of any positive WTP for fossil fuels (b = -0.56), and the Trump cue x Republican interaction was marginally significant (b = 0.63,</w:t>
+        <w:t xml:space="preserve">For fossil fuels, Republicans were significantly more likely than those who identify with neither party to have any positive WTP (b = 0.57, log-odds scale), and Democrats were significantly less likely (b = -0.46). The predicted probability of any positive WTP in the baseline condition was 66.4 percent for Republicans compared to 41.6 percent for Democrats. Among those who identify with neither party, the Trump cue lowered the likelihood of any positive WTP for fossil fuels (b = -0.56), and the Trump cue × Republican interaction was marginally significant (b = 0.63,</w:t>
       </w:r>
       <w:r>
         <w:t xml:space="preserve"> </w:t>
@@ -4155,7 +4171,7 @@
         <w:t xml:space="preserve"> </w:t>
       </w:r>
       <w:r>
-        <w:t xml:space="preserve">= 0.055). However, this interaction reflects the decline among those who identify with neither party rather than an increase among Republicans, whose likelihood of any positive WTP in the Trump cue did not differ from the baseline (68.1% versus 66.4%; difference = 0.07,</w:t>
+        <w:t xml:space="preserve">= .055). However, this interaction reflects the decline among those who identify with neither party rather than an increase among Republicans, whose likelihood of any positive WTP in the Trump cue did not differ from the baseline (68.1 versus 66.4 percent; difference = 0.07 on the log-odds scale,</w:t>
       </w:r>
       <w:r>
         <w:t xml:space="preserve"> </w:t>
@@ -4171,7 +4187,7 @@
         <w:t xml:space="preserve"> </w:t>
       </w:r>
       <w:r>
-        <w:t xml:space="preserve">= 0.711). The WTP amounts are shown in</w:t>
+        <w:t xml:space="preserve">= .711). The WTP amounts are shown in</w:t>
       </w:r>
       <w:r>
         <w:t xml:space="preserve"> </w:t>
@@ -4382,7 +4398,7 @@
         <w:pStyle w:val="BodyText"/>
       </w:pPr>
       <w:r>
-        <w:t xml:space="preserve">Looking to renewables, Democrats were willing to pay $3.97 more, on average, than those who identify with neither party, and Republicans were willing to pay $5.96 less, for a predicted total of $13.12 among Republicans in the baseline condition. The climate cue x Democrat interaction was significant (b = 5.05,</w:t>
+        <w:t xml:space="preserve">Looking to renewables, Democrats were willing to pay $3.97 more, on average, than those who identify with neither party, and Republicans were willing to pay $5.96 less, for a predicted WTP of $13.12 among Republicans in the baseline condition. The climate cue × Democrat interaction was significant (b = 5.05,</w:t>
       </w:r>
       <w:r>
         <w:t xml:space="preserve"> </w:t>
@@ -4398,7 +4414,7 @@
         <w:t xml:space="preserve"> </w:t>
       </w:r>
       <w:r>
-        <w:t xml:space="preserve">= 0.048), and the climate cue x Republican interaction was nearly as large (b = 4.50,</w:t>
+        <w:t xml:space="preserve">= .048), and the climate cue × Republican interaction was nearly as large (b = 4.50,</w:t>
       </w:r>
       <w:r>
         <w:t xml:space="preserve"> </w:t>
@@ -4414,7 +4430,7 @@
         <w:t xml:space="preserve"> </w:t>
       </w:r>
       <w:r>
-        <w:t xml:space="preserve">= 0.092). However, both interactions largely reflect a lower WTP for renewables in the climate cue among those who identify with neither party (b = -3.58,</w:t>
+        <w:t xml:space="preserve">= .092). However, both interactions largely reflect a lower, though not statistically significant, WTP for renewables in the climate cue among those who identify with neither party (b = -3.58,</w:t>
       </w:r>
       <w:r>
         <w:t xml:space="preserve"> </w:t>
@@ -4430,7 +4446,7 @@
         <w:t xml:space="preserve"> </w:t>
       </w:r>
       <w:r>
-        <w:t xml:space="preserve">= 0.111). Among Democrats, the climate cue did not significantly increase WTP for renewables compared to the baseline (difference = $1.48,</w:t>
+        <w:t xml:space="preserve">= .111). Among Democrats, the climate cue did not significantly increase WTP for renewables compared to the baseline (difference = $1.48,</w:t>
       </w:r>
       <w:r>
         <w:t xml:space="preserve"> </w:t>
@@ -4446,7 +4462,7 @@
         <w:t xml:space="preserve"> </w:t>
       </w:r>
       <w:r>
-        <w:t xml:space="preserve">= 0.223).</w:t>
+        <w:t xml:space="preserve">= .223).</w:t>
       </w:r>
     </w:p>
     <w:p>
@@ -4454,7 +4470,7 @@
         <w:pStyle w:val="BodyText"/>
       </w:pPr>
       <w:r>
-        <w:t xml:space="preserve">Comparing the results to the hypotheses, the support is mixed. As expected, partisanship shaped both preferences and WTP, largely supporting H1a and H1b. Republicans prioritized fossil fuels more than those who identify with neither party, were more likely to have any positive WTP for fossil fuels, and were willing to pay less for renewables. Democrats, in contrast, prioritized renewables, were less likely to have any positive WTP for fossil fuels, and were willing to pay more for renewables. However, among those with any WTP for fossil fuels, Republicans were not willing to pay more than others. H2a and H2b were not supported, as neither the Trump cue nor the climate cue had a significant average effect on energy priority or WTP for either source compared to the baseline condition. H3a received limited support. The Trump cue moved Republicans toward fossil fuels on the priority scale. H3b was not supported, as the climate cue did not move Democrats toward renewables on the priority scale, and the climate cue x Democrat interaction for renewables WTP reflects a decline among those who identify with neither party rather than an increase among Democrats. Additionally, there was no evidence of a backlash effect, as neither cue led partisans to move away from the position of the source. Finally, the shift in priority among Republicans did not carry over to WTP, as Republicans in the Trump cue did not differ from those in the baseline in their WTP for fossil fuels. These results suggest that cues are likely more effective at moving the priority the public gives to energy sources than the amount they are willing to pay, though the design could not detect small effects on WTP.</w:t>
+        <w:t xml:space="preserve">Comparing the results to the hypotheses, the support is mixed. As expected, partisanship shaped both preferences and WTP, largely supporting H1a and H1b. Republicans prioritized fossil fuels more than those who identify with neither party, were more likely to have any positive WTP for fossil fuels, and were willing to pay less for renewables. Democrats, in contrast, prioritized renewables, were less likely to have any positive WTP for fossil fuels, and were willing to pay more for renewables. However, among those with any WTP for fossil fuels, Republicans were not willing to pay more than others. H2a and H2b were not supported, as neither the Trump cue nor the climate cue had a significant average effect on energy priority or WTP for either source compared to the baseline condition. H3a received limited support. The Trump cue moved Republicans toward fossil fuels on the priority scale. H3b was not supported, as the climate cue did not move Democrats toward renewables on the priority scale, and the climate cue × Democrat interaction for renewables WTP reflects a decline among those who identify with neither party rather than an increase among Democrats. Additionally, there was no evidence of a backlash effect, as neither cue led partisans to move away from the position of the source. Finally, the shift in priority among Republicans did not carry over to WTP, as Republicans in the Trump cue did not differ from those in the baseline in their WTP for fossil fuels. These results suggest that cues are likely more effective at moving the priority the public gives to energy sources than the amount they are willing to pay, though the design could not detect small effects on WTP.</w:t>
       </w:r>
     </w:p>
     <w:bookmarkEnd w:id="37"/>
@@ -4472,7 +4488,7 @@
         <w:pStyle w:val="FirstParagraph"/>
       </w:pPr>
       <w:r>
-        <w:t xml:space="preserve">A clean energy transition is needed to mitigate climate change, and public support is needed for the energy transition. However, President Trump’s rhetoric and actions on energy may serve to polarize the public. This study examined how exposure to a Trump cue or a climate change cue shapes the US public’s prioritization of, and willingness-to-pay for, fossil fuel versus renewable sources of electricity, and how these responses are shaped by partisanship. The results show that support for energy sources is polarized along partisan lines, both in how respondents prioritized fossil fuels against renewables and in the dollar amounts they were willing to pay. There is also some evidence that a Trump cue moved Republicans toward fossil fuels. In contrast, the climate cue did not move Democrats toward renewables, which is likely because Democrats already strongly prioritized renewables in the baseline condition. Together, these findings suggest that a cue from a polarizing figure such as President Trump may exacerbate existing partisan divisions in how the public prioritizes energy sources.</w:t>
+        <w:t xml:space="preserve">A clean energy transition is needed to mitigate climate change, and public support is needed for the energy transition. However, President Trump’s rhetoric and actions on energy may serve to polarize the public. This study examined how exposure to a Trump cue or a climate change cue shapes the US public’s prioritization of, and willingness-to-pay for, fossil fuel versus renewable sources of electricity, and how these responses are shaped by partisanship. The results show that support for energy sources is polarized along partisan lines, in how respondents prioritized fossil fuels against renewables, in whether they were willing to pay anything for fossil fuels, and in the dollar amounts they were willing to pay for renewables. There is also some evidence that a Trump cue moved Republicans toward fossil fuels. In contrast, the climate cue did not move Democrats toward renewables, which is likely because Democrats already strongly prioritized renewables in the baseline condition. Together, these findings suggest that a cue from a polarizing figure such as President Trump may exacerbate existing partisan divisions in how the public prioritizes energy sources.</w:t>
       </w:r>
     </w:p>
     <w:p>
@@ -4494,7 +4510,7 @@
         <w:pStyle w:val="BodyText"/>
       </w:pPr>
       <w:r>
-        <w:t xml:space="preserve">A single cue is likely a weaker treatment than the sustained rhetoric respondents may encounter outside of a survey. The few cue x party identification interactions for WTP that reached significance reflected a lower WTP among those who identify with neither party rather than a shift among partisans, and this small group is estimated with less precision. However, the design could only detect relatively large interaction effects on WTP, so small effects of the cues on WTP cannot be ruled out. With 80 percent power and</w:t>
+        <w:t xml:space="preserve">A single cue is likely a weaker treatment than the sustained rhetoric respondents may encounter outside of a survey. The few cue × party identification interactions for WTP that reached significance reflected a lower WTP among those who identify with neither party rather than a shift among partisans, and this small group is estimated with less precision. However, the design could only detect relatively large interaction effects on WTP, so small effects of the cues on WTP cannot be ruled out. With 80 percent power and</w:t>
       </w:r>
       <w:r>
         <w:t xml:space="preserve"> </w:t>
@@ -4508,7 +4524,7 @@
         <w:t xml:space="preserve"> </w:t>
       </w:r>
       <w:r>
-        <w:t xml:space="preserve">= .05, the smallest interaction effects the design could reliably detect are $7.15 to 7.61 for renewables and $9.50 to 9.86 for the amount of fossil fuel WTP, compared with 0.58 to 0.72 points for the priority scale. Additionally, neither cue had a significant average effect on WTP for either source in the models with the cues alone (all</w:t>
+        <w:t xml:space="preserve">= .05, the smallest interaction effects the design could reliably detect are $7.15 to 7.61 for renewables and $9.50 to 9.86 for the amount of fossil fuel WTP, compared with 0.58 to 0.72 points for the priority scale. Indeed, the Trump cue × Republican interaction on the priority scale (b = -0.52) is smaller than the minimum detectable effect for that scale, so its magnitude should be interpreted with caution. Additionally, neither cue had a significant average effect on WTP for either source in the models with the cues alone (all</w:t>
       </w:r>
       <w:r>
         <w:t xml:space="preserve"> </w:t>
@@ -4535,7 +4551,7 @@
         <w:t xml:space="preserve"> </w:t>
       </w:r>
       <w:r>
-        <w:t xml:space="preserve">0.135).</w:t>
+        <w:t xml:space="preserve">.135).</w:t>
       </w:r>
     </w:p>
     <w:p>
@@ -4543,7 +4559,7 @@
         <w:pStyle w:val="BodyText"/>
       </w:pPr>
       <w:r>
-        <w:t xml:space="preserve">These results carry several implications for climate and energy policy. First, respondents, on average, leaned toward prioritizing renewables over fossil fuels, with a mean of 5.17 on the 1 to 7 scale, and 86 percent of respondents reported some positive WTP for renewables. This suggests that renewable energy investment likely has general public support even in a polarized environment. Second, given the responsiveness of Republicans to the Trump cue, elite rhetoric, including rhetoric tied to a single prominent figure, may widen the partisan gap in energy preferences further, which is a risk for those seeking durable, bipartisan agreement on energy policy. Third, because the cues did not shift prioritization in the sample overall and did not reliably shift WTP, messaging strategies aimed at building broad coalitions for the energy transition likely benefit from emphasizing shared, cross-partisan benefits of renewables, such as reliability or local economic development, rather than frames tied to a specific political figure or to climate change.</w:t>
+        <w:t xml:space="preserve">These results carry several implications for climate and energy policy. First, respondents, on average, leaned toward prioritizing renewables over fossil fuels, with a mean of 5.17 on the 1 to 7 scale, and 86 percent of respondents reported some positive WTP for renewables. This suggests that renewable energy investment likely has general public support even in a polarized environment. Second, given the responsiveness of Republicans to the Trump cue, elite rhetoric, including rhetoric tied to a single prominent figure, may widen the partisan gap in energy preferences further, which is a risk for those seeking durable, bipartisan agreement on energy policy. Third, because the cues did not shift prioritization in the sample overall and did not reliably shift WTP, messaging strategies aimed at building broad coalitions for the energy transition may benefit from emphasizing shared, cross-partisan benefits of renewables, such as local economic development, rather than frames tied to a specific political figure or to climate change, though this study did not test such messages.</w:t>
       </w:r>
     </w:p>
     <w:p>
@@ -4559,7 +4575,7 @@
         <w:pStyle w:val="BodyText"/>
       </w:pPr>
       <w:r>
-        <w:t xml:space="preserve">Future research should examine whether repeated exposure to partisan cues over time widens the partisan gap in energy preferences identified here, and whether the cues have larger effects on WTP when respondents are asked to pay the stated amount rather than simply report it. Future research should also use parallel cue conditions and symmetric WTP prompts, and test whether cue effects on costless and costly expressions of preference differ within the same respondents.</w:t>
+        <w:t xml:space="preserve">Future research should examine whether repeated exposure to partisan cues over time widens the partisan gap in energy preferences identified here, and whether the cues have larger effects on WTP when respondents are asked to pay the stated amount rather than simply report it. Future research should also use parallel cue conditions and symmetric WTP prompts.</w:t>
       </w:r>
     </w:p>
     <w:bookmarkEnd w:id="39"/>
@@ -4638,6 +4654,78 @@
       </w:hyperlink>
       <w:r>
         <w:t xml:space="preserve">. The survey data will be made available upon publication.</w:t>
+      </w:r>
+    </w:p>
+    <w:p>
+      <w:pPr>
+        <w:pStyle w:val="BodyText"/>
+      </w:pPr>
+      <w:r>
+        <w:rPr>
+          <w:b/>
+          <w:bCs/>
+        </w:rPr>
+        <w:t xml:space="preserve">Funding.</w:t>
+      </w:r>
+      <w:r>
+        <w:t xml:space="preserve"> </w:t>
+      </w:r>
+      <w:r>
+        <w:t xml:space="preserve">[FUNDING STATEMENT]</w:t>
+      </w:r>
+    </w:p>
+    <w:p>
+      <w:pPr>
+        <w:pStyle w:val="BodyText"/>
+      </w:pPr>
+      <w:r>
+        <w:rPr>
+          <w:b/>
+          <w:bCs/>
+        </w:rPr>
+        <w:t xml:space="preserve">Declaration of competing interest.</w:t>
+      </w:r>
+      <w:r>
+        <w:t xml:space="preserve"> </w:t>
+      </w:r>
+      <w:r>
+        <w:t xml:space="preserve">[COMPETING INTEREST STATEMENT]</w:t>
+      </w:r>
+    </w:p>
+    <w:p>
+      <w:pPr>
+        <w:pStyle w:val="BodyText"/>
+      </w:pPr>
+      <w:r>
+        <w:rPr>
+          <w:b/>
+          <w:bCs/>
+        </w:rPr>
+        <w:t xml:space="preserve">CRediT authorship contribution statement.</w:t>
+      </w:r>
+      <w:r>
+        <w:t xml:space="preserve"> </w:t>
+      </w:r>
+      <w:r>
+        <w:t xml:space="preserve">Matthew C. Nowlin: Conceptualization, Methodology, Investigation, Data curation, Formal analysis, Writing – original draft, Writing – review &amp; editing.</w:t>
+      </w:r>
+    </w:p>
+    <w:p>
+      <w:pPr>
+        <w:pStyle w:val="BodyText"/>
+      </w:pPr>
+      <w:r>
+        <w:rPr>
+          <w:b/>
+          <w:bCs/>
+        </w:rPr>
+        <w:t xml:space="preserve">Declaration of generative AI and AI-assisted technologies in the writing process.</w:t>
+      </w:r>
+      <w:r>
+        <w:t xml:space="preserve"> </w:t>
+      </w:r>
+      <w:r>
+        <w:t xml:space="preserve">During the preparation of this work the author used Claude (Anthropic), through Claude Code, to write and debug the R code for the analysis, to draft and revise portions of the manuscript text, and to check the manuscript for accuracy, consistency, and grammar. After using this tool, the author reviewed and edited the content as needed and takes full responsibility for the content of the publication.</w:t>
       </w:r>
     </w:p>
     <w:p>
@@ -7277,7 +7365,7 @@
         <w:t xml:space="preserve"> </w:t>
       </w:r>
       <w:r>
-        <w:t xml:space="preserve">= 0.785; climate cue b = 0.03,</w:t>
+        <w:t xml:space="preserve">= .785; climate cue b = 0.03,</w:t>
       </w:r>
       <w:r>
         <w:t xml:space="preserve"> </w:t>
@@ -7293,7 +7381,7 @@
         <w:t xml:space="preserve"> </w:t>
       </w:r>
       <w:r>
-        <w:t xml:space="preserve">= 0.775).</w:t>
+        <w:t xml:space="preserve">= .775).</w:t>
       </w:r>
     </w:p>
   </w:footnote>
@@ -7312,7 +7400,7 @@
         <w:t xml:space="preserve"> </w:t>
       </w:r>
       <w:r>
-        <w:t xml:space="preserve">Because WTP is bounded at $0 and $46, I also estimate a censored-normal (Tobit) model for each source, which treats $0 as censored from below and $46 as censored from above. Those models are shown in the supplemental material. The results of the Tobit models are consistent with those reported here. For renewables, party identification predicts WTP and no cue x party identification interaction is significant at the .05 level. For fossil fuels, the Trump and climate cue x Republican interactions are significant, but they reflect a lower WTP among those who identify with neither party rather than a higher WTP among Republicans.</w:t>
+        <w:t xml:space="preserve">Because WTP is bounded at $0 and $46, I also estimate a censored-normal (Tobit) model for each source, which treats $0 as censored from below and $46 as censored from above. Those models are shown in the supplemental material. The results of the Tobit models are consistent with those reported here. For renewables, party identification predicts WTP and no cue × party identification interaction is significant at the .05 level. The Tobit results for fossil fuels are discussed below.</w:t>
       </w:r>
     </w:p>
   </w:footnote>
@@ -7331,7 +7419,7 @@
         <w:t xml:space="preserve"> </w:t>
       </w:r>
       <w:r>
-        <w:t xml:space="preserve">In the Tobit model of fossil fuel WTP, the Trump cue x Republican interaction (b = 9.64,</w:t>
+        <w:t xml:space="preserve">In the Tobit model of fossil fuel WTP, the Trump cue × Republican interaction (b = 9.64,</w:t>
       </w:r>
       <w:r>
         <w:t xml:space="preserve"> </w:t>
@@ -7347,7 +7435,7 @@
         <w:t xml:space="preserve"> </w:t>
       </w:r>
       <w:r>
-        <w:t xml:space="preserve">= 0.028) and the climate cue x Republican interaction (b = 9.60,</w:t>
+        <w:t xml:space="preserve">= .028) and the climate cue × Republican interaction (b = 9.60,</w:t>
       </w:r>
       <w:r>
         <w:t xml:space="preserve"> </w:t>
@@ -7363,7 +7451,7 @@
         <w:t xml:space="preserve"> </w:t>
       </w:r>
       <w:r>
-        <w:t xml:space="preserve">= 0.026) are significant. However, these interactions reflect a lower WTP for fossil fuels in the cue conditions among those who identify with neither party (Trump cue b = -9.33,</w:t>
+        <w:t xml:space="preserve">= .026) are significant. However, these interactions reflect a lower WTP for fossil fuels in the cue conditions among those who identify with neither party (Trump cue b = -9.33,</w:t>
       </w:r>
       <w:r>
         <w:t xml:space="preserve"> </w:t>
@@ -7379,7 +7467,7 @@
         <w:t xml:space="preserve"> </w:t>
       </w:r>
       <w:r>
-        <w:t xml:space="preserve">= 0.012) rather than a higher WTP among Republicans, whose WTP for fossil fuels did not differ from the baseline in either the Trump cue (difference = 0.31,</w:t>
+        <w:t xml:space="preserve">= .012; climate cue b = -6.80,</w:t>
       </w:r>
       <w:r>
         <w:t xml:space="preserve"> </w:t>
@@ -7395,7 +7483,7 @@
         <w:t xml:space="preserve"> </w:t>
       </w:r>
       <w:r>
-        <w:t xml:space="preserve">= 0.893) or the climate cue (difference = 2.80,</w:t>
+        <w:t xml:space="preserve">= .065) rather than a higher WTP among Republicans, though the decline in the climate cue is only marginally significant. Republicans’ WTP for fossil fuels did not differ from the baseline in either the Trump cue (difference = 0.31,</w:t>
       </w:r>
       <w:r>
         <w:t xml:space="preserve"> </w:t>
@@ -7411,7 +7499,23 @@
         <w:t xml:space="preserve"> </w:t>
       </w:r>
       <w:r>
-        <w:t xml:space="preserve">= 0.215).</w:t>
+        <w:t xml:space="preserve">= .893) or the climate cue (difference = 2.80,</w:t>
+      </w:r>
+      <w:r>
+        <w:t xml:space="preserve"> </w:t>
+      </w:r>
+      <w:r>
+        <w:rPr>
+          <w:i/>
+          <w:iCs/>
+        </w:rPr>
+        <w:t xml:space="preserve">p</w:t>
+      </w:r>
+      <w:r>
+        <w:t xml:space="preserve"> </w:t>
+      </w:r>
+      <w:r>
+        <w:t xml:space="preserve">= .215).</w:t>
       </w:r>
     </w:p>
   </w:footnote>
@@ -7446,7 +7550,7 @@
         <w:t xml:space="preserve"> </w:t>
       </w:r>
       <w:r>
-        <w:t xml:space="preserve">= 0.010), but not in the Trump cue (b = -0.27,</w:t>
+        <w:t xml:space="preserve">= .010), but not in the Trump cue (b = -0.27,</w:t>
       </w:r>
       <w:r>
         <w:t xml:space="preserve"> </w:t>
@@ -7462,7 +7566,7 @@
         <w:t xml:space="preserve"> </w:t>
       </w:r>
       <w:r>
-        <w:t xml:space="preserve">= 0.645). Among Democrats, greater concern about cost was associated with a marginally lower WTP for renewables in the baseline condition (b = -0.64,</w:t>
+        <w:t xml:space="preserve">= .645). Among Democrats, greater concern about cost was associated with a marginally lower WTP for renewables in the baseline condition (b = -0.64,</w:t>
       </w:r>
       <w:r>
         <w:t xml:space="preserve"> </w:t>
@@ -7478,7 +7582,7 @@
         <w:t xml:space="preserve"> </w:t>
       </w:r>
       <w:r>
-        <w:t xml:space="preserve">= 0.071), but not in the climate cue (b = 0.07,</w:t>
+        <w:t xml:space="preserve">= .071), but not in the climate cue (b = 0.07,</w:t>
       </w:r>
       <w:r>
         <w:t xml:space="preserve"> </w:t>
@@ -7494,7 +7598,7 @@
         <w:t xml:space="preserve"> </w:t>
       </w:r>
       <w:r>
-        <w:t xml:space="preserve">= 0.873). However, in neither case did the effect of cost concern differ significantly between the cue and the baseline condition (</w:t>
+        <w:t xml:space="preserve">= .873). However, in neither case did the effect of cost concern differ significantly between the cue and the baseline condition (</w:t>
       </w:r>
       <w:r>
         <w:rPr>
@@ -7507,7 +7611,7 @@
         <w:t xml:space="preserve"> </w:t>
       </w:r>
       <w:r>
-        <w:t xml:space="preserve">= 0.193 and</w:t>
+        <w:t xml:space="preserve">= .193 and</w:t>
       </w:r>
       <w:r>
         <w:t xml:space="preserve"> </w:t>
@@ -7523,7 +7627,7 @@
         <w:t xml:space="preserve"> </w:t>
       </w:r>
       <w:r>
-        <w:t xml:space="preserve">= 0.205, respectively), so there is limited evidence that the cues override cost concerns among partisans.</w:t>
+        <w:t xml:space="preserve">= .205, respectively), so there is limited evidence that the cues override cost concerns among partisans.</w:t>
       </w:r>
     </w:p>
   </w:footnote>

</xml_diff>